<commit_message>
Raport Oceny Funkcjonalnej: tytuł w jednej linii na okładce
Co-Authored-By: Claude Fable 5.1 <noreply@anthropic.com>
Claude-Session: https://claude.ai/code/session_01FpF7vCSW7jSofte5z6wEKy
</commit_message>
<xml_diff>
--- a/eduplaner2026/raport_oceny_funkcjonalnej/Raport_Oceny_Funkcjonalnej.docx
+++ b/eduplaner2026/raport_oceny_funkcjonalnej/Raport_Oceny_Funkcjonalnej.docx
@@ -469,26 +469,6 @@
     </w:p>
     <w:p>
       <w:pPr>
-        <w:spacing w:after="0" w:before="0" w:line="600" w:lineRule="exact"/>
-        <w:jc w:val="center"/>
-      </w:pPr>
-      <w:r>
-        <w:rPr>
-          <w:rFonts w:ascii="Arial" w:cs="Arial" w:eastAsia="Arial" w:hAnsi="Arial"/>
-          <w:b/>
-          <w:bCs/>
-          <w:i w:val="false"/>
-          <w:iCs w:val="false"/>
-          <w:caps w:val="false"/>
-          <w:color w:val="2D1B69"/>
-          <w:sz w:val="52"/>
-          <w:szCs w:val="52"/>
-        </w:rPr>
-        <w:t xml:space="preserve">Raport Oceny</w:t>
-      </w:r>
-    </w:p>
-    <w:p>
-      <w:pPr>
         <w:spacing w:after="80" w:before="0" w:line="600" w:lineRule="exact"/>
         <w:jc w:val="center"/>
       </w:pPr>
@@ -504,7 +484,7 @@
           <w:sz w:val="52"/>
           <w:szCs w:val="52"/>
         </w:rPr>
-        <w:t xml:space="preserve">Funkcjonalnej</w:t>
+        <w:t xml:space="preserve">Raport Oceny Funkcjonalnej</w:t>
       </w:r>
     </w:p>
     <w:p>

</xml_diff>

<commit_message>
Raport Oceny Funkcjonalnej: sekcja 9 rozbita na rewalidację, PPP i pozostałe zalecenia
A) zajęcia rewalidacyjne – rodzaj, zakres, prowadzący, forma, wymiar
tygodniowy i suma (2 godz.); B) pomoc psychologiczno-pedagogiczna –
rodzaj, forma, wymiar i suma (3 godz. 30 min); C) pozostałe zalecenia
poradni ze sposobem realizacji i statusem. Kafelki sum godzin.
HTML, PDF i Word: 11 stron. Zasada dopisana do CLAUDE.md.

Co-Authored-By: Claude Fable 5.1 <noreply@anthropic.com>
Claude-Session: https://claude.ai/code/session_01FpF7vCSW7jSofte5z6wEKy
</commit_message>
<xml_diff>
--- a/eduplaner2026/raport_oceny_funkcjonalnej/Raport_Oceny_Funkcjonalnej.docx
+++ b/eduplaner2026/raport_oceny_funkcjonalnej/Raport_Oceny_Funkcjonalnej.docx
@@ -1995,7 +1995,7 @@
                 <w:sz w:val="12"/>
                 <w:szCs w:val="12"/>
               </w:rPr>
-              <w:t xml:space="preserve">sposoby realizacji w placówce</w:t>
+              <w:t xml:space="preserve">rewalidacja · PPP · realizacja</w:t>
             </w:r>
           </w:p>
         </w:tc>
@@ -15492,7 +15492,7 @@
                 <w:sz w:val="12"/>
                 <w:szCs w:val="12"/>
               </w:rPr>
-              <w:t xml:space="preserve">Raport Oceny Funkcjonalnej · Część II · Zalecenia poradni i podpisy</w:t>
+              <w:t xml:space="preserve">Raport Oceny Funkcjonalnej · Część II · Zalecenia poradni · zajęcia</w:t>
             </w:r>
           </w:p>
         </w:tc>
@@ -15953,7 +15953,3217 @@
           <w:sz w:val="16"/>
           <w:szCs w:val="16"/>
         </w:rPr>
-        <w:t xml:space="preserve"> oraz przyjęte przez Zespół sposoby ich realizacji, realizatorzy i wymiar wsparcia:</w:t>
+        <w:t xml:space="preserve"> oraz przyjęte przez Zespół sposoby ich realizacji. Zajęcia przydzielone dziecku/uczniowi zestawiono w podziale na </w:t>
+      </w:r>
+      <w:r>
+        <w:rPr>
+          <w:rFonts w:ascii="Arial" w:cs="Arial" w:eastAsia="Arial" w:hAnsi="Arial"/>
+          <w:b/>
+          <w:bCs/>
+          <w:i w:val="false"/>
+          <w:iCs w:val="false"/>
+          <w:caps w:val="false"/>
+          <w:color w:val="2D1B69"/>
+          <w:sz w:val="16"/>
+          <w:szCs w:val="16"/>
+        </w:rPr>
+        <w:t xml:space="preserve">rewalidację</w:t>
+      </w:r>
+      <w:r>
+        <w:rPr>
+          <w:rFonts w:ascii="Arial" w:cs="Arial" w:eastAsia="Arial" w:hAnsi="Arial"/>
+          <w:b w:val="false"/>
+          <w:bCs w:val="false"/>
+          <w:i w:val="false"/>
+          <w:iCs w:val="false"/>
+          <w:caps w:val="false"/>
+          <w:color w:val="6B6378"/>
+          <w:sz w:val="16"/>
+          <w:szCs w:val="16"/>
+        </w:rPr>
+        <w:t xml:space="preserve"> (kształcenie specjalne) i </w:t>
+      </w:r>
+      <w:r>
+        <w:rPr>
+          <w:rFonts w:ascii="Arial" w:cs="Arial" w:eastAsia="Arial" w:hAnsi="Arial"/>
+          <w:b/>
+          <w:bCs/>
+          <w:i w:val="false"/>
+          <w:iCs w:val="false"/>
+          <w:caps w:val="false"/>
+          <w:color w:val="2D1B69"/>
+          <w:sz w:val="16"/>
+          <w:szCs w:val="16"/>
+        </w:rPr>
+        <w:t xml:space="preserve">pomoc psychologiczno-pedagogiczną</w:t>
+      </w:r>
+      <w:r>
+        <w:rPr>
+          <w:rFonts w:ascii="Arial" w:cs="Arial" w:eastAsia="Arial" w:hAnsi="Arial"/>
+          <w:b w:val="false"/>
+          <w:bCs w:val="false"/>
+          <w:i w:val="false"/>
+          <w:iCs w:val="false"/>
+          <w:caps w:val="false"/>
+          <w:color w:val="6B6378"/>
+          <w:sz w:val="16"/>
+          <w:szCs w:val="16"/>
+        </w:rPr>
+        <w:t xml:space="preserve">:</w:t>
+      </w:r>
+    </w:p>
+    <w:tbl>
+      <w:tblPr>
+        <w:tblW w:type="dxa" w:w="9906"/>
+        <w:tblBorders>
+          <w:top w:val="single" w:color="auto" w:sz="4"/>
+          <w:left w:val="single" w:color="auto" w:sz="4"/>
+          <w:bottom w:val="single" w:color="auto" w:sz="4"/>
+          <w:right w:val="single" w:color="auto" w:sz="4"/>
+          <w:insideH w:val="single" w:color="auto" w:sz="4"/>
+          <w:insideV w:val="single" w:color="auto" w:sz="4"/>
+        </w:tblBorders>
+      </w:tblPr>
+      <w:tblGrid>
+        <w:gridCol w:w="4953"/>
+        <w:gridCol w:w="4953"/>
+      </w:tblGrid>
+      <w:tr>
+        <w:trPr>
+          <w:cantSplit/>
+        </w:trPr>
+        <w:tc>
+          <w:tcPr>
+            <w:tcW w:type="dxa" w:w="4953"/>
+            <w:tcBorders>
+              <w:top w:val="single" w:color="E74509" w:sz="24"/>
+              <w:left w:val="single" w:color="D9D0F0" w:sz="4"/>
+              <w:bottom w:val="single" w:color="D9D0F0" w:sz="4"/>
+              <w:right w:val="single" w:color="D9D0F0" w:sz="4"/>
+            </w:tcBorders>
+            <w:tcMar>
+              <w:top w:type="dxa" w:w="90"/>
+              <w:left w:type="dxa" w:w="160"/>
+              <w:bottom w:type="dxa" w:w="90"/>
+              <w:right w:type="dxa" w:w="120"/>
+            </w:tcMar>
+            <w:vAlign w:val="top"/>
+          </w:tcPr>
+          <w:p>
+            <w:pPr>
+              <w:spacing w:after="40" w:before="0" w:line="276"/>
+              <w:jc w:val="left"/>
+            </w:pPr>
+            <w:r>
+              <w:rPr>
+                <w:rFonts w:ascii="Arial" w:cs="Arial" w:eastAsia="Arial" w:hAnsi="Arial"/>
+                <w:b/>
+                <w:bCs/>
+                <w:i w:val="false"/>
+                <w:iCs w:val="false"/>
+                <w:caps w:val="false"/>
+                <w:color w:val="7D6FB0"/>
+                <w:spacing w:val="12"/>
+                <w:sz w:val="12"/>
+                <w:szCs w:val="12"/>
+              </w:rPr>
+              <w:t xml:space="preserve">A · ZAJĘCIA REWALIDACYJNE · RAZEM</w:t>
+            </w:r>
+          </w:p>
+          <w:p>
+            <w:pPr>
+              <w:spacing w:after="0" w:before="0" w:line="276"/>
+              <w:jc w:val="left"/>
+            </w:pPr>
+            <w:r>
+              <w:rPr>
+                <w:rFonts w:ascii="Arial" w:cs="Arial" w:eastAsia="Arial" w:hAnsi="Arial"/>
+                <w:b/>
+                <w:bCs/>
+                <w:i w:val="false"/>
+                <w:iCs w:val="false"/>
+                <w:caps w:val="false"/>
+                <w:color w:val="2D1B69"/>
+                <w:sz w:val="26"/>
+                <w:szCs w:val="26"/>
+              </w:rPr>
+              <w:t xml:space="preserve">2 godz.</w:t>
+            </w:r>
+            <w:r>
+              <w:rPr>
+                <w:rFonts w:ascii="Arial" w:cs="Arial" w:eastAsia="Arial" w:hAnsi="Arial"/>
+                <w:b w:val="false"/>
+                <w:bCs w:val="false"/>
+                <w:i w:val="false"/>
+                <w:iCs w:val="false"/>
+                <w:caps w:val="false"/>
+                <w:color w:val="6B6378"/>
+                <w:sz w:val="15"/>
+                <w:szCs w:val="15"/>
+              </w:rPr>
+              <w:t xml:space="preserve">  = 120 min / tydz. · 3 rodzaje zajęć</w:t>
+            </w:r>
+          </w:p>
+        </w:tc>
+        <w:tc>
+          <w:tcPr>
+            <w:tcW w:type="dxa" w:w="4953"/>
+            <w:tcBorders>
+              <w:top w:val="single" w:color="2D6BB3" w:sz="24"/>
+              <w:left w:val="single" w:color="D9D0F0" w:sz="4"/>
+              <w:bottom w:val="single" w:color="D9D0F0" w:sz="4"/>
+              <w:right w:val="single" w:color="D9D0F0" w:sz="4"/>
+            </w:tcBorders>
+            <w:tcMar>
+              <w:top w:type="dxa" w:w="90"/>
+              <w:left w:type="dxa" w:w="160"/>
+              <w:bottom w:type="dxa" w:w="90"/>
+              <w:right w:type="dxa" w:w="120"/>
+            </w:tcMar>
+            <w:vAlign w:val="top"/>
+          </w:tcPr>
+          <w:p>
+            <w:pPr>
+              <w:spacing w:after="40" w:before="0" w:line="276"/>
+              <w:jc w:val="left"/>
+            </w:pPr>
+            <w:r>
+              <w:rPr>
+                <w:rFonts w:ascii="Arial" w:cs="Arial" w:eastAsia="Arial" w:hAnsi="Arial"/>
+                <w:b/>
+                <w:bCs/>
+                <w:i w:val="false"/>
+                <w:iCs w:val="false"/>
+                <w:caps w:val="false"/>
+                <w:color w:val="7D6FB0"/>
+                <w:spacing w:val="12"/>
+                <w:sz w:val="12"/>
+                <w:szCs w:val="12"/>
+              </w:rPr>
+              <w:t xml:space="preserve">B · POMOC PSYCHOLOGICZNO-PEDAGOGICZNA · RAZEM</w:t>
+            </w:r>
+          </w:p>
+          <w:p>
+            <w:pPr>
+              <w:spacing w:after="0" w:before="0" w:line="276"/>
+              <w:jc w:val="left"/>
+            </w:pPr>
+            <w:r>
+              <w:rPr>
+                <w:rFonts w:ascii="Arial" w:cs="Arial" w:eastAsia="Arial" w:hAnsi="Arial"/>
+                <w:b/>
+                <w:bCs/>
+                <w:i w:val="false"/>
+                <w:iCs w:val="false"/>
+                <w:caps w:val="false"/>
+                <w:color w:val="2D1B69"/>
+                <w:sz w:val="26"/>
+                <w:szCs w:val="26"/>
+              </w:rPr>
+              <w:t xml:space="preserve">3 godz. 30 min</w:t>
+            </w:r>
+            <w:r>
+              <w:rPr>
+                <w:rFonts w:ascii="Arial" w:cs="Arial" w:eastAsia="Arial" w:hAnsi="Arial"/>
+                <w:b w:val="false"/>
+                <w:bCs w:val="false"/>
+                <w:i w:val="false"/>
+                <w:iCs w:val="false"/>
+                <w:caps w:val="false"/>
+                <w:color w:val="6B6378"/>
+                <w:sz w:val="15"/>
+                <w:szCs w:val="15"/>
+              </w:rPr>
+              <w:t xml:space="preserve">  = 210 min / tydz. · 5 form pomocy</w:t>
+            </w:r>
+          </w:p>
+        </w:tc>
+      </w:tr>
+    </w:tbl>
+    <w:p>
+      <w:pPr>
+        <w:keepNext/>
+        <w:spacing w:after="100" w:before="200"/>
+      </w:pPr>
+      <w:r>
+        <w:rPr>
+          <w:rFonts w:ascii="Arial" w:cs="Arial" w:eastAsia="Arial" w:hAnsi="Arial"/>
+          <w:b/>
+          <w:bCs/>
+          <w:i w:val="false"/>
+          <w:iCs w:val="false"/>
+          <w:caps w:val="false"/>
+          <w:color w:val="FFFFFF"/>
+          <w:sz w:val="16"/>
+          <w:szCs w:val="16"/>
+          <w:shd w:fill="E74509" w:color="auto" w:val="clear"/>
+        </w:rPr>
+        <w:t xml:space="preserve"> A </w:t>
+      </w:r>
+      <w:r>
+        <w:rPr>
+          <w:rFonts w:ascii="Arial" w:cs="Arial" w:eastAsia="Arial" w:hAnsi="Arial"/>
+          <w:b/>
+          <w:bCs/>
+          <w:i w:val="false"/>
+          <w:iCs w:val="false"/>
+          <w:caps w:val="false"/>
+          <w:color w:val="2D1B69"/>
+          <w:sz w:val="18"/>
+          <w:szCs w:val="18"/>
+        </w:rPr>
+        <w:t xml:space="preserve">   Zajęcia rewalidacyjne przydzielone dziecku / uczniowi</w:t>
+      </w:r>
+      <w:r>
+        <w:rPr>
+          <w:rFonts w:ascii="Arial" w:cs="Arial" w:eastAsia="Arial" w:hAnsi="Arial"/>
+          <w:b w:val="false"/>
+          <w:bCs w:val="false"/>
+          <w:i w:val="false"/>
+          <w:iCs w:val="false"/>
+          <w:caps w:val="false"/>
+          <w:color w:val="6B6378"/>
+          <w:sz w:val="14"/>
+          <w:szCs w:val="14"/>
+        </w:rPr>
+        <w:t xml:space="preserve">   · kształcenie specjalne · na podstawie orzeczenia</w:t>
+      </w:r>
+    </w:p>
+    <w:tbl>
+      <w:tblPr>
+        <w:tblW w:type="dxa" w:w="9906"/>
+        <w:tblBorders>
+          <w:top w:val="single" w:color="auto" w:sz="4"/>
+          <w:left w:val="single" w:color="auto" w:sz="4"/>
+          <w:bottom w:val="single" w:color="auto" w:sz="4"/>
+          <w:right w:val="single" w:color="auto" w:sz="4"/>
+          <w:insideH w:val="single" w:color="auto" w:sz="4"/>
+          <w:insideV w:val="single" w:color="auto" w:sz="4"/>
+        </w:tblBorders>
+      </w:tblPr>
+      <w:tblGrid>
+        <w:gridCol w:w="3000"/>
+        <w:gridCol w:w="2800"/>
+        <w:gridCol w:w="1500"/>
+        <w:gridCol w:w="1300"/>
+        <w:gridCol w:w="1306"/>
+      </w:tblGrid>
+      <w:tr>
+        <w:trPr>
+          <w:cantSplit/>
+        </w:trPr>
+        <w:tc>
+          <w:tcPr>
+            <w:tcW w:type="dxa" w:w="3000"/>
+            <w:tcBorders>
+              <w:top w:val="single" w:color="D9D0F0" w:sz="4"/>
+              <w:left w:val="single" w:color="D9D0F0" w:sz="4"/>
+              <w:bottom w:val="single" w:color="D9D0F0" w:sz="4"/>
+              <w:right w:val="single" w:color="D9D0F0" w:sz="4"/>
+            </w:tcBorders>
+            <w:shd w:fill="EFE9F9" w:color="auto" w:val="clear"/>
+            <w:tcMar>
+              <w:top w:type="dxa" w:w="100"/>
+              <w:left w:type="dxa" w:w="140"/>
+              <w:bottom w:type="dxa" w:w="100"/>
+              <w:right w:type="dxa" w:w="120"/>
+            </w:tcMar>
+            <w:vAlign w:val="top"/>
+          </w:tcPr>
+          <w:p>
+            <w:pPr>
+              <w:spacing w:after="0" w:before="0" w:line="276"/>
+              <w:jc w:val="left"/>
+            </w:pPr>
+            <w:r>
+              <w:rPr>
+                <w:rFonts w:ascii="Arial" w:cs="Arial" w:eastAsia="Arial" w:hAnsi="Arial"/>
+                <w:b/>
+                <w:bCs/>
+                <w:i w:val="false"/>
+                <w:iCs w:val="false"/>
+                <w:caps/>
+                <w:color w:val="2D1B69"/>
+                <w:spacing w:val="10"/>
+                <w:sz w:val="13"/>
+                <w:szCs w:val="13"/>
+              </w:rPr>
+              <w:t xml:space="preserve">Rodzaj zajęć</w:t>
+            </w:r>
+          </w:p>
+        </w:tc>
+        <w:tc>
+          <w:tcPr>
+            <w:tcW w:type="dxa" w:w="2800"/>
+            <w:tcBorders>
+              <w:top w:val="single" w:color="D9D0F0" w:sz="4"/>
+              <w:left w:val="single" w:color="D9D0F0" w:sz="4"/>
+              <w:bottom w:val="single" w:color="D9D0F0" w:sz="4"/>
+              <w:right w:val="single" w:color="D9D0F0" w:sz="4"/>
+            </w:tcBorders>
+            <w:shd w:fill="EFE9F9" w:color="auto" w:val="clear"/>
+            <w:tcMar>
+              <w:top w:type="dxa" w:w="100"/>
+              <w:left w:type="dxa" w:w="140"/>
+              <w:bottom w:type="dxa" w:w="100"/>
+              <w:right w:type="dxa" w:w="120"/>
+            </w:tcMar>
+            <w:vAlign w:val="top"/>
+          </w:tcPr>
+          <w:p>
+            <w:pPr>
+              <w:spacing w:after="0" w:before="0" w:line="276"/>
+              <w:jc w:val="left"/>
+            </w:pPr>
+            <w:r>
+              <w:rPr>
+                <w:rFonts w:ascii="Arial" w:cs="Arial" w:eastAsia="Arial" w:hAnsi="Arial"/>
+                <w:b/>
+                <w:bCs/>
+                <w:i w:val="false"/>
+                <w:iCs w:val="false"/>
+                <w:caps/>
+                <w:color w:val="2D1B69"/>
+                <w:spacing w:val="10"/>
+                <w:sz w:val="13"/>
+                <w:szCs w:val="13"/>
+              </w:rPr>
+              <w:t xml:space="preserve">Zakres / cel</w:t>
+            </w:r>
+          </w:p>
+        </w:tc>
+        <w:tc>
+          <w:tcPr>
+            <w:tcW w:type="dxa" w:w="1500"/>
+            <w:tcBorders>
+              <w:top w:val="single" w:color="D9D0F0" w:sz="4"/>
+              <w:left w:val="single" w:color="D9D0F0" w:sz="4"/>
+              <w:bottom w:val="single" w:color="D9D0F0" w:sz="4"/>
+              <w:right w:val="single" w:color="D9D0F0" w:sz="4"/>
+            </w:tcBorders>
+            <w:shd w:fill="EFE9F9" w:color="auto" w:val="clear"/>
+            <w:tcMar>
+              <w:top w:type="dxa" w:w="100"/>
+              <w:left w:type="dxa" w:w="140"/>
+              <w:bottom w:type="dxa" w:w="100"/>
+              <w:right w:type="dxa" w:w="120"/>
+            </w:tcMar>
+            <w:vAlign w:val="top"/>
+          </w:tcPr>
+          <w:p>
+            <w:pPr>
+              <w:spacing w:after="0" w:before="0" w:line="276"/>
+              <w:jc w:val="left"/>
+            </w:pPr>
+            <w:r>
+              <w:rPr>
+                <w:rFonts w:ascii="Arial" w:cs="Arial" w:eastAsia="Arial" w:hAnsi="Arial"/>
+                <w:b/>
+                <w:bCs/>
+                <w:i w:val="false"/>
+                <w:iCs w:val="false"/>
+                <w:caps/>
+                <w:color w:val="2D1B69"/>
+                <w:spacing w:val="10"/>
+                <w:sz w:val="13"/>
+                <w:szCs w:val="13"/>
+              </w:rPr>
+              <w:t xml:space="preserve">Prowadzący</w:t>
+            </w:r>
+          </w:p>
+        </w:tc>
+        <w:tc>
+          <w:tcPr>
+            <w:tcW w:type="dxa" w:w="1300"/>
+            <w:tcBorders>
+              <w:top w:val="single" w:color="D9D0F0" w:sz="4"/>
+              <w:left w:val="single" w:color="D9D0F0" w:sz="4"/>
+              <w:bottom w:val="single" w:color="D9D0F0" w:sz="4"/>
+              <w:right w:val="single" w:color="D9D0F0" w:sz="4"/>
+            </w:tcBorders>
+            <w:shd w:fill="EFE9F9" w:color="auto" w:val="clear"/>
+            <w:tcMar>
+              <w:top w:type="dxa" w:w="100"/>
+              <w:left w:type="dxa" w:w="140"/>
+              <w:bottom w:type="dxa" w:w="100"/>
+              <w:right w:type="dxa" w:w="120"/>
+            </w:tcMar>
+            <w:vAlign w:val="top"/>
+          </w:tcPr>
+          <w:p>
+            <w:pPr>
+              <w:spacing w:after="0" w:before="0" w:line="276"/>
+              <w:jc w:val="left"/>
+            </w:pPr>
+            <w:r>
+              <w:rPr>
+                <w:rFonts w:ascii="Arial" w:cs="Arial" w:eastAsia="Arial" w:hAnsi="Arial"/>
+                <w:b/>
+                <w:bCs/>
+                <w:i w:val="false"/>
+                <w:iCs w:val="false"/>
+                <w:caps/>
+                <w:color w:val="2D1B69"/>
+                <w:spacing w:val="10"/>
+                <w:sz w:val="13"/>
+                <w:szCs w:val="13"/>
+              </w:rPr>
+              <w:t xml:space="preserve">Forma</w:t>
+            </w:r>
+          </w:p>
+        </w:tc>
+        <w:tc>
+          <w:tcPr>
+            <w:tcW w:type="dxa" w:w="1306"/>
+            <w:tcBorders>
+              <w:top w:val="single" w:color="D9D0F0" w:sz="4"/>
+              <w:left w:val="single" w:color="D9D0F0" w:sz="4"/>
+              <w:bottom w:val="single" w:color="D9D0F0" w:sz="4"/>
+              <w:right w:val="single" w:color="D9D0F0" w:sz="4"/>
+            </w:tcBorders>
+            <w:shd w:fill="EFE9F9" w:color="auto" w:val="clear"/>
+            <w:tcMar>
+              <w:top w:type="dxa" w:w="100"/>
+              <w:left w:type="dxa" w:w="140"/>
+              <w:bottom w:type="dxa" w:w="100"/>
+              <w:right w:type="dxa" w:w="120"/>
+            </w:tcMar>
+            <w:vAlign w:val="top"/>
+          </w:tcPr>
+          <w:p>
+            <w:pPr>
+              <w:spacing w:after="0" w:before="0" w:line="276"/>
+              <w:jc w:val="left"/>
+            </w:pPr>
+            <w:r>
+              <w:rPr>
+                <w:rFonts w:ascii="Arial" w:cs="Arial" w:eastAsia="Arial" w:hAnsi="Arial"/>
+                <w:b/>
+                <w:bCs/>
+                <w:i w:val="false"/>
+                <w:iCs w:val="false"/>
+                <w:caps/>
+                <w:color w:val="2D1B69"/>
+                <w:spacing w:val="10"/>
+                <w:sz w:val="13"/>
+                <w:szCs w:val="13"/>
+              </w:rPr>
+              <w:t xml:space="preserve">Wymiar tyg.</w:t>
+            </w:r>
+          </w:p>
+        </w:tc>
+      </w:tr>
+      <w:tr>
+        <w:trPr>
+          <w:cantSplit/>
+        </w:trPr>
+        <w:tc>
+          <w:tcPr>
+            <w:tcW w:type="dxa" w:w="3000"/>
+            <w:tcBorders>
+              <w:top w:val="single" w:color="E3E1EC" w:sz="4"/>
+              <w:left w:val="single" w:color="E74509" w:sz="24"/>
+              <w:bottom w:val="single" w:color="E3E1EC" w:sz="4"/>
+              <w:right w:val="single" w:color="E3E1EC" w:sz="4"/>
+            </w:tcBorders>
+            <w:tcMar>
+              <w:top w:type="dxa" w:w="70"/>
+              <w:left w:type="dxa" w:w="140"/>
+              <w:bottom w:type="dxa" w:w="70"/>
+              <w:right w:type="dxa" w:w="120"/>
+            </w:tcMar>
+            <w:vAlign w:val="top"/>
+          </w:tcPr>
+          <w:p>
+            <w:pPr>
+              <w:spacing w:after="0" w:before="0" w:line="250"/>
+              <w:jc w:val="left"/>
+            </w:pPr>
+            <w:r>
+              <w:rPr>
+                <w:rFonts w:ascii="Arial" w:cs="Arial" w:eastAsia="Arial" w:hAnsi="Arial"/>
+                <w:b/>
+                <w:bCs/>
+                <w:i w:val="false"/>
+                <w:iCs w:val="false"/>
+                <w:caps w:val="false"/>
+                <w:color w:val="2D1B69"/>
+                <w:sz w:val="15"/>
+                <w:szCs w:val="15"/>
+              </w:rPr>
+              <w:t xml:space="preserve">Rewalidacja: rozwijanie kompetencji komunikacyjnych i wdrażanie AAC</w:t>
+            </w:r>
+          </w:p>
+        </w:tc>
+        <w:tc>
+          <w:tcPr>
+            <w:tcW w:type="dxa" w:w="2800"/>
+            <w:tcBorders>
+              <w:top w:val="single" w:color="E3E1EC" w:sz="4"/>
+              <w:left w:val="single" w:color="E3E1EC" w:sz="4"/>
+              <w:bottom w:val="single" w:color="E3E1EC" w:sz="4"/>
+              <w:right w:val="single" w:color="E3E1EC" w:sz="4"/>
+            </w:tcBorders>
+            <w:tcMar>
+              <w:top w:type="dxa" w:w="70"/>
+              <w:left w:type="dxa" w:w="140"/>
+              <w:bottom w:type="dxa" w:w="70"/>
+              <w:right w:type="dxa" w:w="120"/>
+            </w:tcMar>
+            <w:vAlign w:val="top"/>
+          </w:tcPr>
+          <w:p>
+            <w:pPr>
+              <w:spacing w:after="0" w:before="0" w:line="250"/>
+              <w:jc w:val="left"/>
+            </w:pPr>
+            <w:r>
+              <w:rPr>
+                <w:rFonts w:ascii="Arial" w:cs="Arial" w:eastAsia="Arial" w:hAnsi="Arial"/>
+                <w:b w:val="false"/>
+                <w:bCs w:val="false"/>
+                <w:i w:val="false"/>
+                <w:iCs w:val="false"/>
+                <w:caps w:val="false"/>
+                <w:color w:val="1A1530"/>
+                <w:sz w:val="15"/>
+                <w:szCs w:val="15"/>
+              </w:rPr>
+              <w:t xml:space="preserve">tablice wyboru, skrypty dialogowe, trening komunikacji funkcjonalnej (FCT)</w:t>
+            </w:r>
+          </w:p>
+        </w:tc>
+        <w:tc>
+          <w:tcPr>
+            <w:tcW w:type="dxa" w:w="1500"/>
+            <w:tcBorders>
+              <w:top w:val="single" w:color="E3E1EC" w:sz="4"/>
+              <w:left w:val="single" w:color="E3E1EC" w:sz="4"/>
+              <w:bottom w:val="single" w:color="E3E1EC" w:sz="4"/>
+              <w:right w:val="single" w:color="E3E1EC" w:sz="4"/>
+            </w:tcBorders>
+            <w:tcMar>
+              <w:top w:type="dxa" w:w="70"/>
+              <w:left w:type="dxa" w:w="140"/>
+              <w:bottom w:type="dxa" w:w="70"/>
+              <w:right w:type="dxa" w:w="120"/>
+            </w:tcMar>
+            <w:vAlign w:val="top"/>
+          </w:tcPr>
+          <w:p>
+            <w:pPr>
+              <w:spacing w:after="0" w:before="0" w:line="250"/>
+              <w:jc w:val="left"/>
+            </w:pPr>
+            <w:r>
+              <w:rPr>
+                <w:rFonts w:ascii="Arial" w:cs="Arial" w:eastAsia="Arial" w:hAnsi="Arial"/>
+                <w:b/>
+                <w:bCs/>
+                <w:i w:val="false"/>
+                <w:iCs w:val="false"/>
+                <w:caps w:val="false"/>
+                <w:color w:val="2D1B69"/>
+                <w:sz w:val="15"/>
+                <w:szCs w:val="15"/>
+              </w:rPr>
+              <w:t xml:space="preserve">Pedagog specjalny / neurologopeda</w:t>
+            </w:r>
+          </w:p>
+        </w:tc>
+        <w:tc>
+          <w:tcPr>
+            <w:tcW w:type="dxa" w:w="1300"/>
+            <w:tcBorders>
+              <w:top w:val="single" w:color="E3E1EC" w:sz="4"/>
+              <w:left w:val="single" w:color="E3E1EC" w:sz="4"/>
+              <w:bottom w:val="single" w:color="E3E1EC" w:sz="4"/>
+              <w:right w:val="single" w:color="E3E1EC" w:sz="4"/>
+            </w:tcBorders>
+            <w:tcMar>
+              <w:top w:type="dxa" w:w="70"/>
+              <w:left w:type="dxa" w:w="140"/>
+              <w:bottom w:type="dxa" w:w="70"/>
+              <w:right w:type="dxa" w:w="120"/>
+            </w:tcMar>
+            <w:vAlign w:val="top"/>
+          </w:tcPr>
+          <w:p>
+            <w:pPr>
+              <w:spacing w:after="0" w:before="0" w:line="250"/>
+              <w:jc w:val="left"/>
+            </w:pPr>
+            <w:r>
+              <w:rPr>
+                <w:rFonts w:ascii="Arial" w:cs="Arial" w:eastAsia="Arial" w:hAnsi="Arial"/>
+                <w:b w:val="false"/>
+                <w:bCs w:val="false"/>
+                <w:i w:val="false"/>
+                <w:iCs w:val="false"/>
+                <w:caps w:val="false"/>
+                <w:color w:val="1A1530"/>
+                <w:sz w:val="15"/>
+                <w:szCs w:val="15"/>
+              </w:rPr>
+              <w:t xml:space="preserve">indywidualnie</w:t>
+            </w:r>
+          </w:p>
+        </w:tc>
+        <w:tc>
+          <w:tcPr>
+            <w:tcW w:type="dxa" w:w="1306"/>
+            <w:tcBorders>
+              <w:top w:val="single" w:color="E3E1EC" w:sz="4"/>
+              <w:left w:val="single" w:color="E3E1EC" w:sz="4"/>
+              <w:bottom w:val="single" w:color="E3E1EC" w:sz="4"/>
+              <w:right w:val="single" w:color="E3E1EC" w:sz="4"/>
+            </w:tcBorders>
+            <w:tcMar>
+              <w:top w:type="dxa" w:w="70"/>
+              <w:left w:type="dxa" w:w="140"/>
+              <w:bottom w:type="dxa" w:w="70"/>
+              <w:right w:type="dxa" w:w="120"/>
+            </w:tcMar>
+            <w:vAlign w:val="top"/>
+          </w:tcPr>
+          <w:p>
+            <w:pPr>
+              <w:spacing w:after="0" w:before="0" w:line="250"/>
+              <w:jc w:val="left"/>
+            </w:pPr>
+            <w:r>
+              <w:rPr>
+                <w:rFonts w:ascii="Arial" w:cs="Arial" w:eastAsia="Arial" w:hAnsi="Arial"/>
+                <w:b/>
+                <w:bCs/>
+                <w:i w:val="false"/>
+                <w:iCs w:val="false"/>
+                <w:caps w:val="false"/>
+                <w:color w:val="2D1B69"/>
+                <w:sz w:val="15"/>
+                <w:szCs w:val="15"/>
+              </w:rPr>
+              <w:t xml:space="preserve">1 × 60 min</w:t>
+            </w:r>
+          </w:p>
+          <w:p>
+            <w:pPr>
+              <w:spacing w:after="0" w:before="0" w:line="250"/>
+              <w:jc w:val="left"/>
+            </w:pPr>
+            <w:r>
+              <w:rPr>
+                <w:rFonts w:ascii="Arial" w:cs="Arial" w:eastAsia="Arial" w:hAnsi="Arial"/>
+                <w:b w:val="false"/>
+                <w:bCs w:val="false"/>
+                <w:i w:val="false"/>
+                <w:iCs w:val="false"/>
+                <w:caps w:val="false"/>
+                <w:color w:val="6B6378"/>
+                <w:sz w:val="12"/>
+                <w:szCs w:val="12"/>
+              </w:rPr>
+              <w:t xml:space="preserve">60 min / tydz.</w:t>
+            </w:r>
+          </w:p>
+        </w:tc>
+      </w:tr>
+      <w:tr>
+        <w:trPr>
+          <w:cantSplit/>
+        </w:trPr>
+        <w:tc>
+          <w:tcPr>
+            <w:tcW w:type="dxa" w:w="3000"/>
+            <w:tcBorders>
+              <w:top w:val="single" w:color="E3E1EC" w:sz="4"/>
+              <w:left w:val="single" w:color="E74509" w:sz="24"/>
+              <w:bottom w:val="single" w:color="E3E1EC" w:sz="4"/>
+              <w:right w:val="single" w:color="E3E1EC" w:sz="4"/>
+            </w:tcBorders>
+            <w:tcMar>
+              <w:top w:type="dxa" w:w="70"/>
+              <w:left w:type="dxa" w:w="140"/>
+              <w:bottom w:type="dxa" w:w="70"/>
+              <w:right w:type="dxa" w:w="120"/>
+            </w:tcMar>
+            <w:vAlign w:val="top"/>
+          </w:tcPr>
+          <w:p>
+            <w:pPr>
+              <w:spacing w:after="0" w:before="0" w:line="250"/>
+              <w:jc w:val="left"/>
+            </w:pPr>
+            <w:r>
+              <w:rPr>
+                <w:rFonts w:ascii="Arial" w:cs="Arial" w:eastAsia="Arial" w:hAnsi="Arial"/>
+                <w:b/>
+                <w:bCs/>
+                <w:i w:val="false"/>
+                <w:iCs w:val="false"/>
+                <w:caps w:val="false"/>
+                <w:color w:val="2D1B69"/>
+                <w:sz w:val="15"/>
+                <w:szCs w:val="15"/>
+              </w:rPr>
+              <w:t xml:space="preserve">Rewalidacja: trening umiejętności społecznych i teorii umysłu (ToM)</w:t>
+            </w:r>
+          </w:p>
+        </w:tc>
+        <w:tc>
+          <w:tcPr>
+            <w:tcW w:type="dxa" w:w="2800"/>
+            <w:tcBorders>
+              <w:top w:val="single" w:color="E3E1EC" w:sz="4"/>
+              <w:left w:val="single" w:color="E3E1EC" w:sz="4"/>
+              <w:bottom w:val="single" w:color="E3E1EC" w:sz="4"/>
+              <w:right w:val="single" w:color="E3E1EC" w:sz="4"/>
+            </w:tcBorders>
+            <w:tcMar>
+              <w:top w:type="dxa" w:w="70"/>
+              <w:left w:type="dxa" w:w="140"/>
+              <w:bottom w:type="dxa" w:w="70"/>
+              <w:right w:type="dxa" w:w="120"/>
+            </w:tcMar>
+            <w:vAlign w:val="top"/>
+          </w:tcPr>
+          <w:p>
+            <w:pPr>
+              <w:spacing w:after="0" w:before="0" w:line="250"/>
+              <w:jc w:val="left"/>
+            </w:pPr>
+            <w:r>
+              <w:rPr>
+                <w:rFonts w:ascii="Arial" w:cs="Arial" w:eastAsia="Arial" w:hAnsi="Arial"/>
+                <w:b w:val="false"/>
+                <w:bCs w:val="false"/>
+                <w:i w:val="false"/>
+                <w:iCs w:val="false"/>
+                <w:caps w:val="false"/>
+                <w:color w:val="1A1530"/>
+                <w:sz w:val="15"/>
+                <w:szCs w:val="15"/>
+              </w:rPr>
+              <w:t xml:space="preserve">rozpoznawanie emocji i intencji, historyjki społeczne, naprzemienność</w:t>
+            </w:r>
+          </w:p>
+        </w:tc>
+        <w:tc>
+          <w:tcPr>
+            <w:tcW w:type="dxa" w:w="1500"/>
+            <w:tcBorders>
+              <w:top w:val="single" w:color="E3E1EC" w:sz="4"/>
+              <w:left w:val="single" w:color="E3E1EC" w:sz="4"/>
+              <w:bottom w:val="single" w:color="E3E1EC" w:sz="4"/>
+              <w:right w:val="single" w:color="E3E1EC" w:sz="4"/>
+            </w:tcBorders>
+            <w:tcMar>
+              <w:top w:type="dxa" w:w="70"/>
+              <w:left w:type="dxa" w:w="140"/>
+              <w:bottom w:type="dxa" w:w="70"/>
+              <w:right w:type="dxa" w:w="120"/>
+            </w:tcMar>
+            <w:vAlign w:val="top"/>
+          </w:tcPr>
+          <w:p>
+            <w:pPr>
+              <w:spacing w:after="0" w:before="0" w:line="250"/>
+              <w:jc w:val="left"/>
+            </w:pPr>
+            <w:r>
+              <w:rPr>
+                <w:rFonts w:ascii="Arial" w:cs="Arial" w:eastAsia="Arial" w:hAnsi="Arial"/>
+                <w:b/>
+                <w:bCs/>
+                <w:i w:val="false"/>
+                <w:iCs w:val="false"/>
+                <w:caps w:val="false"/>
+                <w:color w:val="2D1B69"/>
+                <w:sz w:val="15"/>
+                <w:szCs w:val="15"/>
+              </w:rPr>
+              <w:t xml:space="preserve">Pedagog specjalny</w:t>
+            </w:r>
+          </w:p>
+        </w:tc>
+        <w:tc>
+          <w:tcPr>
+            <w:tcW w:type="dxa" w:w="1300"/>
+            <w:tcBorders>
+              <w:top w:val="single" w:color="E3E1EC" w:sz="4"/>
+              <w:left w:val="single" w:color="E3E1EC" w:sz="4"/>
+              <w:bottom w:val="single" w:color="E3E1EC" w:sz="4"/>
+              <w:right w:val="single" w:color="E3E1EC" w:sz="4"/>
+            </w:tcBorders>
+            <w:tcMar>
+              <w:top w:type="dxa" w:w="70"/>
+              <w:left w:type="dxa" w:w="140"/>
+              <w:bottom w:type="dxa" w:w="70"/>
+              <w:right w:type="dxa" w:w="120"/>
+            </w:tcMar>
+            <w:vAlign w:val="top"/>
+          </w:tcPr>
+          <w:p>
+            <w:pPr>
+              <w:spacing w:after="0" w:before="0" w:line="250"/>
+              <w:jc w:val="left"/>
+            </w:pPr>
+            <w:r>
+              <w:rPr>
+                <w:rFonts w:ascii="Arial" w:cs="Arial" w:eastAsia="Arial" w:hAnsi="Arial"/>
+                <w:b w:val="false"/>
+                <w:bCs w:val="false"/>
+                <w:i w:val="false"/>
+                <w:iCs w:val="false"/>
+                <w:caps w:val="false"/>
+                <w:color w:val="1A1530"/>
+                <w:sz w:val="15"/>
+                <w:szCs w:val="15"/>
+              </w:rPr>
+              <w:t xml:space="preserve">indywidualnie / w parze</w:t>
+            </w:r>
+          </w:p>
+        </w:tc>
+        <w:tc>
+          <w:tcPr>
+            <w:tcW w:type="dxa" w:w="1306"/>
+            <w:tcBorders>
+              <w:top w:val="single" w:color="E3E1EC" w:sz="4"/>
+              <w:left w:val="single" w:color="E3E1EC" w:sz="4"/>
+              <w:bottom w:val="single" w:color="E3E1EC" w:sz="4"/>
+              <w:right w:val="single" w:color="E3E1EC" w:sz="4"/>
+            </w:tcBorders>
+            <w:tcMar>
+              <w:top w:type="dxa" w:w="70"/>
+              <w:left w:type="dxa" w:w="140"/>
+              <w:bottom w:type="dxa" w:w="70"/>
+              <w:right w:type="dxa" w:w="120"/>
+            </w:tcMar>
+            <w:vAlign w:val="top"/>
+          </w:tcPr>
+          <w:p>
+            <w:pPr>
+              <w:spacing w:after="0" w:before="0" w:line="250"/>
+              <w:jc w:val="left"/>
+            </w:pPr>
+            <w:r>
+              <w:rPr>
+                <w:rFonts w:ascii="Arial" w:cs="Arial" w:eastAsia="Arial" w:hAnsi="Arial"/>
+                <w:b/>
+                <w:bCs/>
+                <w:i w:val="false"/>
+                <w:iCs w:val="false"/>
+                <w:caps w:val="false"/>
+                <w:color w:val="2D1B69"/>
+                <w:sz w:val="15"/>
+                <w:szCs w:val="15"/>
+              </w:rPr>
+              <w:t xml:space="preserve">1 × 30 min</w:t>
+            </w:r>
+          </w:p>
+          <w:p>
+            <w:pPr>
+              <w:spacing w:after="0" w:before="0" w:line="250"/>
+              <w:jc w:val="left"/>
+            </w:pPr>
+            <w:r>
+              <w:rPr>
+                <w:rFonts w:ascii="Arial" w:cs="Arial" w:eastAsia="Arial" w:hAnsi="Arial"/>
+                <w:b w:val="false"/>
+                <w:bCs w:val="false"/>
+                <w:i w:val="false"/>
+                <w:iCs w:val="false"/>
+                <w:caps w:val="false"/>
+                <w:color w:val="6B6378"/>
+                <w:sz w:val="12"/>
+                <w:szCs w:val="12"/>
+              </w:rPr>
+              <w:t xml:space="preserve">30 min / tydz.</w:t>
+            </w:r>
+          </w:p>
+        </w:tc>
+      </w:tr>
+      <w:tr>
+        <w:trPr>
+          <w:cantSplit/>
+        </w:trPr>
+        <w:tc>
+          <w:tcPr>
+            <w:tcW w:type="dxa" w:w="3000"/>
+            <w:tcBorders>
+              <w:top w:val="single" w:color="E3E1EC" w:sz="4"/>
+              <w:left w:val="single" w:color="E74509" w:sz="24"/>
+              <w:bottom w:val="single" w:color="E3E1EC" w:sz="4"/>
+              <w:right w:val="single" w:color="E3E1EC" w:sz="4"/>
+            </w:tcBorders>
+            <w:tcMar>
+              <w:top w:type="dxa" w:w="70"/>
+              <w:left w:type="dxa" w:w="140"/>
+              <w:bottom w:type="dxa" w:w="70"/>
+              <w:right w:type="dxa" w:w="120"/>
+            </w:tcMar>
+            <w:vAlign w:val="top"/>
+          </w:tcPr>
+          <w:p>
+            <w:pPr>
+              <w:spacing w:after="0" w:before="0" w:line="250"/>
+              <w:jc w:val="left"/>
+            </w:pPr>
+            <w:r>
+              <w:rPr>
+                <w:rFonts w:ascii="Arial" w:cs="Arial" w:eastAsia="Arial" w:hAnsi="Arial"/>
+                <w:b/>
+                <w:bCs/>
+                <w:i w:val="false"/>
+                <w:iCs w:val="false"/>
+                <w:caps w:val="false"/>
+                <w:color w:val="2D1B69"/>
+                <w:sz w:val="15"/>
+                <w:szCs w:val="15"/>
+              </w:rPr>
+              <w:t xml:space="preserve">Rewalidacja: usprawnianie motoryki małej i grafomotoryki</w:t>
+            </w:r>
+          </w:p>
+        </w:tc>
+        <w:tc>
+          <w:tcPr>
+            <w:tcW w:type="dxa" w:w="2800"/>
+            <w:tcBorders>
+              <w:top w:val="single" w:color="E3E1EC" w:sz="4"/>
+              <w:left w:val="single" w:color="E3E1EC" w:sz="4"/>
+              <w:bottom w:val="single" w:color="E3E1EC" w:sz="4"/>
+              <w:right w:val="single" w:color="E3E1EC" w:sz="4"/>
+            </w:tcBorders>
+            <w:tcMar>
+              <w:top w:type="dxa" w:w="70"/>
+              <w:left w:type="dxa" w:w="140"/>
+              <w:bottom w:type="dxa" w:w="70"/>
+              <w:right w:type="dxa" w:w="120"/>
+            </w:tcMar>
+            <w:vAlign w:val="top"/>
+          </w:tcPr>
+          <w:p>
+            <w:pPr>
+              <w:spacing w:after="0" w:before="0" w:line="250"/>
+              <w:jc w:val="left"/>
+            </w:pPr>
+            <w:r>
+              <w:rPr>
+                <w:rFonts w:ascii="Arial" w:cs="Arial" w:eastAsia="Arial" w:hAnsi="Arial"/>
+                <w:b w:val="false"/>
+                <w:bCs w:val="false"/>
+                <w:i w:val="false"/>
+                <w:iCs w:val="false"/>
+                <w:caps w:val="false"/>
+                <w:color w:val="1A1530"/>
+                <w:sz w:val="15"/>
+                <w:szCs w:val="15"/>
+              </w:rPr>
+              <w:t xml:space="preserve">chwyt pisarski, koordynacja wzrokowo-ruchowa, planowanie ruchu</w:t>
+            </w:r>
+          </w:p>
+        </w:tc>
+        <w:tc>
+          <w:tcPr>
+            <w:tcW w:type="dxa" w:w="1500"/>
+            <w:tcBorders>
+              <w:top w:val="single" w:color="E3E1EC" w:sz="4"/>
+              <w:left w:val="single" w:color="E3E1EC" w:sz="4"/>
+              <w:bottom w:val="single" w:color="E3E1EC" w:sz="4"/>
+              <w:right w:val="single" w:color="E3E1EC" w:sz="4"/>
+            </w:tcBorders>
+            <w:tcMar>
+              <w:top w:type="dxa" w:w="70"/>
+              <w:left w:type="dxa" w:w="140"/>
+              <w:bottom w:type="dxa" w:w="70"/>
+              <w:right w:type="dxa" w:w="120"/>
+            </w:tcMar>
+            <w:vAlign w:val="top"/>
+          </w:tcPr>
+          <w:p>
+            <w:pPr>
+              <w:spacing w:after="0" w:before="0" w:line="250"/>
+              <w:jc w:val="left"/>
+            </w:pPr>
+            <w:r>
+              <w:rPr>
+                <w:rFonts w:ascii="Arial" w:cs="Arial" w:eastAsia="Arial" w:hAnsi="Arial"/>
+                <w:b/>
+                <w:bCs/>
+                <w:i w:val="false"/>
+                <w:iCs w:val="false"/>
+                <w:caps w:val="false"/>
+                <w:color w:val="2D1B69"/>
+                <w:sz w:val="15"/>
+                <w:szCs w:val="15"/>
+              </w:rPr>
+              <w:t xml:space="preserve">Terapeuta pedagogiczny</w:t>
+            </w:r>
+          </w:p>
+        </w:tc>
+        <w:tc>
+          <w:tcPr>
+            <w:tcW w:type="dxa" w:w="1300"/>
+            <w:tcBorders>
+              <w:top w:val="single" w:color="E3E1EC" w:sz="4"/>
+              <w:left w:val="single" w:color="E3E1EC" w:sz="4"/>
+              <w:bottom w:val="single" w:color="E3E1EC" w:sz="4"/>
+              <w:right w:val="single" w:color="E3E1EC" w:sz="4"/>
+            </w:tcBorders>
+            <w:tcMar>
+              <w:top w:type="dxa" w:w="70"/>
+              <w:left w:type="dxa" w:w="140"/>
+              <w:bottom w:type="dxa" w:w="70"/>
+              <w:right w:type="dxa" w:w="120"/>
+            </w:tcMar>
+            <w:vAlign w:val="top"/>
+          </w:tcPr>
+          <w:p>
+            <w:pPr>
+              <w:spacing w:after="0" w:before="0" w:line="250"/>
+              <w:jc w:val="left"/>
+            </w:pPr>
+            <w:r>
+              <w:rPr>
+                <w:rFonts w:ascii="Arial" w:cs="Arial" w:eastAsia="Arial" w:hAnsi="Arial"/>
+                <w:b w:val="false"/>
+                <w:bCs w:val="false"/>
+                <w:i w:val="false"/>
+                <w:iCs w:val="false"/>
+                <w:caps w:val="false"/>
+                <w:color w:val="1A1530"/>
+                <w:sz w:val="15"/>
+                <w:szCs w:val="15"/>
+              </w:rPr>
+              <w:t xml:space="preserve">indywidualnie</w:t>
+            </w:r>
+          </w:p>
+        </w:tc>
+        <w:tc>
+          <w:tcPr>
+            <w:tcW w:type="dxa" w:w="1306"/>
+            <w:tcBorders>
+              <w:top w:val="single" w:color="E3E1EC" w:sz="4"/>
+              <w:left w:val="single" w:color="E3E1EC" w:sz="4"/>
+              <w:bottom w:val="single" w:color="E3E1EC" w:sz="4"/>
+              <w:right w:val="single" w:color="E3E1EC" w:sz="4"/>
+            </w:tcBorders>
+            <w:tcMar>
+              <w:top w:type="dxa" w:w="70"/>
+              <w:left w:type="dxa" w:w="140"/>
+              <w:bottom w:type="dxa" w:w="70"/>
+              <w:right w:type="dxa" w:w="120"/>
+            </w:tcMar>
+            <w:vAlign w:val="top"/>
+          </w:tcPr>
+          <w:p>
+            <w:pPr>
+              <w:spacing w:after="0" w:before="0" w:line="250"/>
+              <w:jc w:val="left"/>
+            </w:pPr>
+            <w:r>
+              <w:rPr>
+                <w:rFonts w:ascii="Arial" w:cs="Arial" w:eastAsia="Arial" w:hAnsi="Arial"/>
+                <w:b/>
+                <w:bCs/>
+                <w:i w:val="false"/>
+                <w:iCs w:val="false"/>
+                <w:caps w:val="false"/>
+                <w:color w:val="2D1B69"/>
+                <w:sz w:val="15"/>
+                <w:szCs w:val="15"/>
+              </w:rPr>
+              <w:t xml:space="preserve">1 × 30 min</w:t>
+            </w:r>
+          </w:p>
+          <w:p>
+            <w:pPr>
+              <w:spacing w:after="0" w:before="0" w:line="250"/>
+              <w:jc w:val="left"/>
+            </w:pPr>
+            <w:r>
+              <w:rPr>
+                <w:rFonts w:ascii="Arial" w:cs="Arial" w:eastAsia="Arial" w:hAnsi="Arial"/>
+                <w:b w:val="false"/>
+                <w:bCs w:val="false"/>
+                <w:i w:val="false"/>
+                <w:iCs w:val="false"/>
+                <w:caps w:val="false"/>
+                <w:color w:val="6B6378"/>
+                <w:sz w:val="12"/>
+                <w:szCs w:val="12"/>
+              </w:rPr>
+              <w:t xml:space="preserve">30 min / tydz.</w:t>
+            </w:r>
+          </w:p>
+        </w:tc>
+      </w:tr>
+      <w:tr>
+        <w:trPr>
+          <w:cantSplit/>
+        </w:trPr>
+        <w:tc>
+          <w:tcPr>
+            <w:tcW w:type="dxa" w:w="8600"/>
+            <w:gridSpan w:val="4"/>
+            <w:tcBorders>
+              <w:top w:val="single" w:color="D9D0F0" w:sz="4"/>
+              <w:left w:val="single" w:color="D9D0F0" w:sz="4"/>
+              <w:bottom w:val="single" w:color="D9D0F0" w:sz="4"/>
+              <w:right w:val="single" w:color="D9D0F0" w:sz="4"/>
+            </w:tcBorders>
+            <w:shd w:fill="EFE9F9" w:color="auto" w:val="clear"/>
+            <w:tcMar>
+              <w:top w:type="dxa" w:w="80"/>
+              <w:left w:type="dxa" w:w="140"/>
+              <w:bottom w:type="dxa" w:w="80"/>
+              <w:right w:type="dxa" w:w="120"/>
+            </w:tcMar>
+            <w:vAlign w:val="top"/>
+          </w:tcPr>
+          <w:p>
+            <w:pPr>
+              <w:spacing w:after="0" w:before="0" w:line="250"/>
+              <w:jc w:val="left"/>
+            </w:pPr>
+            <w:r>
+              <w:rPr>
+                <w:rFonts w:ascii="Arial" w:cs="Arial" w:eastAsia="Arial" w:hAnsi="Arial"/>
+                <w:b/>
+                <w:bCs/>
+                <w:i w:val="false"/>
+                <w:iCs w:val="false"/>
+                <w:caps w:val="false"/>
+                <w:color w:val="2D1B69"/>
+                <w:sz w:val="15"/>
+                <w:szCs w:val="15"/>
+              </w:rPr>
+              <w:t xml:space="preserve">Razem zajęcia rewalidacyjne</w:t>
+            </w:r>
+          </w:p>
+        </w:tc>
+        <w:tc>
+          <w:tcPr>
+            <w:tcW w:type="dxa" w:w="1306"/>
+            <w:tcBorders>
+              <w:top w:val="single" w:color="D9D0F0" w:sz="4"/>
+              <w:left w:val="single" w:color="D9D0F0" w:sz="4"/>
+              <w:bottom w:val="single" w:color="D9D0F0" w:sz="4"/>
+              <w:right w:val="single" w:color="D9D0F0" w:sz="4"/>
+            </w:tcBorders>
+            <w:shd w:fill="EFE9F9" w:color="auto" w:val="clear"/>
+            <w:tcMar>
+              <w:top w:type="dxa" w:w="80"/>
+              <w:left w:type="dxa" w:w="140"/>
+              <w:bottom w:type="dxa" w:w="80"/>
+              <w:right w:type="dxa" w:w="120"/>
+            </w:tcMar>
+            <w:vAlign w:val="top"/>
+          </w:tcPr>
+          <w:p>
+            <w:pPr>
+              <w:spacing w:after="0" w:before="0" w:line="250"/>
+              <w:jc w:val="left"/>
+            </w:pPr>
+            <w:r>
+              <w:rPr>
+                <w:rFonts w:ascii="Arial" w:cs="Arial" w:eastAsia="Arial" w:hAnsi="Arial"/>
+                <w:b/>
+                <w:bCs/>
+                <w:i w:val="false"/>
+                <w:iCs w:val="false"/>
+                <w:caps w:val="false"/>
+                <w:color w:val="2D1B69"/>
+                <w:sz w:val="15"/>
+                <w:szCs w:val="15"/>
+              </w:rPr>
+              <w:t xml:space="preserve">2 godz.</w:t>
+            </w:r>
+          </w:p>
+          <w:p>
+            <w:pPr>
+              <w:spacing w:after="0" w:before="0" w:line="250"/>
+              <w:jc w:val="left"/>
+            </w:pPr>
+            <w:r>
+              <w:rPr>
+                <w:rFonts w:ascii="Arial" w:cs="Arial" w:eastAsia="Arial" w:hAnsi="Arial"/>
+                <w:b w:val="false"/>
+                <w:bCs w:val="false"/>
+                <w:i w:val="false"/>
+                <w:iCs w:val="false"/>
+                <w:caps w:val="false"/>
+                <w:color w:val="6B6378"/>
+                <w:sz w:val="12"/>
+                <w:szCs w:val="12"/>
+              </w:rPr>
+              <w:t xml:space="preserve">120 min / tydz.</w:t>
+            </w:r>
+          </w:p>
+        </w:tc>
+      </w:tr>
+    </w:tbl>
+    <w:p>
+      <w:pPr>
+        <w:keepNext/>
+        <w:spacing w:after="100" w:before="200"/>
+      </w:pPr>
+      <w:r>
+        <w:rPr>
+          <w:rFonts w:ascii="Arial" w:cs="Arial" w:eastAsia="Arial" w:hAnsi="Arial"/>
+          <w:b/>
+          <w:bCs/>
+          <w:i w:val="false"/>
+          <w:iCs w:val="false"/>
+          <w:caps w:val="false"/>
+          <w:color w:val="FFFFFF"/>
+          <w:sz w:val="16"/>
+          <w:szCs w:val="16"/>
+          <w:shd w:fill="2D6BB3" w:color="auto" w:val="clear"/>
+        </w:rPr>
+        <w:t xml:space="preserve"> B </w:t>
+      </w:r>
+      <w:r>
+        <w:rPr>
+          <w:rFonts w:ascii="Arial" w:cs="Arial" w:eastAsia="Arial" w:hAnsi="Arial"/>
+          <w:b/>
+          <w:bCs/>
+          <w:i w:val="false"/>
+          <w:iCs w:val="false"/>
+          <w:caps w:val="false"/>
+          <w:color w:val="2D1B69"/>
+          <w:sz w:val="18"/>
+          <w:szCs w:val="18"/>
+        </w:rPr>
+        <w:t xml:space="preserve">   Zajęcia z zakresu pomocy psychologiczno-pedagogicznej</w:t>
+      </w:r>
+      <w:r>
+        <w:rPr>
+          <w:rFonts w:ascii="Arial" w:cs="Arial" w:eastAsia="Arial" w:hAnsi="Arial"/>
+          <w:b w:val="false"/>
+          <w:bCs w:val="false"/>
+          <w:i w:val="false"/>
+          <w:iCs w:val="false"/>
+          <w:caps w:val="false"/>
+          <w:color w:val="6B6378"/>
+          <w:sz w:val="14"/>
+          <w:szCs w:val="14"/>
+        </w:rPr>
+        <w:t xml:space="preserve">   · rodzaj, forma i wymiar czasowy</w:t>
+      </w:r>
+    </w:p>
+    <w:tbl>
+      <w:tblPr>
+        <w:tblW w:type="dxa" w:w="9906"/>
+        <w:tblBorders>
+          <w:top w:val="single" w:color="auto" w:sz="4"/>
+          <w:left w:val="single" w:color="auto" w:sz="4"/>
+          <w:bottom w:val="single" w:color="auto" w:sz="4"/>
+          <w:right w:val="single" w:color="auto" w:sz="4"/>
+          <w:insideH w:val="single" w:color="auto" w:sz="4"/>
+          <w:insideV w:val="single" w:color="auto" w:sz="4"/>
+        </w:tblBorders>
+      </w:tblPr>
+      <w:tblGrid>
+        <w:gridCol w:w="3000"/>
+        <w:gridCol w:w="2800"/>
+        <w:gridCol w:w="1500"/>
+        <w:gridCol w:w="1300"/>
+        <w:gridCol w:w="1306"/>
+      </w:tblGrid>
+      <w:tr>
+        <w:trPr>
+          <w:cantSplit/>
+        </w:trPr>
+        <w:tc>
+          <w:tcPr>
+            <w:tcW w:type="dxa" w:w="3000"/>
+            <w:tcBorders>
+              <w:top w:val="single" w:color="D9D0F0" w:sz="4"/>
+              <w:left w:val="single" w:color="D9D0F0" w:sz="4"/>
+              <w:bottom w:val="single" w:color="D9D0F0" w:sz="4"/>
+              <w:right w:val="single" w:color="D9D0F0" w:sz="4"/>
+            </w:tcBorders>
+            <w:shd w:fill="EFE9F9" w:color="auto" w:val="clear"/>
+            <w:tcMar>
+              <w:top w:type="dxa" w:w="100"/>
+              <w:left w:type="dxa" w:w="140"/>
+              <w:bottom w:type="dxa" w:w="100"/>
+              <w:right w:type="dxa" w:w="120"/>
+            </w:tcMar>
+            <w:vAlign w:val="top"/>
+          </w:tcPr>
+          <w:p>
+            <w:pPr>
+              <w:spacing w:after="0" w:before="0" w:line="276"/>
+              <w:jc w:val="left"/>
+            </w:pPr>
+            <w:r>
+              <w:rPr>
+                <w:rFonts w:ascii="Arial" w:cs="Arial" w:eastAsia="Arial" w:hAnsi="Arial"/>
+                <w:b/>
+                <w:bCs/>
+                <w:i w:val="false"/>
+                <w:iCs w:val="false"/>
+                <w:caps/>
+                <w:color w:val="2D1B69"/>
+                <w:spacing w:val="10"/>
+                <w:sz w:val="13"/>
+                <w:szCs w:val="13"/>
+              </w:rPr>
+              <w:t xml:space="preserve">Rodzaj zajęć</w:t>
+            </w:r>
+          </w:p>
+        </w:tc>
+        <w:tc>
+          <w:tcPr>
+            <w:tcW w:type="dxa" w:w="2800"/>
+            <w:tcBorders>
+              <w:top w:val="single" w:color="D9D0F0" w:sz="4"/>
+              <w:left w:val="single" w:color="D9D0F0" w:sz="4"/>
+              <w:bottom w:val="single" w:color="D9D0F0" w:sz="4"/>
+              <w:right w:val="single" w:color="D9D0F0" w:sz="4"/>
+            </w:tcBorders>
+            <w:shd w:fill="EFE9F9" w:color="auto" w:val="clear"/>
+            <w:tcMar>
+              <w:top w:type="dxa" w:w="100"/>
+              <w:left w:type="dxa" w:w="140"/>
+              <w:bottom w:type="dxa" w:w="100"/>
+              <w:right w:type="dxa" w:w="120"/>
+            </w:tcMar>
+            <w:vAlign w:val="top"/>
+          </w:tcPr>
+          <w:p>
+            <w:pPr>
+              <w:spacing w:after="0" w:before="0" w:line="276"/>
+              <w:jc w:val="left"/>
+            </w:pPr>
+            <w:r>
+              <w:rPr>
+                <w:rFonts w:ascii="Arial" w:cs="Arial" w:eastAsia="Arial" w:hAnsi="Arial"/>
+                <w:b/>
+                <w:bCs/>
+                <w:i w:val="false"/>
+                <w:iCs w:val="false"/>
+                <w:caps/>
+                <w:color w:val="2D1B69"/>
+                <w:spacing w:val="10"/>
+                <w:sz w:val="13"/>
+                <w:szCs w:val="13"/>
+              </w:rPr>
+              <w:t xml:space="preserve">Zakres / cel</w:t>
+            </w:r>
+          </w:p>
+        </w:tc>
+        <w:tc>
+          <w:tcPr>
+            <w:tcW w:type="dxa" w:w="1500"/>
+            <w:tcBorders>
+              <w:top w:val="single" w:color="D9D0F0" w:sz="4"/>
+              <w:left w:val="single" w:color="D9D0F0" w:sz="4"/>
+              <w:bottom w:val="single" w:color="D9D0F0" w:sz="4"/>
+              <w:right w:val="single" w:color="D9D0F0" w:sz="4"/>
+            </w:tcBorders>
+            <w:shd w:fill="EFE9F9" w:color="auto" w:val="clear"/>
+            <w:tcMar>
+              <w:top w:type="dxa" w:w="100"/>
+              <w:left w:type="dxa" w:w="140"/>
+              <w:bottom w:type="dxa" w:w="100"/>
+              <w:right w:type="dxa" w:w="120"/>
+            </w:tcMar>
+            <w:vAlign w:val="top"/>
+          </w:tcPr>
+          <w:p>
+            <w:pPr>
+              <w:spacing w:after="0" w:before="0" w:line="276"/>
+              <w:jc w:val="left"/>
+            </w:pPr>
+            <w:r>
+              <w:rPr>
+                <w:rFonts w:ascii="Arial" w:cs="Arial" w:eastAsia="Arial" w:hAnsi="Arial"/>
+                <w:b/>
+                <w:bCs/>
+                <w:i w:val="false"/>
+                <w:iCs w:val="false"/>
+                <w:caps/>
+                <w:color w:val="2D1B69"/>
+                <w:spacing w:val="10"/>
+                <w:sz w:val="13"/>
+                <w:szCs w:val="13"/>
+              </w:rPr>
+              <w:t xml:space="preserve">Prowadzący</w:t>
+            </w:r>
+          </w:p>
+        </w:tc>
+        <w:tc>
+          <w:tcPr>
+            <w:tcW w:type="dxa" w:w="1300"/>
+            <w:tcBorders>
+              <w:top w:val="single" w:color="D9D0F0" w:sz="4"/>
+              <w:left w:val="single" w:color="D9D0F0" w:sz="4"/>
+              <w:bottom w:val="single" w:color="D9D0F0" w:sz="4"/>
+              <w:right w:val="single" w:color="D9D0F0" w:sz="4"/>
+            </w:tcBorders>
+            <w:shd w:fill="EFE9F9" w:color="auto" w:val="clear"/>
+            <w:tcMar>
+              <w:top w:type="dxa" w:w="100"/>
+              <w:left w:type="dxa" w:w="140"/>
+              <w:bottom w:type="dxa" w:w="100"/>
+              <w:right w:type="dxa" w:w="120"/>
+            </w:tcMar>
+            <w:vAlign w:val="top"/>
+          </w:tcPr>
+          <w:p>
+            <w:pPr>
+              <w:spacing w:after="0" w:before="0" w:line="276"/>
+              <w:jc w:val="left"/>
+            </w:pPr>
+            <w:r>
+              <w:rPr>
+                <w:rFonts w:ascii="Arial" w:cs="Arial" w:eastAsia="Arial" w:hAnsi="Arial"/>
+                <w:b/>
+                <w:bCs/>
+                <w:i w:val="false"/>
+                <w:iCs w:val="false"/>
+                <w:caps/>
+                <w:color w:val="2D1B69"/>
+                <w:spacing w:val="10"/>
+                <w:sz w:val="13"/>
+                <w:szCs w:val="13"/>
+              </w:rPr>
+              <w:t xml:space="preserve">Forma</w:t>
+            </w:r>
+          </w:p>
+        </w:tc>
+        <w:tc>
+          <w:tcPr>
+            <w:tcW w:type="dxa" w:w="1306"/>
+            <w:tcBorders>
+              <w:top w:val="single" w:color="D9D0F0" w:sz="4"/>
+              <w:left w:val="single" w:color="D9D0F0" w:sz="4"/>
+              <w:bottom w:val="single" w:color="D9D0F0" w:sz="4"/>
+              <w:right w:val="single" w:color="D9D0F0" w:sz="4"/>
+            </w:tcBorders>
+            <w:shd w:fill="EFE9F9" w:color="auto" w:val="clear"/>
+            <w:tcMar>
+              <w:top w:type="dxa" w:w="100"/>
+              <w:left w:type="dxa" w:w="140"/>
+              <w:bottom w:type="dxa" w:w="100"/>
+              <w:right w:type="dxa" w:w="120"/>
+            </w:tcMar>
+            <w:vAlign w:val="top"/>
+          </w:tcPr>
+          <w:p>
+            <w:pPr>
+              <w:spacing w:after="0" w:before="0" w:line="276"/>
+              <w:jc w:val="left"/>
+            </w:pPr>
+            <w:r>
+              <w:rPr>
+                <w:rFonts w:ascii="Arial" w:cs="Arial" w:eastAsia="Arial" w:hAnsi="Arial"/>
+                <w:b/>
+                <w:bCs/>
+                <w:i w:val="false"/>
+                <w:iCs w:val="false"/>
+                <w:caps/>
+                <w:color w:val="2D1B69"/>
+                <w:spacing w:val="10"/>
+                <w:sz w:val="13"/>
+                <w:szCs w:val="13"/>
+              </w:rPr>
+              <w:t xml:space="preserve">Wymiar tyg.</w:t>
+            </w:r>
+          </w:p>
+        </w:tc>
+      </w:tr>
+      <w:tr>
+        <w:trPr>
+          <w:cantSplit/>
+        </w:trPr>
+        <w:tc>
+          <w:tcPr>
+            <w:tcW w:type="dxa" w:w="3000"/>
+            <w:tcBorders>
+              <w:top w:val="single" w:color="E3E1EC" w:sz="4"/>
+              <w:left w:val="single" w:color="2D6BB3" w:sz="24"/>
+              <w:bottom w:val="single" w:color="E3E1EC" w:sz="4"/>
+              <w:right w:val="single" w:color="E3E1EC" w:sz="4"/>
+            </w:tcBorders>
+            <w:tcMar>
+              <w:top w:type="dxa" w:w="70"/>
+              <w:left w:type="dxa" w:w="140"/>
+              <w:bottom w:type="dxa" w:w="70"/>
+              <w:right w:type="dxa" w:w="120"/>
+            </w:tcMar>
+            <w:vAlign w:val="top"/>
+          </w:tcPr>
+          <w:p>
+            <w:pPr>
+              <w:spacing w:after="0" w:before="0" w:line="250"/>
+              <w:jc w:val="left"/>
+            </w:pPr>
+            <w:r>
+              <w:rPr>
+                <w:rFonts w:ascii="Arial" w:cs="Arial" w:eastAsia="Arial" w:hAnsi="Arial"/>
+                <w:b/>
+                <w:bCs/>
+                <w:i w:val="false"/>
+                <w:iCs w:val="false"/>
+                <w:caps w:val="false"/>
+                <w:color w:val="2D1B69"/>
+                <w:sz w:val="15"/>
+                <w:szCs w:val="15"/>
+              </w:rPr>
+              <w:t xml:space="preserve">Zajęcia logopedyczne</w:t>
+            </w:r>
+          </w:p>
+        </w:tc>
+        <w:tc>
+          <w:tcPr>
+            <w:tcW w:type="dxa" w:w="2800"/>
+            <w:tcBorders>
+              <w:top w:val="single" w:color="E3E1EC" w:sz="4"/>
+              <w:left w:val="single" w:color="E3E1EC" w:sz="4"/>
+              <w:bottom w:val="single" w:color="E3E1EC" w:sz="4"/>
+              <w:right w:val="single" w:color="E3E1EC" w:sz="4"/>
+            </w:tcBorders>
+            <w:tcMar>
+              <w:top w:type="dxa" w:w="70"/>
+              <w:left w:type="dxa" w:w="140"/>
+              <w:bottom w:type="dxa" w:w="70"/>
+              <w:right w:type="dxa" w:w="120"/>
+            </w:tcMar>
+            <w:vAlign w:val="top"/>
+          </w:tcPr>
+          <w:p>
+            <w:pPr>
+              <w:spacing w:after="0" w:before="0" w:line="250"/>
+              <w:jc w:val="left"/>
+            </w:pPr>
+            <w:r>
+              <w:rPr>
+                <w:rFonts w:ascii="Arial" w:cs="Arial" w:eastAsia="Arial" w:hAnsi="Arial"/>
+                <w:b w:val="false"/>
+                <w:bCs w:val="false"/>
+                <w:i w:val="false"/>
+                <w:iCs w:val="false"/>
+                <w:caps w:val="false"/>
+                <w:color w:val="1A1530"/>
+                <w:sz w:val="15"/>
+                <w:szCs w:val="15"/>
+              </w:rPr>
+              <w:t xml:space="preserve">artykulacja, pragmatyka wypowiedzi, redukcja echolalii, dialog</w:t>
+            </w:r>
+          </w:p>
+        </w:tc>
+        <w:tc>
+          <w:tcPr>
+            <w:tcW w:type="dxa" w:w="1500"/>
+            <w:tcBorders>
+              <w:top w:val="single" w:color="E3E1EC" w:sz="4"/>
+              <w:left w:val="single" w:color="E3E1EC" w:sz="4"/>
+              <w:bottom w:val="single" w:color="E3E1EC" w:sz="4"/>
+              <w:right w:val="single" w:color="E3E1EC" w:sz="4"/>
+            </w:tcBorders>
+            <w:tcMar>
+              <w:top w:type="dxa" w:w="70"/>
+              <w:left w:type="dxa" w:w="140"/>
+              <w:bottom w:type="dxa" w:w="70"/>
+              <w:right w:type="dxa" w:w="120"/>
+            </w:tcMar>
+            <w:vAlign w:val="top"/>
+          </w:tcPr>
+          <w:p>
+            <w:pPr>
+              <w:spacing w:after="0" w:before="0" w:line="250"/>
+              <w:jc w:val="left"/>
+            </w:pPr>
+            <w:r>
+              <w:rPr>
+                <w:rFonts w:ascii="Arial" w:cs="Arial" w:eastAsia="Arial" w:hAnsi="Arial"/>
+                <w:b/>
+                <w:bCs/>
+                <w:i w:val="false"/>
+                <w:iCs w:val="false"/>
+                <w:caps w:val="false"/>
+                <w:color w:val="2D1B69"/>
+                <w:sz w:val="15"/>
+                <w:szCs w:val="15"/>
+              </w:rPr>
+              <w:t xml:space="preserve">Logopeda</w:t>
+            </w:r>
+          </w:p>
+        </w:tc>
+        <w:tc>
+          <w:tcPr>
+            <w:tcW w:type="dxa" w:w="1300"/>
+            <w:tcBorders>
+              <w:top w:val="single" w:color="E3E1EC" w:sz="4"/>
+              <w:left w:val="single" w:color="E3E1EC" w:sz="4"/>
+              <w:bottom w:val="single" w:color="E3E1EC" w:sz="4"/>
+              <w:right w:val="single" w:color="E3E1EC" w:sz="4"/>
+            </w:tcBorders>
+            <w:tcMar>
+              <w:top w:type="dxa" w:w="70"/>
+              <w:left w:type="dxa" w:w="140"/>
+              <w:bottom w:type="dxa" w:w="70"/>
+              <w:right w:type="dxa" w:w="120"/>
+            </w:tcMar>
+            <w:vAlign w:val="top"/>
+          </w:tcPr>
+          <w:p>
+            <w:pPr>
+              <w:spacing w:after="0" w:before="0" w:line="250"/>
+              <w:jc w:val="left"/>
+            </w:pPr>
+            <w:r>
+              <w:rPr>
+                <w:rFonts w:ascii="Arial" w:cs="Arial" w:eastAsia="Arial" w:hAnsi="Arial"/>
+                <w:b w:val="false"/>
+                <w:bCs w:val="false"/>
+                <w:i w:val="false"/>
+                <w:iCs w:val="false"/>
+                <w:caps w:val="false"/>
+                <w:color w:val="1A1530"/>
+                <w:sz w:val="15"/>
+                <w:szCs w:val="15"/>
+              </w:rPr>
+              <w:t xml:space="preserve">indywidualnie</w:t>
+            </w:r>
+          </w:p>
+        </w:tc>
+        <w:tc>
+          <w:tcPr>
+            <w:tcW w:type="dxa" w:w="1306"/>
+            <w:tcBorders>
+              <w:top w:val="single" w:color="E3E1EC" w:sz="4"/>
+              <w:left w:val="single" w:color="E3E1EC" w:sz="4"/>
+              <w:bottom w:val="single" w:color="E3E1EC" w:sz="4"/>
+              <w:right w:val="single" w:color="E3E1EC" w:sz="4"/>
+            </w:tcBorders>
+            <w:tcMar>
+              <w:top w:type="dxa" w:w="70"/>
+              <w:left w:type="dxa" w:w="140"/>
+              <w:bottom w:type="dxa" w:w="70"/>
+              <w:right w:type="dxa" w:w="120"/>
+            </w:tcMar>
+            <w:vAlign w:val="top"/>
+          </w:tcPr>
+          <w:p>
+            <w:pPr>
+              <w:spacing w:after="0" w:before="0" w:line="250"/>
+              <w:jc w:val="left"/>
+            </w:pPr>
+            <w:r>
+              <w:rPr>
+                <w:rFonts w:ascii="Arial" w:cs="Arial" w:eastAsia="Arial" w:hAnsi="Arial"/>
+                <w:b/>
+                <w:bCs/>
+                <w:i w:val="false"/>
+                <w:iCs w:val="false"/>
+                <w:caps w:val="false"/>
+                <w:color w:val="2D1B69"/>
+                <w:sz w:val="15"/>
+                <w:szCs w:val="15"/>
+              </w:rPr>
+              <w:t xml:space="preserve">1 × 45 min</w:t>
+            </w:r>
+          </w:p>
+          <w:p>
+            <w:pPr>
+              <w:spacing w:after="0" w:before="0" w:line="250"/>
+              <w:jc w:val="left"/>
+            </w:pPr>
+            <w:r>
+              <w:rPr>
+                <w:rFonts w:ascii="Arial" w:cs="Arial" w:eastAsia="Arial" w:hAnsi="Arial"/>
+                <w:b w:val="false"/>
+                <w:bCs w:val="false"/>
+                <w:i w:val="false"/>
+                <w:iCs w:val="false"/>
+                <w:caps w:val="false"/>
+                <w:color w:val="6B6378"/>
+                <w:sz w:val="12"/>
+                <w:szCs w:val="12"/>
+              </w:rPr>
+              <w:t xml:space="preserve">45 min / tydz.</w:t>
+            </w:r>
+          </w:p>
+        </w:tc>
+      </w:tr>
+      <w:tr>
+        <w:trPr>
+          <w:cantSplit/>
+        </w:trPr>
+        <w:tc>
+          <w:tcPr>
+            <w:tcW w:type="dxa" w:w="3000"/>
+            <w:tcBorders>
+              <w:top w:val="single" w:color="E3E1EC" w:sz="4"/>
+              <w:left w:val="single" w:color="2D6BB3" w:sz="24"/>
+              <w:bottom w:val="single" w:color="E3E1EC" w:sz="4"/>
+              <w:right w:val="single" w:color="E3E1EC" w:sz="4"/>
+            </w:tcBorders>
+            <w:tcMar>
+              <w:top w:type="dxa" w:w="70"/>
+              <w:left w:type="dxa" w:w="140"/>
+              <w:bottom w:type="dxa" w:w="70"/>
+              <w:right w:type="dxa" w:w="120"/>
+            </w:tcMar>
+            <w:vAlign w:val="top"/>
+          </w:tcPr>
+          <w:p>
+            <w:pPr>
+              <w:spacing w:after="0" w:before="0" w:line="250"/>
+              <w:jc w:val="left"/>
+            </w:pPr>
+            <w:r>
+              <w:rPr>
+                <w:rFonts w:ascii="Arial" w:cs="Arial" w:eastAsia="Arial" w:hAnsi="Arial"/>
+                <w:b/>
+                <w:bCs/>
+                <w:i w:val="false"/>
+                <w:iCs w:val="false"/>
+                <w:caps w:val="false"/>
+                <w:color w:val="2D1B69"/>
+                <w:sz w:val="15"/>
+                <w:szCs w:val="15"/>
+              </w:rPr>
+              <w:t xml:space="preserve">Zajęcia rozwijające kompetencje emocjonalno-społeczne (TUS)</w:t>
+            </w:r>
+          </w:p>
+        </w:tc>
+        <w:tc>
+          <w:tcPr>
+            <w:tcW w:type="dxa" w:w="2800"/>
+            <w:tcBorders>
+              <w:top w:val="single" w:color="E3E1EC" w:sz="4"/>
+              <w:left w:val="single" w:color="E3E1EC" w:sz="4"/>
+              <w:bottom w:val="single" w:color="E3E1EC" w:sz="4"/>
+              <w:right w:val="single" w:color="E3E1EC" w:sz="4"/>
+            </w:tcBorders>
+            <w:tcMar>
+              <w:top w:type="dxa" w:w="70"/>
+              <w:left w:type="dxa" w:w="140"/>
+              <w:bottom w:type="dxa" w:w="70"/>
+              <w:right w:type="dxa" w:w="120"/>
+            </w:tcMar>
+            <w:vAlign w:val="top"/>
+          </w:tcPr>
+          <w:p>
+            <w:pPr>
+              <w:spacing w:after="0" w:before="0" w:line="250"/>
+              <w:jc w:val="left"/>
+            </w:pPr>
+            <w:r>
+              <w:rPr>
+                <w:rFonts w:ascii="Arial" w:cs="Arial" w:eastAsia="Arial" w:hAnsi="Arial"/>
+                <w:b w:val="false"/>
+                <w:bCs w:val="false"/>
+                <w:i w:val="false"/>
+                <w:iCs w:val="false"/>
+                <w:caps w:val="false"/>
+                <w:color w:val="1A1530"/>
+                <w:sz w:val="15"/>
+                <w:szCs w:val="15"/>
+              </w:rPr>
+              <w:t xml:space="preserve">naprzemienność, radzenie sobie z przegraną, odczytywanie sygnałów rówieśników</w:t>
+            </w:r>
+          </w:p>
+        </w:tc>
+        <w:tc>
+          <w:tcPr>
+            <w:tcW w:type="dxa" w:w="1500"/>
+            <w:tcBorders>
+              <w:top w:val="single" w:color="E3E1EC" w:sz="4"/>
+              <w:left w:val="single" w:color="E3E1EC" w:sz="4"/>
+              <w:bottom w:val="single" w:color="E3E1EC" w:sz="4"/>
+              <w:right w:val="single" w:color="E3E1EC" w:sz="4"/>
+            </w:tcBorders>
+            <w:tcMar>
+              <w:top w:type="dxa" w:w="70"/>
+              <w:left w:type="dxa" w:w="140"/>
+              <w:bottom w:type="dxa" w:w="70"/>
+              <w:right w:type="dxa" w:w="120"/>
+            </w:tcMar>
+            <w:vAlign w:val="top"/>
+          </w:tcPr>
+          <w:p>
+            <w:pPr>
+              <w:spacing w:after="0" w:before="0" w:line="250"/>
+              <w:jc w:val="left"/>
+            </w:pPr>
+            <w:r>
+              <w:rPr>
+                <w:rFonts w:ascii="Arial" w:cs="Arial" w:eastAsia="Arial" w:hAnsi="Arial"/>
+                <w:b/>
+                <w:bCs/>
+                <w:i w:val="false"/>
+                <w:iCs w:val="false"/>
+                <w:caps w:val="false"/>
+                <w:color w:val="2D1B69"/>
+                <w:sz w:val="15"/>
+                <w:szCs w:val="15"/>
+              </w:rPr>
+              <w:t xml:space="preserve">Psycholog</w:t>
+            </w:r>
+          </w:p>
+        </w:tc>
+        <w:tc>
+          <w:tcPr>
+            <w:tcW w:type="dxa" w:w="1300"/>
+            <w:tcBorders>
+              <w:top w:val="single" w:color="E3E1EC" w:sz="4"/>
+              <w:left w:val="single" w:color="E3E1EC" w:sz="4"/>
+              <w:bottom w:val="single" w:color="E3E1EC" w:sz="4"/>
+              <w:right w:val="single" w:color="E3E1EC" w:sz="4"/>
+            </w:tcBorders>
+            <w:tcMar>
+              <w:top w:type="dxa" w:w="70"/>
+              <w:left w:type="dxa" w:w="140"/>
+              <w:bottom w:type="dxa" w:w="70"/>
+              <w:right w:type="dxa" w:w="120"/>
+            </w:tcMar>
+            <w:vAlign w:val="top"/>
+          </w:tcPr>
+          <w:p>
+            <w:pPr>
+              <w:spacing w:after="0" w:before="0" w:line="250"/>
+              <w:jc w:val="left"/>
+            </w:pPr>
+            <w:r>
+              <w:rPr>
+                <w:rFonts w:ascii="Arial" w:cs="Arial" w:eastAsia="Arial" w:hAnsi="Arial"/>
+                <w:b w:val="false"/>
+                <w:bCs w:val="false"/>
+                <w:i w:val="false"/>
+                <w:iCs w:val="false"/>
+                <w:caps w:val="false"/>
+                <w:color w:val="1A1530"/>
+                <w:sz w:val="15"/>
+                <w:szCs w:val="15"/>
+              </w:rPr>
+              <w:t xml:space="preserve">grupa 3–5 osób</w:t>
+            </w:r>
+          </w:p>
+        </w:tc>
+        <w:tc>
+          <w:tcPr>
+            <w:tcW w:type="dxa" w:w="1306"/>
+            <w:tcBorders>
+              <w:top w:val="single" w:color="E3E1EC" w:sz="4"/>
+              <w:left w:val="single" w:color="E3E1EC" w:sz="4"/>
+              <w:bottom w:val="single" w:color="E3E1EC" w:sz="4"/>
+              <w:right w:val="single" w:color="E3E1EC" w:sz="4"/>
+            </w:tcBorders>
+            <w:tcMar>
+              <w:top w:type="dxa" w:w="70"/>
+              <w:left w:type="dxa" w:w="140"/>
+              <w:bottom w:type="dxa" w:w="70"/>
+              <w:right w:type="dxa" w:w="120"/>
+            </w:tcMar>
+            <w:vAlign w:val="top"/>
+          </w:tcPr>
+          <w:p>
+            <w:pPr>
+              <w:spacing w:after="0" w:before="0" w:line="250"/>
+              <w:jc w:val="left"/>
+            </w:pPr>
+            <w:r>
+              <w:rPr>
+                <w:rFonts w:ascii="Arial" w:cs="Arial" w:eastAsia="Arial" w:hAnsi="Arial"/>
+                <w:b/>
+                <w:bCs/>
+                <w:i w:val="false"/>
+                <w:iCs w:val="false"/>
+                <w:caps w:val="false"/>
+                <w:color w:val="2D1B69"/>
+                <w:sz w:val="15"/>
+                <w:szCs w:val="15"/>
+              </w:rPr>
+              <w:t xml:space="preserve">1 × 45 min</w:t>
+            </w:r>
+          </w:p>
+          <w:p>
+            <w:pPr>
+              <w:spacing w:after="0" w:before="0" w:line="250"/>
+              <w:jc w:val="left"/>
+            </w:pPr>
+            <w:r>
+              <w:rPr>
+                <w:rFonts w:ascii="Arial" w:cs="Arial" w:eastAsia="Arial" w:hAnsi="Arial"/>
+                <w:b w:val="false"/>
+                <w:bCs w:val="false"/>
+                <w:i w:val="false"/>
+                <w:iCs w:val="false"/>
+                <w:caps w:val="false"/>
+                <w:color w:val="6B6378"/>
+                <w:sz w:val="12"/>
+                <w:szCs w:val="12"/>
+              </w:rPr>
+              <w:t xml:space="preserve">45 min / tydz.</w:t>
+            </w:r>
+          </w:p>
+        </w:tc>
+      </w:tr>
+      <w:tr>
+        <w:trPr>
+          <w:cantSplit/>
+        </w:trPr>
+        <w:tc>
+          <w:tcPr>
+            <w:tcW w:type="dxa" w:w="3000"/>
+            <w:tcBorders>
+              <w:top w:val="single" w:color="E3E1EC" w:sz="4"/>
+              <w:left w:val="single" w:color="2D6BB3" w:sz="24"/>
+              <w:bottom w:val="single" w:color="E3E1EC" w:sz="4"/>
+              <w:right w:val="single" w:color="E3E1EC" w:sz="4"/>
+            </w:tcBorders>
+            <w:tcMar>
+              <w:top w:type="dxa" w:w="70"/>
+              <w:left w:type="dxa" w:w="140"/>
+              <w:bottom w:type="dxa" w:w="70"/>
+              <w:right w:type="dxa" w:w="120"/>
+            </w:tcMar>
+            <w:vAlign w:val="top"/>
+          </w:tcPr>
+          <w:p>
+            <w:pPr>
+              <w:spacing w:after="0" w:before="0" w:line="250"/>
+              <w:jc w:val="left"/>
+            </w:pPr>
+            <w:r>
+              <w:rPr>
+                <w:rFonts w:ascii="Arial" w:cs="Arial" w:eastAsia="Arial" w:hAnsi="Arial"/>
+                <w:b/>
+                <w:bCs/>
+                <w:i w:val="false"/>
+                <w:iCs w:val="false"/>
+                <w:caps w:val="false"/>
+                <w:color w:val="2D1B69"/>
+                <w:sz w:val="15"/>
+                <w:szCs w:val="15"/>
+              </w:rPr>
+              <w:t xml:space="preserve">Zajęcia korekcyjno-kompensacyjne</w:t>
+            </w:r>
+          </w:p>
+        </w:tc>
+        <w:tc>
+          <w:tcPr>
+            <w:tcW w:type="dxa" w:w="2800"/>
+            <w:tcBorders>
+              <w:top w:val="single" w:color="E3E1EC" w:sz="4"/>
+              <w:left w:val="single" w:color="E3E1EC" w:sz="4"/>
+              <w:bottom w:val="single" w:color="E3E1EC" w:sz="4"/>
+              <w:right w:val="single" w:color="E3E1EC" w:sz="4"/>
+            </w:tcBorders>
+            <w:tcMar>
+              <w:top w:type="dxa" w:w="70"/>
+              <w:left w:type="dxa" w:w="140"/>
+              <w:bottom w:type="dxa" w:w="70"/>
+              <w:right w:type="dxa" w:w="120"/>
+            </w:tcMar>
+            <w:vAlign w:val="top"/>
+          </w:tcPr>
+          <w:p>
+            <w:pPr>
+              <w:spacing w:after="0" w:before="0" w:line="250"/>
+              <w:jc w:val="left"/>
+            </w:pPr>
+            <w:r>
+              <w:rPr>
+                <w:rFonts w:ascii="Arial" w:cs="Arial" w:eastAsia="Arial" w:hAnsi="Arial"/>
+                <w:b w:val="false"/>
+                <w:bCs w:val="false"/>
+                <w:i w:val="false"/>
+                <w:iCs w:val="false"/>
+                <w:caps w:val="false"/>
+                <w:color w:val="1A1530"/>
+                <w:sz w:val="15"/>
+                <w:szCs w:val="15"/>
+              </w:rPr>
+              <w:t xml:space="preserve">uwaga, pamięć, uogólnianie wiedzy, organizacja pracy</w:t>
+            </w:r>
+          </w:p>
+        </w:tc>
+        <w:tc>
+          <w:tcPr>
+            <w:tcW w:type="dxa" w:w="1500"/>
+            <w:tcBorders>
+              <w:top w:val="single" w:color="E3E1EC" w:sz="4"/>
+              <w:left w:val="single" w:color="E3E1EC" w:sz="4"/>
+              <w:bottom w:val="single" w:color="E3E1EC" w:sz="4"/>
+              <w:right w:val="single" w:color="E3E1EC" w:sz="4"/>
+            </w:tcBorders>
+            <w:tcMar>
+              <w:top w:type="dxa" w:w="70"/>
+              <w:left w:type="dxa" w:w="140"/>
+              <w:bottom w:type="dxa" w:w="70"/>
+              <w:right w:type="dxa" w:w="120"/>
+            </w:tcMar>
+            <w:vAlign w:val="top"/>
+          </w:tcPr>
+          <w:p>
+            <w:pPr>
+              <w:spacing w:after="0" w:before="0" w:line="250"/>
+              <w:jc w:val="left"/>
+            </w:pPr>
+            <w:r>
+              <w:rPr>
+                <w:rFonts w:ascii="Arial" w:cs="Arial" w:eastAsia="Arial" w:hAnsi="Arial"/>
+                <w:b/>
+                <w:bCs/>
+                <w:i w:val="false"/>
+                <w:iCs w:val="false"/>
+                <w:caps w:val="false"/>
+                <w:color w:val="2D1B69"/>
+                <w:sz w:val="15"/>
+                <w:szCs w:val="15"/>
+              </w:rPr>
+              <w:t xml:space="preserve">Terapeuta pedagogiczny</w:t>
+            </w:r>
+          </w:p>
+        </w:tc>
+        <w:tc>
+          <w:tcPr>
+            <w:tcW w:type="dxa" w:w="1300"/>
+            <w:tcBorders>
+              <w:top w:val="single" w:color="E3E1EC" w:sz="4"/>
+              <w:left w:val="single" w:color="E3E1EC" w:sz="4"/>
+              <w:bottom w:val="single" w:color="E3E1EC" w:sz="4"/>
+              <w:right w:val="single" w:color="E3E1EC" w:sz="4"/>
+            </w:tcBorders>
+            <w:tcMar>
+              <w:top w:type="dxa" w:w="70"/>
+              <w:left w:type="dxa" w:w="140"/>
+              <w:bottom w:type="dxa" w:w="70"/>
+              <w:right w:type="dxa" w:w="120"/>
+            </w:tcMar>
+            <w:vAlign w:val="top"/>
+          </w:tcPr>
+          <w:p>
+            <w:pPr>
+              <w:spacing w:after="0" w:before="0" w:line="250"/>
+              <w:jc w:val="left"/>
+            </w:pPr>
+            <w:r>
+              <w:rPr>
+                <w:rFonts w:ascii="Arial" w:cs="Arial" w:eastAsia="Arial" w:hAnsi="Arial"/>
+                <w:b w:val="false"/>
+                <w:bCs w:val="false"/>
+                <w:i w:val="false"/>
+                <w:iCs w:val="false"/>
+                <w:caps w:val="false"/>
+                <w:color w:val="1A1530"/>
+                <w:sz w:val="15"/>
+                <w:szCs w:val="15"/>
+              </w:rPr>
+              <w:t xml:space="preserve">grupa do 5 osób</w:t>
+            </w:r>
+          </w:p>
+        </w:tc>
+        <w:tc>
+          <w:tcPr>
+            <w:tcW w:type="dxa" w:w="1306"/>
+            <w:tcBorders>
+              <w:top w:val="single" w:color="E3E1EC" w:sz="4"/>
+              <w:left w:val="single" w:color="E3E1EC" w:sz="4"/>
+              <w:bottom w:val="single" w:color="E3E1EC" w:sz="4"/>
+              <w:right w:val="single" w:color="E3E1EC" w:sz="4"/>
+            </w:tcBorders>
+            <w:tcMar>
+              <w:top w:type="dxa" w:w="70"/>
+              <w:left w:type="dxa" w:w="140"/>
+              <w:bottom w:type="dxa" w:w="70"/>
+              <w:right w:type="dxa" w:w="120"/>
+            </w:tcMar>
+            <w:vAlign w:val="top"/>
+          </w:tcPr>
+          <w:p>
+            <w:pPr>
+              <w:spacing w:after="0" w:before="0" w:line="250"/>
+              <w:jc w:val="left"/>
+            </w:pPr>
+            <w:r>
+              <w:rPr>
+                <w:rFonts w:ascii="Arial" w:cs="Arial" w:eastAsia="Arial" w:hAnsi="Arial"/>
+                <w:b/>
+                <w:bCs/>
+                <w:i w:val="false"/>
+                <w:iCs w:val="false"/>
+                <w:caps w:val="false"/>
+                <w:color w:val="2D1B69"/>
+                <w:sz w:val="15"/>
+                <w:szCs w:val="15"/>
+              </w:rPr>
+              <w:t xml:space="preserve">1 × 45 min</w:t>
+            </w:r>
+          </w:p>
+          <w:p>
+            <w:pPr>
+              <w:spacing w:after="0" w:before="0" w:line="250"/>
+              <w:jc w:val="left"/>
+            </w:pPr>
+            <w:r>
+              <w:rPr>
+                <w:rFonts w:ascii="Arial" w:cs="Arial" w:eastAsia="Arial" w:hAnsi="Arial"/>
+                <w:b w:val="false"/>
+                <w:bCs w:val="false"/>
+                <w:i w:val="false"/>
+                <w:iCs w:val="false"/>
+                <w:caps w:val="false"/>
+                <w:color w:val="6B6378"/>
+                <w:sz w:val="12"/>
+                <w:szCs w:val="12"/>
+              </w:rPr>
+              <w:t xml:space="preserve">45 min / tydz.</w:t>
+            </w:r>
+          </w:p>
+        </w:tc>
+      </w:tr>
+      <w:tr>
+        <w:trPr>
+          <w:cantSplit/>
+        </w:trPr>
+        <w:tc>
+          <w:tcPr>
+            <w:tcW w:type="dxa" w:w="3000"/>
+            <w:tcBorders>
+              <w:top w:val="single" w:color="E3E1EC" w:sz="4"/>
+              <w:left w:val="single" w:color="2D6BB3" w:sz="24"/>
+              <w:bottom w:val="single" w:color="E3E1EC" w:sz="4"/>
+              <w:right w:val="single" w:color="E3E1EC" w:sz="4"/>
+            </w:tcBorders>
+            <w:tcMar>
+              <w:top w:type="dxa" w:w="70"/>
+              <w:left w:type="dxa" w:w="140"/>
+              <w:bottom w:type="dxa" w:w="70"/>
+              <w:right w:type="dxa" w:w="120"/>
+            </w:tcMar>
+            <w:vAlign w:val="top"/>
+          </w:tcPr>
+          <w:p>
+            <w:pPr>
+              <w:spacing w:after="0" w:before="0" w:line="250"/>
+              <w:jc w:val="left"/>
+            </w:pPr>
+            <w:r>
+              <w:rPr>
+                <w:rFonts w:ascii="Arial" w:cs="Arial" w:eastAsia="Arial" w:hAnsi="Arial"/>
+                <w:b/>
+                <w:bCs/>
+                <w:i w:val="false"/>
+                <w:iCs w:val="false"/>
+                <w:caps w:val="false"/>
+                <w:color w:val="2D1B69"/>
+                <w:sz w:val="15"/>
+                <w:szCs w:val="15"/>
+              </w:rPr>
+              <w:t xml:space="preserve">Zajęcia specjalistyczne: integracja sensoryczna (SI)</w:t>
+            </w:r>
+          </w:p>
+        </w:tc>
+        <w:tc>
+          <w:tcPr>
+            <w:tcW w:type="dxa" w:w="2800"/>
+            <w:tcBorders>
+              <w:top w:val="single" w:color="E3E1EC" w:sz="4"/>
+              <w:left w:val="single" w:color="E3E1EC" w:sz="4"/>
+              <w:bottom w:val="single" w:color="E3E1EC" w:sz="4"/>
+              <w:right w:val="single" w:color="E3E1EC" w:sz="4"/>
+            </w:tcBorders>
+            <w:tcMar>
+              <w:top w:type="dxa" w:w="70"/>
+              <w:left w:type="dxa" w:w="140"/>
+              <w:bottom w:type="dxa" w:w="70"/>
+              <w:right w:type="dxa" w:w="120"/>
+            </w:tcMar>
+            <w:vAlign w:val="top"/>
+          </w:tcPr>
+          <w:p>
+            <w:pPr>
+              <w:spacing w:after="0" w:before="0" w:line="250"/>
+              <w:jc w:val="left"/>
+            </w:pPr>
+            <w:r>
+              <w:rPr>
+                <w:rFonts w:ascii="Arial" w:cs="Arial" w:eastAsia="Arial" w:hAnsi="Arial"/>
+                <w:b w:val="false"/>
+                <w:bCs w:val="false"/>
+                <w:i w:val="false"/>
+                <w:iCs w:val="false"/>
+                <w:caps w:val="false"/>
+                <w:color w:val="1A1530"/>
+                <w:sz w:val="15"/>
+                <w:szCs w:val="15"/>
+              </w:rPr>
+              <w:t xml:space="preserve">modulacja sensoryczna, dieta sensoryczna, przerwy sensoryczne</w:t>
+            </w:r>
+          </w:p>
+        </w:tc>
+        <w:tc>
+          <w:tcPr>
+            <w:tcW w:type="dxa" w:w="1500"/>
+            <w:tcBorders>
+              <w:top w:val="single" w:color="E3E1EC" w:sz="4"/>
+              <w:left w:val="single" w:color="E3E1EC" w:sz="4"/>
+              <w:bottom w:val="single" w:color="E3E1EC" w:sz="4"/>
+              <w:right w:val="single" w:color="E3E1EC" w:sz="4"/>
+            </w:tcBorders>
+            <w:tcMar>
+              <w:top w:type="dxa" w:w="70"/>
+              <w:left w:type="dxa" w:w="140"/>
+              <w:bottom w:type="dxa" w:w="70"/>
+              <w:right w:type="dxa" w:w="120"/>
+            </w:tcMar>
+            <w:vAlign w:val="top"/>
+          </w:tcPr>
+          <w:p>
+            <w:pPr>
+              <w:spacing w:after="0" w:before="0" w:line="250"/>
+              <w:jc w:val="left"/>
+            </w:pPr>
+            <w:r>
+              <w:rPr>
+                <w:rFonts w:ascii="Arial" w:cs="Arial" w:eastAsia="Arial" w:hAnsi="Arial"/>
+                <w:b/>
+                <w:bCs/>
+                <w:i w:val="false"/>
+                <w:iCs w:val="false"/>
+                <w:caps w:val="false"/>
+                <w:color w:val="2D1B69"/>
+                <w:sz w:val="15"/>
+                <w:szCs w:val="15"/>
+              </w:rPr>
+              <w:t xml:space="preserve">Terapeuta SI</w:t>
+            </w:r>
+          </w:p>
+        </w:tc>
+        <w:tc>
+          <w:tcPr>
+            <w:tcW w:type="dxa" w:w="1300"/>
+            <w:tcBorders>
+              <w:top w:val="single" w:color="E3E1EC" w:sz="4"/>
+              <w:left w:val="single" w:color="E3E1EC" w:sz="4"/>
+              <w:bottom w:val="single" w:color="E3E1EC" w:sz="4"/>
+              <w:right w:val="single" w:color="E3E1EC" w:sz="4"/>
+            </w:tcBorders>
+            <w:tcMar>
+              <w:top w:type="dxa" w:w="70"/>
+              <w:left w:type="dxa" w:w="140"/>
+              <w:bottom w:type="dxa" w:w="70"/>
+              <w:right w:type="dxa" w:w="120"/>
+            </w:tcMar>
+            <w:vAlign w:val="top"/>
+          </w:tcPr>
+          <w:p>
+            <w:pPr>
+              <w:spacing w:after="0" w:before="0" w:line="250"/>
+              <w:jc w:val="left"/>
+            </w:pPr>
+            <w:r>
+              <w:rPr>
+                <w:rFonts w:ascii="Arial" w:cs="Arial" w:eastAsia="Arial" w:hAnsi="Arial"/>
+                <w:b w:val="false"/>
+                <w:bCs w:val="false"/>
+                <w:i w:val="false"/>
+                <w:iCs w:val="false"/>
+                <w:caps w:val="false"/>
+                <w:color w:val="1A1530"/>
+                <w:sz w:val="15"/>
+                <w:szCs w:val="15"/>
+              </w:rPr>
+              <w:t xml:space="preserve">indywidualnie</w:t>
+            </w:r>
+          </w:p>
+        </w:tc>
+        <w:tc>
+          <w:tcPr>
+            <w:tcW w:type="dxa" w:w="1306"/>
+            <w:tcBorders>
+              <w:top w:val="single" w:color="E3E1EC" w:sz="4"/>
+              <w:left w:val="single" w:color="E3E1EC" w:sz="4"/>
+              <w:bottom w:val="single" w:color="E3E1EC" w:sz="4"/>
+              <w:right w:val="single" w:color="E3E1EC" w:sz="4"/>
+            </w:tcBorders>
+            <w:tcMar>
+              <w:top w:type="dxa" w:w="70"/>
+              <w:left w:type="dxa" w:w="140"/>
+              <w:bottom w:type="dxa" w:w="70"/>
+              <w:right w:type="dxa" w:w="120"/>
+            </w:tcMar>
+            <w:vAlign w:val="top"/>
+          </w:tcPr>
+          <w:p>
+            <w:pPr>
+              <w:spacing w:after="0" w:before="0" w:line="250"/>
+              <w:jc w:val="left"/>
+            </w:pPr>
+            <w:r>
+              <w:rPr>
+                <w:rFonts w:ascii="Arial" w:cs="Arial" w:eastAsia="Arial" w:hAnsi="Arial"/>
+                <w:b/>
+                <w:bCs/>
+                <w:i w:val="false"/>
+                <w:iCs w:val="false"/>
+                <w:caps w:val="false"/>
+                <w:color w:val="2D1B69"/>
+                <w:sz w:val="15"/>
+                <w:szCs w:val="15"/>
+              </w:rPr>
+              <w:t xml:space="preserve">1 × 45 min</w:t>
+            </w:r>
+          </w:p>
+          <w:p>
+            <w:pPr>
+              <w:spacing w:after="0" w:before="0" w:line="250"/>
+              <w:jc w:val="left"/>
+            </w:pPr>
+            <w:r>
+              <w:rPr>
+                <w:rFonts w:ascii="Arial" w:cs="Arial" w:eastAsia="Arial" w:hAnsi="Arial"/>
+                <w:b w:val="false"/>
+                <w:bCs w:val="false"/>
+                <w:i w:val="false"/>
+                <w:iCs w:val="false"/>
+                <w:caps w:val="false"/>
+                <w:color w:val="6B6378"/>
+                <w:sz w:val="12"/>
+                <w:szCs w:val="12"/>
+              </w:rPr>
+              <w:t xml:space="preserve">45 min / tydz.</w:t>
+            </w:r>
+          </w:p>
+        </w:tc>
+      </w:tr>
+      <w:tr>
+        <w:trPr>
+          <w:cantSplit/>
+        </w:trPr>
+        <w:tc>
+          <w:tcPr>
+            <w:tcW w:type="dxa" w:w="3000"/>
+            <w:tcBorders>
+              <w:top w:val="single" w:color="E3E1EC" w:sz="4"/>
+              <w:left w:val="single" w:color="2D6BB3" w:sz="24"/>
+              <w:bottom w:val="single" w:color="E3E1EC" w:sz="4"/>
+              <w:right w:val="single" w:color="E3E1EC" w:sz="4"/>
+            </w:tcBorders>
+            <w:tcMar>
+              <w:top w:type="dxa" w:w="70"/>
+              <w:left w:type="dxa" w:w="140"/>
+              <w:bottom w:type="dxa" w:w="70"/>
+              <w:right w:type="dxa" w:w="120"/>
+            </w:tcMar>
+            <w:vAlign w:val="top"/>
+          </w:tcPr>
+          <w:p>
+            <w:pPr>
+              <w:spacing w:after="0" w:before="0" w:line="250"/>
+              <w:jc w:val="left"/>
+            </w:pPr>
+            <w:r>
+              <w:rPr>
+                <w:rFonts w:ascii="Arial" w:cs="Arial" w:eastAsia="Arial" w:hAnsi="Arial"/>
+                <w:b/>
+                <w:bCs/>
+                <w:i w:val="false"/>
+                <w:iCs w:val="false"/>
+                <w:caps w:val="false"/>
+                <w:color w:val="2D1B69"/>
+                <w:sz w:val="15"/>
+                <w:szCs w:val="15"/>
+              </w:rPr>
+              <w:t xml:space="preserve">Porady i konsultacje dla rodziców</w:t>
+            </w:r>
+          </w:p>
+        </w:tc>
+        <w:tc>
+          <w:tcPr>
+            <w:tcW w:type="dxa" w:w="2800"/>
+            <w:tcBorders>
+              <w:top w:val="single" w:color="E3E1EC" w:sz="4"/>
+              <w:left w:val="single" w:color="E3E1EC" w:sz="4"/>
+              <w:bottom w:val="single" w:color="E3E1EC" w:sz="4"/>
+              <w:right w:val="single" w:color="E3E1EC" w:sz="4"/>
+            </w:tcBorders>
+            <w:tcMar>
+              <w:top w:type="dxa" w:w="70"/>
+              <w:left w:type="dxa" w:w="140"/>
+              <w:bottom w:type="dxa" w:w="70"/>
+              <w:right w:type="dxa" w:w="120"/>
+            </w:tcMar>
+            <w:vAlign w:val="top"/>
+          </w:tcPr>
+          <w:p>
+            <w:pPr>
+              <w:spacing w:after="0" w:before="0" w:line="250"/>
+              <w:jc w:val="left"/>
+            </w:pPr>
+            <w:r>
+              <w:rPr>
+                <w:rFonts w:ascii="Arial" w:cs="Arial" w:eastAsia="Arial" w:hAnsi="Arial"/>
+                <w:b w:val="false"/>
+                <w:bCs w:val="false"/>
+                <w:i w:val="false"/>
+                <w:iCs w:val="false"/>
+                <w:caps w:val="false"/>
+                <w:color w:val="1A1530"/>
+                <w:sz w:val="15"/>
+                <w:szCs w:val="15"/>
+              </w:rPr>
+              <w:t xml:space="preserve">ujednolicenie oddziaływań dom–placówka, zeszyt korespondencji</w:t>
+            </w:r>
+          </w:p>
+        </w:tc>
+        <w:tc>
+          <w:tcPr>
+            <w:tcW w:type="dxa" w:w="1500"/>
+            <w:tcBorders>
+              <w:top w:val="single" w:color="E3E1EC" w:sz="4"/>
+              <w:left w:val="single" w:color="E3E1EC" w:sz="4"/>
+              <w:bottom w:val="single" w:color="E3E1EC" w:sz="4"/>
+              <w:right w:val="single" w:color="E3E1EC" w:sz="4"/>
+            </w:tcBorders>
+            <w:tcMar>
+              <w:top w:type="dxa" w:w="70"/>
+              <w:left w:type="dxa" w:w="140"/>
+              <w:bottom w:type="dxa" w:w="70"/>
+              <w:right w:type="dxa" w:w="120"/>
+            </w:tcMar>
+            <w:vAlign w:val="top"/>
+          </w:tcPr>
+          <w:p>
+            <w:pPr>
+              <w:spacing w:after="0" w:before="0" w:line="250"/>
+              <w:jc w:val="left"/>
+            </w:pPr>
+            <w:r>
+              <w:rPr>
+                <w:rFonts w:ascii="Arial" w:cs="Arial" w:eastAsia="Arial" w:hAnsi="Arial"/>
+                <w:b/>
+                <w:bCs/>
+                <w:i w:val="false"/>
+                <w:iCs w:val="false"/>
+                <w:caps w:val="false"/>
+                <w:color w:val="2D1B69"/>
+                <w:sz w:val="15"/>
+                <w:szCs w:val="15"/>
+              </w:rPr>
+              <w:t xml:space="preserve">Psycholog / koordynator</w:t>
+            </w:r>
+          </w:p>
+        </w:tc>
+        <w:tc>
+          <w:tcPr>
+            <w:tcW w:type="dxa" w:w="1300"/>
+            <w:tcBorders>
+              <w:top w:val="single" w:color="E3E1EC" w:sz="4"/>
+              <w:left w:val="single" w:color="E3E1EC" w:sz="4"/>
+              <w:bottom w:val="single" w:color="E3E1EC" w:sz="4"/>
+              <w:right w:val="single" w:color="E3E1EC" w:sz="4"/>
+            </w:tcBorders>
+            <w:tcMar>
+              <w:top w:type="dxa" w:w="70"/>
+              <w:left w:type="dxa" w:w="140"/>
+              <w:bottom w:type="dxa" w:w="70"/>
+              <w:right w:type="dxa" w:w="120"/>
+            </w:tcMar>
+            <w:vAlign w:val="top"/>
+          </w:tcPr>
+          <w:p>
+            <w:pPr>
+              <w:spacing w:after="0" w:before="0" w:line="250"/>
+              <w:jc w:val="left"/>
+            </w:pPr>
+            <w:r>
+              <w:rPr>
+                <w:rFonts w:ascii="Arial" w:cs="Arial" w:eastAsia="Arial" w:hAnsi="Arial"/>
+                <w:b w:val="false"/>
+                <w:bCs w:val="false"/>
+                <w:i w:val="false"/>
+                <w:iCs w:val="false"/>
+                <w:caps w:val="false"/>
+                <w:color w:val="1A1530"/>
+                <w:sz w:val="15"/>
+                <w:szCs w:val="15"/>
+              </w:rPr>
+              <w:t xml:space="preserve">rodzice</w:t>
+            </w:r>
+          </w:p>
+        </w:tc>
+        <w:tc>
+          <w:tcPr>
+            <w:tcW w:type="dxa" w:w="1306"/>
+            <w:tcBorders>
+              <w:top w:val="single" w:color="E3E1EC" w:sz="4"/>
+              <w:left w:val="single" w:color="E3E1EC" w:sz="4"/>
+              <w:bottom w:val="single" w:color="E3E1EC" w:sz="4"/>
+              <w:right w:val="single" w:color="E3E1EC" w:sz="4"/>
+            </w:tcBorders>
+            <w:tcMar>
+              <w:top w:type="dxa" w:w="70"/>
+              <w:left w:type="dxa" w:w="140"/>
+              <w:bottom w:type="dxa" w:w="70"/>
+              <w:right w:type="dxa" w:w="120"/>
+            </w:tcMar>
+            <w:vAlign w:val="top"/>
+          </w:tcPr>
+          <w:p>
+            <w:pPr>
+              <w:spacing w:after="0" w:before="0" w:line="250"/>
+              <w:jc w:val="left"/>
+            </w:pPr>
+            <w:r>
+              <w:rPr>
+                <w:rFonts w:ascii="Arial" w:cs="Arial" w:eastAsia="Arial" w:hAnsi="Arial"/>
+                <w:b/>
+                <w:bCs/>
+                <w:i w:val="false"/>
+                <w:iCs w:val="false"/>
+                <w:caps w:val="false"/>
+                <w:color w:val="2D1B69"/>
+                <w:sz w:val="15"/>
+                <w:szCs w:val="15"/>
+              </w:rPr>
+              <w:t xml:space="preserve">1 × 30 min</w:t>
+            </w:r>
+          </w:p>
+          <w:p>
+            <w:pPr>
+              <w:spacing w:after="0" w:before="0" w:line="250"/>
+              <w:jc w:val="left"/>
+            </w:pPr>
+            <w:r>
+              <w:rPr>
+                <w:rFonts w:ascii="Arial" w:cs="Arial" w:eastAsia="Arial" w:hAnsi="Arial"/>
+                <w:b w:val="false"/>
+                <w:bCs w:val="false"/>
+                <w:i w:val="false"/>
+                <w:iCs w:val="false"/>
+                <w:caps w:val="false"/>
+                <w:color w:val="6B6378"/>
+                <w:sz w:val="12"/>
+                <w:szCs w:val="12"/>
+              </w:rPr>
+              <w:t xml:space="preserve">30 min / tydz.</w:t>
+            </w:r>
+          </w:p>
+        </w:tc>
+      </w:tr>
+      <w:tr>
+        <w:trPr>
+          <w:cantSplit/>
+        </w:trPr>
+        <w:tc>
+          <w:tcPr>
+            <w:tcW w:type="dxa" w:w="8600"/>
+            <w:gridSpan w:val="4"/>
+            <w:tcBorders>
+              <w:top w:val="single" w:color="D9D0F0" w:sz="4"/>
+              <w:left w:val="single" w:color="D9D0F0" w:sz="4"/>
+              <w:bottom w:val="single" w:color="D9D0F0" w:sz="4"/>
+              <w:right w:val="single" w:color="D9D0F0" w:sz="4"/>
+            </w:tcBorders>
+            <w:shd w:fill="EFE9F9" w:color="auto" w:val="clear"/>
+            <w:tcMar>
+              <w:top w:type="dxa" w:w="80"/>
+              <w:left w:type="dxa" w:w="140"/>
+              <w:bottom w:type="dxa" w:w="80"/>
+              <w:right w:type="dxa" w:w="120"/>
+            </w:tcMar>
+            <w:vAlign w:val="top"/>
+          </w:tcPr>
+          <w:p>
+            <w:pPr>
+              <w:spacing w:after="0" w:before="0" w:line="250"/>
+              <w:jc w:val="left"/>
+            </w:pPr>
+            <w:r>
+              <w:rPr>
+                <w:rFonts w:ascii="Arial" w:cs="Arial" w:eastAsia="Arial" w:hAnsi="Arial"/>
+                <w:b/>
+                <w:bCs/>
+                <w:i w:val="false"/>
+                <w:iCs w:val="false"/>
+                <w:caps w:val="false"/>
+                <w:color w:val="2D1B69"/>
+                <w:sz w:val="15"/>
+                <w:szCs w:val="15"/>
+              </w:rPr>
+              <w:t xml:space="preserve">Razem pomoc psychologiczno-pedagogiczna</w:t>
+            </w:r>
+          </w:p>
+        </w:tc>
+        <w:tc>
+          <w:tcPr>
+            <w:tcW w:type="dxa" w:w="1306"/>
+            <w:tcBorders>
+              <w:top w:val="single" w:color="D9D0F0" w:sz="4"/>
+              <w:left w:val="single" w:color="D9D0F0" w:sz="4"/>
+              <w:bottom w:val="single" w:color="D9D0F0" w:sz="4"/>
+              <w:right w:val="single" w:color="D9D0F0" w:sz="4"/>
+            </w:tcBorders>
+            <w:shd w:fill="EFE9F9" w:color="auto" w:val="clear"/>
+            <w:tcMar>
+              <w:top w:type="dxa" w:w="80"/>
+              <w:left w:type="dxa" w:w="140"/>
+              <w:bottom w:type="dxa" w:w="80"/>
+              <w:right w:type="dxa" w:w="120"/>
+            </w:tcMar>
+            <w:vAlign w:val="top"/>
+          </w:tcPr>
+          <w:p>
+            <w:pPr>
+              <w:spacing w:after="0" w:before="0" w:line="250"/>
+              <w:jc w:val="left"/>
+            </w:pPr>
+            <w:r>
+              <w:rPr>
+                <w:rFonts w:ascii="Arial" w:cs="Arial" w:eastAsia="Arial" w:hAnsi="Arial"/>
+                <w:b/>
+                <w:bCs/>
+                <w:i w:val="false"/>
+                <w:iCs w:val="false"/>
+                <w:caps w:val="false"/>
+                <w:color w:val="2D1B69"/>
+                <w:sz w:val="15"/>
+                <w:szCs w:val="15"/>
+              </w:rPr>
+              <w:t xml:space="preserve">3 godz. 30 min</w:t>
+            </w:r>
+          </w:p>
+          <w:p>
+            <w:pPr>
+              <w:spacing w:after="0" w:before="0" w:line="250"/>
+              <w:jc w:val="left"/>
+            </w:pPr>
+            <w:r>
+              <w:rPr>
+                <w:rFonts w:ascii="Arial" w:cs="Arial" w:eastAsia="Arial" w:hAnsi="Arial"/>
+                <w:b w:val="false"/>
+                <w:bCs w:val="false"/>
+                <w:i w:val="false"/>
+                <w:iCs w:val="false"/>
+                <w:caps w:val="false"/>
+                <w:color w:val="6B6378"/>
+                <w:sz w:val="12"/>
+                <w:szCs w:val="12"/>
+              </w:rPr>
+              <w:t xml:space="preserve">210 min / tydz.</w:t>
+            </w:r>
+          </w:p>
+        </w:tc>
+      </w:tr>
+    </w:tbl>
+    <w:p>
+      <w:pPr>
+        <w:spacing w:after="0" w:before="60" w:line="276"/>
+        <w:jc w:val="left"/>
+      </w:pPr>
+      <w:r>
+        <w:rPr>
+          <w:rFonts w:ascii="Arial" w:cs="Arial" w:eastAsia="Arial" w:hAnsi="Arial"/>
+          <w:b/>
+          <w:bCs/>
+          <w:i w:val="false"/>
+          <w:iCs w:val="false"/>
+          <w:caps w:val="false"/>
+          <w:color w:val="2D1B69"/>
+          <w:sz w:val="13"/>
+          <w:szCs w:val="13"/>
+        </w:rPr>
+        <w:t xml:space="preserve">Uwaga: </w:t>
+      </w:r>
+      <w:r>
+        <w:rPr>
+          <w:rFonts w:ascii="Arial" w:cs="Arial" w:eastAsia="Arial" w:hAnsi="Arial"/>
+          <w:b w:val="false"/>
+          <w:bCs w:val="false"/>
+          <w:i w:val="false"/>
+          <w:iCs w:val="false"/>
+          <w:caps w:val="false"/>
+          <w:color w:val="6B6378"/>
+          <w:sz w:val="13"/>
+          <w:szCs w:val="13"/>
+        </w:rPr>
+        <w:t xml:space="preserve">godzina rewalidacji = 60 min; godzina zajęć PPP = 45 min (w przedszkolu czas dostosowany do możliwości dziecka).</w:t>
+      </w:r>
+    </w:p>
+    <w:p>
+      <w:r>
+        <w:br w:type="page"/>
+      </w:r>
+    </w:p>
+    <w:tbl>
+      <w:tblPr>
+        <w:tblW w:type="dxa" w:w="9906"/>
+        <w:tblBorders>
+          <w:top w:val="single" w:color="auto" w:sz="4"/>
+          <w:left w:val="single" w:color="auto" w:sz="4"/>
+          <w:bottom w:val="single" w:color="auto" w:sz="4"/>
+          <w:right w:val="single" w:color="auto" w:sz="4"/>
+          <w:insideH w:val="single" w:color="auto" w:sz="4"/>
+          <w:insideV w:val="single" w:color="auto" w:sz="4"/>
+        </w:tblBorders>
+      </w:tblPr>
+      <w:tblGrid>
+        <w:gridCol w:w="700"/>
+        <w:gridCol w:w="6200"/>
+        <w:gridCol w:w="3006"/>
+      </w:tblGrid>
+      <w:tr>
+        <w:trPr>
+          <w:cantSplit/>
+        </w:trPr>
+        <w:tc>
+          <w:tcPr>
+            <w:tcW w:type="dxa" w:w="700"/>
+            <w:tcBorders>
+              <w:top w:val="nil"/>
+              <w:left w:val="nil"/>
+              <w:bottom w:val="nil"/>
+              <w:right w:val="nil"/>
+            </w:tcBorders>
+            <w:shd w:fill="2D1B69" w:color="auto" w:val="clear"/>
+            <w:tcMar>
+              <w:top w:type="dxa" w:w="120"/>
+              <w:left w:type="dxa" w:w="40"/>
+              <w:bottom w:type="dxa" w:w="120"/>
+              <w:right w:type="dxa" w:w="40"/>
+            </w:tcMar>
+            <w:vAlign w:val="center"/>
+          </w:tcPr>
+          <w:p>
+            <w:pPr>
+              <w:spacing w:after="0" w:before="0" w:line="276"/>
+              <w:jc w:val="center"/>
+            </w:pPr>
+            <w:r>
+              <w:rPr>
+                <w:rFonts w:ascii="Arial" w:cs="Arial" w:eastAsia="Arial" w:hAnsi="Arial"/>
+                <w:b/>
+                <w:bCs/>
+                <w:i w:val="false"/>
+                <w:iCs w:val="false"/>
+                <w:caps w:val="false"/>
+                <w:color w:val="FFFFFF"/>
+                <w:sz w:val="12"/>
+                <w:szCs w:val="12"/>
+              </w:rPr>
+              <w:t xml:space="preserve">PCTP</w:t>
+            </w:r>
+          </w:p>
+        </w:tc>
+        <w:tc>
+          <w:tcPr>
+            <w:tcW w:type="dxa" w:w="6200"/>
+            <w:tcBorders>
+              <w:top w:val="nil"/>
+              <w:left w:val="nil"/>
+              <w:bottom w:val="nil"/>
+              <w:right w:val="nil"/>
+            </w:tcBorders>
+            <w:tcMar>
+              <w:top w:type="dxa" w:w="0"/>
+              <w:left w:type="dxa" w:w="160"/>
+              <w:bottom w:type="dxa" w:w="0"/>
+              <w:right w:type="dxa" w:w="0"/>
+            </w:tcMar>
+            <w:vAlign w:val="center"/>
+          </w:tcPr>
+          <w:p>
+            <w:pPr>
+              <w:spacing w:after="20" w:before="0" w:line="276"/>
+              <w:jc w:val="left"/>
+            </w:pPr>
+            <w:r>
+              <w:rPr>
+                <w:rFonts w:ascii="Arial" w:cs="Arial" w:eastAsia="Arial" w:hAnsi="Arial"/>
+                <w:b/>
+                <w:bCs/>
+                <w:i w:val="false"/>
+                <w:iCs w:val="false"/>
+                <w:caps w:val="false"/>
+                <w:color w:val="2D1B69"/>
+                <w:sz w:val="26"/>
+                <w:szCs w:val="26"/>
+              </w:rPr>
+              <w:t xml:space="preserve">EduPlaner 2026</w:t>
+            </w:r>
+          </w:p>
+          <w:p>
+            <w:pPr>
+              <w:spacing w:after="0" w:before="0" w:line="276"/>
+              <w:jc w:val="left"/>
+            </w:pPr>
+            <w:r>
+              <w:rPr>
+                <w:rFonts w:ascii="Arial" w:cs="Arial" w:eastAsia="Arial" w:hAnsi="Arial"/>
+                <w:b w:val="false"/>
+                <w:bCs w:val="false"/>
+                <w:i w:val="false"/>
+                <w:iCs w:val="false"/>
+                <w:caps/>
+                <w:color w:val="6B6378"/>
+                <w:spacing w:val="14"/>
+                <w:sz w:val="12"/>
+                <w:szCs w:val="12"/>
+              </w:rPr>
+              <w:t xml:space="preserve">Raport Oceny Funkcjonalnej · Część II · Zalecenia poradni · realizacja i podpisy</w:t>
+            </w:r>
+          </w:p>
+        </w:tc>
+        <w:tc>
+          <w:tcPr>
+            <w:tcW w:type="dxa" w:w="3006"/>
+            <w:tcBorders>
+              <w:top w:val="nil"/>
+              <w:left w:val="nil"/>
+              <w:bottom w:val="nil"/>
+              <w:right w:val="nil"/>
+            </w:tcBorders>
+            <w:tcMar>
+              <w:top w:type="dxa" w:w="0"/>
+              <w:left w:type="dxa" w:w="0"/>
+              <w:bottom w:type="dxa" w:w="0"/>
+              <w:right w:type="dxa" w:w="0"/>
+            </w:tcMar>
+            <w:vAlign w:val="center"/>
+          </w:tcPr>
+          <w:p>
+            <w:pPr>
+              <w:spacing w:after="60" w:before="0" w:line="276"/>
+              <w:jc w:val="right"/>
+            </w:pPr>
+            <w:r>
+              <w:rPr>
+                <w:rFonts w:ascii="Arial" w:cs="Arial" w:eastAsia="Arial" w:hAnsi="Arial"/>
+                <w:b/>
+                <w:bCs/>
+                <w:i w:val="false"/>
+                <w:iCs w:val="false"/>
+                <w:caps w:val="false"/>
+                <w:color w:val="FFFFFF"/>
+                <w:spacing w:val="10"/>
+                <w:sz w:val="13"/>
+                <w:szCs w:val="13"/>
+                <w:shd w:fill="E74509" w:color="auto" w:val="clear"/>
+              </w:rPr>
+              <w:t xml:space="preserve">  RAPORT · 2026  </w:t>
+            </w:r>
+          </w:p>
+          <w:p>
+            <w:pPr>
+              <w:spacing w:after="0" w:before="0" w:line="276"/>
+              <w:jc w:val="right"/>
+            </w:pPr>
+            <w:r>
+              <w:rPr>
+                <w:rFonts w:ascii="Arial" w:cs="Arial" w:eastAsia="Arial" w:hAnsi="Arial"/>
+                <w:b w:val="false"/>
+                <w:bCs w:val="false"/>
+                <w:i w:val="false"/>
+                <w:iCs w:val="false"/>
+                <w:caps w:val="false"/>
+                <w:color w:val="6B6378"/>
+                <w:spacing w:val="14"/>
+                <w:sz w:val="11"/>
+                <w:szCs w:val="11"/>
+              </w:rPr>
+              <w:t xml:space="preserve">DOKUMENT DLA RODZICA · 2026</w:t>
+            </w:r>
+          </w:p>
+        </w:tc>
+      </w:tr>
+    </w:tbl>
+    <w:p>
+      <w:pPr>
+        <w:pBdr>
+          <w:bottom w:val="single" w:color="2D1B69" w:sz="12" w:space="1"/>
+        </w:pBdr>
+        <w:spacing w:after="160" w:before="60"/>
+      </w:pPr>
+    </w:p>
+    <w:tbl>
+      <w:tblPr>
+        <w:tblW w:type="dxa" w:w="9706"/>
+        <w:tblBorders>
+          <w:top w:val="single" w:color="auto" w:sz="4"/>
+          <w:left w:val="single" w:color="auto" w:sz="4"/>
+          <w:bottom w:val="single" w:color="auto" w:sz="4"/>
+          <w:right w:val="single" w:color="auto" w:sz="4"/>
+          <w:insideH w:val="single" w:color="auto" w:sz="4"/>
+          <w:insideV w:val="single" w:color="auto" w:sz="4"/>
+        </w:tblBorders>
+      </w:tblPr>
+      <w:tblGrid>
+        <w:gridCol w:w="3900"/>
+        <w:gridCol w:w="2900"/>
+        <w:gridCol w:w="2906"/>
+      </w:tblGrid>
+      <w:tr>
+        <w:trPr>
+          <w:cantSplit/>
+        </w:trPr>
+        <w:tc>
+          <w:tcPr>
+            <w:tcW w:type="dxa" w:w="3900"/>
+            <w:tcBorders>
+              <w:top w:val="single" w:color="FFFFFF" w:sz="12"/>
+              <w:left w:val="single" w:color="FFFFFF" w:sz="12"/>
+              <w:bottom w:val="single" w:color="FFFFFF" w:sz="12"/>
+              <w:right w:val="single" w:color="FFFFFF" w:sz="12"/>
+            </w:tcBorders>
+            <w:shd w:fill="EFE9F9" w:color="auto" w:val="clear"/>
+            <w:tcMar>
+              <w:top w:type="dxa" w:w="110"/>
+              <w:left w:type="dxa" w:w="180"/>
+              <w:bottom w:type="dxa" w:w="110"/>
+              <w:right w:type="dxa" w:w="120"/>
+            </w:tcMar>
+            <w:vAlign w:val="top"/>
+          </w:tcPr>
+          <w:p>
+            <w:pPr>
+              <w:spacing w:after="0" w:before="0" w:line="276"/>
+              <w:jc w:val="left"/>
+            </w:pPr>
+            <w:r>
+              <w:rPr>
+                <w:rFonts w:ascii="Arial" w:cs="Arial" w:eastAsia="Arial" w:hAnsi="Arial"/>
+                <w:b/>
+                <w:bCs/>
+                <w:i w:val="false"/>
+                <w:iCs w:val="false"/>
+                <w:caps w:val="false"/>
+                <w:color w:val="7D6FB0"/>
+                <w:spacing w:val="14"/>
+                <w:sz w:val="12"/>
+                <w:szCs w:val="12"/>
+              </w:rPr>
+              <w:t xml:space="preserve">DOTYCZY DZIECKA</w:t>
+            </w:r>
+            <w:r>
+              <w:rPr>
+                <w:rFonts w:ascii="Arial" w:cs="Arial" w:eastAsia="Arial" w:hAnsi="Arial"/>
+                <w:b w:val="false"/>
+                <w:bCs w:val="false"/>
+                <w:i w:val="false"/>
+                <w:iCs w:val="false"/>
+                <w:caps w:val="false"/>
+                <w:color w:val="B6A6DF"/>
+                <w:sz w:val="14"/>
+                <w:szCs w:val="14"/>
+              </w:rPr>
+              <w:t xml:space="preserve">  ....................................................</w:t>
+            </w:r>
+            <w:r>
+              <w:rPr>
+                <w:rFonts w:ascii="Arial" w:cs="Arial" w:eastAsia="Arial" w:hAnsi="Arial"/>
+                <w:b w:val="false"/>
+                <w:bCs w:val="false"/>
+                <w:i w:val="false"/>
+                <w:iCs w:val="false"/>
+                <w:caps w:val="false"/>
+                <w:color w:val="6B6378"/>
+                <w:sz w:val="14"/>
+                <w:szCs w:val="14"/>
+              </w:rPr>
+              <w:t xml:space="preserve"/>
+            </w:r>
+          </w:p>
+        </w:tc>
+        <w:tc>
+          <w:tcPr>
+            <w:tcW w:type="dxa" w:w="2900"/>
+            <w:tcBorders>
+              <w:top w:val="single" w:color="FFFFFF" w:sz="12"/>
+              <w:left w:val="single" w:color="FFFFFF" w:sz="12"/>
+              <w:bottom w:val="single" w:color="FFFFFF" w:sz="12"/>
+              <w:right w:val="single" w:color="FFFFFF" w:sz="12"/>
+            </w:tcBorders>
+            <w:shd w:fill="EFE9F9" w:color="auto" w:val="clear"/>
+            <w:tcMar>
+              <w:top w:type="dxa" w:w="110"/>
+              <w:left w:type="dxa" w:w="180"/>
+              <w:bottom w:type="dxa" w:w="110"/>
+              <w:right w:type="dxa" w:w="120"/>
+            </w:tcMar>
+            <w:vAlign w:val="top"/>
+          </w:tcPr>
+          <w:p>
+            <w:pPr>
+              <w:spacing w:after="0" w:before="0" w:line="276"/>
+              <w:jc w:val="left"/>
+            </w:pPr>
+            <w:r>
+              <w:rPr>
+                <w:rFonts w:ascii="Arial" w:cs="Arial" w:eastAsia="Arial" w:hAnsi="Arial"/>
+                <w:b/>
+                <w:bCs/>
+                <w:i w:val="false"/>
+                <w:iCs w:val="false"/>
+                <w:caps w:val="false"/>
+                <w:color w:val="7D6FB0"/>
+                <w:spacing w:val="14"/>
+                <w:sz w:val="12"/>
+                <w:szCs w:val="12"/>
+              </w:rPr>
+              <w:t xml:space="preserve">GRUPA / KLASA</w:t>
+            </w:r>
+            <w:r>
+              <w:rPr>
+                <w:rFonts w:ascii="Arial" w:cs="Arial" w:eastAsia="Arial" w:hAnsi="Arial"/>
+                <w:b w:val="false"/>
+                <w:bCs w:val="false"/>
+                <w:i w:val="false"/>
+                <w:iCs w:val="false"/>
+                <w:caps w:val="false"/>
+                <w:color w:val="B6A6DF"/>
+                <w:sz w:val="14"/>
+                <w:szCs w:val="14"/>
+              </w:rPr>
+              <w:t xml:space="preserve">  ..............................</w:t>
+            </w:r>
+            <w:r>
+              <w:rPr>
+                <w:rFonts w:ascii="Arial" w:cs="Arial" w:eastAsia="Arial" w:hAnsi="Arial"/>
+                <w:b w:val="false"/>
+                <w:bCs w:val="false"/>
+                <w:i w:val="false"/>
+                <w:iCs w:val="false"/>
+                <w:caps w:val="false"/>
+                <w:color w:val="6B6378"/>
+                <w:sz w:val="14"/>
+                <w:szCs w:val="14"/>
+              </w:rPr>
+              <w:t xml:space="preserve"/>
+            </w:r>
+          </w:p>
+        </w:tc>
+        <w:tc>
+          <w:tcPr>
+            <w:tcW w:type="dxa" w:w="2906"/>
+            <w:tcBorders>
+              <w:top w:val="single" w:color="FFFFFF" w:sz="12"/>
+              <w:left w:val="single" w:color="FFFFFF" w:sz="12"/>
+              <w:bottom w:val="single" w:color="FFFFFF" w:sz="12"/>
+              <w:right w:val="single" w:color="FFFFFF" w:sz="12"/>
+            </w:tcBorders>
+            <w:shd w:fill="EFE9F9" w:color="auto" w:val="clear"/>
+            <w:tcMar>
+              <w:top w:type="dxa" w:w="110"/>
+              <w:left w:type="dxa" w:w="180"/>
+              <w:bottom w:type="dxa" w:w="110"/>
+              <w:right w:type="dxa" w:w="120"/>
+            </w:tcMar>
+            <w:vAlign w:val="top"/>
+          </w:tcPr>
+          <w:p>
+            <w:pPr>
+              <w:spacing w:after="0" w:before="0" w:line="276"/>
+              <w:jc w:val="left"/>
+            </w:pPr>
+            <w:r>
+              <w:rPr>
+                <w:rFonts w:ascii="Arial" w:cs="Arial" w:eastAsia="Arial" w:hAnsi="Arial"/>
+                <w:b/>
+                <w:bCs/>
+                <w:i w:val="false"/>
+                <w:iCs w:val="false"/>
+                <w:caps w:val="false"/>
+                <w:color w:val="7D6FB0"/>
+                <w:spacing w:val="14"/>
+                <w:sz w:val="12"/>
+                <w:szCs w:val="12"/>
+              </w:rPr>
+              <w:t xml:space="preserve">DATA</w:t>
+            </w:r>
+            <w:r>
+              <w:rPr>
+                <w:rFonts w:ascii="Arial" w:cs="Arial" w:eastAsia="Arial" w:hAnsi="Arial"/>
+                <w:b w:val="false"/>
+                <w:bCs w:val="false"/>
+                <w:i w:val="false"/>
+                <w:iCs w:val="false"/>
+                <w:caps w:val="false"/>
+                <w:color w:val="B6A6DF"/>
+                <w:sz w:val="14"/>
+                <w:szCs w:val="14"/>
+              </w:rPr>
+              <w:t xml:space="preserve">  ..............................</w:t>
+            </w:r>
+            <w:r>
+              <w:rPr>
+                <w:rFonts w:ascii="Arial" w:cs="Arial" w:eastAsia="Arial" w:hAnsi="Arial"/>
+                <w:b w:val="false"/>
+                <w:bCs w:val="false"/>
+                <w:i w:val="false"/>
+                <w:iCs w:val="false"/>
+                <w:caps w:val="false"/>
+                <w:color w:val="6B6378"/>
+                <w:sz w:val="14"/>
+                <w:szCs w:val="14"/>
+              </w:rPr>
+              <w:t xml:space="preserve">  r.</w:t>
+            </w:r>
+          </w:p>
+        </w:tc>
+      </w:tr>
+    </w:tbl>
+    <w:p>
+      <w:pPr>
+        <w:spacing w:after="120" w:before="0"/>
+      </w:pPr>
+    </w:p>
+    <w:p>
+      <w:pPr>
+        <w:keepNext/>
+        <w:spacing w:after="100" w:before="200"/>
+      </w:pPr>
+      <w:r>
+        <w:rPr>
+          <w:rFonts w:ascii="Arial" w:cs="Arial" w:eastAsia="Arial" w:hAnsi="Arial"/>
+          <w:b/>
+          <w:bCs/>
+          <w:i w:val="false"/>
+          <w:iCs w:val="false"/>
+          <w:caps w:val="false"/>
+          <w:color w:val="FFFFFF"/>
+          <w:sz w:val="16"/>
+          <w:szCs w:val="16"/>
+          <w:shd w:fill="2D1B69" w:color="auto" w:val="clear"/>
+        </w:rPr>
+        <w:t xml:space="preserve"> C </w:t>
+      </w:r>
+      <w:r>
+        <w:rPr>
+          <w:rFonts w:ascii="Arial" w:cs="Arial" w:eastAsia="Arial" w:hAnsi="Arial"/>
+          <w:b/>
+          <w:bCs/>
+          <w:i w:val="false"/>
+          <w:iCs w:val="false"/>
+          <w:caps w:val="false"/>
+          <w:color w:val="2D1B69"/>
+          <w:sz w:val="18"/>
+          <w:szCs w:val="18"/>
+        </w:rPr>
+        <w:t xml:space="preserve">   Pozostałe zalecenia poradni i sposoby ich realizacji w placówce</w:t>
+      </w:r>
+      <w:r>
+        <w:rPr>
+          <w:rFonts w:ascii="Arial" w:cs="Arial" w:eastAsia="Arial" w:hAnsi="Arial"/>
+          <w:b w:val="false"/>
+          <w:bCs w:val="false"/>
+          <w:i w:val="false"/>
+          <w:iCs w:val="false"/>
+          <w:caps w:val="false"/>
+          <w:color w:val="6B6378"/>
+          <w:sz w:val="14"/>
+          <w:szCs w:val="14"/>
+        </w:rPr>
+        <w:t xml:space="preserve"/>
       </w:r>
     </w:p>
     <w:tbl>
@@ -16256,7 +19466,7 @@
                 <w:sz w:val="15"/>
                 <w:szCs w:val="15"/>
               </w:rPr>
-              <w:t xml:space="preserve">Zajęcia rewalidacyjne rozwijające kompetencje społeczno-komunikacyjne (2 godz. tyg.)</w:t>
+              <w:t xml:space="preserve">Wsparcie nauczyciela współorganizującego kształcenie</w:t>
             </w:r>
           </w:p>
         </w:tc>
@@ -16294,7 +19504,7 @@
                 <w:sz w:val="15"/>
                 <w:szCs w:val="15"/>
               </w:rPr>
-              <w:t xml:space="preserve">Rewalidacja indywidualna 2 × 30 min tygodniowo: trening komunikacji funkcjonalnej, rozpoznawanie emocji, historyjki społeczne; zadania generalizowane w grupie.</w:t>
+              <w:t xml:space="preserve">Obecność w czasie zajęć kierowanych i przejść między aktywnościami; pomoc w dekodowaniu poleceń.</w:t>
             </w:r>
           </w:p>
         </w:tc>
@@ -16332,7 +19542,7 @@
                 <w:sz w:val="15"/>
                 <w:szCs w:val="15"/>
               </w:rPr>
-              <w:t xml:space="preserve">Pedagog specjalny · 2 × 30 min / tydz.</w:t>
+              <w:t xml:space="preserve">Nauczyciel współorganizujący · wg arkusza organizacji</w:t>
             </w:r>
           </w:p>
         </w:tc>
@@ -16533,7 +19743,7 @@
                 <w:sz w:val="15"/>
                 <w:szCs w:val="15"/>
               </w:rPr>
-              <w:t xml:space="preserve">Terapia logopedyczna z elementami komunikacji wspomagającej (AAC)</w:t>
+              <w:t xml:space="preserve">Dostosowanie wymagań edukacyjnych oraz form i metod pracy</w:t>
             </w:r>
           </w:p>
         </w:tc>
@@ -16571,7 +19781,7 @@
                 <w:sz w:val="15"/>
                 <w:szCs w:val="15"/>
               </w:rPr>
-              <w:t xml:space="preserve">Indywidualne zajęcia logopedyczne; wdrożenie tablic wyboru i skryptów dialogowych w sali; szkolenie kadry z obsługi pomocy AAC.</w:t>
+              <w:t xml:space="preserve">Karty pracy z jednym poleceniem, większa czcionka, ograniczenie bodźców; wydłużony czas; ocenianie wysiłku i postępu.</w:t>
             </w:r>
           </w:p>
         </w:tc>
@@ -16609,7 +19819,7 @@
                 <w:sz w:val="15"/>
                 <w:szCs w:val="15"/>
               </w:rPr>
-              <w:t xml:space="preserve">Logopeda / neurologopeda · 1 × 30 min / tydz.</w:t>
+              <w:t xml:space="preserve">Wychowawca i nauczyciele · na bieżąco</w:t>
             </w:r>
           </w:p>
         </w:tc>
@@ -16810,7 +20020,7 @@
                 <w:sz w:val="15"/>
                 <w:szCs w:val="15"/>
               </w:rPr>
-              <w:t xml:space="preserve">Terapia integracji sensorycznej i dieta sensoryczna w ciągu dnia</w:t>
+              <w:t xml:space="preserve">Zapewnienie stałości, przewidywalności i struktury otoczenia</w:t>
             </w:r>
           </w:p>
         </w:tc>
@@ -16848,7 +20058,7 @@
                 <w:sz w:val="15"/>
                 <w:szCs w:val="15"/>
               </w:rPr>
-              <w:t xml:space="preserve">Zajęcia SI na sali gimnastycznej; przerwy sensoryczne wpisane w plan dnia; słuchawki wygłuszające; strefa wyciszenia w sali.</w:t>
+              <w:t xml:space="preserve">Wizualny plan dnia; zapowiadanie zmian; stały skład kadry; protokół wyprzedzający przed wydarzeniami grupowymi; strefa wyciszenia i słuchawki.</w:t>
             </w:r>
           </w:p>
         </w:tc>
@@ -16886,7 +20096,7 @@
                 <w:sz w:val="15"/>
                 <w:szCs w:val="15"/>
               </w:rPr>
-              <w:t xml:space="preserve">Terapeuta SI · 1 × 45 min / tydz.; nauczyciele codziennie</w:t>
+              <w:t xml:space="preserve">Wychowawca · codziennie</w:t>
             </w:r>
           </w:p>
         </w:tc>
@@ -17087,7 +20297,7 @@
                 <w:sz w:val="15"/>
                 <w:szCs w:val="15"/>
               </w:rPr>
-              <w:t xml:space="preserve">Wsparcie nauczyciela współorganizującego kształcenie</w:t>
+              <w:t xml:space="preserve">Ścisła współpraca z rodzicami i ujednolicenie oddziaływań</w:t>
             </w:r>
           </w:p>
         </w:tc>
@@ -17125,1115 +20335,7 @@
                 <w:sz w:val="15"/>
                 <w:szCs w:val="15"/>
               </w:rPr>
-              <w:t xml:space="preserve">Obecność nauczyciela współorganizującego w czasie zajęć kierowanych i przejść między aktywnościami; pomoc w dekodowaniu poleceń.</w:t>
-            </w:r>
-          </w:p>
-        </w:tc>
-        <w:tc>
-          <w:tcPr>
-            <w:tcW w:type="dxa" w:w="2200"/>
-            <w:tcBorders>
-              <w:top w:val="single" w:color="E3E1EC" w:sz="4"/>
-              <w:left w:val="single" w:color="E3E1EC" w:sz="4"/>
-              <w:bottom w:val="single" w:color="E3E1EC" w:sz="4"/>
-              <w:right w:val="single" w:color="E3E1EC" w:sz="4"/>
-            </w:tcBorders>
-            <w:tcMar>
-              <w:top w:type="dxa" w:w="70"/>
-              <w:left w:type="dxa" w:w="140"/>
-              <w:bottom w:type="dxa" w:w="70"/>
-              <w:right w:type="dxa" w:w="120"/>
-            </w:tcMar>
-            <w:vAlign w:val="top"/>
-          </w:tcPr>
-          <w:p>
-            <w:pPr>
-              <w:spacing w:after="0" w:before="0" w:line="250"/>
-              <w:jc w:val="left"/>
-            </w:pPr>
-            <w:r>
-              <w:rPr>
-                <w:rFonts w:ascii="Arial" w:cs="Arial" w:eastAsia="Arial" w:hAnsi="Arial"/>
-                <w:b/>
-                <w:bCs/>
-                <w:i w:val="false"/>
-                <w:iCs w:val="false"/>
-                <w:caps w:val="false"/>
-                <w:color w:val="2D1B69"/>
-                <w:sz w:val="15"/>
-                <w:szCs w:val="15"/>
-              </w:rPr>
-              <w:t xml:space="preserve">Nauczyciel współorganizujący · zgodnie z arkuszem organizacji</w:t>
-            </w:r>
-          </w:p>
-        </w:tc>
-        <w:tc>
-          <w:tcPr>
-            <w:tcW w:type="dxa" w:w="1256"/>
-            <w:tcBorders>
-              <w:top w:val="single" w:color="E3E1EC" w:sz="4"/>
-              <w:left w:val="single" w:color="E3E1EC" w:sz="4"/>
-              <w:bottom w:val="single" w:color="E3E1EC" w:sz="4"/>
-              <w:right w:val="single" w:color="E3E1EC" w:sz="4"/>
-            </w:tcBorders>
-            <w:tcMar>
-              <w:top w:type="dxa" w:w="70"/>
-              <w:left w:type="dxa" w:w="140"/>
-              <w:bottom w:type="dxa" w:w="70"/>
-              <w:right w:type="dxa" w:w="120"/>
-            </w:tcMar>
-            <w:vAlign w:val="top"/>
-          </w:tcPr>
-          <w:p>
-            <w:pPr>
-              <w:spacing w:after="0" w:before="0" w:line="220"/>
-              <w:jc w:val="left"/>
-            </w:pPr>
-            <w:r>
-              <w:rPr>
-                <w:rFonts w:ascii="Arial" w:cs="Arial" w:eastAsia="Arial" w:hAnsi="Arial"/>
-                <w:b w:val="false"/>
-                <w:bCs w:val="false"/>
-                <w:i w:val="false"/>
-                <w:iCs w:val="false"/>
-                <w:caps w:val="false"/>
-                <w:color w:val="B6A6DF"/>
-                <w:sz w:val="15"/>
-                <w:szCs w:val="15"/>
-              </w:rPr>
-              <w:t xml:space="preserve">☐ </w:t>
-            </w:r>
-            <w:r>
-              <w:rPr>
-                <w:rFonts w:ascii="Arial" w:cs="Arial" w:eastAsia="Arial" w:hAnsi="Arial"/>
-                <w:b w:val="false"/>
-                <w:bCs w:val="false"/>
-                <w:i w:val="false"/>
-                <w:iCs w:val="false"/>
-                <w:caps w:val="false"/>
-                <w:color w:val="6B6378"/>
-                <w:sz w:val="12"/>
-                <w:szCs w:val="12"/>
-              </w:rPr>
-              <w:t xml:space="preserve">wdrożone</w:t>
-            </w:r>
-          </w:p>
-          <w:p>
-            <w:pPr>
-              <w:spacing w:after="0" w:before="0" w:line="220"/>
-              <w:jc w:val="left"/>
-            </w:pPr>
-            <w:r>
-              <w:rPr>
-                <w:rFonts w:ascii="Arial" w:cs="Arial" w:eastAsia="Arial" w:hAnsi="Arial"/>
-                <w:b w:val="false"/>
-                <w:bCs w:val="false"/>
-                <w:i w:val="false"/>
-                <w:iCs w:val="false"/>
-                <w:caps w:val="false"/>
-                <w:color w:val="B6A6DF"/>
-                <w:sz w:val="15"/>
-                <w:szCs w:val="15"/>
-              </w:rPr>
-              <w:t xml:space="preserve">☐ </w:t>
-            </w:r>
-            <w:r>
-              <w:rPr>
-                <w:rFonts w:ascii="Arial" w:cs="Arial" w:eastAsia="Arial" w:hAnsi="Arial"/>
-                <w:b w:val="false"/>
-                <w:bCs w:val="false"/>
-                <w:i w:val="false"/>
-                <w:iCs w:val="false"/>
-                <w:caps w:val="false"/>
-                <w:color w:val="6B6378"/>
-                <w:sz w:val="12"/>
-                <w:szCs w:val="12"/>
-              </w:rPr>
-              <w:t xml:space="preserve">w trakcie</w:t>
-            </w:r>
-          </w:p>
-          <w:p>
-            <w:pPr>
-              <w:spacing w:after="0" w:before="0" w:line="220"/>
-              <w:jc w:val="left"/>
-            </w:pPr>
-            <w:r>
-              <w:rPr>
-                <w:rFonts w:ascii="Arial" w:cs="Arial" w:eastAsia="Arial" w:hAnsi="Arial"/>
-                <w:b w:val="false"/>
-                <w:bCs w:val="false"/>
-                <w:i w:val="false"/>
-                <w:iCs w:val="false"/>
-                <w:caps w:val="false"/>
-                <w:color w:val="B6A6DF"/>
-                <w:sz w:val="15"/>
-                <w:szCs w:val="15"/>
-              </w:rPr>
-              <w:t xml:space="preserve">☐ </w:t>
-            </w:r>
-            <w:r>
-              <w:rPr>
-                <w:rFonts w:ascii="Arial" w:cs="Arial" w:eastAsia="Arial" w:hAnsi="Arial"/>
-                <w:b w:val="false"/>
-                <w:bCs w:val="false"/>
-                <w:i w:val="false"/>
-                <w:iCs w:val="false"/>
-                <w:caps w:val="false"/>
-                <w:color w:val="6B6378"/>
-                <w:sz w:val="12"/>
-                <w:szCs w:val="12"/>
-              </w:rPr>
-              <w:t xml:space="preserve">planowane</w:t>
-            </w:r>
-          </w:p>
-        </w:tc>
-      </w:tr>
-      <w:tr>
-        <w:trPr>
-          <w:cantSplit/>
-        </w:trPr>
-        <w:tc>
-          <w:tcPr>
-            <w:tcW w:type="dxa" w:w="400"/>
-            <w:tcBorders>
-              <w:top w:val="single" w:color="E3E1EC" w:sz="4"/>
-              <w:left w:val="single" w:color="E3E1EC" w:sz="4"/>
-              <w:bottom w:val="single" w:color="E3E1EC" w:sz="4"/>
-              <w:right w:val="single" w:color="E3E1EC" w:sz="4"/>
-            </w:tcBorders>
-            <w:tcMar>
-              <w:top w:type="dxa" w:w="70"/>
-              <w:left w:type="dxa" w:w="140"/>
-              <w:bottom w:type="dxa" w:w="70"/>
-              <w:right w:type="dxa" w:w="120"/>
-            </w:tcMar>
-            <w:vAlign w:val="top"/>
-          </w:tcPr>
-          <w:p>
-            <w:pPr>
-              <w:spacing w:after="0" w:before="0" w:line="250"/>
-              <w:jc w:val="left"/>
-            </w:pPr>
-            <w:r>
-              <w:rPr>
-                <w:rFonts w:ascii="Arial" w:cs="Arial" w:eastAsia="Arial" w:hAnsi="Arial"/>
-                <w:b/>
-                <w:bCs/>
-                <w:i w:val="false"/>
-                <w:iCs w:val="false"/>
-                <w:caps w:val="false"/>
-                <w:color w:val="E74509"/>
-                <w:sz w:val="15"/>
-                <w:szCs w:val="15"/>
-              </w:rPr>
-              <w:t xml:space="preserve">5</w:t>
-            </w:r>
-          </w:p>
-        </w:tc>
-        <w:tc>
-          <w:tcPr>
-            <w:tcW w:type="dxa" w:w="2550"/>
-            <w:tcBorders>
-              <w:top w:val="single" w:color="E3E1EC" w:sz="4"/>
-              <w:left w:val="single" w:color="E3E1EC" w:sz="4"/>
-              <w:bottom w:val="single" w:color="E3E1EC" w:sz="4"/>
-              <w:right w:val="single" w:color="E3E1EC" w:sz="4"/>
-            </w:tcBorders>
-            <w:tcMar>
-              <w:top w:type="dxa" w:w="70"/>
-              <w:left w:type="dxa" w:w="140"/>
-              <w:bottom w:type="dxa" w:w="70"/>
-              <w:right w:type="dxa" w:w="120"/>
-            </w:tcMar>
-            <w:vAlign w:val="top"/>
-          </w:tcPr>
-          <w:p>
-            <w:pPr>
-              <w:spacing w:after="0" w:before="0" w:line="250"/>
-              <w:jc w:val="left"/>
-            </w:pPr>
-            <w:r>
-              <w:rPr>
-                <w:rFonts w:ascii="Arial" w:cs="Arial" w:eastAsia="Arial" w:hAnsi="Arial"/>
-                <w:b/>
-                <w:bCs/>
-                <w:i w:val="false"/>
-                <w:iCs w:val="false"/>
-                <w:caps w:val="false"/>
-                <w:color w:val="1A1530"/>
-                <w:sz w:val="15"/>
-                <w:szCs w:val="15"/>
-              </w:rPr>
-              <w:t xml:space="preserve">Dostosowanie wymagań edukacyjnych oraz form i metod pracy</w:t>
-            </w:r>
-          </w:p>
-        </w:tc>
-        <w:tc>
-          <w:tcPr>
-            <w:tcW w:type="dxa" w:w="3500"/>
-            <w:tcBorders>
-              <w:top w:val="single" w:color="E3E1EC" w:sz="4"/>
-              <w:left w:val="single" w:color="E3E1EC" w:sz="4"/>
-              <w:bottom w:val="single" w:color="E3E1EC" w:sz="4"/>
-              <w:right w:val="single" w:color="E3E1EC" w:sz="4"/>
-            </w:tcBorders>
-            <w:tcMar>
-              <w:top w:type="dxa" w:w="70"/>
-              <w:left w:type="dxa" w:w="140"/>
-              <w:bottom w:type="dxa" w:w="70"/>
-              <w:right w:type="dxa" w:w="120"/>
-            </w:tcMar>
-            <w:vAlign w:val="top"/>
-          </w:tcPr>
-          <w:p>
-            <w:pPr>
-              <w:spacing w:after="0" w:before="0" w:line="250"/>
-              <w:jc w:val="left"/>
-            </w:pPr>
-            <w:r>
-              <w:rPr>
-                <w:rFonts w:ascii="Arial" w:cs="Arial" w:eastAsia="Arial" w:hAnsi="Arial"/>
-                <w:b w:val="false"/>
-                <w:bCs w:val="false"/>
-                <w:i w:val="false"/>
-                <w:iCs w:val="false"/>
-                <w:caps w:val="false"/>
-                <w:color w:val="1A1530"/>
-                <w:sz w:val="15"/>
-                <w:szCs w:val="15"/>
-              </w:rPr>
-              <w:t xml:space="preserve">Karty pracy z jednym poleceniem, większa czcionka, ograniczenie bodźców; wydłużony czas; ocenianie wysiłku i postępu; instrukcje wsparte piktogramami.</w:t>
-            </w:r>
-          </w:p>
-        </w:tc>
-        <w:tc>
-          <w:tcPr>
-            <w:tcW w:type="dxa" w:w="2200"/>
-            <w:tcBorders>
-              <w:top w:val="single" w:color="E3E1EC" w:sz="4"/>
-              <w:left w:val="single" w:color="E3E1EC" w:sz="4"/>
-              <w:bottom w:val="single" w:color="E3E1EC" w:sz="4"/>
-              <w:right w:val="single" w:color="E3E1EC" w:sz="4"/>
-            </w:tcBorders>
-            <w:tcMar>
-              <w:top w:type="dxa" w:w="70"/>
-              <w:left w:type="dxa" w:w="140"/>
-              <w:bottom w:type="dxa" w:w="70"/>
-              <w:right w:type="dxa" w:w="120"/>
-            </w:tcMar>
-            <w:vAlign w:val="top"/>
-          </w:tcPr>
-          <w:p>
-            <w:pPr>
-              <w:spacing w:after="0" w:before="0" w:line="250"/>
-              <w:jc w:val="left"/>
-            </w:pPr>
-            <w:r>
-              <w:rPr>
-                <w:rFonts w:ascii="Arial" w:cs="Arial" w:eastAsia="Arial" w:hAnsi="Arial"/>
-                <w:b/>
-                <w:bCs/>
-                <w:i w:val="false"/>
-                <w:iCs w:val="false"/>
-                <w:caps w:val="false"/>
-                <w:color w:val="2D1B69"/>
-                <w:sz w:val="15"/>
-                <w:szCs w:val="15"/>
-              </w:rPr>
-              <w:t xml:space="preserve">Wychowawca i nauczyciele przedmiotów · na bieżąco</w:t>
-            </w:r>
-          </w:p>
-        </w:tc>
-        <w:tc>
-          <w:tcPr>
-            <w:tcW w:type="dxa" w:w="1256"/>
-            <w:tcBorders>
-              <w:top w:val="single" w:color="E3E1EC" w:sz="4"/>
-              <w:left w:val="single" w:color="E3E1EC" w:sz="4"/>
-              <w:bottom w:val="single" w:color="E3E1EC" w:sz="4"/>
-              <w:right w:val="single" w:color="E3E1EC" w:sz="4"/>
-            </w:tcBorders>
-            <w:tcMar>
-              <w:top w:type="dxa" w:w="70"/>
-              <w:left w:type="dxa" w:w="140"/>
-              <w:bottom w:type="dxa" w:w="70"/>
-              <w:right w:type="dxa" w:w="120"/>
-            </w:tcMar>
-            <w:vAlign w:val="top"/>
-          </w:tcPr>
-          <w:p>
-            <w:pPr>
-              <w:spacing w:after="0" w:before="0" w:line="220"/>
-              <w:jc w:val="left"/>
-            </w:pPr>
-            <w:r>
-              <w:rPr>
-                <w:rFonts w:ascii="Arial" w:cs="Arial" w:eastAsia="Arial" w:hAnsi="Arial"/>
-                <w:b w:val="false"/>
-                <w:bCs w:val="false"/>
-                <w:i w:val="false"/>
-                <w:iCs w:val="false"/>
-                <w:caps w:val="false"/>
-                <w:color w:val="B6A6DF"/>
-                <w:sz w:val="15"/>
-                <w:szCs w:val="15"/>
-              </w:rPr>
-              <w:t xml:space="preserve">☐ </w:t>
-            </w:r>
-            <w:r>
-              <w:rPr>
-                <w:rFonts w:ascii="Arial" w:cs="Arial" w:eastAsia="Arial" w:hAnsi="Arial"/>
-                <w:b w:val="false"/>
-                <w:bCs w:val="false"/>
-                <w:i w:val="false"/>
-                <w:iCs w:val="false"/>
-                <w:caps w:val="false"/>
-                <w:color w:val="6B6378"/>
-                <w:sz w:val="12"/>
-                <w:szCs w:val="12"/>
-              </w:rPr>
-              <w:t xml:space="preserve">wdrożone</w:t>
-            </w:r>
-          </w:p>
-          <w:p>
-            <w:pPr>
-              <w:spacing w:after="0" w:before="0" w:line="220"/>
-              <w:jc w:val="left"/>
-            </w:pPr>
-            <w:r>
-              <w:rPr>
-                <w:rFonts w:ascii="Arial" w:cs="Arial" w:eastAsia="Arial" w:hAnsi="Arial"/>
-                <w:b w:val="false"/>
-                <w:bCs w:val="false"/>
-                <w:i w:val="false"/>
-                <w:iCs w:val="false"/>
-                <w:caps w:val="false"/>
-                <w:color w:val="B6A6DF"/>
-                <w:sz w:val="15"/>
-                <w:szCs w:val="15"/>
-              </w:rPr>
-              <w:t xml:space="preserve">☐ </w:t>
-            </w:r>
-            <w:r>
-              <w:rPr>
-                <w:rFonts w:ascii="Arial" w:cs="Arial" w:eastAsia="Arial" w:hAnsi="Arial"/>
-                <w:b w:val="false"/>
-                <w:bCs w:val="false"/>
-                <w:i w:val="false"/>
-                <w:iCs w:val="false"/>
-                <w:caps w:val="false"/>
-                <w:color w:val="6B6378"/>
-                <w:sz w:val="12"/>
-                <w:szCs w:val="12"/>
-              </w:rPr>
-              <w:t xml:space="preserve">w trakcie</w:t>
-            </w:r>
-          </w:p>
-          <w:p>
-            <w:pPr>
-              <w:spacing w:after="0" w:before="0" w:line="220"/>
-              <w:jc w:val="left"/>
-            </w:pPr>
-            <w:r>
-              <w:rPr>
-                <w:rFonts w:ascii="Arial" w:cs="Arial" w:eastAsia="Arial" w:hAnsi="Arial"/>
-                <w:b w:val="false"/>
-                <w:bCs w:val="false"/>
-                <w:i w:val="false"/>
-                <w:iCs w:val="false"/>
-                <w:caps w:val="false"/>
-                <w:color w:val="B6A6DF"/>
-                <w:sz w:val="15"/>
-                <w:szCs w:val="15"/>
-              </w:rPr>
-              <w:t xml:space="preserve">☐ </w:t>
-            </w:r>
-            <w:r>
-              <w:rPr>
-                <w:rFonts w:ascii="Arial" w:cs="Arial" w:eastAsia="Arial" w:hAnsi="Arial"/>
-                <w:b w:val="false"/>
-                <w:bCs w:val="false"/>
-                <w:i w:val="false"/>
-                <w:iCs w:val="false"/>
-                <w:caps w:val="false"/>
-                <w:color w:val="6B6378"/>
-                <w:sz w:val="12"/>
-                <w:szCs w:val="12"/>
-              </w:rPr>
-              <w:t xml:space="preserve">planowane</w:t>
-            </w:r>
-          </w:p>
-        </w:tc>
-      </w:tr>
-      <w:tr>
-        <w:trPr>
-          <w:cantSplit/>
-        </w:trPr>
-        <w:tc>
-          <w:tcPr>
-            <w:tcW w:type="dxa" w:w="400"/>
-            <w:tcBorders>
-              <w:top w:val="single" w:color="E3E1EC" w:sz="4"/>
-              <w:left w:val="single" w:color="E3E1EC" w:sz="4"/>
-              <w:bottom w:val="single" w:color="E3E1EC" w:sz="4"/>
-              <w:right w:val="single" w:color="E3E1EC" w:sz="4"/>
-            </w:tcBorders>
-            <w:tcMar>
-              <w:top w:type="dxa" w:w="70"/>
-              <w:left w:type="dxa" w:w="140"/>
-              <w:bottom w:type="dxa" w:w="70"/>
-              <w:right w:type="dxa" w:w="120"/>
-            </w:tcMar>
-            <w:vAlign w:val="top"/>
-          </w:tcPr>
-          <w:p>
-            <w:pPr>
-              <w:spacing w:after="0" w:before="0" w:line="250"/>
-              <w:jc w:val="left"/>
-            </w:pPr>
-            <w:r>
-              <w:rPr>
-                <w:rFonts w:ascii="Arial" w:cs="Arial" w:eastAsia="Arial" w:hAnsi="Arial"/>
-                <w:b/>
-                <w:bCs/>
-                <w:i w:val="false"/>
-                <w:iCs w:val="false"/>
-                <w:caps w:val="false"/>
-                <w:color w:val="E74509"/>
-                <w:sz w:val="15"/>
-                <w:szCs w:val="15"/>
-              </w:rPr>
-              <w:t xml:space="preserve">6</w:t>
-            </w:r>
-          </w:p>
-        </w:tc>
-        <w:tc>
-          <w:tcPr>
-            <w:tcW w:type="dxa" w:w="2550"/>
-            <w:tcBorders>
-              <w:top w:val="single" w:color="E3E1EC" w:sz="4"/>
-              <w:left w:val="single" w:color="E3E1EC" w:sz="4"/>
-              <w:bottom w:val="single" w:color="E3E1EC" w:sz="4"/>
-              <w:right w:val="single" w:color="E3E1EC" w:sz="4"/>
-            </w:tcBorders>
-            <w:tcMar>
-              <w:top w:type="dxa" w:w="70"/>
-              <w:left w:type="dxa" w:w="140"/>
-              <w:bottom w:type="dxa" w:w="70"/>
-              <w:right w:type="dxa" w:w="120"/>
-            </w:tcMar>
-            <w:vAlign w:val="top"/>
-          </w:tcPr>
-          <w:p>
-            <w:pPr>
-              <w:spacing w:after="0" w:before="0" w:line="250"/>
-              <w:jc w:val="left"/>
-            </w:pPr>
-            <w:r>
-              <w:rPr>
-                <w:rFonts w:ascii="Arial" w:cs="Arial" w:eastAsia="Arial" w:hAnsi="Arial"/>
-                <w:b/>
-                <w:bCs/>
-                <w:i w:val="false"/>
-                <w:iCs w:val="false"/>
-                <w:caps w:val="false"/>
-                <w:color w:val="1A1530"/>
-                <w:sz w:val="15"/>
-                <w:szCs w:val="15"/>
-              </w:rPr>
-              <w:t xml:space="preserve">Trening umiejętności społecznych (TUS) w małej grupie</w:t>
-            </w:r>
-          </w:p>
-        </w:tc>
-        <w:tc>
-          <w:tcPr>
-            <w:tcW w:type="dxa" w:w="3500"/>
-            <w:tcBorders>
-              <w:top w:val="single" w:color="E3E1EC" w:sz="4"/>
-              <w:left w:val="single" w:color="E3E1EC" w:sz="4"/>
-              <w:bottom w:val="single" w:color="E3E1EC" w:sz="4"/>
-              <w:right w:val="single" w:color="E3E1EC" w:sz="4"/>
-            </w:tcBorders>
-            <w:tcMar>
-              <w:top w:type="dxa" w:w="70"/>
-              <w:left w:type="dxa" w:w="140"/>
-              <w:bottom w:type="dxa" w:w="70"/>
-              <w:right w:type="dxa" w:w="120"/>
-            </w:tcMar>
-            <w:vAlign w:val="top"/>
-          </w:tcPr>
-          <w:p>
-            <w:pPr>
-              <w:spacing w:after="0" w:before="0" w:line="250"/>
-              <w:jc w:val="left"/>
-            </w:pPr>
-            <w:r>
-              <w:rPr>
-                <w:rFonts w:ascii="Arial" w:cs="Arial" w:eastAsia="Arial" w:hAnsi="Arial"/>
-                <w:b w:val="false"/>
-                <w:bCs w:val="false"/>
-                <w:i w:val="false"/>
-                <w:iCs w:val="false"/>
-                <w:caps w:val="false"/>
-                <w:color w:val="1A1530"/>
-                <w:sz w:val="15"/>
-                <w:szCs w:val="15"/>
-              </w:rPr>
-              <w:t xml:space="preserve">Zajęcia TUS w grupie 3–5 osób: naprzemienność, rozpoznawanie intencji, radzenie sobie z przegraną; rówieśnik-mentor w zabawach swobodnych.</w:t>
-            </w:r>
-          </w:p>
-        </w:tc>
-        <w:tc>
-          <w:tcPr>
-            <w:tcW w:type="dxa" w:w="2200"/>
-            <w:tcBorders>
-              <w:top w:val="single" w:color="E3E1EC" w:sz="4"/>
-              <w:left w:val="single" w:color="E3E1EC" w:sz="4"/>
-              <w:bottom w:val="single" w:color="E3E1EC" w:sz="4"/>
-              <w:right w:val="single" w:color="E3E1EC" w:sz="4"/>
-            </w:tcBorders>
-            <w:tcMar>
-              <w:top w:type="dxa" w:w="70"/>
-              <w:left w:type="dxa" w:w="140"/>
-              <w:bottom w:type="dxa" w:w="70"/>
-              <w:right w:type="dxa" w:w="120"/>
-            </w:tcMar>
-            <w:vAlign w:val="top"/>
-          </w:tcPr>
-          <w:p>
-            <w:pPr>
-              <w:spacing w:after="0" w:before="0" w:line="250"/>
-              <w:jc w:val="left"/>
-            </w:pPr>
-            <w:r>
-              <w:rPr>
-                <w:rFonts w:ascii="Arial" w:cs="Arial" w:eastAsia="Arial" w:hAnsi="Arial"/>
-                <w:b/>
-                <w:bCs/>
-                <w:i w:val="false"/>
-                <w:iCs w:val="false"/>
-                <w:caps w:val="false"/>
-                <w:color w:val="2D1B69"/>
-                <w:sz w:val="15"/>
-                <w:szCs w:val="15"/>
-              </w:rPr>
-              <w:t xml:space="preserve">Psycholog / pedagog · 1 × 45 min / tydz.</w:t>
-            </w:r>
-          </w:p>
-        </w:tc>
-        <w:tc>
-          <w:tcPr>
-            <w:tcW w:type="dxa" w:w="1256"/>
-            <w:tcBorders>
-              <w:top w:val="single" w:color="E3E1EC" w:sz="4"/>
-              <w:left w:val="single" w:color="E3E1EC" w:sz="4"/>
-              <w:bottom w:val="single" w:color="E3E1EC" w:sz="4"/>
-              <w:right w:val="single" w:color="E3E1EC" w:sz="4"/>
-            </w:tcBorders>
-            <w:tcMar>
-              <w:top w:type="dxa" w:w="70"/>
-              <w:left w:type="dxa" w:w="140"/>
-              <w:bottom w:type="dxa" w:w="70"/>
-              <w:right w:type="dxa" w:w="120"/>
-            </w:tcMar>
-            <w:vAlign w:val="top"/>
-          </w:tcPr>
-          <w:p>
-            <w:pPr>
-              <w:spacing w:after="0" w:before="0" w:line="220"/>
-              <w:jc w:val="left"/>
-            </w:pPr>
-            <w:r>
-              <w:rPr>
-                <w:rFonts w:ascii="Arial" w:cs="Arial" w:eastAsia="Arial" w:hAnsi="Arial"/>
-                <w:b w:val="false"/>
-                <w:bCs w:val="false"/>
-                <w:i w:val="false"/>
-                <w:iCs w:val="false"/>
-                <w:caps w:val="false"/>
-                <w:color w:val="B6A6DF"/>
-                <w:sz w:val="15"/>
-                <w:szCs w:val="15"/>
-              </w:rPr>
-              <w:t xml:space="preserve">☐ </w:t>
-            </w:r>
-            <w:r>
-              <w:rPr>
-                <w:rFonts w:ascii="Arial" w:cs="Arial" w:eastAsia="Arial" w:hAnsi="Arial"/>
-                <w:b w:val="false"/>
-                <w:bCs w:val="false"/>
-                <w:i w:val="false"/>
-                <w:iCs w:val="false"/>
-                <w:caps w:val="false"/>
-                <w:color w:val="6B6378"/>
-                <w:sz w:val="12"/>
-                <w:szCs w:val="12"/>
-              </w:rPr>
-              <w:t xml:space="preserve">wdrożone</w:t>
-            </w:r>
-          </w:p>
-          <w:p>
-            <w:pPr>
-              <w:spacing w:after="0" w:before="0" w:line="220"/>
-              <w:jc w:val="left"/>
-            </w:pPr>
-            <w:r>
-              <w:rPr>
-                <w:rFonts w:ascii="Arial" w:cs="Arial" w:eastAsia="Arial" w:hAnsi="Arial"/>
-                <w:b w:val="false"/>
-                <w:bCs w:val="false"/>
-                <w:i w:val="false"/>
-                <w:iCs w:val="false"/>
-                <w:caps w:val="false"/>
-                <w:color w:val="B6A6DF"/>
-                <w:sz w:val="15"/>
-                <w:szCs w:val="15"/>
-              </w:rPr>
-              <w:t xml:space="preserve">☐ </w:t>
-            </w:r>
-            <w:r>
-              <w:rPr>
-                <w:rFonts w:ascii="Arial" w:cs="Arial" w:eastAsia="Arial" w:hAnsi="Arial"/>
-                <w:b w:val="false"/>
-                <w:bCs w:val="false"/>
-                <w:i w:val="false"/>
-                <w:iCs w:val="false"/>
-                <w:caps w:val="false"/>
-                <w:color w:val="6B6378"/>
-                <w:sz w:val="12"/>
-                <w:szCs w:val="12"/>
-              </w:rPr>
-              <w:t xml:space="preserve">w trakcie</w:t>
-            </w:r>
-          </w:p>
-          <w:p>
-            <w:pPr>
-              <w:spacing w:after="0" w:before="0" w:line="220"/>
-              <w:jc w:val="left"/>
-            </w:pPr>
-            <w:r>
-              <w:rPr>
-                <w:rFonts w:ascii="Arial" w:cs="Arial" w:eastAsia="Arial" w:hAnsi="Arial"/>
-                <w:b w:val="false"/>
-                <w:bCs w:val="false"/>
-                <w:i w:val="false"/>
-                <w:iCs w:val="false"/>
-                <w:caps w:val="false"/>
-                <w:color w:val="B6A6DF"/>
-                <w:sz w:val="15"/>
-                <w:szCs w:val="15"/>
-              </w:rPr>
-              <w:t xml:space="preserve">☐ </w:t>
-            </w:r>
-            <w:r>
-              <w:rPr>
-                <w:rFonts w:ascii="Arial" w:cs="Arial" w:eastAsia="Arial" w:hAnsi="Arial"/>
-                <w:b w:val="false"/>
-                <w:bCs w:val="false"/>
-                <w:i w:val="false"/>
-                <w:iCs w:val="false"/>
-                <w:caps w:val="false"/>
-                <w:color w:val="6B6378"/>
-                <w:sz w:val="12"/>
-                <w:szCs w:val="12"/>
-              </w:rPr>
-              <w:t xml:space="preserve">planowane</w:t>
-            </w:r>
-          </w:p>
-        </w:tc>
-      </w:tr>
-      <w:tr>
-        <w:trPr>
-          <w:cantSplit/>
-        </w:trPr>
-        <w:tc>
-          <w:tcPr>
-            <w:tcW w:type="dxa" w:w="400"/>
-            <w:tcBorders>
-              <w:top w:val="single" w:color="E3E1EC" w:sz="4"/>
-              <w:left w:val="single" w:color="E3E1EC" w:sz="4"/>
-              <w:bottom w:val="single" w:color="E3E1EC" w:sz="4"/>
-              <w:right w:val="single" w:color="E3E1EC" w:sz="4"/>
-            </w:tcBorders>
-            <w:tcMar>
-              <w:top w:type="dxa" w:w="70"/>
-              <w:left w:type="dxa" w:w="140"/>
-              <w:bottom w:type="dxa" w:w="70"/>
-              <w:right w:type="dxa" w:w="120"/>
-            </w:tcMar>
-            <w:vAlign w:val="top"/>
-          </w:tcPr>
-          <w:p>
-            <w:pPr>
-              <w:spacing w:after="0" w:before="0" w:line="250"/>
-              <w:jc w:val="left"/>
-            </w:pPr>
-            <w:r>
-              <w:rPr>
-                <w:rFonts w:ascii="Arial" w:cs="Arial" w:eastAsia="Arial" w:hAnsi="Arial"/>
-                <w:b/>
-                <w:bCs/>
-                <w:i w:val="false"/>
-                <w:iCs w:val="false"/>
-                <w:caps w:val="false"/>
-                <w:color w:val="E74509"/>
-                <w:sz w:val="15"/>
-                <w:szCs w:val="15"/>
-              </w:rPr>
-              <w:t xml:space="preserve">7</w:t>
-            </w:r>
-          </w:p>
-        </w:tc>
-        <w:tc>
-          <w:tcPr>
-            <w:tcW w:type="dxa" w:w="2550"/>
-            <w:tcBorders>
-              <w:top w:val="single" w:color="E3E1EC" w:sz="4"/>
-              <w:left w:val="single" w:color="E3E1EC" w:sz="4"/>
-              <w:bottom w:val="single" w:color="E3E1EC" w:sz="4"/>
-              <w:right w:val="single" w:color="E3E1EC" w:sz="4"/>
-            </w:tcBorders>
-            <w:tcMar>
-              <w:top w:type="dxa" w:w="70"/>
-              <w:left w:type="dxa" w:w="140"/>
-              <w:bottom w:type="dxa" w:w="70"/>
-              <w:right w:type="dxa" w:w="120"/>
-            </w:tcMar>
-            <w:vAlign w:val="top"/>
-          </w:tcPr>
-          <w:p>
-            <w:pPr>
-              <w:spacing w:after="0" w:before="0" w:line="250"/>
-              <w:jc w:val="left"/>
-            </w:pPr>
-            <w:r>
-              <w:rPr>
-                <w:rFonts w:ascii="Arial" w:cs="Arial" w:eastAsia="Arial" w:hAnsi="Arial"/>
-                <w:b/>
-                <w:bCs/>
-                <w:i w:val="false"/>
-                <w:iCs w:val="false"/>
-                <w:caps w:val="false"/>
-                <w:color w:val="1A1530"/>
-                <w:sz w:val="15"/>
-                <w:szCs w:val="15"/>
-              </w:rPr>
-              <w:t xml:space="preserve">Zapewnienie stałości, przewidywalności i struktury otoczenia</w:t>
-            </w:r>
-          </w:p>
-        </w:tc>
-        <w:tc>
-          <w:tcPr>
-            <w:tcW w:type="dxa" w:w="3500"/>
-            <w:tcBorders>
-              <w:top w:val="single" w:color="E3E1EC" w:sz="4"/>
-              <w:left w:val="single" w:color="E3E1EC" w:sz="4"/>
-              <w:bottom w:val="single" w:color="E3E1EC" w:sz="4"/>
-              <w:right w:val="single" w:color="E3E1EC" w:sz="4"/>
-            </w:tcBorders>
-            <w:tcMar>
-              <w:top w:type="dxa" w:w="70"/>
-              <w:left w:type="dxa" w:w="140"/>
-              <w:bottom w:type="dxa" w:w="70"/>
-              <w:right w:type="dxa" w:w="120"/>
-            </w:tcMar>
-            <w:vAlign w:val="top"/>
-          </w:tcPr>
-          <w:p>
-            <w:pPr>
-              <w:spacing w:after="0" w:before="0" w:line="250"/>
-              <w:jc w:val="left"/>
-            </w:pPr>
-            <w:r>
-              <w:rPr>
-                <w:rFonts w:ascii="Arial" w:cs="Arial" w:eastAsia="Arial" w:hAnsi="Arial"/>
-                <w:b w:val="false"/>
-                <w:bCs w:val="false"/>
-                <w:i w:val="false"/>
-                <w:iCs w:val="false"/>
-                <w:caps w:val="false"/>
-                <w:color w:val="1A1530"/>
-                <w:sz w:val="15"/>
-                <w:szCs w:val="15"/>
-              </w:rPr>
-              <w:t xml:space="preserve">Wizualny plan dnia na rzepy; zapowiadanie zmian; stały skład kadry; protokół wyprzedzający przed wydarzeniami grupowymi.</w:t>
-            </w:r>
-          </w:p>
-        </w:tc>
-        <w:tc>
-          <w:tcPr>
-            <w:tcW w:type="dxa" w:w="2200"/>
-            <w:tcBorders>
-              <w:top w:val="single" w:color="E3E1EC" w:sz="4"/>
-              <w:left w:val="single" w:color="E3E1EC" w:sz="4"/>
-              <w:bottom w:val="single" w:color="E3E1EC" w:sz="4"/>
-              <w:right w:val="single" w:color="E3E1EC" w:sz="4"/>
-            </w:tcBorders>
-            <w:tcMar>
-              <w:top w:type="dxa" w:w="70"/>
-              <w:left w:type="dxa" w:w="140"/>
-              <w:bottom w:type="dxa" w:w="70"/>
-              <w:right w:type="dxa" w:w="120"/>
-            </w:tcMar>
-            <w:vAlign w:val="top"/>
-          </w:tcPr>
-          <w:p>
-            <w:pPr>
-              <w:spacing w:after="0" w:before="0" w:line="250"/>
-              <w:jc w:val="left"/>
-            </w:pPr>
-            <w:r>
-              <w:rPr>
-                <w:rFonts w:ascii="Arial" w:cs="Arial" w:eastAsia="Arial" w:hAnsi="Arial"/>
-                <w:b/>
-                <w:bCs/>
-                <w:i w:val="false"/>
-                <w:iCs w:val="false"/>
-                <w:caps w:val="false"/>
-                <w:color w:val="2D1B69"/>
-                <w:sz w:val="15"/>
-                <w:szCs w:val="15"/>
-              </w:rPr>
-              <w:t xml:space="preserve">Wychowawca · codziennie</w:t>
-            </w:r>
-          </w:p>
-        </w:tc>
-        <w:tc>
-          <w:tcPr>
-            <w:tcW w:type="dxa" w:w="1256"/>
-            <w:tcBorders>
-              <w:top w:val="single" w:color="E3E1EC" w:sz="4"/>
-              <w:left w:val="single" w:color="E3E1EC" w:sz="4"/>
-              <w:bottom w:val="single" w:color="E3E1EC" w:sz="4"/>
-              <w:right w:val="single" w:color="E3E1EC" w:sz="4"/>
-            </w:tcBorders>
-            <w:tcMar>
-              <w:top w:type="dxa" w:w="70"/>
-              <w:left w:type="dxa" w:w="140"/>
-              <w:bottom w:type="dxa" w:w="70"/>
-              <w:right w:type="dxa" w:w="120"/>
-            </w:tcMar>
-            <w:vAlign w:val="top"/>
-          </w:tcPr>
-          <w:p>
-            <w:pPr>
-              <w:spacing w:after="0" w:before="0" w:line="220"/>
-              <w:jc w:val="left"/>
-            </w:pPr>
-            <w:r>
-              <w:rPr>
-                <w:rFonts w:ascii="Arial" w:cs="Arial" w:eastAsia="Arial" w:hAnsi="Arial"/>
-                <w:b w:val="false"/>
-                <w:bCs w:val="false"/>
-                <w:i w:val="false"/>
-                <w:iCs w:val="false"/>
-                <w:caps w:val="false"/>
-                <w:color w:val="B6A6DF"/>
-                <w:sz w:val="15"/>
-                <w:szCs w:val="15"/>
-              </w:rPr>
-              <w:t xml:space="preserve">☐ </w:t>
-            </w:r>
-            <w:r>
-              <w:rPr>
-                <w:rFonts w:ascii="Arial" w:cs="Arial" w:eastAsia="Arial" w:hAnsi="Arial"/>
-                <w:b w:val="false"/>
-                <w:bCs w:val="false"/>
-                <w:i w:val="false"/>
-                <w:iCs w:val="false"/>
-                <w:caps w:val="false"/>
-                <w:color w:val="6B6378"/>
-                <w:sz w:val="12"/>
-                <w:szCs w:val="12"/>
-              </w:rPr>
-              <w:t xml:space="preserve">wdrożone</w:t>
-            </w:r>
-          </w:p>
-          <w:p>
-            <w:pPr>
-              <w:spacing w:after="0" w:before="0" w:line="220"/>
-              <w:jc w:val="left"/>
-            </w:pPr>
-            <w:r>
-              <w:rPr>
-                <w:rFonts w:ascii="Arial" w:cs="Arial" w:eastAsia="Arial" w:hAnsi="Arial"/>
-                <w:b w:val="false"/>
-                <w:bCs w:val="false"/>
-                <w:i w:val="false"/>
-                <w:iCs w:val="false"/>
-                <w:caps w:val="false"/>
-                <w:color w:val="B6A6DF"/>
-                <w:sz w:val="15"/>
-                <w:szCs w:val="15"/>
-              </w:rPr>
-              <w:t xml:space="preserve">☐ </w:t>
-            </w:r>
-            <w:r>
-              <w:rPr>
-                <w:rFonts w:ascii="Arial" w:cs="Arial" w:eastAsia="Arial" w:hAnsi="Arial"/>
-                <w:b w:val="false"/>
-                <w:bCs w:val="false"/>
-                <w:i w:val="false"/>
-                <w:iCs w:val="false"/>
-                <w:caps w:val="false"/>
-                <w:color w:val="6B6378"/>
-                <w:sz w:val="12"/>
-                <w:szCs w:val="12"/>
-              </w:rPr>
-              <w:t xml:space="preserve">w trakcie</w:t>
-            </w:r>
-          </w:p>
-          <w:p>
-            <w:pPr>
-              <w:spacing w:after="0" w:before="0" w:line="220"/>
-              <w:jc w:val="left"/>
-            </w:pPr>
-            <w:r>
-              <w:rPr>
-                <w:rFonts w:ascii="Arial" w:cs="Arial" w:eastAsia="Arial" w:hAnsi="Arial"/>
-                <w:b w:val="false"/>
-                <w:bCs w:val="false"/>
-                <w:i w:val="false"/>
-                <w:iCs w:val="false"/>
-                <w:caps w:val="false"/>
-                <w:color w:val="B6A6DF"/>
-                <w:sz w:val="15"/>
-                <w:szCs w:val="15"/>
-              </w:rPr>
-              <w:t xml:space="preserve">☐ </w:t>
-            </w:r>
-            <w:r>
-              <w:rPr>
-                <w:rFonts w:ascii="Arial" w:cs="Arial" w:eastAsia="Arial" w:hAnsi="Arial"/>
-                <w:b w:val="false"/>
-                <w:bCs w:val="false"/>
-                <w:i w:val="false"/>
-                <w:iCs w:val="false"/>
-                <w:caps w:val="false"/>
-                <w:color w:val="6B6378"/>
-                <w:sz w:val="12"/>
-                <w:szCs w:val="12"/>
-              </w:rPr>
-              <w:t xml:space="preserve">planowane</w:t>
-            </w:r>
-          </w:p>
-        </w:tc>
-      </w:tr>
-      <w:tr>
-        <w:trPr>
-          <w:cantSplit/>
-        </w:trPr>
-        <w:tc>
-          <w:tcPr>
-            <w:tcW w:type="dxa" w:w="400"/>
-            <w:tcBorders>
-              <w:top w:val="single" w:color="E3E1EC" w:sz="4"/>
-              <w:left w:val="single" w:color="E3E1EC" w:sz="4"/>
-              <w:bottom w:val="single" w:color="E3E1EC" w:sz="4"/>
-              <w:right w:val="single" w:color="E3E1EC" w:sz="4"/>
-            </w:tcBorders>
-            <w:tcMar>
-              <w:top w:type="dxa" w:w="70"/>
-              <w:left w:type="dxa" w:w="140"/>
-              <w:bottom w:type="dxa" w:w="70"/>
-              <w:right w:type="dxa" w:w="120"/>
-            </w:tcMar>
-            <w:vAlign w:val="top"/>
-          </w:tcPr>
-          <w:p>
-            <w:pPr>
-              <w:spacing w:after="0" w:before="0" w:line="250"/>
-              <w:jc w:val="left"/>
-            </w:pPr>
-            <w:r>
-              <w:rPr>
-                <w:rFonts w:ascii="Arial" w:cs="Arial" w:eastAsia="Arial" w:hAnsi="Arial"/>
-                <w:b/>
-                <w:bCs/>
-                <w:i w:val="false"/>
-                <w:iCs w:val="false"/>
-                <w:caps w:val="false"/>
-                <w:color w:val="E74509"/>
-                <w:sz w:val="15"/>
-                <w:szCs w:val="15"/>
-              </w:rPr>
-              <w:t xml:space="preserve">8</w:t>
-            </w:r>
-          </w:p>
-        </w:tc>
-        <w:tc>
-          <w:tcPr>
-            <w:tcW w:type="dxa" w:w="2550"/>
-            <w:tcBorders>
-              <w:top w:val="single" w:color="E3E1EC" w:sz="4"/>
-              <w:left w:val="single" w:color="E3E1EC" w:sz="4"/>
-              <w:bottom w:val="single" w:color="E3E1EC" w:sz="4"/>
-              <w:right w:val="single" w:color="E3E1EC" w:sz="4"/>
-            </w:tcBorders>
-            <w:tcMar>
-              <w:top w:type="dxa" w:w="70"/>
-              <w:left w:type="dxa" w:w="140"/>
-              <w:bottom w:type="dxa" w:w="70"/>
-              <w:right w:type="dxa" w:w="120"/>
-            </w:tcMar>
-            <w:vAlign w:val="top"/>
-          </w:tcPr>
-          <w:p>
-            <w:pPr>
-              <w:spacing w:after="0" w:before="0" w:line="250"/>
-              <w:jc w:val="left"/>
-            </w:pPr>
-            <w:r>
-              <w:rPr>
-                <w:rFonts w:ascii="Arial" w:cs="Arial" w:eastAsia="Arial" w:hAnsi="Arial"/>
-                <w:b/>
-                <w:bCs/>
-                <w:i w:val="false"/>
-                <w:iCs w:val="false"/>
-                <w:caps w:val="false"/>
-                <w:color w:val="1A1530"/>
-                <w:sz w:val="15"/>
-                <w:szCs w:val="15"/>
-              </w:rPr>
-              <w:t xml:space="preserve">Ścisła współpraca z rodzicami i ujednolicenie oddziaływań</w:t>
-            </w:r>
-          </w:p>
-        </w:tc>
-        <w:tc>
-          <w:tcPr>
-            <w:tcW w:type="dxa" w:w="3500"/>
-            <w:tcBorders>
-              <w:top w:val="single" w:color="E3E1EC" w:sz="4"/>
-              <w:left w:val="single" w:color="E3E1EC" w:sz="4"/>
-              <w:bottom w:val="single" w:color="E3E1EC" w:sz="4"/>
-              <w:right w:val="single" w:color="E3E1EC" w:sz="4"/>
-            </w:tcBorders>
-            <w:tcMar>
-              <w:top w:type="dxa" w:w="70"/>
-              <w:left w:type="dxa" w:w="140"/>
-              <w:bottom w:type="dxa" w:w="70"/>
-              <w:right w:type="dxa" w:w="120"/>
-            </w:tcMar>
-            <w:vAlign w:val="top"/>
-          </w:tcPr>
-          <w:p>
-            <w:pPr>
-              <w:spacing w:after="0" w:before="0" w:line="250"/>
-              <w:jc w:val="left"/>
-            </w:pPr>
-            <w:r>
-              <w:rPr>
-                <w:rFonts w:ascii="Arial" w:cs="Arial" w:eastAsia="Arial" w:hAnsi="Arial"/>
-                <w:b w:val="false"/>
-                <w:bCs w:val="false"/>
-                <w:i w:val="false"/>
-                <w:iCs w:val="false"/>
-                <w:caps w:val="false"/>
-                <w:color w:val="1A1530"/>
-                <w:sz w:val="15"/>
-                <w:szCs w:val="15"/>
-              </w:rPr>
-              <w:t xml:space="preserve">Cotygodniowe konsultacje; zeszyt korespondencji dom–placówka; wspólny system komunikatów i wzmocnień; udział rodziców w ewaluacji IPET.</w:t>
+              <w:t xml:space="preserve">Cotygodniowe konsultacje; wspólny system komunikatów i wzmocnień; udział rodziców w ewaluacji IPET.</w:t>
             </w:r>
           </w:p>
         </w:tc>

</xml_diff>

<commit_message>
Word: blok B (pomoc psychologiczno-pedagogiczna) na osobnej stronie
Co-Authored-By: Claude Fable 5.1 <noreply@anthropic.com>
Claude-Session: https://claude.ai/code/session_01FpF7vCSW7jSofte5z6wEKy
</commit_message>
<xml_diff>
--- a/eduplaner2026/raport_oceny_funkcjonalnej/Raport_Oceny_Funkcjonalnej.docx
+++ b/eduplaner2026/raport_oceny_funkcjonalnej/Raport_Oceny_Funkcjonalnej.docx
@@ -25067,6 +25067,448 @@
         </w:tc>
       </w:tr>
     </w:tbl>
+    <w:p>
+      <w:pPr>
+        <w:pageBreakBefore/>
+        <w:spacing w:after="0" w:before="0" w:line="20" w:lineRule="exact"/>
+      </w:pPr>
+      <w:r>
+        <w:rPr>
+          <w:rFonts w:ascii="Arial" w:cs="Arial" w:eastAsia="Arial" w:hAnsi="Arial"/>
+          <w:b w:val="false"/>
+          <w:bCs w:val="false"/>
+          <w:i w:val="false"/>
+          <w:iCs w:val="false"/>
+          <w:caps w:val="false"/>
+          <w:color w:val="1A1530"/>
+          <w:sz w:val="2"/>
+          <w:szCs w:val="2"/>
+        </w:rPr>
+        <w:t xml:space="preserve"/>
+      </w:r>
+    </w:p>
+    <w:tbl>
+      <w:tblPr>
+        <w:tblW w:type="dxa" w:w="9906"/>
+        <w:tblBorders>
+          <w:top w:val="single" w:color="auto" w:sz="4"/>
+          <w:left w:val="single" w:color="auto" w:sz="4"/>
+          <w:bottom w:val="single" w:color="auto" w:sz="4"/>
+          <w:right w:val="single" w:color="auto" w:sz="4"/>
+          <w:insideH w:val="single" w:color="auto" w:sz="4"/>
+          <w:insideV w:val="single" w:color="auto" w:sz="4"/>
+        </w:tblBorders>
+      </w:tblPr>
+      <w:tblGrid>
+        <w:gridCol w:w="700"/>
+        <w:gridCol w:w="6200"/>
+        <w:gridCol w:w="3006"/>
+      </w:tblGrid>
+      <w:tr>
+        <w:trPr>
+          <w:cantSplit/>
+        </w:trPr>
+        <w:tc>
+          <w:tcPr>
+            <w:tcW w:type="dxa" w:w="700"/>
+            <w:tcBorders>
+              <w:top w:val="nil"/>
+              <w:left w:val="nil"/>
+              <w:bottom w:val="nil"/>
+              <w:right w:val="nil"/>
+            </w:tcBorders>
+            <w:shd w:fill="2D1B69" w:color="auto" w:val="clear"/>
+            <w:tcMar>
+              <w:top w:type="dxa" w:w="120"/>
+              <w:left w:type="dxa" w:w="40"/>
+              <w:bottom w:type="dxa" w:w="120"/>
+              <w:right w:type="dxa" w:w="40"/>
+            </w:tcMar>
+            <w:vAlign w:val="center"/>
+          </w:tcPr>
+          <w:p>
+            <w:pPr>
+              <w:spacing w:after="0" w:before="0" w:line="276"/>
+              <w:jc w:val="center"/>
+            </w:pPr>
+            <w:r>
+              <w:rPr>
+                <w:rFonts w:ascii="Arial" w:cs="Arial" w:eastAsia="Arial" w:hAnsi="Arial"/>
+                <w:b/>
+                <w:bCs/>
+                <w:i w:val="false"/>
+                <w:iCs w:val="false"/>
+                <w:caps w:val="false"/>
+                <w:color w:val="FFFFFF"/>
+                <w:sz w:val="12"/>
+                <w:szCs w:val="12"/>
+              </w:rPr>
+              <w:t xml:space="preserve">PCTP</w:t>
+            </w:r>
+          </w:p>
+        </w:tc>
+        <w:tc>
+          <w:tcPr>
+            <w:tcW w:type="dxa" w:w="6200"/>
+            <w:tcBorders>
+              <w:top w:val="nil"/>
+              <w:left w:val="nil"/>
+              <w:bottom w:val="nil"/>
+              <w:right w:val="nil"/>
+            </w:tcBorders>
+            <w:tcMar>
+              <w:top w:type="dxa" w:w="0"/>
+              <w:left w:type="dxa" w:w="160"/>
+              <w:bottom w:type="dxa" w:w="0"/>
+              <w:right w:type="dxa" w:w="0"/>
+            </w:tcMar>
+            <w:vAlign w:val="center"/>
+          </w:tcPr>
+          <w:p>
+            <w:pPr>
+              <w:spacing w:after="20" w:before="0" w:line="276"/>
+              <w:jc w:val="left"/>
+            </w:pPr>
+            <w:r>
+              <w:rPr>
+                <w:rFonts w:ascii="Arial" w:cs="Arial" w:eastAsia="Arial" w:hAnsi="Arial"/>
+                <w:b/>
+                <w:bCs/>
+                <w:i w:val="false"/>
+                <w:iCs w:val="false"/>
+                <w:caps w:val="false"/>
+                <w:color w:val="2D1B69"/>
+                <w:sz w:val="26"/>
+                <w:szCs w:val="26"/>
+              </w:rPr>
+              <w:t xml:space="preserve">EduPlaner 2026</w:t>
+            </w:r>
+          </w:p>
+          <w:p>
+            <w:pPr>
+              <w:spacing w:after="0" w:before="0" w:line="276"/>
+              <w:jc w:val="left"/>
+            </w:pPr>
+            <w:r>
+              <w:rPr>
+                <w:rFonts w:ascii="Arial" w:cs="Arial" w:eastAsia="Arial" w:hAnsi="Arial"/>
+                <w:b w:val="false"/>
+                <w:bCs w:val="false"/>
+                <w:i w:val="false"/>
+                <w:iCs w:val="false"/>
+                <w:caps/>
+                <w:color w:val="6B6378"/>
+                <w:spacing w:val="14"/>
+                <w:sz w:val="12"/>
+                <w:szCs w:val="12"/>
+              </w:rPr>
+              <w:t xml:space="preserve">Raport Oceny Funkcjonalnej · Część III · Pomoc psychologiczno-pedagogiczna</w:t>
+            </w:r>
+          </w:p>
+        </w:tc>
+        <w:tc>
+          <w:tcPr>
+            <w:tcW w:type="dxa" w:w="3006"/>
+            <w:tcBorders>
+              <w:top w:val="nil"/>
+              <w:left w:val="nil"/>
+              <w:bottom w:val="nil"/>
+              <w:right w:val="nil"/>
+            </w:tcBorders>
+            <w:tcMar>
+              <w:top w:type="dxa" w:w="0"/>
+              <w:left w:type="dxa" w:w="0"/>
+              <w:bottom w:type="dxa" w:w="0"/>
+              <w:right w:type="dxa" w:w="0"/>
+            </w:tcMar>
+            <w:vAlign w:val="center"/>
+          </w:tcPr>
+          <w:p>
+            <w:pPr>
+              <w:spacing w:after="60" w:before="0" w:line="276"/>
+              <w:jc w:val="right"/>
+            </w:pPr>
+            <w:r>
+              <w:rPr>
+                <w:rFonts w:ascii="Arial" w:cs="Arial" w:eastAsia="Arial" w:hAnsi="Arial"/>
+                <w:b/>
+                <w:bCs/>
+                <w:i w:val="false"/>
+                <w:iCs w:val="false"/>
+                <w:caps w:val="false"/>
+                <w:color w:val="FFFFFF"/>
+                <w:spacing w:val="10"/>
+                <w:sz w:val="13"/>
+                <w:szCs w:val="13"/>
+                <w:shd w:fill="E74509" w:color="auto" w:val="clear"/>
+              </w:rPr>
+              <w:t xml:space="preserve">  RAPORT · 2026  </w:t>
+            </w:r>
+          </w:p>
+          <w:p>
+            <w:pPr>
+              <w:spacing w:after="0" w:before="0" w:line="276"/>
+              <w:jc w:val="right"/>
+            </w:pPr>
+            <w:r>
+              <w:rPr>
+                <w:rFonts w:ascii="Arial" w:cs="Arial" w:eastAsia="Arial" w:hAnsi="Arial"/>
+                <w:b w:val="false"/>
+                <w:bCs w:val="false"/>
+                <w:i w:val="false"/>
+                <w:iCs w:val="false"/>
+                <w:caps w:val="false"/>
+                <w:color w:val="6B6378"/>
+                <w:spacing w:val="14"/>
+                <w:sz w:val="11"/>
+                <w:szCs w:val="11"/>
+              </w:rPr>
+              <w:t xml:space="preserve">DOKUMENT DLA RODZICA · 2026</w:t>
+            </w:r>
+          </w:p>
+        </w:tc>
+      </w:tr>
+    </w:tbl>
+    <w:p>
+      <w:pPr>
+        <w:pBdr>
+          <w:bottom w:val="single" w:color="2D1B69" w:sz="12" w:space="1"/>
+        </w:pBdr>
+        <w:spacing w:after="160" w:before="60"/>
+      </w:pPr>
+    </w:p>
+    <w:tbl>
+      <w:tblPr>
+        <w:tblW w:type="dxa" w:w="9706"/>
+        <w:tblBorders>
+          <w:top w:val="single" w:color="auto" w:sz="4"/>
+          <w:left w:val="single" w:color="auto" w:sz="4"/>
+          <w:bottom w:val="single" w:color="auto" w:sz="4"/>
+          <w:right w:val="single" w:color="auto" w:sz="4"/>
+          <w:insideH w:val="single" w:color="auto" w:sz="4"/>
+          <w:insideV w:val="single" w:color="auto" w:sz="4"/>
+        </w:tblBorders>
+      </w:tblPr>
+      <w:tblGrid>
+        <w:gridCol w:w="3900"/>
+        <w:gridCol w:w="2900"/>
+        <w:gridCol w:w="2906"/>
+      </w:tblGrid>
+      <w:tr>
+        <w:trPr>
+          <w:cantSplit/>
+        </w:trPr>
+        <w:tc>
+          <w:tcPr>
+            <w:tcW w:type="dxa" w:w="3900"/>
+            <w:tcBorders>
+              <w:top w:val="single" w:color="FFFFFF" w:sz="12"/>
+              <w:left w:val="single" w:color="FFFFFF" w:sz="12"/>
+              <w:bottom w:val="single" w:color="FFFFFF" w:sz="12"/>
+              <w:right w:val="single" w:color="FFFFFF" w:sz="12"/>
+            </w:tcBorders>
+            <w:shd w:fill="EFE9F9" w:color="auto" w:val="clear"/>
+            <w:tcMar>
+              <w:top w:type="dxa" w:w="110"/>
+              <w:left w:type="dxa" w:w="180"/>
+              <w:bottom w:type="dxa" w:w="110"/>
+              <w:right w:type="dxa" w:w="120"/>
+            </w:tcMar>
+            <w:vAlign w:val="top"/>
+          </w:tcPr>
+          <w:p>
+            <w:pPr>
+              <w:spacing w:after="0" w:before="0" w:line="276"/>
+              <w:jc w:val="left"/>
+            </w:pPr>
+            <w:r>
+              <w:rPr>
+                <w:rFonts w:ascii="Arial" w:cs="Arial" w:eastAsia="Arial" w:hAnsi="Arial"/>
+                <w:b/>
+                <w:bCs/>
+                <w:i w:val="false"/>
+                <w:iCs w:val="false"/>
+                <w:caps w:val="false"/>
+                <w:color w:val="7D6FB0"/>
+                <w:spacing w:val="14"/>
+                <w:sz w:val="12"/>
+                <w:szCs w:val="12"/>
+              </w:rPr>
+              <w:t xml:space="preserve">DOTYCZY DZIECKA</w:t>
+            </w:r>
+            <w:r>
+              <w:rPr>
+                <w:rFonts w:ascii="Arial" w:cs="Arial" w:eastAsia="Arial" w:hAnsi="Arial"/>
+                <w:b w:val="false"/>
+                <w:bCs w:val="false"/>
+                <w:i w:val="false"/>
+                <w:iCs w:val="false"/>
+                <w:caps w:val="false"/>
+                <w:color w:val="B6A6DF"/>
+                <w:sz w:val="14"/>
+                <w:szCs w:val="14"/>
+              </w:rPr>
+              <w:t xml:space="preserve">  ....................................................</w:t>
+            </w:r>
+            <w:r>
+              <w:rPr>
+                <w:rFonts w:ascii="Arial" w:cs="Arial" w:eastAsia="Arial" w:hAnsi="Arial"/>
+                <w:b w:val="false"/>
+                <w:bCs w:val="false"/>
+                <w:i w:val="false"/>
+                <w:iCs w:val="false"/>
+                <w:caps w:val="false"/>
+                <w:color w:val="6B6378"/>
+                <w:sz w:val="14"/>
+                <w:szCs w:val="14"/>
+              </w:rPr>
+              <w:t xml:space="preserve"/>
+            </w:r>
+          </w:p>
+        </w:tc>
+        <w:tc>
+          <w:tcPr>
+            <w:tcW w:type="dxa" w:w="2900"/>
+            <w:tcBorders>
+              <w:top w:val="single" w:color="FFFFFF" w:sz="12"/>
+              <w:left w:val="single" w:color="FFFFFF" w:sz="12"/>
+              <w:bottom w:val="single" w:color="FFFFFF" w:sz="12"/>
+              <w:right w:val="single" w:color="FFFFFF" w:sz="12"/>
+            </w:tcBorders>
+            <w:shd w:fill="EFE9F9" w:color="auto" w:val="clear"/>
+            <w:tcMar>
+              <w:top w:type="dxa" w:w="110"/>
+              <w:left w:type="dxa" w:w="180"/>
+              <w:bottom w:type="dxa" w:w="110"/>
+              <w:right w:type="dxa" w:w="120"/>
+            </w:tcMar>
+            <w:vAlign w:val="top"/>
+          </w:tcPr>
+          <w:p>
+            <w:pPr>
+              <w:spacing w:after="0" w:before="0" w:line="276"/>
+              <w:jc w:val="left"/>
+            </w:pPr>
+            <w:r>
+              <w:rPr>
+                <w:rFonts w:ascii="Arial" w:cs="Arial" w:eastAsia="Arial" w:hAnsi="Arial"/>
+                <w:b/>
+                <w:bCs/>
+                <w:i w:val="false"/>
+                <w:iCs w:val="false"/>
+                <w:caps w:val="false"/>
+                <w:color w:val="7D6FB0"/>
+                <w:spacing w:val="14"/>
+                <w:sz w:val="12"/>
+                <w:szCs w:val="12"/>
+              </w:rPr>
+              <w:t xml:space="preserve">GRUPA / KLASA</w:t>
+            </w:r>
+            <w:r>
+              <w:rPr>
+                <w:rFonts w:ascii="Arial" w:cs="Arial" w:eastAsia="Arial" w:hAnsi="Arial"/>
+                <w:b w:val="false"/>
+                <w:bCs w:val="false"/>
+                <w:i w:val="false"/>
+                <w:iCs w:val="false"/>
+                <w:caps w:val="false"/>
+                <w:color w:val="B6A6DF"/>
+                <w:sz w:val="14"/>
+                <w:szCs w:val="14"/>
+              </w:rPr>
+              <w:t xml:space="preserve">  ..............................</w:t>
+            </w:r>
+            <w:r>
+              <w:rPr>
+                <w:rFonts w:ascii="Arial" w:cs="Arial" w:eastAsia="Arial" w:hAnsi="Arial"/>
+                <w:b w:val="false"/>
+                <w:bCs w:val="false"/>
+                <w:i w:val="false"/>
+                <w:iCs w:val="false"/>
+                <w:caps w:val="false"/>
+                <w:color w:val="6B6378"/>
+                <w:sz w:val="14"/>
+                <w:szCs w:val="14"/>
+              </w:rPr>
+              <w:t xml:space="preserve"/>
+            </w:r>
+          </w:p>
+        </w:tc>
+        <w:tc>
+          <w:tcPr>
+            <w:tcW w:type="dxa" w:w="2906"/>
+            <w:tcBorders>
+              <w:top w:val="single" w:color="FFFFFF" w:sz="12"/>
+              <w:left w:val="single" w:color="FFFFFF" w:sz="12"/>
+              <w:bottom w:val="single" w:color="FFFFFF" w:sz="12"/>
+              <w:right w:val="single" w:color="FFFFFF" w:sz="12"/>
+            </w:tcBorders>
+            <w:shd w:fill="EFE9F9" w:color="auto" w:val="clear"/>
+            <w:tcMar>
+              <w:top w:type="dxa" w:w="110"/>
+              <w:left w:type="dxa" w:w="180"/>
+              <w:bottom w:type="dxa" w:w="110"/>
+              <w:right w:type="dxa" w:w="120"/>
+            </w:tcMar>
+            <w:vAlign w:val="top"/>
+          </w:tcPr>
+          <w:p>
+            <w:pPr>
+              <w:spacing w:after="0" w:before="0" w:line="276"/>
+              <w:jc w:val="left"/>
+            </w:pPr>
+            <w:r>
+              <w:rPr>
+                <w:rFonts w:ascii="Arial" w:cs="Arial" w:eastAsia="Arial" w:hAnsi="Arial"/>
+                <w:b/>
+                <w:bCs/>
+                <w:i w:val="false"/>
+                <w:iCs w:val="false"/>
+                <w:caps w:val="false"/>
+                <w:color w:val="7D6FB0"/>
+                <w:spacing w:val="14"/>
+                <w:sz w:val="12"/>
+                <w:szCs w:val="12"/>
+              </w:rPr>
+              <w:t xml:space="preserve">DATA</w:t>
+            </w:r>
+            <w:r>
+              <w:rPr>
+                <w:rFonts w:ascii="Arial" w:cs="Arial" w:eastAsia="Arial" w:hAnsi="Arial"/>
+                <w:b w:val="false"/>
+                <w:bCs w:val="false"/>
+                <w:i w:val="false"/>
+                <w:iCs w:val="false"/>
+                <w:caps w:val="false"/>
+                <w:color w:val="B6A6DF"/>
+                <w:sz w:val="14"/>
+                <w:szCs w:val="14"/>
+              </w:rPr>
+              <w:t xml:space="preserve">  ..............................</w:t>
+            </w:r>
+            <w:r>
+              <w:rPr>
+                <w:rFonts w:ascii="Arial" w:cs="Arial" w:eastAsia="Arial" w:hAnsi="Arial"/>
+                <w:b w:val="false"/>
+                <w:bCs w:val="false"/>
+                <w:i w:val="false"/>
+                <w:iCs w:val="false"/>
+                <w:caps w:val="false"/>
+                <w:color w:val="6B6378"/>
+                <w:sz w:val="14"/>
+                <w:szCs w:val="14"/>
+              </w:rPr>
+              <w:t xml:space="preserve">  r.</w:t>
+            </w:r>
+          </w:p>
+        </w:tc>
+      </w:tr>
+    </w:tbl>
+    <w:p>
+      <w:pPr>
+        <w:spacing w:after="120" w:before="0"/>
+      </w:pPr>
+    </w:p>
     <w:p>
       <w:pPr>
         <w:keepNext/>

</xml_diff>

<commit_message>
Raport Oceny Funkcjonalnej: podstawy prawne i przewodnik czytania
Nowa strona 2: tabela aktów prawnych (rozp. ME z 2.03.2026 poz. 428,
Prawo oświatowe art. 127, rozp. o kształceniu specjalnym § 6–7,
rozp. o PPP, podstawa programowa, ICF, RODO) z odesłaniem do sekcji
oraz 5 kroków „jak czytać raport”. Plakietka podstawy prawnej pod
każdą sekcją 4–16. Treść w raport_data.json, HTML/PDF 20 stron,
Word 21 stron.

Co-Authored-By: Claude Fable 5.1 <noreply@anthropic.com>
Claude-Session: https://claude.ai/code/session_01FpF7vCSW7jSofte5z6wEKy
</commit_message>
<xml_diff>
--- a/eduplaner2026/raport_oceny_funkcjonalnej/Raport_Oceny_Funkcjonalnej.docx
+++ b/eduplaner2026/raport_oceny_funkcjonalnej/Raport_Oceny_Funkcjonalnej.docx
@@ -2474,6 +2474,2071 @@
                 <w:sz w:val="12"/>
                 <w:szCs w:val="12"/>
               </w:rPr>
+              <w:t xml:space="preserve">Raport Oceny Funkcjonalnej · Podstawy prawne i jak czytać raport</w:t>
+            </w:r>
+          </w:p>
+        </w:tc>
+        <w:tc>
+          <w:tcPr>
+            <w:tcW w:type="dxa" w:w="3006"/>
+            <w:tcBorders>
+              <w:top w:val="nil"/>
+              <w:left w:val="nil"/>
+              <w:bottom w:val="nil"/>
+              <w:right w:val="nil"/>
+            </w:tcBorders>
+            <w:tcMar>
+              <w:top w:type="dxa" w:w="0"/>
+              <w:left w:type="dxa" w:w="0"/>
+              <w:bottom w:type="dxa" w:w="0"/>
+              <w:right w:type="dxa" w:w="0"/>
+            </w:tcMar>
+            <w:vAlign w:val="center"/>
+          </w:tcPr>
+          <w:p>
+            <w:pPr>
+              <w:spacing w:after="60" w:before="0" w:line="276"/>
+              <w:jc w:val="right"/>
+            </w:pPr>
+            <w:r>
+              <w:rPr>
+                <w:rFonts w:ascii="Arial" w:cs="Arial" w:eastAsia="Arial" w:hAnsi="Arial"/>
+                <w:b/>
+                <w:bCs/>
+                <w:i w:val="false"/>
+                <w:iCs w:val="false"/>
+                <w:caps w:val="false"/>
+                <w:color w:val="FFFFFF"/>
+                <w:spacing w:val="10"/>
+                <w:sz w:val="13"/>
+                <w:szCs w:val="13"/>
+                <w:shd w:fill="E74509" w:color="auto" w:val="clear"/>
+              </w:rPr>
+              <w:t xml:space="preserve">  RAPORT · 2026  </w:t>
+            </w:r>
+          </w:p>
+          <w:p>
+            <w:pPr>
+              <w:spacing w:after="0" w:before="0" w:line="276"/>
+              <w:jc w:val="right"/>
+            </w:pPr>
+            <w:r>
+              <w:rPr>
+                <w:rFonts w:ascii="Arial" w:cs="Arial" w:eastAsia="Arial" w:hAnsi="Arial"/>
+                <w:b w:val="false"/>
+                <w:bCs w:val="false"/>
+                <w:i w:val="false"/>
+                <w:iCs w:val="false"/>
+                <w:caps w:val="false"/>
+                <w:color w:val="6B6378"/>
+                <w:spacing w:val="14"/>
+                <w:sz w:val="11"/>
+                <w:szCs w:val="11"/>
+              </w:rPr>
+              <w:t xml:space="preserve">DOKUMENT DLA RODZICA · 2026</w:t>
+            </w:r>
+          </w:p>
+        </w:tc>
+      </w:tr>
+    </w:tbl>
+    <w:p>
+      <w:pPr>
+        <w:pBdr>
+          <w:bottom w:val="single" w:color="2D1B69" w:sz="12" w:space="1"/>
+        </w:pBdr>
+        <w:spacing w:after="160" w:before="60"/>
+      </w:pPr>
+    </w:p>
+    <w:tbl>
+      <w:tblPr>
+        <w:tblW w:type="dxa" w:w="9706"/>
+        <w:tblBorders>
+          <w:top w:val="single" w:color="auto" w:sz="4"/>
+          <w:left w:val="single" w:color="auto" w:sz="4"/>
+          <w:bottom w:val="single" w:color="auto" w:sz="4"/>
+          <w:right w:val="single" w:color="auto" w:sz="4"/>
+          <w:insideH w:val="single" w:color="auto" w:sz="4"/>
+          <w:insideV w:val="single" w:color="auto" w:sz="4"/>
+        </w:tblBorders>
+      </w:tblPr>
+      <w:tblGrid>
+        <w:gridCol w:w="3900"/>
+        <w:gridCol w:w="2900"/>
+        <w:gridCol w:w="2906"/>
+      </w:tblGrid>
+      <w:tr>
+        <w:trPr>
+          <w:cantSplit/>
+        </w:trPr>
+        <w:tc>
+          <w:tcPr>
+            <w:tcW w:type="dxa" w:w="3900"/>
+            <w:tcBorders>
+              <w:top w:val="single" w:color="FFFFFF" w:sz="12"/>
+              <w:left w:val="single" w:color="FFFFFF" w:sz="12"/>
+              <w:bottom w:val="single" w:color="FFFFFF" w:sz="12"/>
+              <w:right w:val="single" w:color="FFFFFF" w:sz="12"/>
+            </w:tcBorders>
+            <w:shd w:fill="EFE9F9" w:color="auto" w:val="clear"/>
+            <w:tcMar>
+              <w:top w:type="dxa" w:w="110"/>
+              <w:left w:type="dxa" w:w="180"/>
+              <w:bottom w:type="dxa" w:w="110"/>
+              <w:right w:type="dxa" w:w="120"/>
+            </w:tcMar>
+            <w:vAlign w:val="top"/>
+          </w:tcPr>
+          <w:p>
+            <w:pPr>
+              <w:spacing w:after="0" w:before="0" w:line="276"/>
+              <w:jc w:val="left"/>
+            </w:pPr>
+            <w:r>
+              <w:rPr>
+                <w:rFonts w:ascii="Arial" w:cs="Arial" w:eastAsia="Arial" w:hAnsi="Arial"/>
+                <w:b/>
+                <w:bCs/>
+                <w:i w:val="false"/>
+                <w:iCs w:val="false"/>
+                <w:caps w:val="false"/>
+                <w:color w:val="7D6FB0"/>
+                <w:spacing w:val="14"/>
+                <w:sz w:val="12"/>
+                <w:szCs w:val="12"/>
+              </w:rPr>
+              <w:t xml:space="preserve">DOTYCZY DZIECKA</w:t>
+            </w:r>
+            <w:r>
+              <w:rPr>
+                <w:rFonts w:ascii="Arial" w:cs="Arial" w:eastAsia="Arial" w:hAnsi="Arial"/>
+                <w:b w:val="false"/>
+                <w:bCs w:val="false"/>
+                <w:i w:val="false"/>
+                <w:iCs w:val="false"/>
+                <w:caps w:val="false"/>
+                <w:color w:val="B6A6DF"/>
+                <w:sz w:val="14"/>
+                <w:szCs w:val="14"/>
+              </w:rPr>
+              <w:t xml:space="preserve">  ....................................................</w:t>
+            </w:r>
+            <w:r>
+              <w:rPr>
+                <w:rFonts w:ascii="Arial" w:cs="Arial" w:eastAsia="Arial" w:hAnsi="Arial"/>
+                <w:b w:val="false"/>
+                <w:bCs w:val="false"/>
+                <w:i w:val="false"/>
+                <w:iCs w:val="false"/>
+                <w:caps w:val="false"/>
+                <w:color w:val="6B6378"/>
+                <w:sz w:val="14"/>
+                <w:szCs w:val="14"/>
+              </w:rPr>
+              <w:t xml:space="preserve"/>
+            </w:r>
+          </w:p>
+        </w:tc>
+        <w:tc>
+          <w:tcPr>
+            <w:tcW w:type="dxa" w:w="2900"/>
+            <w:tcBorders>
+              <w:top w:val="single" w:color="FFFFFF" w:sz="12"/>
+              <w:left w:val="single" w:color="FFFFFF" w:sz="12"/>
+              <w:bottom w:val="single" w:color="FFFFFF" w:sz="12"/>
+              <w:right w:val="single" w:color="FFFFFF" w:sz="12"/>
+            </w:tcBorders>
+            <w:shd w:fill="EFE9F9" w:color="auto" w:val="clear"/>
+            <w:tcMar>
+              <w:top w:type="dxa" w:w="110"/>
+              <w:left w:type="dxa" w:w="180"/>
+              <w:bottom w:type="dxa" w:w="110"/>
+              <w:right w:type="dxa" w:w="120"/>
+            </w:tcMar>
+            <w:vAlign w:val="top"/>
+          </w:tcPr>
+          <w:p>
+            <w:pPr>
+              <w:spacing w:after="0" w:before="0" w:line="276"/>
+              <w:jc w:val="left"/>
+            </w:pPr>
+            <w:r>
+              <w:rPr>
+                <w:rFonts w:ascii="Arial" w:cs="Arial" w:eastAsia="Arial" w:hAnsi="Arial"/>
+                <w:b/>
+                <w:bCs/>
+                <w:i w:val="false"/>
+                <w:iCs w:val="false"/>
+                <w:caps w:val="false"/>
+                <w:color w:val="7D6FB0"/>
+                <w:spacing w:val="14"/>
+                <w:sz w:val="12"/>
+                <w:szCs w:val="12"/>
+              </w:rPr>
+              <w:t xml:space="preserve">GRUPA / KLASA</w:t>
+            </w:r>
+            <w:r>
+              <w:rPr>
+                <w:rFonts w:ascii="Arial" w:cs="Arial" w:eastAsia="Arial" w:hAnsi="Arial"/>
+                <w:b w:val="false"/>
+                <w:bCs w:val="false"/>
+                <w:i w:val="false"/>
+                <w:iCs w:val="false"/>
+                <w:caps w:val="false"/>
+                <w:color w:val="B6A6DF"/>
+                <w:sz w:val="14"/>
+                <w:szCs w:val="14"/>
+              </w:rPr>
+              <w:t xml:space="preserve">  ..............................</w:t>
+            </w:r>
+            <w:r>
+              <w:rPr>
+                <w:rFonts w:ascii="Arial" w:cs="Arial" w:eastAsia="Arial" w:hAnsi="Arial"/>
+                <w:b w:val="false"/>
+                <w:bCs w:val="false"/>
+                <w:i w:val="false"/>
+                <w:iCs w:val="false"/>
+                <w:caps w:val="false"/>
+                <w:color w:val="6B6378"/>
+                <w:sz w:val="14"/>
+                <w:szCs w:val="14"/>
+              </w:rPr>
+              <w:t xml:space="preserve"/>
+            </w:r>
+          </w:p>
+        </w:tc>
+        <w:tc>
+          <w:tcPr>
+            <w:tcW w:type="dxa" w:w="2906"/>
+            <w:tcBorders>
+              <w:top w:val="single" w:color="FFFFFF" w:sz="12"/>
+              <w:left w:val="single" w:color="FFFFFF" w:sz="12"/>
+              <w:bottom w:val="single" w:color="FFFFFF" w:sz="12"/>
+              <w:right w:val="single" w:color="FFFFFF" w:sz="12"/>
+            </w:tcBorders>
+            <w:shd w:fill="EFE9F9" w:color="auto" w:val="clear"/>
+            <w:tcMar>
+              <w:top w:type="dxa" w:w="110"/>
+              <w:left w:type="dxa" w:w="180"/>
+              <w:bottom w:type="dxa" w:w="110"/>
+              <w:right w:type="dxa" w:w="120"/>
+            </w:tcMar>
+            <w:vAlign w:val="top"/>
+          </w:tcPr>
+          <w:p>
+            <w:pPr>
+              <w:spacing w:after="0" w:before="0" w:line="276"/>
+              <w:jc w:val="left"/>
+            </w:pPr>
+            <w:r>
+              <w:rPr>
+                <w:rFonts w:ascii="Arial" w:cs="Arial" w:eastAsia="Arial" w:hAnsi="Arial"/>
+                <w:b/>
+                <w:bCs/>
+                <w:i w:val="false"/>
+                <w:iCs w:val="false"/>
+                <w:caps w:val="false"/>
+                <w:color w:val="7D6FB0"/>
+                <w:spacing w:val="14"/>
+                <w:sz w:val="12"/>
+                <w:szCs w:val="12"/>
+              </w:rPr>
+              <w:t xml:space="preserve">DATA</w:t>
+            </w:r>
+            <w:r>
+              <w:rPr>
+                <w:rFonts w:ascii="Arial" w:cs="Arial" w:eastAsia="Arial" w:hAnsi="Arial"/>
+                <w:b w:val="false"/>
+                <w:bCs w:val="false"/>
+                <w:i w:val="false"/>
+                <w:iCs w:val="false"/>
+                <w:caps w:val="false"/>
+                <w:color w:val="B6A6DF"/>
+                <w:sz w:val="14"/>
+                <w:szCs w:val="14"/>
+              </w:rPr>
+              <w:t xml:space="preserve">  ..............................</w:t>
+            </w:r>
+            <w:r>
+              <w:rPr>
+                <w:rFonts w:ascii="Arial" w:cs="Arial" w:eastAsia="Arial" w:hAnsi="Arial"/>
+                <w:b w:val="false"/>
+                <w:bCs w:val="false"/>
+                <w:i w:val="false"/>
+                <w:iCs w:val="false"/>
+                <w:caps w:val="false"/>
+                <w:color w:val="6B6378"/>
+                <w:sz w:val="14"/>
+                <w:szCs w:val="14"/>
+              </w:rPr>
+              <w:t xml:space="preserve">  r.</w:t>
+            </w:r>
+          </w:p>
+        </w:tc>
+      </w:tr>
+    </w:tbl>
+    <w:p>
+      <w:pPr>
+        <w:spacing w:after="120" w:before="0"/>
+      </w:pPr>
+    </w:p>
+    <w:p>
+      <w:pPr>
+        <w:keepNext/>
+        <w:pBdr>
+          <w:bottom w:val="single" w:color="D9D0F0" w:sz="4" w:space="6"/>
+        </w:pBdr>
+        <w:spacing w:after="140" w:before="200"/>
+      </w:pPr>
+      <w:r>
+        <w:rPr>
+          <w:rFonts w:ascii="Arial" w:cs="Arial" w:eastAsia="Arial" w:hAnsi="Arial"/>
+          <w:b/>
+          <w:bCs/>
+          <w:i w:val="false"/>
+          <w:iCs w:val="false"/>
+          <w:caps w:val="false"/>
+          <w:color w:val="FFFFFF"/>
+          <w:sz w:val="20"/>
+          <w:szCs w:val="20"/>
+          <w:shd w:fill="E74509" w:color="auto" w:val="clear"/>
+        </w:rPr>
+        <w:t xml:space="preserve"> § </w:t>
+      </w:r>
+      <w:r>
+        <w:rPr>
+          <w:rFonts w:ascii="Arial" w:cs="Arial" w:eastAsia="Arial" w:hAnsi="Arial"/>
+          <w:b w:val="false"/>
+          <w:bCs w:val="false"/>
+          <w:i w:val="false"/>
+          <w:iCs w:val="false"/>
+          <w:caps w:val="false"/>
+          <w:color w:val="1A1530"/>
+          <w:sz w:val="20"/>
+          <w:szCs w:val="20"/>
+        </w:rPr>
+        <w:t xml:space="preserve">   </w:t>
+      </w:r>
+      <w:r>
+        <w:rPr>
+          <w:rFonts w:ascii="Arial" w:cs="Arial" w:eastAsia="Arial" w:hAnsi="Arial"/>
+          <w:b/>
+          <w:bCs/>
+          <w:i w:val="false"/>
+          <w:iCs w:val="false"/>
+          <w:caps w:val="false"/>
+          <w:color w:val="2D1B69"/>
+          <w:spacing w:val="10"/>
+          <w:sz w:val="22"/>
+          <w:szCs w:val="22"/>
+        </w:rPr>
+        <w:t xml:space="preserve">PODSTAWY PRAWNE DOKUMENTU I JAK CZYTAĆ RAPORT</w:t>
+      </w:r>
+    </w:p>
+    <w:p>
+      <w:pPr>
+        <w:spacing w:after="140" w:before="0" w:line="260"/>
+        <w:jc w:val="both"/>
+      </w:pPr>
+      <w:r>
+        <w:rPr>
+          <w:rFonts w:ascii="Arial" w:cs="Arial" w:eastAsia="Arial" w:hAnsi="Arial"/>
+          <w:b w:val="false"/>
+          <w:bCs w:val="false"/>
+          <w:i w:val="false"/>
+          <w:iCs w:val="false"/>
+          <w:caps w:val="false"/>
+          <w:color w:val="6B6378"/>
+          <w:sz w:val="16"/>
+          <w:szCs w:val="16"/>
+        </w:rPr>
+        <w:t xml:space="preserve">Raport łączy trzy obowiązki placówki: opinię dla zespołu orzekającego poradni (Część I–II), wielospecjalistyczną ocenę poziomu funkcjonowania (Część II) oraz elementy indywidualnego programu edukacyjno-terapeutycznego (Część III). Każda sekcja raportu wskazuje przepis, z którego wynika.</w:t>
+      </w:r>
+    </w:p>
+    <w:tbl>
+      <w:tblPr>
+        <w:tblW w:type="dxa" w:w="9906"/>
+        <w:tblBorders>
+          <w:top w:val="single" w:color="auto" w:sz="4"/>
+          <w:left w:val="single" w:color="auto" w:sz="4"/>
+          <w:bottom w:val="single" w:color="auto" w:sz="4"/>
+          <w:right w:val="single" w:color="auto" w:sz="4"/>
+          <w:insideH w:val="single" w:color="auto" w:sz="4"/>
+          <w:insideV w:val="single" w:color="auto" w:sz="4"/>
+        </w:tblBorders>
+      </w:tblPr>
+      <w:tblGrid>
+        <w:gridCol w:w="3300"/>
+        <w:gridCol w:w="1300"/>
+        <w:gridCol w:w="5306"/>
+      </w:tblGrid>
+      <w:tr>
+        <w:trPr>
+          <w:cantSplit/>
+        </w:trPr>
+        <w:tc>
+          <w:tcPr>
+            <w:tcW w:type="dxa" w:w="3300"/>
+            <w:tcBorders>
+              <w:top w:val="single" w:color="D9D0F0" w:sz="4"/>
+              <w:left w:val="single" w:color="D9D0F0" w:sz="4"/>
+              <w:bottom w:val="single" w:color="D9D0F0" w:sz="4"/>
+              <w:right w:val="single" w:color="D9D0F0" w:sz="4"/>
+            </w:tcBorders>
+            <w:shd w:fill="EFE9F9" w:color="auto" w:val="clear"/>
+            <w:tcMar>
+              <w:top w:type="dxa" w:w="100"/>
+              <w:left w:type="dxa" w:w="140"/>
+              <w:bottom w:type="dxa" w:w="100"/>
+              <w:right w:type="dxa" w:w="120"/>
+            </w:tcMar>
+            <w:vAlign w:val="top"/>
+          </w:tcPr>
+          <w:p>
+            <w:pPr>
+              <w:spacing w:after="0" w:before="0" w:line="276"/>
+              <w:jc w:val="left"/>
+            </w:pPr>
+            <w:r>
+              <w:rPr>
+                <w:rFonts w:ascii="Arial" w:cs="Arial" w:eastAsia="Arial" w:hAnsi="Arial"/>
+                <w:b/>
+                <w:bCs/>
+                <w:i w:val="false"/>
+                <w:iCs w:val="false"/>
+                <w:caps/>
+                <w:color w:val="2D1B69"/>
+                <w:spacing w:val="10"/>
+                <w:sz w:val="13"/>
+                <w:szCs w:val="13"/>
+              </w:rPr>
+              <w:t xml:space="preserve">Akt prawny</w:t>
+            </w:r>
+          </w:p>
+        </w:tc>
+        <w:tc>
+          <w:tcPr>
+            <w:tcW w:type="dxa" w:w="1300"/>
+            <w:tcBorders>
+              <w:top w:val="single" w:color="D9D0F0" w:sz="4"/>
+              <w:left w:val="single" w:color="D9D0F0" w:sz="4"/>
+              <w:bottom w:val="single" w:color="D9D0F0" w:sz="4"/>
+              <w:right w:val="single" w:color="D9D0F0" w:sz="4"/>
+            </w:tcBorders>
+            <w:shd w:fill="EFE9F9" w:color="auto" w:val="clear"/>
+            <w:tcMar>
+              <w:top w:type="dxa" w:w="100"/>
+              <w:left w:type="dxa" w:w="140"/>
+              <w:bottom w:type="dxa" w:w="100"/>
+              <w:right w:type="dxa" w:w="120"/>
+            </w:tcMar>
+            <w:vAlign w:val="top"/>
+          </w:tcPr>
+          <w:p>
+            <w:pPr>
+              <w:spacing w:after="0" w:before="0" w:line="276"/>
+              <w:jc w:val="left"/>
+            </w:pPr>
+            <w:r>
+              <w:rPr>
+                <w:rFonts w:ascii="Arial" w:cs="Arial" w:eastAsia="Arial" w:hAnsi="Arial"/>
+                <w:b/>
+                <w:bCs/>
+                <w:i w:val="false"/>
+                <w:iCs w:val="false"/>
+                <w:caps/>
+                <w:color w:val="2D1B69"/>
+                <w:spacing w:val="10"/>
+                <w:sz w:val="13"/>
+                <w:szCs w:val="13"/>
+              </w:rPr>
+              <w:t xml:space="preserve">Publikacja</w:t>
+            </w:r>
+          </w:p>
+        </w:tc>
+        <w:tc>
+          <w:tcPr>
+            <w:tcW w:type="dxa" w:w="5306"/>
+            <w:tcBorders>
+              <w:top w:val="single" w:color="D9D0F0" w:sz="4"/>
+              <w:left w:val="single" w:color="D9D0F0" w:sz="4"/>
+              <w:bottom w:val="single" w:color="D9D0F0" w:sz="4"/>
+              <w:right w:val="single" w:color="D9D0F0" w:sz="4"/>
+            </w:tcBorders>
+            <w:shd w:fill="EFE9F9" w:color="auto" w:val="clear"/>
+            <w:tcMar>
+              <w:top w:type="dxa" w:w="100"/>
+              <w:left w:type="dxa" w:w="140"/>
+              <w:bottom w:type="dxa" w:w="100"/>
+              <w:right w:type="dxa" w:w="120"/>
+            </w:tcMar>
+            <w:vAlign w:val="top"/>
+          </w:tcPr>
+          <w:p>
+            <w:pPr>
+              <w:spacing w:after="0" w:before="0" w:line="276"/>
+              <w:jc w:val="left"/>
+            </w:pPr>
+            <w:r>
+              <w:rPr>
+                <w:rFonts w:ascii="Arial" w:cs="Arial" w:eastAsia="Arial" w:hAnsi="Arial"/>
+                <w:b/>
+                <w:bCs/>
+                <w:i w:val="false"/>
+                <w:iCs w:val="false"/>
+                <w:caps/>
+                <w:color w:val="2D1B69"/>
+                <w:spacing w:val="10"/>
+                <w:sz w:val="13"/>
+                <w:szCs w:val="13"/>
+              </w:rPr>
+              <w:t xml:space="preserve">Zakres zastosowania w raporcie</w:t>
+            </w:r>
+          </w:p>
+        </w:tc>
+      </w:tr>
+      <w:tr>
+        <w:trPr>
+          <w:cantSplit/>
+        </w:trPr>
+        <w:tc>
+          <w:tcPr>
+            <w:tcW w:type="dxa" w:w="3300"/>
+            <w:tcBorders>
+              <w:top w:val="single" w:color="E3E1EC" w:sz="4"/>
+              <w:left w:val="single" w:color="E3E1EC" w:sz="4"/>
+              <w:bottom w:val="single" w:color="E3E1EC" w:sz="4"/>
+              <w:right w:val="single" w:color="E3E1EC" w:sz="4"/>
+            </w:tcBorders>
+            <w:tcMar>
+              <w:top w:type="dxa" w:w="50"/>
+              <w:left w:type="dxa" w:w="140"/>
+              <w:bottom w:type="dxa" w:w="50"/>
+              <w:right w:type="dxa" w:w="120"/>
+            </w:tcMar>
+            <w:vAlign w:val="top"/>
+          </w:tcPr>
+          <w:p>
+            <w:pPr>
+              <w:spacing w:after="0" w:before="0" w:line="230"/>
+              <w:jc w:val="left"/>
+            </w:pPr>
+            <w:r>
+              <w:rPr>
+                <w:rFonts w:ascii="Arial" w:cs="Arial" w:eastAsia="Arial" w:hAnsi="Arial"/>
+                <w:b/>
+                <w:bCs/>
+                <w:i w:val="false"/>
+                <w:iCs w:val="false"/>
+                <w:caps w:val="false"/>
+                <w:color w:val="2D1B69"/>
+                <w:sz w:val="13"/>
+                <w:szCs w:val="13"/>
+              </w:rPr>
+              <w:t xml:space="preserve">Rozporządzenie Ministra Edukacji z 2 marca 2026 r. w sprawie orzeczeń i opinii wydawanych przez zespoły orzekające w publicznych poradniach psychologiczno-pedagogicznych</w:t>
+            </w:r>
+          </w:p>
+        </w:tc>
+        <w:tc>
+          <w:tcPr>
+            <w:tcW w:type="dxa" w:w="1300"/>
+            <w:tcBorders>
+              <w:top w:val="single" w:color="E3E1EC" w:sz="4"/>
+              <w:left w:val="single" w:color="E3E1EC" w:sz="4"/>
+              <w:bottom w:val="single" w:color="E3E1EC" w:sz="4"/>
+              <w:right w:val="single" w:color="E3E1EC" w:sz="4"/>
+            </w:tcBorders>
+            <w:tcMar>
+              <w:top w:type="dxa" w:w="50"/>
+              <w:left w:type="dxa" w:w="140"/>
+              <w:bottom w:type="dxa" w:w="50"/>
+              <w:right w:type="dxa" w:w="120"/>
+            </w:tcMar>
+            <w:vAlign w:val="top"/>
+          </w:tcPr>
+          <w:p>
+            <w:pPr>
+              <w:spacing w:after="0" w:before="0" w:line="230"/>
+              <w:jc w:val="left"/>
+            </w:pPr>
+            <w:r>
+              <w:rPr>
+                <w:rFonts w:ascii="Arial" w:cs="Arial" w:eastAsia="Arial" w:hAnsi="Arial"/>
+                <w:b/>
+                <w:bCs/>
+                <w:i w:val="false"/>
+                <w:iCs w:val="false"/>
+                <w:caps w:val="false"/>
+                <w:color w:val="E74509"/>
+                <w:sz w:val="12"/>
+                <w:szCs w:val="12"/>
+              </w:rPr>
+              <w:t xml:space="preserve">Dz. U. z 2026 r. poz. 428</w:t>
+            </w:r>
+          </w:p>
+        </w:tc>
+        <w:tc>
+          <w:tcPr>
+            <w:tcW w:type="dxa" w:w="5306"/>
+            <w:tcBorders>
+              <w:top w:val="single" w:color="E3E1EC" w:sz="4"/>
+              <w:left w:val="single" w:color="E3E1EC" w:sz="4"/>
+              <w:bottom w:val="single" w:color="E3E1EC" w:sz="4"/>
+              <w:right w:val="single" w:color="E3E1EC" w:sz="4"/>
+            </w:tcBorders>
+            <w:tcMar>
+              <w:top w:type="dxa" w:w="50"/>
+              <w:left w:type="dxa" w:w="140"/>
+              <w:bottom w:type="dxa" w:w="50"/>
+              <w:right w:type="dxa" w:w="120"/>
+            </w:tcMar>
+            <w:vAlign w:val="top"/>
+          </w:tcPr>
+          <w:p>
+            <w:pPr>
+              <w:spacing w:after="0" w:before="0" w:line="230"/>
+              <w:jc w:val="left"/>
+            </w:pPr>
+            <w:r>
+              <w:rPr>
+                <w:rFonts w:ascii="Arial" w:cs="Arial" w:eastAsia="Arial" w:hAnsi="Arial"/>
+                <w:b w:val="false"/>
+                <w:bCs w:val="false"/>
+                <w:i w:val="false"/>
+                <w:iCs w:val="false"/>
+                <w:caps w:val="false"/>
+                <w:color w:val="1A1530"/>
+                <w:sz w:val="13"/>
+                <w:szCs w:val="13"/>
+              </w:rPr>
+              <w:t xml:space="preserve">§ 7 ust. 6–7 (od 1.09.2026): struktura opinii przedszkola/szkoły dla zespołu orzekającego – odrębne obszary ICF dla przedszkola i szkoły; opinia przekazywana rodzicowi.  </w:t>
+            </w:r>
+            <w:r>
+              <w:rPr>
+                <w:rFonts w:ascii="Arial" w:cs="Arial" w:eastAsia="Arial" w:hAnsi="Arial"/>
+                <w:b/>
+                <w:bCs/>
+                <w:i w:val="false"/>
+                <w:iCs w:val="false"/>
+                <w:caps w:val="false"/>
+                <w:color w:val="E74509"/>
+                <w:sz w:val="11"/>
+                <w:szCs w:val="11"/>
+                <w:shd w:fill="FDECE3" w:color="auto" w:val="clear"/>
+              </w:rPr>
+              <w:t xml:space="preserve"> sekcje 1–10 </w:t>
+            </w:r>
+          </w:p>
+        </w:tc>
+      </w:tr>
+      <w:tr>
+        <w:trPr>
+          <w:cantSplit/>
+        </w:trPr>
+        <w:tc>
+          <w:tcPr>
+            <w:tcW w:type="dxa" w:w="3300"/>
+            <w:tcBorders>
+              <w:top w:val="single" w:color="E3E1EC" w:sz="4"/>
+              <w:left w:val="single" w:color="E3E1EC" w:sz="4"/>
+              <w:bottom w:val="single" w:color="E3E1EC" w:sz="4"/>
+              <w:right w:val="single" w:color="E3E1EC" w:sz="4"/>
+            </w:tcBorders>
+            <w:tcMar>
+              <w:top w:type="dxa" w:w="50"/>
+              <w:left w:type="dxa" w:w="140"/>
+              <w:bottom w:type="dxa" w:w="50"/>
+              <w:right w:type="dxa" w:w="120"/>
+            </w:tcMar>
+            <w:vAlign w:val="top"/>
+          </w:tcPr>
+          <w:p>
+            <w:pPr>
+              <w:spacing w:after="0" w:before="0" w:line="230"/>
+              <w:jc w:val="left"/>
+            </w:pPr>
+            <w:r>
+              <w:rPr>
+                <w:rFonts w:ascii="Arial" w:cs="Arial" w:eastAsia="Arial" w:hAnsi="Arial"/>
+                <w:b/>
+                <w:bCs/>
+                <w:i w:val="false"/>
+                <w:iCs w:val="false"/>
+                <w:caps w:val="false"/>
+                <w:color w:val="2D1B69"/>
+                <w:sz w:val="13"/>
+                <w:szCs w:val="13"/>
+              </w:rPr>
+              <w:t xml:space="preserve">Ustawa z 14 grudnia 2016 r. – Prawo oświatowe</w:t>
+            </w:r>
+          </w:p>
+        </w:tc>
+        <w:tc>
+          <w:tcPr>
+            <w:tcW w:type="dxa" w:w="1300"/>
+            <w:tcBorders>
+              <w:top w:val="single" w:color="E3E1EC" w:sz="4"/>
+              <w:left w:val="single" w:color="E3E1EC" w:sz="4"/>
+              <w:bottom w:val="single" w:color="E3E1EC" w:sz="4"/>
+              <w:right w:val="single" w:color="E3E1EC" w:sz="4"/>
+            </w:tcBorders>
+            <w:tcMar>
+              <w:top w:type="dxa" w:w="50"/>
+              <w:left w:type="dxa" w:w="140"/>
+              <w:bottom w:type="dxa" w:w="50"/>
+              <w:right w:type="dxa" w:w="120"/>
+            </w:tcMar>
+            <w:vAlign w:val="top"/>
+          </w:tcPr>
+          <w:p>
+            <w:pPr>
+              <w:spacing w:after="0" w:before="0" w:line="230"/>
+              <w:jc w:val="left"/>
+            </w:pPr>
+            <w:r>
+              <w:rPr>
+                <w:rFonts w:ascii="Arial" w:cs="Arial" w:eastAsia="Arial" w:hAnsi="Arial"/>
+                <w:b/>
+                <w:bCs/>
+                <w:i w:val="false"/>
+                <w:iCs w:val="false"/>
+                <w:caps w:val="false"/>
+                <w:color w:val="E74509"/>
+                <w:sz w:val="12"/>
+                <w:szCs w:val="12"/>
+              </w:rPr>
+              <w:t xml:space="preserve">Dz. U. z 2024 r. poz. 737 ze zm.</w:t>
+            </w:r>
+          </w:p>
+        </w:tc>
+        <w:tc>
+          <w:tcPr>
+            <w:tcW w:type="dxa" w:w="5306"/>
+            <w:tcBorders>
+              <w:top w:val="single" w:color="E3E1EC" w:sz="4"/>
+              <w:left w:val="single" w:color="E3E1EC" w:sz="4"/>
+              <w:bottom w:val="single" w:color="E3E1EC" w:sz="4"/>
+              <w:right w:val="single" w:color="E3E1EC" w:sz="4"/>
+            </w:tcBorders>
+            <w:tcMar>
+              <w:top w:type="dxa" w:w="50"/>
+              <w:left w:type="dxa" w:w="140"/>
+              <w:bottom w:type="dxa" w:w="50"/>
+              <w:right w:type="dxa" w:w="120"/>
+            </w:tcMar>
+            <w:vAlign w:val="top"/>
+          </w:tcPr>
+          <w:p>
+            <w:pPr>
+              <w:spacing w:after="0" w:before="0" w:line="230"/>
+              <w:jc w:val="left"/>
+            </w:pPr>
+            <w:r>
+              <w:rPr>
+                <w:rFonts w:ascii="Arial" w:cs="Arial" w:eastAsia="Arial" w:hAnsi="Arial"/>
+                <w:b w:val="false"/>
+                <w:bCs w:val="false"/>
+                <w:i w:val="false"/>
+                <w:iCs w:val="false"/>
+                <w:caps w:val="false"/>
+                <w:color w:val="1A1530"/>
+                <w:sz w:val="13"/>
+                <w:szCs w:val="13"/>
+              </w:rPr>
+              <w:t xml:space="preserve">art. 127: kształcenie specjalne, IPET, wielospecjalistyczna ocena poziomu funkcjonowania, udział rodziców w pracach zespołu.  </w:t>
+            </w:r>
+            <w:r>
+              <w:rPr>
+                <w:rFonts w:ascii="Arial" w:cs="Arial" w:eastAsia="Arial" w:hAnsi="Arial"/>
+                <w:b/>
+                <w:bCs/>
+                <w:i w:val="false"/>
+                <w:iCs w:val="false"/>
+                <w:caps w:val="false"/>
+                <w:color w:val="E74509"/>
+                <w:sz w:val="11"/>
+                <w:szCs w:val="11"/>
+                <w:shd w:fill="FDECE3" w:color="auto" w:val="clear"/>
+              </w:rPr>
+              <w:t xml:space="preserve"> Część II–III </w:t>
+            </w:r>
+          </w:p>
+        </w:tc>
+      </w:tr>
+      <w:tr>
+        <w:trPr>
+          <w:cantSplit/>
+        </w:trPr>
+        <w:tc>
+          <w:tcPr>
+            <w:tcW w:type="dxa" w:w="3300"/>
+            <w:tcBorders>
+              <w:top w:val="single" w:color="E3E1EC" w:sz="4"/>
+              <w:left w:val="single" w:color="E3E1EC" w:sz="4"/>
+              <w:bottom w:val="single" w:color="E3E1EC" w:sz="4"/>
+              <w:right w:val="single" w:color="E3E1EC" w:sz="4"/>
+            </w:tcBorders>
+            <w:tcMar>
+              <w:top w:type="dxa" w:w="50"/>
+              <w:left w:type="dxa" w:w="140"/>
+              <w:bottom w:type="dxa" w:w="50"/>
+              <w:right w:type="dxa" w:w="120"/>
+            </w:tcMar>
+            <w:vAlign w:val="top"/>
+          </w:tcPr>
+          <w:p>
+            <w:pPr>
+              <w:spacing w:after="0" w:before="0" w:line="230"/>
+              <w:jc w:val="left"/>
+            </w:pPr>
+            <w:r>
+              <w:rPr>
+                <w:rFonts w:ascii="Arial" w:cs="Arial" w:eastAsia="Arial" w:hAnsi="Arial"/>
+                <w:b/>
+                <w:bCs/>
+                <w:i w:val="false"/>
+                <w:iCs w:val="false"/>
+                <w:caps w:val="false"/>
+                <w:color w:val="2D1B69"/>
+                <w:sz w:val="13"/>
+                <w:szCs w:val="13"/>
+              </w:rPr>
+              <w:t xml:space="preserve">Rozporządzenie MEN z 9 sierpnia 2017 r. w sprawie warunków organizowania kształcenia, wychowania i opieki dla dzieci i młodzieży niepełnosprawnych (kształcenie specjalne)</w:t>
+            </w:r>
+          </w:p>
+        </w:tc>
+        <w:tc>
+          <w:tcPr>
+            <w:tcW w:type="dxa" w:w="1300"/>
+            <w:tcBorders>
+              <w:top w:val="single" w:color="E3E1EC" w:sz="4"/>
+              <w:left w:val="single" w:color="E3E1EC" w:sz="4"/>
+              <w:bottom w:val="single" w:color="E3E1EC" w:sz="4"/>
+              <w:right w:val="single" w:color="E3E1EC" w:sz="4"/>
+            </w:tcBorders>
+            <w:tcMar>
+              <w:top w:type="dxa" w:w="50"/>
+              <w:left w:type="dxa" w:w="140"/>
+              <w:bottom w:type="dxa" w:w="50"/>
+              <w:right w:type="dxa" w:w="120"/>
+            </w:tcMar>
+            <w:vAlign w:val="top"/>
+          </w:tcPr>
+          <w:p>
+            <w:pPr>
+              <w:spacing w:after="0" w:before="0" w:line="230"/>
+              <w:jc w:val="left"/>
+            </w:pPr>
+            <w:r>
+              <w:rPr>
+                <w:rFonts w:ascii="Arial" w:cs="Arial" w:eastAsia="Arial" w:hAnsi="Arial"/>
+                <w:b/>
+                <w:bCs/>
+                <w:i w:val="false"/>
+                <w:iCs w:val="false"/>
+                <w:caps w:val="false"/>
+                <w:color w:val="E74509"/>
+                <w:sz w:val="12"/>
+                <w:szCs w:val="12"/>
+              </w:rPr>
+              <w:t xml:space="preserve">Dz. U. z 2020 r. poz. 1309</w:t>
+            </w:r>
+          </w:p>
+        </w:tc>
+        <w:tc>
+          <w:tcPr>
+            <w:tcW w:type="dxa" w:w="5306"/>
+            <w:tcBorders>
+              <w:top w:val="single" w:color="E3E1EC" w:sz="4"/>
+              <w:left w:val="single" w:color="E3E1EC" w:sz="4"/>
+              <w:bottom w:val="single" w:color="E3E1EC" w:sz="4"/>
+              <w:right w:val="single" w:color="E3E1EC" w:sz="4"/>
+            </w:tcBorders>
+            <w:tcMar>
+              <w:top w:type="dxa" w:w="50"/>
+              <w:left w:type="dxa" w:w="140"/>
+              <w:bottom w:type="dxa" w:w="50"/>
+              <w:right w:type="dxa" w:w="120"/>
+            </w:tcMar>
+            <w:vAlign w:val="top"/>
+          </w:tcPr>
+          <w:p>
+            <w:pPr>
+              <w:spacing w:after="0" w:before="0" w:line="230"/>
+              <w:jc w:val="left"/>
+            </w:pPr>
+            <w:r>
+              <w:rPr>
+                <w:rFonts w:ascii="Arial" w:cs="Arial" w:eastAsia="Arial" w:hAnsi="Arial"/>
+                <w:b w:val="false"/>
+                <w:bCs w:val="false"/>
+                <w:i w:val="false"/>
+                <w:iCs w:val="false"/>
+                <w:caps w:val="false"/>
+                <w:color w:val="1A1530"/>
+                <w:sz w:val="13"/>
+                <w:szCs w:val="13"/>
+              </w:rPr>
+              <w:t xml:space="preserve">§ 6 ust. 1 pkt 1–8: treść IPET – dostosowanie programu, zintegrowane działania, formy i okres PPP, wsparcie rodziców i współdziałanie z poradniami, rewalidacja, współpraca z rodzicami, organizacja kształcenia i technologie; § 6 ust. 9–10: okresowa WOPF i ocena efektywności; § 7: dodatkowa osoba.  </w:t>
+            </w:r>
+            <w:r>
+              <w:rPr>
+                <w:rFonts w:ascii="Arial" w:cs="Arial" w:eastAsia="Arial" w:hAnsi="Arial"/>
+                <w:b/>
+                <w:bCs/>
+                <w:i w:val="false"/>
+                <w:iCs w:val="false"/>
+                <w:caps w:val="false"/>
+                <w:color w:val="E74509"/>
+                <w:sz w:val="11"/>
+                <w:szCs w:val="11"/>
+                <w:shd w:fill="FDECE3" w:color="auto" w:val="clear"/>
+              </w:rPr>
+              <w:t xml:space="preserve"> sekcje 4, 8–16 </w:t>
+            </w:r>
+          </w:p>
+        </w:tc>
+      </w:tr>
+      <w:tr>
+        <w:trPr>
+          <w:cantSplit/>
+        </w:trPr>
+        <w:tc>
+          <w:tcPr>
+            <w:tcW w:type="dxa" w:w="3300"/>
+            <w:tcBorders>
+              <w:top w:val="single" w:color="E3E1EC" w:sz="4"/>
+              <w:left w:val="single" w:color="E3E1EC" w:sz="4"/>
+              <w:bottom w:val="single" w:color="E3E1EC" w:sz="4"/>
+              <w:right w:val="single" w:color="E3E1EC" w:sz="4"/>
+            </w:tcBorders>
+            <w:tcMar>
+              <w:top w:type="dxa" w:w="50"/>
+              <w:left w:type="dxa" w:w="140"/>
+              <w:bottom w:type="dxa" w:w="50"/>
+              <w:right w:type="dxa" w:w="120"/>
+            </w:tcMar>
+            <w:vAlign w:val="top"/>
+          </w:tcPr>
+          <w:p>
+            <w:pPr>
+              <w:spacing w:after="0" w:before="0" w:line="230"/>
+              <w:jc w:val="left"/>
+            </w:pPr>
+            <w:r>
+              <w:rPr>
+                <w:rFonts w:ascii="Arial" w:cs="Arial" w:eastAsia="Arial" w:hAnsi="Arial"/>
+                <w:b/>
+                <w:bCs/>
+                <w:i w:val="false"/>
+                <w:iCs w:val="false"/>
+                <w:caps w:val="false"/>
+                <w:color w:val="2D1B69"/>
+                <w:sz w:val="13"/>
+                <w:szCs w:val="13"/>
+              </w:rPr>
+              <w:t xml:space="preserve">Rozporządzenie MEN z 9 sierpnia 2017 r. w sprawie zasad organizacji i udzielania pomocy psychologiczno-pedagogicznej</w:t>
+            </w:r>
+          </w:p>
+        </w:tc>
+        <w:tc>
+          <w:tcPr>
+            <w:tcW w:type="dxa" w:w="1300"/>
+            <w:tcBorders>
+              <w:top w:val="single" w:color="E3E1EC" w:sz="4"/>
+              <w:left w:val="single" w:color="E3E1EC" w:sz="4"/>
+              <w:bottom w:val="single" w:color="E3E1EC" w:sz="4"/>
+              <w:right w:val="single" w:color="E3E1EC" w:sz="4"/>
+            </w:tcBorders>
+            <w:tcMar>
+              <w:top w:type="dxa" w:w="50"/>
+              <w:left w:type="dxa" w:w="140"/>
+              <w:bottom w:type="dxa" w:w="50"/>
+              <w:right w:type="dxa" w:w="120"/>
+            </w:tcMar>
+            <w:vAlign w:val="top"/>
+          </w:tcPr>
+          <w:p>
+            <w:pPr>
+              <w:spacing w:after="0" w:before="0" w:line="230"/>
+              <w:jc w:val="left"/>
+            </w:pPr>
+            <w:r>
+              <w:rPr>
+                <w:rFonts w:ascii="Arial" w:cs="Arial" w:eastAsia="Arial" w:hAnsi="Arial"/>
+                <w:b/>
+                <w:bCs/>
+                <w:i w:val="false"/>
+                <w:iCs w:val="false"/>
+                <w:caps w:val="false"/>
+                <w:color w:val="E74509"/>
+                <w:sz w:val="12"/>
+                <w:szCs w:val="12"/>
+              </w:rPr>
+              <w:t xml:space="preserve">Dz. U. z 2023 r. poz. 1798</w:t>
+            </w:r>
+          </w:p>
+        </w:tc>
+        <w:tc>
+          <w:tcPr>
+            <w:tcW w:type="dxa" w:w="5306"/>
+            <w:tcBorders>
+              <w:top w:val="single" w:color="E3E1EC" w:sz="4"/>
+              <w:left w:val="single" w:color="E3E1EC" w:sz="4"/>
+              <w:bottom w:val="single" w:color="E3E1EC" w:sz="4"/>
+              <w:right w:val="single" w:color="E3E1EC" w:sz="4"/>
+            </w:tcBorders>
+            <w:tcMar>
+              <w:top w:type="dxa" w:w="50"/>
+              <w:left w:type="dxa" w:w="140"/>
+              <w:bottom w:type="dxa" w:w="50"/>
+              <w:right w:type="dxa" w:w="120"/>
+            </w:tcMar>
+            <w:vAlign w:val="top"/>
+          </w:tcPr>
+          <w:p>
+            <w:pPr>
+              <w:spacing w:after="0" w:before="0" w:line="230"/>
+              <w:jc w:val="left"/>
+            </w:pPr>
+            <w:r>
+              <w:rPr>
+                <w:rFonts w:ascii="Arial" w:cs="Arial" w:eastAsia="Arial" w:hAnsi="Arial"/>
+                <w:b w:val="false"/>
+                <w:bCs w:val="false"/>
+                <w:i w:val="false"/>
+                <w:iCs w:val="false"/>
+                <w:caps w:val="false"/>
+                <w:color w:val="1A1530"/>
+                <w:sz w:val="13"/>
+                <w:szCs w:val="13"/>
+              </w:rPr>
+              <w:t xml:space="preserve">Formy pomocy (logopedyczne, korekcyjno-kompensacyjne, emocjonalno-społeczne, inne specjalistyczne, porady i konsultacje); godzina zajęć 45 min; informowanie rodziców o formach, okresie i wymiarze.  </w:t>
+            </w:r>
+            <w:r>
+              <w:rPr>
+                <w:rFonts w:ascii="Arial" w:cs="Arial" w:eastAsia="Arial" w:hAnsi="Arial"/>
+                <w:b/>
+                <w:bCs/>
+                <w:i w:val="false"/>
+                <w:iCs w:val="false"/>
+                <w:caps w:val="false"/>
+                <w:color w:val="E74509"/>
+                <w:sz w:val="11"/>
+                <w:szCs w:val="11"/>
+                <w:shd w:fill="FDECE3" w:color="auto" w:val="clear"/>
+              </w:rPr>
+              <w:t xml:space="preserve"> sekcje 13 B, 15 </w:t>
+            </w:r>
+          </w:p>
+        </w:tc>
+      </w:tr>
+      <w:tr>
+        <w:trPr>
+          <w:cantSplit/>
+        </w:trPr>
+        <w:tc>
+          <w:tcPr>
+            <w:tcW w:type="dxa" w:w="3300"/>
+            <w:tcBorders>
+              <w:top w:val="single" w:color="E3E1EC" w:sz="4"/>
+              <w:left w:val="single" w:color="E3E1EC" w:sz="4"/>
+              <w:bottom w:val="single" w:color="E3E1EC" w:sz="4"/>
+              <w:right w:val="single" w:color="E3E1EC" w:sz="4"/>
+            </w:tcBorders>
+            <w:tcMar>
+              <w:top w:type="dxa" w:w="50"/>
+              <w:left w:type="dxa" w:w="140"/>
+              <w:bottom w:type="dxa" w:w="50"/>
+              <w:right w:type="dxa" w:w="120"/>
+            </w:tcMar>
+            <w:vAlign w:val="top"/>
+          </w:tcPr>
+          <w:p>
+            <w:pPr>
+              <w:spacing w:after="0" w:before="0" w:line="230"/>
+              <w:jc w:val="left"/>
+            </w:pPr>
+            <w:r>
+              <w:rPr>
+                <w:rFonts w:ascii="Arial" w:cs="Arial" w:eastAsia="Arial" w:hAnsi="Arial"/>
+                <w:b/>
+                <w:bCs/>
+                <w:i w:val="false"/>
+                <w:iCs w:val="false"/>
+                <w:caps w:val="false"/>
+                <w:color w:val="2D1B69"/>
+                <w:sz w:val="13"/>
+                <w:szCs w:val="13"/>
+              </w:rPr>
+              <w:t xml:space="preserve">Rozporządzenie MEN z 14 lutego 2017 r. w sprawie podstawy programowej wychowania przedszkolnego oraz kształcenia ogólnego</w:t>
+            </w:r>
+          </w:p>
+        </w:tc>
+        <w:tc>
+          <w:tcPr>
+            <w:tcW w:type="dxa" w:w="1300"/>
+            <w:tcBorders>
+              <w:top w:val="single" w:color="E3E1EC" w:sz="4"/>
+              <w:left w:val="single" w:color="E3E1EC" w:sz="4"/>
+              <w:bottom w:val="single" w:color="E3E1EC" w:sz="4"/>
+              <w:right w:val="single" w:color="E3E1EC" w:sz="4"/>
+            </w:tcBorders>
+            <w:tcMar>
+              <w:top w:type="dxa" w:w="50"/>
+              <w:left w:type="dxa" w:w="140"/>
+              <w:bottom w:type="dxa" w:w="50"/>
+              <w:right w:type="dxa" w:w="120"/>
+            </w:tcMar>
+            <w:vAlign w:val="top"/>
+          </w:tcPr>
+          <w:p>
+            <w:pPr>
+              <w:spacing w:after="0" w:before="0" w:line="230"/>
+              <w:jc w:val="left"/>
+            </w:pPr>
+            <w:r>
+              <w:rPr>
+                <w:rFonts w:ascii="Arial" w:cs="Arial" w:eastAsia="Arial" w:hAnsi="Arial"/>
+                <w:b/>
+                <w:bCs/>
+                <w:i w:val="false"/>
+                <w:iCs w:val="false"/>
+                <w:caps w:val="false"/>
+                <w:color w:val="E74509"/>
+                <w:sz w:val="12"/>
+                <w:szCs w:val="12"/>
+              </w:rPr>
+              <w:t xml:space="preserve">Dz. U. z 2017 r. poz. 356 ze zm.</w:t>
+            </w:r>
+          </w:p>
+        </w:tc>
+        <w:tc>
+          <w:tcPr>
+            <w:tcW w:type="dxa" w:w="5306"/>
+            <w:tcBorders>
+              <w:top w:val="single" w:color="E3E1EC" w:sz="4"/>
+              <w:left w:val="single" w:color="E3E1EC" w:sz="4"/>
+              <w:bottom w:val="single" w:color="E3E1EC" w:sz="4"/>
+              <w:right w:val="single" w:color="E3E1EC" w:sz="4"/>
+            </w:tcBorders>
+            <w:tcMar>
+              <w:top w:type="dxa" w:w="50"/>
+              <w:left w:type="dxa" w:w="140"/>
+              <w:bottom w:type="dxa" w:w="50"/>
+              <w:right w:type="dxa" w:w="120"/>
+            </w:tcMar>
+            <w:vAlign w:val="top"/>
+          </w:tcPr>
+          <w:p>
+            <w:pPr>
+              <w:spacing w:after="0" w:before="0" w:line="230"/>
+              <w:jc w:val="left"/>
+            </w:pPr>
+            <w:r>
+              <w:rPr>
+                <w:rFonts w:ascii="Arial" w:cs="Arial" w:eastAsia="Arial" w:hAnsi="Arial"/>
+                <w:b w:val="false"/>
+                <w:bCs w:val="false"/>
+                <w:i w:val="false"/>
+                <w:iCs w:val="false"/>
+                <w:caps w:val="false"/>
+                <w:color w:val="1A1530"/>
+                <w:sz w:val="13"/>
+                <w:szCs w:val="13"/>
+              </w:rPr>
+              <w:t xml:space="preserve">Cele i treści, które są dostosowywane (nie obniżane) w programie wsparcia.  </w:t>
+            </w:r>
+            <w:r>
+              <w:rPr>
+                <w:rFonts w:ascii="Arial" w:cs="Arial" w:eastAsia="Arial" w:hAnsi="Arial"/>
+                <w:b/>
+                <w:bCs/>
+                <w:i w:val="false"/>
+                <w:iCs w:val="false"/>
+                <w:caps w:val="false"/>
+                <w:color w:val="E74509"/>
+                <w:sz w:val="11"/>
+                <w:szCs w:val="11"/>
+                <w:shd w:fill="FDECE3" w:color="auto" w:val="clear"/>
+              </w:rPr>
+              <w:t xml:space="preserve"> sekcja 11 A </w:t>
+            </w:r>
+          </w:p>
+        </w:tc>
+      </w:tr>
+      <w:tr>
+        <w:trPr>
+          <w:cantSplit/>
+        </w:trPr>
+        <w:tc>
+          <w:tcPr>
+            <w:tcW w:type="dxa" w:w="3300"/>
+            <w:tcBorders>
+              <w:top w:val="single" w:color="E3E1EC" w:sz="4"/>
+              <w:left w:val="single" w:color="E3E1EC" w:sz="4"/>
+              <w:bottom w:val="single" w:color="E3E1EC" w:sz="4"/>
+              <w:right w:val="single" w:color="E3E1EC" w:sz="4"/>
+            </w:tcBorders>
+            <w:tcMar>
+              <w:top w:type="dxa" w:w="50"/>
+              <w:left w:type="dxa" w:w="140"/>
+              <w:bottom w:type="dxa" w:w="50"/>
+              <w:right w:type="dxa" w:w="120"/>
+            </w:tcMar>
+            <w:vAlign w:val="top"/>
+          </w:tcPr>
+          <w:p>
+            <w:pPr>
+              <w:spacing w:after="0" w:before="0" w:line="230"/>
+              <w:jc w:val="left"/>
+            </w:pPr>
+            <w:r>
+              <w:rPr>
+                <w:rFonts w:ascii="Arial" w:cs="Arial" w:eastAsia="Arial" w:hAnsi="Arial"/>
+                <w:b/>
+                <w:bCs/>
+                <w:i w:val="false"/>
+                <w:iCs w:val="false"/>
+                <w:caps w:val="false"/>
+                <w:color w:val="2D1B69"/>
+                <w:sz w:val="13"/>
+                <w:szCs w:val="13"/>
+              </w:rPr>
+              <w:t xml:space="preserve">ICF – Międzynarodowa Klasyfikacja Funkcjonowania, Niepełnosprawności i Zdrowia (WHO) · model oceny funkcjonalnej 2026/27</w:t>
+            </w:r>
+          </w:p>
+        </w:tc>
+        <w:tc>
+          <w:tcPr>
+            <w:tcW w:type="dxa" w:w="1300"/>
+            <w:tcBorders>
+              <w:top w:val="single" w:color="E3E1EC" w:sz="4"/>
+              <w:left w:val="single" w:color="E3E1EC" w:sz="4"/>
+              <w:bottom w:val="single" w:color="E3E1EC" w:sz="4"/>
+              <w:right w:val="single" w:color="E3E1EC" w:sz="4"/>
+            </w:tcBorders>
+            <w:tcMar>
+              <w:top w:type="dxa" w:w="50"/>
+              <w:left w:type="dxa" w:w="140"/>
+              <w:bottom w:type="dxa" w:w="50"/>
+              <w:right w:type="dxa" w:w="120"/>
+            </w:tcMar>
+            <w:vAlign w:val="top"/>
+          </w:tcPr>
+          <w:p>
+            <w:pPr>
+              <w:spacing w:after="0" w:before="0" w:line="230"/>
+              <w:jc w:val="left"/>
+            </w:pPr>
+            <w:r>
+              <w:rPr>
+                <w:rFonts w:ascii="Arial" w:cs="Arial" w:eastAsia="Arial" w:hAnsi="Arial"/>
+                <w:b/>
+                <w:bCs/>
+                <w:i w:val="false"/>
+                <w:iCs w:val="false"/>
+                <w:caps w:val="false"/>
+                <w:color w:val="E74509"/>
+                <w:sz w:val="12"/>
+                <w:szCs w:val="12"/>
+              </w:rPr>
+              <w:t xml:space="preserve">ramy merytoryczne</w:t>
+            </w:r>
+          </w:p>
+        </w:tc>
+        <w:tc>
+          <w:tcPr>
+            <w:tcW w:type="dxa" w:w="5306"/>
+            <w:tcBorders>
+              <w:top w:val="single" w:color="E3E1EC" w:sz="4"/>
+              <w:left w:val="single" w:color="E3E1EC" w:sz="4"/>
+              <w:bottom w:val="single" w:color="E3E1EC" w:sz="4"/>
+              <w:right w:val="single" w:color="E3E1EC" w:sz="4"/>
+            </w:tcBorders>
+            <w:tcMar>
+              <w:top w:type="dxa" w:w="50"/>
+              <w:left w:type="dxa" w:w="140"/>
+              <w:bottom w:type="dxa" w:w="50"/>
+              <w:right w:type="dxa" w:w="120"/>
+            </w:tcMar>
+            <w:vAlign w:val="top"/>
+          </w:tcPr>
+          <w:p>
+            <w:pPr>
+              <w:spacing w:after="0" w:before="0" w:line="230"/>
+              <w:jc w:val="left"/>
+            </w:pPr>
+            <w:r>
+              <w:rPr>
+                <w:rFonts w:ascii="Arial" w:cs="Arial" w:eastAsia="Arial" w:hAnsi="Arial"/>
+                <w:b w:val="false"/>
+                <w:bCs w:val="false"/>
+                <w:i w:val="false"/>
+                <w:iCs w:val="false"/>
+                <w:caps w:val="false"/>
+                <w:color w:val="1A1530"/>
+                <w:sz w:val="13"/>
+                <w:szCs w:val="13"/>
+              </w:rPr>
+              <w:t xml:space="preserve">Domeny d1–d9, czynniki środowiskowe i osobowe; narzędzia KPOF (przedszkole) / KSzOF (szkoła); głos dziecka.  </w:t>
+            </w:r>
+            <w:r>
+              <w:rPr>
+                <w:rFonts w:ascii="Arial" w:cs="Arial" w:eastAsia="Arial" w:hAnsi="Arial"/>
+                <w:b/>
+                <w:bCs/>
+                <w:i w:val="false"/>
+                <w:iCs w:val="false"/>
+                <w:caps w:val="false"/>
+                <w:color w:val="E74509"/>
+                <w:sz w:val="11"/>
+                <w:szCs w:val="11"/>
+                <w:shd w:fill="FDECE3" w:color="auto" w:val="clear"/>
+              </w:rPr>
+              <w:t xml:space="preserve"> sekcje 2–7, 9 </w:t>
+            </w:r>
+          </w:p>
+        </w:tc>
+      </w:tr>
+      <w:tr>
+        <w:trPr>
+          <w:cantSplit/>
+        </w:trPr>
+        <w:tc>
+          <w:tcPr>
+            <w:tcW w:type="dxa" w:w="3300"/>
+            <w:tcBorders>
+              <w:top w:val="single" w:color="E3E1EC" w:sz="4"/>
+              <w:left w:val="single" w:color="E3E1EC" w:sz="4"/>
+              <w:bottom w:val="single" w:color="E3E1EC" w:sz="4"/>
+              <w:right w:val="single" w:color="E3E1EC" w:sz="4"/>
+            </w:tcBorders>
+            <w:tcMar>
+              <w:top w:type="dxa" w:w="50"/>
+              <w:left w:type="dxa" w:w="140"/>
+              <w:bottom w:type="dxa" w:w="50"/>
+              <w:right w:type="dxa" w:w="120"/>
+            </w:tcMar>
+            <w:vAlign w:val="top"/>
+          </w:tcPr>
+          <w:p>
+            <w:pPr>
+              <w:spacing w:after="0" w:before="0" w:line="230"/>
+              <w:jc w:val="left"/>
+            </w:pPr>
+            <w:r>
+              <w:rPr>
+                <w:rFonts w:ascii="Arial" w:cs="Arial" w:eastAsia="Arial" w:hAnsi="Arial"/>
+                <w:b/>
+                <w:bCs/>
+                <w:i w:val="false"/>
+                <w:iCs w:val="false"/>
+                <w:caps w:val="false"/>
+                <w:color w:val="2D1B69"/>
+                <w:sz w:val="13"/>
+                <w:szCs w:val="13"/>
+              </w:rPr>
+              <w:t xml:space="preserve">RODO – rozporządzenie (UE) 2016/679</w:t>
+            </w:r>
+          </w:p>
+        </w:tc>
+        <w:tc>
+          <w:tcPr>
+            <w:tcW w:type="dxa" w:w="1300"/>
+            <w:tcBorders>
+              <w:top w:val="single" w:color="E3E1EC" w:sz="4"/>
+              <w:left w:val="single" w:color="E3E1EC" w:sz="4"/>
+              <w:bottom w:val="single" w:color="E3E1EC" w:sz="4"/>
+              <w:right w:val="single" w:color="E3E1EC" w:sz="4"/>
+            </w:tcBorders>
+            <w:tcMar>
+              <w:top w:type="dxa" w:w="50"/>
+              <w:left w:type="dxa" w:w="140"/>
+              <w:bottom w:type="dxa" w:w="50"/>
+              <w:right w:type="dxa" w:w="120"/>
+            </w:tcMar>
+            <w:vAlign w:val="top"/>
+          </w:tcPr>
+          <w:p>
+            <w:pPr>
+              <w:spacing w:after="0" w:before="0" w:line="230"/>
+              <w:jc w:val="left"/>
+            </w:pPr>
+            <w:r>
+              <w:rPr>
+                <w:rFonts w:ascii="Arial" w:cs="Arial" w:eastAsia="Arial" w:hAnsi="Arial"/>
+                <w:b/>
+                <w:bCs/>
+                <w:i w:val="false"/>
+                <w:iCs w:val="false"/>
+                <w:caps w:val="false"/>
+                <w:color w:val="E74509"/>
+                <w:sz w:val="12"/>
+                <w:szCs w:val="12"/>
+              </w:rPr>
+              <w:t xml:space="preserve">Dz. Urz. UE L 119</w:t>
+            </w:r>
+          </w:p>
+        </w:tc>
+        <w:tc>
+          <w:tcPr>
+            <w:tcW w:type="dxa" w:w="5306"/>
+            <w:tcBorders>
+              <w:top w:val="single" w:color="E3E1EC" w:sz="4"/>
+              <w:left w:val="single" w:color="E3E1EC" w:sz="4"/>
+              <w:bottom w:val="single" w:color="E3E1EC" w:sz="4"/>
+              <w:right w:val="single" w:color="E3E1EC" w:sz="4"/>
+            </w:tcBorders>
+            <w:tcMar>
+              <w:top w:type="dxa" w:w="50"/>
+              <w:left w:type="dxa" w:w="140"/>
+              <w:bottom w:type="dxa" w:w="50"/>
+              <w:right w:type="dxa" w:w="120"/>
+            </w:tcMar>
+            <w:vAlign w:val="top"/>
+          </w:tcPr>
+          <w:p>
+            <w:pPr>
+              <w:spacing w:after="0" w:before="0" w:line="230"/>
+              <w:jc w:val="left"/>
+            </w:pPr>
+            <w:r>
+              <w:rPr>
+                <w:rFonts w:ascii="Arial" w:cs="Arial" w:eastAsia="Arial" w:hAnsi="Arial"/>
+                <w:b w:val="false"/>
+                <w:bCs w:val="false"/>
+                <w:i w:val="false"/>
+                <w:iCs w:val="false"/>
+                <w:caps w:val="false"/>
+                <w:color w:val="1A1530"/>
+                <w:sz w:val="13"/>
+                <w:szCs w:val="13"/>
+              </w:rPr>
+              <w:t xml:space="preserve">art. 9: dane o zdrowiu – dokument poufny, udostępniany rodzicowi i poradni za zgodą rodzica.  </w:t>
+            </w:r>
+            <w:r>
+              <w:rPr>
+                <w:rFonts w:ascii="Arial" w:cs="Arial" w:eastAsia="Arial" w:hAnsi="Arial"/>
+                <w:b/>
+                <w:bCs/>
+                <w:i w:val="false"/>
+                <w:iCs w:val="false"/>
+                <w:caps w:val="false"/>
+                <w:color w:val="E74509"/>
+                <w:sz w:val="11"/>
+                <w:szCs w:val="11"/>
+                <w:shd w:fill="FDECE3" w:color="auto" w:val="clear"/>
+              </w:rPr>
+              <w:t xml:space="preserve"> cały dokument </w:t>
+            </w:r>
+          </w:p>
+        </w:tc>
+      </w:tr>
+    </w:tbl>
+    <w:p>
+      <w:pPr>
+        <w:keepNext/>
+        <w:spacing w:after="90" w:before="140"/>
+      </w:pPr>
+      <w:r>
+        <w:rPr>
+          <w:rFonts w:ascii="Arial" w:cs="Arial" w:eastAsia="Arial" w:hAnsi="Arial"/>
+          <w:b/>
+          <w:bCs/>
+          <w:i w:val="false"/>
+          <w:iCs w:val="false"/>
+          <w:caps w:val="false"/>
+          <w:color w:val="FFFFFF"/>
+          <w:sz w:val="16"/>
+          <w:szCs w:val="16"/>
+          <w:shd w:fill="2D1B69" w:color="auto" w:val="clear"/>
+        </w:rPr>
+        <w:t xml:space="preserve"> ? </w:t>
+      </w:r>
+      <w:r>
+        <w:rPr>
+          <w:rFonts w:ascii="Arial" w:cs="Arial" w:eastAsia="Arial" w:hAnsi="Arial"/>
+          <w:b/>
+          <w:bCs/>
+          <w:i w:val="false"/>
+          <w:iCs w:val="false"/>
+          <w:caps w:val="false"/>
+          <w:color w:val="2D1B69"/>
+          <w:sz w:val="18"/>
+          <w:szCs w:val="18"/>
+        </w:rPr>
+        <w:t xml:space="preserve">   Jak czytać ten raport</w:t>
+      </w:r>
+      <w:r>
+        <w:rPr>
+          <w:rFonts w:ascii="Arial" w:cs="Arial" w:eastAsia="Arial" w:hAnsi="Arial"/>
+          <w:b w:val="false"/>
+          <w:bCs w:val="false"/>
+          <w:i w:val="false"/>
+          <w:iCs w:val="false"/>
+          <w:caps w:val="false"/>
+          <w:color w:val="6B6378"/>
+          <w:sz w:val="14"/>
+          <w:szCs w:val="14"/>
+        </w:rPr>
+        <w:t xml:space="preserve">   · pięć kroków od obserwacji do oceny efektów · Część I–II = opinia dla rodzica i poradni, Część III = organizacja wsparcia</w:t>
+      </w:r>
+    </w:p>
+    <w:tbl>
+      <w:tblPr>
+        <w:tblW w:type="dxa" w:w="9906"/>
+        <w:tblBorders>
+          <w:top w:val="single" w:color="auto" w:sz="4"/>
+          <w:left w:val="single" w:color="auto" w:sz="4"/>
+          <w:bottom w:val="single" w:color="auto" w:sz="4"/>
+          <w:right w:val="single" w:color="auto" w:sz="4"/>
+          <w:insideH w:val="single" w:color="auto" w:sz="4"/>
+          <w:insideV w:val="single" w:color="auto" w:sz="4"/>
+        </w:tblBorders>
+      </w:tblPr>
+      <w:tblGrid>
+        <w:gridCol w:w="1981"/>
+        <w:gridCol w:w="1981"/>
+        <w:gridCol w:w="1981"/>
+        <w:gridCol w:w="1981"/>
+        <w:gridCol w:w="1982"/>
+      </w:tblGrid>
+      <w:tr>
+        <w:trPr>
+          <w:cantSplit/>
+        </w:trPr>
+        <w:tc>
+          <w:tcPr>
+            <w:tcW w:type="dxa" w:w="1981"/>
+            <w:tcBorders>
+              <w:top w:val="single" w:color="D9D0F0" w:sz="4"/>
+              <w:left w:val="single" w:color="D9D0F0" w:sz="4"/>
+              <w:bottom w:val="single" w:color="D9D0F0" w:sz="4"/>
+              <w:right w:val="single" w:color="D9D0F0" w:sz="4"/>
+            </w:tcBorders>
+            <w:tcMar>
+              <w:top w:type="dxa" w:w="80"/>
+              <w:left w:type="dxa" w:w="120"/>
+              <w:bottom w:type="dxa" w:w="80"/>
+              <w:right w:type="dxa" w:w="100"/>
+            </w:tcMar>
+            <w:vAlign w:val="top"/>
+          </w:tcPr>
+          <w:p>
+            <w:pPr>
+              <w:spacing w:after="20" w:before="0" w:line="276"/>
+              <w:jc w:val="left"/>
+            </w:pPr>
+            <w:r>
+              <w:rPr>
+                <w:rFonts w:ascii="Arial" w:cs="Arial" w:eastAsia="Arial" w:hAnsi="Arial"/>
+                <w:b/>
+                <w:bCs/>
+                <w:i w:val="false"/>
+                <w:iCs w:val="false"/>
+                <w:caps w:val="false"/>
+                <w:color w:val="E74509"/>
+                <w:spacing w:val="12"/>
+                <w:sz w:val="11"/>
+                <w:szCs w:val="11"/>
+              </w:rPr>
+              <w:t xml:space="preserve">CZĘŚĆ I</w:t>
+            </w:r>
+          </w:p>
+          <w:p>
+            <w:pPr>
+              <w:spacing w:after="30" w:before="0" w:line="276"/>
+              <w:jc w:val="left"/>
+            </w:pPr>
+            <w:r>
+              <w:rPr>
+                <w:rFonts w:ascii="Arial" w:cs="Arial" w:eastAsia="Arial" w:hAnsi="Arial"/>
+                <w:b/>
+                <w:bCs/>
+                <w:i w:val="false"/>
+                <w:iCs w:val="false"/>
+                <w:caps w:val="false"/>
+                <w:color w:val="2D1B69"/>
+                <w:sz w:val="15"/>
+                <w:szCs w:val="15"/>
+              </w:rPr>
+              <w:t xml:space="preserve">Obserwujemy</w:t>
+            </w:r>
+          </w:p>
+          <w:p>
+            <w:pPr>
+              <w:spacing w:after="0" w:before="0" w:line="220"/>
+              <w:jc w:val="left"/>
+            </w:pPr>
+            <w:r>
+              <w:rPr>
+                <w:rFonts w:ascii="Arial" w:cs="Arial" w:eastAsia="Arial" w:hAnsi="Arial"/>
+                <w:b w:val="false"/>
+                <w:bCs w:val="false"/>
+                <w:i w:val="false"/>
+                <w:iCs w:val="false"/>
+                <w:caps w:val="false"/>
+                <w:color w:val="6B6378"/>
+                <w:sz w:val="12"/>
+                <w:szCs w:val="12"/>
+              </w:rPr>
+              <w:t xml:space="preserve">sekcje 1–3: kto, kiedy, jakimi narzędziami</w:t>
+            </w:r>
+          </w:p>
+        </w:tc>
+        <w:tc>
+          <w:tcPr>
+            <w:tcW w:type="dxa" w:w="1981"/>
+            <w:tcBorders>
+              <w:top w:val="single" w:color="D9D0F0" w:sz="4"/>
+              <w:left w:val="single" w:color="D9D0F0" w:sz="4"/>
+              <w:bottom w:val="single" w:color="D9D0F0" w:sz="4"/>
+              <w:right w:val="single" w:color="D9D0F0" w:sz="4"/>
+            </w:tcBorders>
+            <w:tcMar>
+              <w:top w:type="dxa" w:w="80"/>
+              <w:left w:type="dxa" w:w="120"/>
+              <w:bottom w:type="dxa" w:w="80"/>
+              <w:right w:type="dxa" w:w="100"/>
+            </w:tcMar>
+            <w:vAlign w:val="top"/>
+          </w:tcPr>
+          <w:p>
+            <w:pPr>
+              <w:spacing w:after="20" w:before="0" w:line="276"/>
+              <w:jc w:val="left"/>
+            </w:pPr>
+            <w:r>
+              <w:rPr>
+                <w:rFonts w:ascii="Arial" w:cs="Arial" w:eastAsia="Arial" w:hAnsi="Arial"/>
+                <w:b/>
+                <w:bCs/>
+                <w:i w:val="false"/>
+                <w:iCs w:val="false"/>
+                <w:caps w:val="false"/>
+                <w:color w:val="E74509"/>
+                <w:spacing w:val="12"/>
+                <w:sz w:val="11"/>
+                <w:szCs w:val="11"/>
+              </w:rPr>
+              <w:t xml:space="preserve">CZĘŚĆ II</w:t>
+            </w:r>
+          </w:p>
+          <w:p>
+            <w:pPr>
+              <w:spacing w:after="30" w:before="0" w:line="276"/>
+              <w:jc w:val="left"/>
+            </w:pPr>
+            <w:r>
+              <w:rPr>
+                <w:rFonts w:ascii="Arial" w:cs="Arial" w:eastAsia="Arial" w:hAnsi="Arial"/>
+                <w:b/>
+                <w:bCs/>
+                <w:i w:val="false"/>
+                <w:iCs w:val="false"/>
+                <w:caps w:val="false"/>
+                <w:color w:val="2D1B69"/>
+                <w:sz w:val="15"/>
+                <w:szCs w:val="15"/>
+              </w:rPr>
+              <w:t xml:space="preserve">Opisujemy wyniki</w:t>
+            </w:r>
+          </w:p>
+          <w:p>
+            <w:pPr>
+              <w:spacing w:after="0" w:before="0" w:line="220"/>
+              <w:jc w:val="left"/>
+            </w:pPr>
+            <w:r>
+              <w:rPr>
+                <w:rFonts w:ascii="Arial" w:cs="Arial" w:eastAsia="Arial" w:hAnsi="Arial"/>
+                <w:b w:val="false"/>
+                <w:bCs w:val="false"/>
+                <w:i w:val="false"/>
+                <w:iCs w:val="false"/>
+                <w:caps w:val="false"/>
+                <w:color w:val="6B6378"/>
+                <w:sz w:val="12"/>
+                <w:szCs w:val="12"/>
+              </w:rPr>
+              <w:t xml:space="preserve">sekcje 4–9: funkcjonowanie, liczby, arkusze, głos dziecka, analiza</w:t>
+            </w:r>
+          </w:p>
+        </w:tc>
+        <w:tc>
+          <w:tcPr>
+            <w:tcW w:type="dxa" w:w="1981"/>
+            <w:tcBorders>
+              <w:top w:val="single" w:color="D9D0F0" w:sz="4"/>
+              <w:left w:val="single" w:color="D9D0F0" w:sz="4"/>
+              <w:bottom w:val="single" w:color="D9D0F0" w:sz="4"/>
+              <w:right w:val="single" w:color="D9D0F0" w:sz="4"/>
+            </w:tcBorders>
+            <w:tcMar>
+              <w:top w:type="dxa" w:w="80"/>
+              <w:left w:type="dxa" w:w="120"/>
+              <w:bottom w:type="dxa" w:w="80"/>
+              <w:right w:type="dxa" w:w="100"/>
+            </w:tcMar>
+            <w:vAlign w:val="top"/>
+          </w:tcPr>
+          <w:p>
+            <w:pPr>
+              <w:spacing w:after="20" w:before="0" w:line="276"/>
+              <w:jc w:val="left"/>
+            </w:pPr>
+            <w:r>
+              <w:rPr>
+                <w:rFonts w:ascii="Arial" w:cs="Arial" w:eastAsia="Arial" w:hAnsi="Arial"/>
+                <w:b/>
+                <w:bCs/>
+                <w:i w:val="false"/>
+                <w:iCs w:val="false"/>
+                <w:caps w:val="false"/>
+                <w:color w:val="E74509"/>
+                <w:spacing w:val="12"/>
+                <w:sz w:val="11"/>
+                <w:szCs w:val="11"/>
+              </w:rPr>
+              <w:t xml:space="preserve">CZĘŚĆ II</w:t>
+            </w:r>
+          </w:p>
+          <w:p>
+            <w:pPr>
+              <w:spacing w:after="30" w:before="0" w:line="276"/>
+              <w:jc w:val="left"/>
+            </w:pPr>
+            <w:r>
+              <w:rPr>
+                <w:rFonts w:ascii="Arial" w:cs="Arial" w:eastAsia="Arial" w:hAnsi="Arial"/>
+                <w:b/>
+                <w:bCs/>
+                <w:i w:val="false"/>
+                <w:iCs w:val="false"/>
+                <w:caps w:val="false"/>
+                <w:color w:val="2D1B69"/>
+                <w:sz w:val="15"/>
+                <w:szCs w:val="15"/>
+              </w:rPr>
+              <w:t xml:space="preserve">Decydujemy</w:t>
+            </w:r>
+          </w:p>
+          <w:p>
+            <w:pPr>
+              <w:spacing w:after="0" w:before="0" w:line="220"/>
+              <w:jc w:val="left"/>
+            </w:pPr>
+            <w:r>
+              <w:rPr>
+                <w:rFonts w:ascii="Arial" w:cs="Arial" w:eastAsia="Arial" w:hAnsi="Arial"/>
+                <w:b w:val="false"/>
+                <w:bCs w:val="false"/>
+                <w:i w:val="false"/>
+                <w:iCs w:val="false"/>
+                <w:caps w:val="false"/>
+                <w:color w:val="6B6378"/>
+                <w:sz w:val="12"/>
+                <w:szCs w:val="12"/>
+              </w:rPr>
+              <w:t xml:space="preserve">sekcja 10: Zespół ustala poziom wsparcia</w:t>
+            </w:r>
+          </w:p>
+        </w:tc>
+        <w:tc>
+          <w:tcPr>
+            <w:tcW w:type="dxa" w:w="1981"/>
+            <w:tcBorders>
+              <w:top w:val="single" w:color="D9D0F0" w:sz="4"/>
+              <w:left w:val="single" w:color="D9D0F0" w:sz="4"/>
+              <w:bottom w:val="single" w:color="D9D0F0" w:sz="4"/>
+              <w:right w:val="single" w:color="D9D0F0" w:sz="4"/>
+            </w:tcBorders>
+            <w:tcMar>
+              <w:top w:type="dxa" w:w="80"/>
+              <w:left w:type="dxa" w:w="120"/>
+              <w:bottom w:type="dxa" w:w="80"/>
+              <w:right w:type="dxa" w:w="100"/>
+            </w:tcMar>
+            <w:vAlign w:val="top"/>
+          </w:tcPr>
+          <w:p>
+            <w:pPr>
+              <w:spacing w:after="20" w:before="0" w:line="276"/>
+              <w:jc w:val="left"/>
+            </w:pPr>
+            <w:r>
+              <w:rPr>
+                <w:rFonts w:ascii="Arial" w:cs="Arial" w:eastAsia="Arial" w:hAnsi="Arial"/>
+                <w:b/>
+                <w:bCs/>
+                <w:i w:val="false"/>
+                <w:iCs w:val="false"/>
+                <w:caps w:val="false"/>
+                <w:color w:val="E74509"/>
+                <w:spacing w:val="12"/>
+                <w:sz w:val="11"/>
+                <w:szCs w:val="11"/>
+              </w:rPr>
+              <w:t xml:space="preserve">CZĘŚĆ III</w:t>
+            </w:r>
+          </w:p>
+          <w:p>
+            <w:pPr>
+              <w:spacing w:after="30" w:before="0" w:line="276"/>
+              <w:jc w:val="left"/>
+            </w:pPr>
+            <w:r>
+              <w:rPr>
+                <w:rFonts w:ascii="Arial" w:cs="Arial" w:eastAsia="Arial" w:hAnsi="Arial"/>
+                <w:b/>
+                <w:bCs/>
+                <w:i w:val="false"/>
+                <w:iCs w:val="false"/>
+                <w:caps w:val="false"/>
+                <w:color w:val="2D1B69"/>
+                <w:sz w:val="15"/>
+                <w:szCs w:val="15"/>
+              </w:rPr>
+              <w:t xml:space="preserve">Planujemy wsparcie</w:t>
+            </w:r>
+          </w:p>
+          <w:p>
+            <w:pPr>
+              <w:spacing w:after="0" w:before="0" w:line="220"/>
+              <w:jc w:val="left"/>
+            </w:pPr>
+            <w:r>
+              <w:rPr>
+                <w:rFonts w:ascii="Arial" w:cs="Arial" w:eastAsia="Arial" w:hAnsi="Arial"/>
+                <w:b w:val="false"/>
+                <w:bCs w:val="false"/>
+                <w:i w:val="false"/>
+                <w:iCs w:val="false"/>
+                <w:caps w:val="false"/>
+                <w:color w:val="6B6378"/>
+                <w:sz w:val="12"/>
+                <w:szCs w:val="12"/>
+              </w:rPr>
+              <w:t xml:space="preserve">sekcje 11–15: program, zajęcia, osoby, rodzice, poradnia</w:t>
+            </w:r>
+          </w:p>
+        </w:tc>
+        <w:tc>
+          <w:tcPr>
+            <w:tcW w:type="dxa" w:w="1982"/>
+            <w:tcBorders>
+              <w:top w:val="single" w:color="D9D0F0" w:sz="4"/>
+              <w:left w:val="single" w:color="D9D0F0" w:sz="4"/>
+              <w:bottom w:val="single" w:color="D9D0F0" w:sz="4"/>
+              <w:right w:val="single" w:color="D9D0F0" w:sz="4"/>
+            </w:tcBorders>
+            <w:tcMar>
+              <w:top w:type="dxa" w:w="80"/>
+              <w:left w:type="dxa" w:w="120"/>
+              <w:bottom w:type="dxa" w:w="80"/>
+              <w:right w:type="dxa" w:w="100"/>
+            </w:tcMar>
+            <w:vAlign w:val="top"/>
+          </w:tcPr>
+          <w:p>
+            <w:pPr>
+              <w:spacing w:after="20" w:before="0" w:line="276"/>
+              <w:jc w:val="left"/>
+            </w:pPr>
+            <w:r>
+              <w:rPr>
+                <w:rFonts w:ascii="Arial" w:cs="Arial" w:eastAsia="Arial" w:hAnsi="Arial"/>
+                <w:b/>
+                <w:bCs/>
+                <w:i w:val="false"/>
+                <w:iCs w:val="false"/>
+                <w:caps w:val="false"/>
+                <w:color w:val="E74509"/>
+                <w:spacing w:val="12"/>
+                <w:sz w:val="11"/>
+                <w:szCs w:val="11"/>
+              </w:rPr>
+              <w:t xml:space="preserve">CZĘŚĆ III</w:t>
+            </w:r>
+          </w:p>
+          <w:p>
+            <w:pPr>
+              <w:spacing w:after="30" w:before="0" w:line="276"/>
+              <w:jc w:val="left"/>
+            </w:pPr>
+            <w:r>
+              <w:rPr>
+                <w:rFonts w:ascii="Arial" w:cs="Arial" w:eastAsia="Arial" w:hAnsi="Arial"/>
+                <w:b/>
+                <w:bCs/>
+                <w:i w:val="false"/>
+                <w:iCs w:val="false"/>
+                <w:caps w:val="false"/>
+                <w:color w:val="2D1B69"/>
+                <w:sz w:val="15"/>
+                <w:szCs w:val="15"/>
+              </w:rPr>
+              <w:t xml:space="preserve">Sprawdzamy efekty</w:t>
+            </w:r>
+          </w:p>
+          <w:p>
+            <w:pPr>
+              <w:spacing w:after="0" w:before="0" w:line="220"/>
+              <w:jc w:val="left"/>
+            </w:pPr>
+            <w:r>
+              <w:rPr>
+                <w:rFonts w:ascii="Arial" w:cs="Arial" w:eastAsia="Arial" w:hAnsi="Arial"/>
+                <w:b w:val="false"/>
+                <w:bCs w:val="false"/>
+                <w:i w:val="false"/>
+                <w:iCs w:val="false"/>
+                <w:caps w:val="false"/>
+                <w:color w:val="6B6378"/>
+                <w:sz w:val="12"/>
+                <w:szCs w:val="12"/>
+              </w:rPr>
+              <w:t xml:space="preserve">sekcja 16: terminy oceny i podpisy</w:t>
+            </w:r>
+          </w:p>
+        </w:tc>
+      </w:tr>
+    </w:tbl>
+    <w:p>
+      <w:pPr>
+        <w:pageBreakBefore/>
+        <w:spacing w:after="0" w:before="0" w:line="20" w:lineRule="exact"/>
+      </w:pPr>
+      <w:r>
+        <w:rPr>
+          <w:rFonts w:ascii="Arial" w:cs="Arial" w:eastAsia="Arial" w:hAnsi="Arial"/>
+          <w:b w:val="false"/>
+          <w:bCs w:val="false"/>
+          <w:i w:val="false"/>
+          <w:iCs w:val="false"/>
+          <w:caps w:val="false"/>
+          <w:color w:val="1A1530"/>
+          <w:sz w:val="2"/>
+          <w:szCs w:val="2"/>
+        </w:rPr>
+        <w:t xml:space="preserve"/>
+      </w:r>
+    </w:p>
+    <w:tbl>
+      <w:tblPr>
+        <w:tblW w:type="dxa" w:w="9906"/>
+        <w:tblBorders>
+          <w:top w:val="single" w:color="auto" w:sz="4"/>
+          <w:left w:val="single" w:color="auto" w:sz="4"/>
+          <w:bottom w:val="single" w:color="auto" w:sz="4"/>
+          <w:right w:val="single" w:color="auto" w:sz="4"/>
+          <w:insideH w:val="single" w:color="auto" w:sz="4"/>
+          <w:insideV w:val="single" w:color="auto" w:sz="4"/>
+        </w:tblBorders>
+      </w:tblPr>
+      <w:tblGrid>
+        <w:gridCol w:w="700"/>
+        <w:gridCol w:w="6200"/>
+        <w:gridCol w:w="3006"/>
+      </w:tblGrid>
+      <w:tr>
+        <w:trPr>
+          <w:cantSplit/>
+        </w:trPr>
+        <w:tc>
+          <w:tcPr>
+            <w:tcW w:type="dxa" w:w="700"/>
+            <w:tcBorders>
+              <w:top w:val="nil"/>
+              <w:left w:val="nil"/>
+              <w:bottom w:val="nil"/>
+              <w:right w:val="nil"/>
+            </w:tcBorders>
+            <w:shd w:fill="2D1B69" w:color="auto" w:val="clear"/>
+            <w:tcMar>
+              <w:top w:type="dxa" w:w="120"/>
+              <w:left w:type="dxa" w:w="40"/>
+              <w:bottom w:type="dxa" w:w="120"/>
+              <w:right w:type="dxa" w:w="40"/>
+            </w:tcMar>
+            <w:vAlign w:val="center"/>
+          </w:tcPr>
+          <w:p>
+            <w:pPr>
+              <w:spacing w:after="0" w:before="0" w:line="276"/>
+              <w:jc w:val="center"/>
+            </w:pPr>
+            <w:r>
+              <w:rPr>
+                <w:rFonts w:ascii="Arial" w:cs="Arial" w:eastAsia="Arial" w:hAnsi="Arial"/>
+                <w:b/>
+                <w:bCs/>
+                <w:i w:val="false"/>
+                <w:iCs w:val="false"/>
+                <w:caps w:val="false"/>
+                <w:color w:val="FFFFFF"/>
+                <w:sz w:val="12"/>
+                <w:szCs w:val="12"/>
+              </w:rPr>
+              <w:t xml:space="preserve">PCTP</w:t>
+            </w:r>
+          </w:p>
+        </w:tc>
+        <w:tc>
+          <w:tcPr>
+            <w:tcW w:type="dxa" w:w="6200"/>
+            <w:tcBorders>
+              <w:top w:val="nil"/>
+              <w:left w:val="nil"/>
+              <w:bottom w:val="nil"/>
+              <w:right w:val="nil"/>
+            </w:tcBorders>
+            <w:tcMar>
+              <w:top w:type="dxa" w:w="0"/>
+              <w:left w:type="dxa" w:w="160"/>
+              <w:bottom w:type="dxa" w:w="0"/>
+              <w:right w:type="dxa" w:w="0"/>
+            </w:tcMar>
+            <w:vAlign w:val="center"/>
+          </w:tcPr>
+          <w:p>
+            <w:pPr>
+              <w:spacing w:after="20" w:before="0" w:line="276"/>
+              <w:jc w:val="left"/>
+            </w:pPr>
+            <w:r>
+              <w:rPr>
+                <w:rFonts w:ascii="Arial" w:cs="Arial" w:eastAsia="Arial" w:hAnsi="Arial"/>
+                <w:b/>
+                <w:bCs/>
+                <w:i w:val="false"/>
+                <w:iCs w:val="false"/>
+                <w:caps w:val="false"/>
+                <w:color w:val="2D1B69"/>
+                <w:sz w:val="26"/>
+                <w:szCs w:val="26"/>
+              </w:rPr>
+              <w:t xml:space="preserve">EduPlaner 2026</w:t>
+            </w:r>
+          </w:p>
+          <w:p>
+            <w:pPr>
+              <w:spacing w:after="0" w:before="0" w:line="276"/>
+              <w:jc w:val="left"/>
+            </w:pPr>
+            <w:r>
+              <w:rPr>
+                <w:rFonts w:ascii="Arial" w:cs="Arial" w:eastAsia="Arial" w:hAnsi="Arial"/>
+                <w:b w:val="false"/>
+                <w:bCs w:val="false"/>
+                <w:i w:val="false"/>
+                <w:iCs w:val="false"/>
+                <w:caps/>
+                <w:color w:val="6B6378"/>
+                <w:spacing w:val="14"/>
+                <w:sz w:val="12"/>
+                <w:szCs w:val="12"/>
+              </w:rPr>
               <w:t xml:space="preserve">Raport Oceny Funkcjonalnej · Metryczka i obserwacja wstępna</w:t>
             </w:r>
           </w:p>
@@ -6403,6 +8468,27 @@
     </w:p>
     <w:p>
       <w:pPr>
+        <w:spacing w:after="120" w:before="0" w:line="276"/>
+        <w:jc w:val="left"/>
+      </w:pPr>
+      <w:r>
+        <w:rPr>
+          <w:rFonts w:ascii="Arial" w:cs="Arial" w:eastAsia="Arial" w:hAnsi="Arial"/>
+          <w:b/>
+          <w:bCs/>
+          <w:i w:val="false"/>
+          <w:iCs w:val="false"/>
+          <w:caps w:val="false"/>
+          <w:color w:val="2D1B69"/>
+          <w:sz w:val="12"/>
+          <w:szCs w:val="12"/>
+          <w:shd w:fill="EFE9F9" w:color="auto" w:val="clear"/>
+        </w:rPr>
+        <w:t xml:space="preserve"> § Podstawa prawna: § 7 ust. 6 pkt 3 rozp. z 2.03.2026 (poz. 428) · § 6 ust. 10 pkt 1 i 3 rozp. o kształceniu specjalnym </w:t>
+      </w:r>
+    </w:p>
+    <w:p>
+      <w:pPr>
         <w:spacing w:after="140" w:before="0" w:line="260"/>
         <w:jc w:val="both"/>
       </w:pPr>
@@ -7666,6 +9752,27 @@
           <w:szCs w:val="22"/>
         </w:rPr>
         <w:t xml:space="preserve">AKTUALNA WIELOSPECJALISTYCZNA OCENA POZIOMU FUNKCJONOWANIA – WYNIKI LICZBOWE</w:t>
+      </w:r>
+    </w:p>
+    <w:p>
+      <w:pPr>
+        <w:spacing w:after="120" w:before="0" w:line="276"/>
+        <w:jc w:val="left"/>
+      </w:pPr>
+      <w:r>
+        <w:rPr>
+          <w:rFonts w:ascii="Arial" w:cs="Arial" w:eastAsia="Arial" w:hAnsi="Arial"/>
+          <w:b/>
+          <w:bCs/>
+          <w:i w:val="false"/>
+          <w:iCs w:val="false"/>
+          <w:caps w:val="false"/>
+          <w:color w:val="2D1B69"/>
+          <w:sz w:val="12"/>
+          <w:szCs w:val="12"/>
+          <w:shd w:fill="EFE9F9" w:color="auto" w:val="clear"/>
+        </w:rPr>
+        <w:t xml:space="preserve"> § Podstawa prawna: § 7 ust. 6 pkt 4 rozp. z 2.03.2026 (poz. 428) · ICF d1–d9 </w:t>
       </w:r>
     </w:p>
     <w:p>
@@ -11167,6 +13274,27 @@
         <w:t xml:space="preserve">WYNIKI OBSERWACJI POGŁĘBIONEJ (NARZĘDZIA SPECJALISTYCZNE)</w:t>
       </w:r>
     </w:p>
+    <w:p>
+      <w:pPr>
+        <w:spacing w:after="120" w:before="0" w:line="276"/>
+        <w:jc w:val="left"/>
+      </w:pPr>
+      <w:r>
+        <w:rPr>
+          <w:rFonts w:ascii="Arial" w:cs="Arial" w:eastAsia="Arial" w:hAnsi="Arial"/>
+          <w:b/>
+          <w:bCs/>
+          <w:i w:val="false"/>
+          <w:iCs w:val="false"/>
+          <w:caps w:val="false"/>
+          <w:color w:val="2D1B69"/>
+          <w:sz w:val="12"/>
+          <w:szCs w:val="12"/>
+          <w:shd w:fill="EFE9F9" w:color="auto" w:val="clear"/>
+        </w:rPr>
+        <w:t xml:space="preserve"> § Podstawa prawna: § 7 ust. 6 pkt 4–5 rozp. z 2.03.2026 (poz. 428) · § 6 ust. 10 pkt 3 rozp. o kształceniu specjalnym </w:t>
+      </w:r>
+    </w:p>
     <w:tbl>
       <w:tblPr>
         <w:tblW w:type="dxa" w:w="9906"/>
@@ -12470,6 +14598,27 @@
           <w:szCs w:val="22"/>
         </w:rPr>
         <w:t xml:space="preserve">MÓJ GŁOS – PERSPEKTYWA DZIECKA / UCZNIA</w:t>
+      </w:r>
+    </w:p>
+    <w:p>
+      <w:pPr>
+        <w:spacing w:after="120" w:before="0" w:line="276"/>
+        <w:jc w:val="left"/>
+      </w:pPr>
+      <w:r>
+        <w:rPr>
+          <w:rFonts w:ascii="Arial" w:cs="Arial" w:eastAsia="Arial" w:hAnsi="Arial"/>
+          <w:b/>
+          <w:bCs/>
+          <w:i w:val="false"/>
+          <w:iCs w:val="false"/>
+          <w:caps w:val="false"/>
+          <w:color w:val="2D1B69"/>
+          <w:sz w:val="12"/>
+          <w:szCs w:val="12"/>
+          <w:shd w:fill="EFE9F9" w:color="auto" w:val="clear"/>
+        </w:rPr>
+        <w:t xml:space="preserve"> § Podstawa prawna: model oceny funkcjonalnej 2026/27 · ICF: czynniki osobowe · art. 127 Prawa oświatowego (podmiotowość ucznia) </w:t>
       </w:r>
     </w:p>
     <w:p>
@@ -14611,6 +16760,27 @@
     </w:p>
     <w:p>
       <w:pPr>
+        <w:spacing w:after="120" w:before="0" w:line="276"/>
+        <w:jc w:val="left"/>
+      </w:pPr>
+      <w:r>
+        <w:rPr>
+          <w:rFonts w:ascii="Arial" w:cs="Arial" w:eastAsia="Arial" w:hAnsi="Arial"/>
+          <w:b/>
+          <w:bCs/>
+          <w:i w:val="false"/>
+          <w:iCs w:val="false"/>
+          <w:caps w:val="false"/>
+          <w:color w:val="2D1B69"/>
+          <w:sz w:val="12"/>
+          <w:szCs w:val="12"/>
+          <w:shd w:fill="EFE9F9" w:color="auto" w:val="clear"/>
+        </w:rPr>
+        <w:t xml:space="preserve"> § Podstawa prawna: § 7 ust. 6 pkt 6 rozp. z 2.03.2026 (poz. 428) · § 6 ust. 10 pkt 2 rozp. o kształceniu specjalnym </w:t>
+      </w:r>
+    </w:p>
+    <w:p>
+      <w:pPr>
         <w:spacing w:after="140" w:before="0" w:line="260"/>
         <w:jc w:val="both"/>
       </w:pPr>
@@ -15719,6 +17889,27 @@
     </w:p>
     <w:p>
       <w:pPr>
+        <w:spacing w:after="120" w:before="0" w:line="276"/>
+        <w:jc w:val="left"/>
+      </w:pPr>
+      <w:r>
+        <w:rPr>
+          <w:rFonts w:ascii="Arial" w:cs="Arial" w:eastAsia="Arial" w:hAnsi="Arial"/>
+          <w:b/>
+          <w:bCs/>
+          <w:i w:val="false"/>
+          <w:iCs w:val="false"/>
+          <w:caps w:val="false"/>
+          <w:color w:val="2D1B69"/>
+          <w:sz w:val="12"/>
+          <w:szCs w:val="12"/>
+          <w:shd w:fill="EFE9F9" w:color="auto" w:val="clear"/>
+        </w:rPr>
+        <w:t xml:space="preserve"> § Podstawa prawna: § 7 ust. 6 pkt 4 rozp. z 2.03.2026 (poz. 428) · § 6 ust. 10 rozp. o kształceniu specjalnym </w:t>
+      </w:r>
+    </w:p>
+    <w:p>
+      <w:pPr>
         <w:spacing w:after="140" w:before="0" w:line="260"/>
         <w:jc w:val="both"/>
       </w:pPr>
@@ -18430,6 +20621,27 @@
           <w:szCs w:val="22"/>
         </w:rPr>
         <w:t xml:space="preserve">USTALENIE DECYZJĄ ZESPOŁU POZIOMU WSPARCIA DLA DZIECKA / UCZNIA</w:t>
+      </w:r>
+    </w:p>
+    <w:p>
+      <w:pPr>
+        <w:spacing w:after="120" w:before="0" w:line="276"/>
+        <w:jc w:val="left"/>
+      </w:pPr>
+      <w:r>
+        <w:rPr>
+          <w:rFonts w:ascii="Arial" w:cs="Arial" w:eastAsia="Arial" w:hAnsi="Arial"/>
+          <w:b/>
+          <w:bCs/>
+          <w:i w:val="false"/>
+          <w:iCs w:val="false"/>
+          <w:caps w:val="false"/>
+          <w:color w:val="2D1B69"/>
+          <w:sz w:val="12"/>
+          <w:szCs w:val="12"/>
+          <w:shd w:fill="EFE9F9" w:color="auto" w:val="clear"/>
+        </w:rPr>
+        <w:t xml:space="preserve"> § Podstawa prawna: art. 127 Prawa oświatowego · § 6 ust. 2–3 rozp. o kształceniu specjalnym (zespół, udział rodziców) </w:t>
       </w:r>
     </w:p>
     <w:p>
@@ -19686,6 +21898,27 @@
           <w:szCs w:val="22"/>
         </w:rPr>
         <w:t xml:space="preserve">ZAKRES I SPOSÓB DOSTOSOWANIA PROGRAMU, ORGANIZACJI KSZTAŁCENIA I TECHNOLOGII</w:t>
+      </w:r>
+    </w:p>
+    <w:p>
+      <w:pPr>
+        <w:spacing w:after="120" w:before="0" w:line="276"/>
+        <w:jc w:val="left"/>
+      </w:pPr>
+      <w:r>
+        <w:rPr>
+          <w:rFonts w:ascii="Arial" w:cs="Arial" w:eastAsia="Arial" w:hAnsi="Arial"/>
+          <w:b/>
+          <w:bCs/>
+          <w:i w:val="false"/>
+          <w:iCs w:val="false"/>
+          <w:caps w:val="false"/>
+          <w:color w:val="2D1B69"/>
+          <w:sz w:val="12"/>
+          <w:szCs w:val="12"/>
+          <w:shd w:fill="EFE9F9" w:color="auto" w:val="clear"/>
+        </w:rPr>
+        <w:t xml:space="preserve"> § Podstawa prawna: § 6 ust. 1 pkt 1 i 7 rozp. o kształceniu specjalnym · rozp. o podstawie programowej </w:t>
       </w:r>
     </w:p>
     <w:p>
@@ -22452,6 +24685,27 @@
     </w:p>
     <w:p>
       <w:pPr>
+        <w:spacing w:after="120" w:before="0" w:line="276"/>
+        <w:jc w:val="left"/>
+      </w:pPr>
+      <w:r>
+        <w:rPr>
+          <w:rFonts w:ascii="Arial" w:cs="Arial" w:eastAsia="Arial" w:hAnsi="Arial"/>
+          <w:b/>
+          <w:bCs/>
+          <w:i w:val="false"/>
+          <w:iCs w:val="false"/>
+          <w:caps w:val="false"/>
+          <w:color w:val="2D1B69"/>
+          <w:sz w:val="12"/>
+          <w:szCs w:val="12"/>
+          <w:shd w:fill="EFE9F9" w:color="auto" w:val="clear"/>
+        </w:rPr>
+        <w:t xml:space="preserve"> § Podstawa prawna: § 6 ust. 1 pkt 2 rozp. o kształceniu specjalnym </w:t>
+      </w:r>
+    </w:p>
+    <w:p>
+      <w:pPr>
         <w:spacing w:after="140" w:before="0" w:line="260"/>
         <w:jc w:val="both"/>
       </w:pPr>
@@ -23854,6 +26108,27 @@
           <w:szCs w:val="22"/>
         </w:rPr>
         <w:t xml:space="preserve">ZAJĘCIA PRZYDZIELONE DZIECKU / UCZNIOWI I REALIZACJA ZALECEŃ PORADNI</w:t>
+      </w:r>
+    </w:p>
+    <w:p>
+      <w:pPr>
+        <w:spacing w:after="120" w:before="0" w:line="276"/>
+        <w:jc w:val="left"/>
+      </w:pPr>
+      <w:r>
+        <w:rPr>
+          <w:rFonts w:ascii="Arial" w:cs="Arial" w:eastAsia="Arial" w:hAnsi="Arial"/>
+          <w:b/>
+          <w:bCs/>
+          <w:i w:val="false"/>
+          <w:iCs w:val="false"/>
+          <w:caps w:val="false"/>
+          <w:color w:val="2D1B69"/>
+          <w:sz w:val="12"/>
+          <w:szCs w:val="12"/>
+          <w:shd w:fill="EFE9F9" w:color="auto" w:val="clear"/>
+        </w:rPr>
+        <w:t xml:space="preserve"> § Podstawa prawna: § 6 ust. 1 pkt 3, 5 i 8 rozp. o kształceniu specjalnym · rozp. o PPP (formy, czas 45 min) </w:t>
       </w:r>
     </w:p>
     <w:p>
@@ -30646,6 +32921,27 @@
       <w:r>
         <w:rPr>
           <w:rFonts w:ascii="Arial" w:cs="Arial" w:eastAsia="Arial" w:hAnsi="Arial"/>
+          <w:b/>
+          <w:bCs/>
+          <w:i w:val="false"/>
+          <w:iCs w:val="false"/>
+          <w:caps w:val="false"/>
+          <w:color w:val="2D1B69"/>
+          <w:sz w:val="12"/>
+          <w:szCs w:val="12"/>
+          <w:shd w:fill="EFE9F9" w:color="auto" w:val="clear"/>
+        </w:rPr>
+        <w:t xml:space="preserve"> § Podstawa prawna: § 7 ust. 2–7 rozp. o kształceniu specjalnym </w:t>
+      </w:r>
+    </w:p>
+    <w:p>
+      <w:pPr>
+        <w:spacing w:after="120" w:before="0" w:line="276"/>
+        <w:jc w:val="left"/>
+      </w:pPr>
+      <w:r>
+        <w:rPr>
+          <w:rFonts w:ascii="Arial" w:cs="Arial" w:eastAsia="Arial" w:hAnsi="Arial"/>
           <w:b w:val="false"/>
           <w:bCs w:val="false"/>
           <w:i w:val="false"/>
@@ -31802,6 +34098,27 @@
     </w:p>
     <w:p>
       <w:pPr>
+        <w:spacing w:after="120" w:before="0" w:line="276"/>
+        <w:jc w:val="left"/>
+      </w:pPr>
+      <w:r>
+        <w:rPr>
+          <w:rFonts w:ascii="Arial" w:cs="Arial" w:eastAsia="Arial" w:hAnsi="Arial"/>
+          <w:b/>
+          <w:bCs/>
+          <w:i w:val="false"/>
+          <w:iCs w:val="false"/>
+          <w:caps w:val="false"/>
+          <w:color w:val="2D1B69"/>
+          <w:sz w:val="12"/>
+          <w:szCs w:val="12"/>
+          <w:shd w:fill="EFE9F9" w:color="auto" w:val="clear"/>
+        </w:rPr>
+        <w:t xml:space="preserve"> § Podstawa prawna: § 6 ust. 1 pkt 4 i 6 rozp. o kształceniu specjalnym · rozp. o PPP (informowanie rodziców) </w:t>
+      </w:r>
+    </w:p>
+    <w:p>
+      <w:pPr>
         <w:keepNext/>
         <w:spacing w:after="90" w:before="140"/>
       </w:pPr>
@@ -34622,6 +36939,27 @@
           <w:szCs w:val="22"/>
         </w:rPr>
         <w:t xml:space="preserve">TERMINY OKRESOWEJ OCENY EFEKTYWNOŚCI PROGRAMU</w:t>
+      </w:r>
+    </w:p>
+    <w:p>
+      <w:pPr>
+        <w:spacing w:after="120" w:before="0" w:line="276"/>
+        <w:jc w:val="left"/>
+      </w:pPr>
+      <w:r>
+        <w:rPr>
+          <w:rFonts w:ascii="Arial" w:cs="Arial" w:eastAsia="Arial" w:hAnsi="Arial"/>
+          <w:b/>
+          <w:bCs/>
+          <w:i w:val="false"/>
+          <w:iCs w:val="false"/>
+          <w:caps w:val="false"/>
+          <w:color w:val="2D1B69"/>
+          <w:sz w:val="12"/>
+          <w:szCs w:val="12"/>
+          <w:shd w:fill="EFE9F9" w:color="auto" w:val="clear"/>
+        </w:rPr>
+        <w:t xml:space="preserve"> § Podstawa prawna: § 6 ust. 9 rozp. o kształceniu specjalnym (okresowa WOPF co najmniej 2 × w roku, ocena efektywności) </w:t>
       </w:r>
     </w:p>
     <w:p>

</xml_diff>

<commit_message>
Ocena Funkcjonalna: nowy tytuł, podstawa programowa 2026, obszary wg rozporządzenia
- Tytuł druku: Ocena Funkcjonalna – raport: podsumowanie WOPF i IPET.
- Podstawy prawne: rozp. ME z 11.03.2026 o podstawie programowej
  (Dz. U. 2026 poz. 378, zm. poz. 958); rozp. z 2017 r. przejściowo.
- Sekcja 4: pięć obszarów w kolejności z rozporządzenia (uczenie się,
  przystosowanie społeczne i emocjonalne, porozumiewanie się, aktywność
  ruchowa, dbanie o siebie) z kodami domen ICF.

Co-Authored-By: Claude Fable 5.1 <noreply@anthropic.com>
Claude-Session: https://claude.ai/code/session_01FpF7vCSW7jSofte5z6wEKy
</commit_message>
<xml_diff>
--- a/eduplaner2026/raport_oceny_funkcjonalnej/Raport_Oceny_Funkcjonalnej.docx
+++ b/eduplaner2026/raport_oceny_funkcjonalnej/Raport_Oceny_Funkcjonalnej.docx
@@ -117,7 +117,7 @@
                 <w:sz w:val="12"/>
                 <w:szCs w:val="12"/>
               </w:rPr>
-              <w:t xml:space="preserve">Raport Oceny Funkcjonalnej · Okładka</w:t>
+              <w:t xml:space="preserve">Ocena Funkcjonalna · Okładka</w:t>
             </w:r>
           </w:p>
         </w:tc>
@@ -464,7 +464,7 @@
           <w:sz w:val="15"/>
           <w:szCs w:val="15"/>
         </w:rPr>
-        <w:t xml:space="preserve">OCENA FUNKCJONALNA · ICF · PRZEDSZKOLE · SZKOŁA</w:t>
+        <w:t xml:space="preserve">OBSERWACJA WSTĘPNA I POGŁĘBIONA · ICF · PRZEDSZKOLE · SZKOŁA</w:t>
       </w:r>
     </w:p>
     <w:p>
@@ -484,7 +484,7 @@
           <w:sz w:val="52"/>
           <w:szCs w:val="52"/>
         </w:rPr>
-        <w:t xml:space="preserve">Raport Oceny Funkcjonalnej</w:t>
+        <w:t xml:space="preserve">Ocena Funkcjonalna</w:t>
       </w:r>
     </w:p>
     <w:p>
@@ -505,7 +505,7 @@
           <w:sz w:val="15"/>
           <w:szCs w:val="15"/>
         </w:rPr>
-        <w:t xml:space="preserve">OBSERWACJA WSTĘPNA I POGŁĘBIONA · OBSZARY ICF</w:t>
+        <w:t xml:space="preserve">RAPORT – PODSUMOWANIE WOPF I IPET · OBSZARY ICF</w:t>
       </w:r>
     </w:p>
     <w:p>
@@ -2474,7 +2474,7 @@
                 <w:sz w:val="12"/>
                 <w:szCs w:val="12"/>
               </w:rPr>
-              <w:t xml:space="preserve">Raport Oceny Funkcjonalnej · Jak czytać raport · dwa warianty</w:t>
+              <w:t xml:space="preserve">Ocena Funkcjonalna · Jak czytać raport · dwa warianty</w:t>
             </w:r>
           </w:p>
         </w:tc>
@@ -5369,7 +5369,7 @@
                 <w:sz w:val="12"/>
                 <w:szCs w:val="12"/>
               </w:rPr>
-              <w:t xml:space="preserve">Raport Oceny Funkcjonalnej · Podstawy prawne</w:t>
+              <w:t xml:space="preserve">Ocena Funkcjonalna · Podstawy prawne</w:t>
             </w:r>
           </w:p>
         </w:tc>
@@ -6465,7 +6465,7 @@
                 <w:sz w:val="13"/>
                 <w:szCs w:val="13"/>
               </w:rPr>
-              <w:t xml:space="preserve">Rozporządzenie MEN z 14 lutego 2017 r. w sprawie podstawy programowej wychowania przedszkolnego oraz kształcenia ogólnego</w:t>
+              <w:t xml:space="preserve">Rozporządzenie Ministra Edukacji z 11 marca 2026 r. w sprawie podstawy programowej wychowania przedszkolnego oraz podstawy programowej kształcenia ogólnego dla szkoły podstawowej, w tym dla uczniów z niepełnosprawnością intelektualną w stopniu umiarkowanym lub znacznym</w:t>
             </w:r>
           </w:p>
         </w:tc>
@@ -6503,7 +6503,7 @@
                 <w:sz w:val="12"/>
                 <w:szCs w:val="12"/>
               </w:rPr>
-              <w:t xml:space="preserve">Dz. U. z 2017 r. poz. 356 ze zm.</w:t>
+              <w:t xml:space="preserve">Dz. U. z 2026 r. poz. 378, zm. poz. 958</w:t>
             </w:r>
           </w:p>
         </w:tc>
@@ -6541,7 +6541,141 @@
                 <w:sz w:val="13"/>
                 <w:szCs w:val="13"/>
               </w:rPr>
-              <w:t xml:space="preserve">Cele i treści, które są dostosowywane (nie obniżane) w programie wsparcia.  </w:t>
+              <w:t xml:space="preserve">Nowa podstawa programowa stosowana od 1.09.2026 r.: w przedszkolu we wszystkich grupach, w szkole podstawowej sukcesywnie od klas I i IV. Cele i treści dostosowuje się (nie obniża) w programie wsparcia.  </w:t>
+            </w:r>
+            <w:r>
+              <w:rPr>
+                <w:rFonts w:ascii="Arial" w:cs="Arial" w:eastAsia="Arial" w:hAnsi="Arial"/>
+                <w:b/>
+                <w:bCs/>
+                <w:i w:val="false"/>
+                <w:iCs w:val="false"/>
+                <w:caps w:val="false"/>
+                <w:color w:val="E74509"/>
+                <w:sz w:val="11"/>
+                <w:szCs w:val="11"/>
+                <w:shd w:fill="FDECE3" w:color="auto" w:val="clear"/>
+              </w:rPr>
+              <w:t xml:space="preserve"> sekcja 11 A </w:t>
+            </w:r>
+          </w:p>
+        </w:tc>
+      </w:tr>
+      <w:tr>
+        <w:trPr>
+          <w:cantSplit/>
+        </w:trPr>
+        <w:tc>
+          <w:tcPr>
+            <w:tcW w:type="dxa" w:w="3300"/>
+            <w:tcBorders>
+              <w:top w:val="single" w:color="E3E1EC" w:sz="4"/>
+              <w:left w:val="single" w:color="E3E1EC" w:sz="4"/>
+              <w:bottom w:val="single" w:color="E3E1EC" w:sz="4"/>
+              <w:right w:val="single" w:color="E3E1EC" w:sz="4"/>
+            </w:tcBorders>
+            <w:tcMar>
+              <w:top w:type="dxa" w:w="50"/>
+              <w:left w:type="dxa" w:w="140"/>
+              <w:bottom w:type="dxa" w:w="50"/>
+              <w:right w:type="dxa" w:w="120"/>
+            </w:tcMar>
+            <w:vAlign w:val="top"/>
+          </w:tcPr>
+          <w:p>
+            <w:pPr>
+              <w:spacing w:after="0" w:before="0" w:line="230"/>
+              <w:jc w:val="left"/>
+            </w:pPr>
+            <w:r>
+              <w:rPr>
+                <w:rFonts w:ascii="Arial" w:cs="Arial" w:eastAsia="Arial" w:hAnsi="Arial"/>
+                <w:b/>
+                <w:bCs/>
+                <w:i w:val="false"/>
+                <w:iCs w:val="false"/>
+                <w:caps w:val="false"/>
+                <w:color w:val="2D1B69"/>
+                <w:sz w:val="13"/>
+                <w:szCs w:val="13"/>
+              </w:rPr>
+              <w:t xml:space="preserve">Rozporządzenie MEN z 14 lutego 2017 r. w sprawie podstawy programowej wychowania przedszkolnego oraz kształcenia ogólnego</w:t>
+            </w:r>
+          </w:p>
+        </w:tc>
+        <w:tc>
+          <w:tcPr>
+            <w:tcW w:type="dxa" w:w="1300"/>
+            <w:tcBorders>
+              <w:top w:val="single" w:color="E3E1EC" w:sz="4"/>
+              <w:left w:val="single" w:color="E3E1EC" w:sz="4"/>
+              <w:bottom w:val="single" w:color="E3E1EC" w:sz="4"/>
+              <w:right w:val="single" w:color="E3E1EC" w:sz="4"/>
+            </w:tcBorders>
+            <w:tcMar>
+              <w:top w:type="dxa" w:w="50"/>
+              <w:left w:type="dxa" w:w="140"/>
+              <w:bottom w:type="dxa" w:w="50"/>
+              <w:right w:type="dxa" w:w="120"/>
+            </w:tcMar>
+            <w:vAlign w:val="top"/>
+          </w:tcPr>
+          <w:p>
+            <w:pPr>
+              <w:spacing w:after="0" w:before="0" w:line="230"/>
+              <w:jc w:val="left"/>
+            </w:pPr>
+            <w:r>
+              <w:rPr>
+                <w:rFonts w:ascii="Arial" w:cs="Arial" w:eastAsia="Arial" w:hAnsi="Arial"/>
+                <w:b/>
+                <w:bCs/>
+                <w:i w:val="false"/>
+                <w:iCs w:val="false"/>
+                <w:caps w:val="false"/>
+                <w:color w:val="E74509"/>
+                <w:sz w:val="12"/>
+                <w:szCs w:val="12"/>
+              </w:rPr>
+              <w:t xml:space="preserve">Dz. U. z 2017 r. poz. 356 ze zm.</w:t>
+            </w:r>
+          </w:p>
+        </w:tc>
+        <w:tc>
+          <w:tcPr>
+            <w:tcW w:type="dxa" w:w="5306"/>
+            <w:tcBorders>
+              <w:top w:val="single" w:color="E3E1EC" w:sz="4"/>
+              <w:left w:val="single" w:color="E3E1EC" w:sz="4"/>
+              <w:bottom w:val="single" w:color="E3E1EC" w:sz="4"/>
+              <w:right w:val="single" w:color="E3E1EC" w:sz="4"/>
+            </w:tcBorders>
+            <w:tcMar>
+              <w:top w:type="dxa" w:w="50"/>
+              <w:left w:type="dxa" w:w="140"/>
+              <w:bottom w:type="dxa" w:w="50"/>
+              <w:right w:type="dxa" w:w="120"/>
+            </w:tcMar>
+            <w:vAlign w:val="top"/>
+          </w:tcPr>
+          <w:p>
+            <w:pPr>
+              <w:spacing w:after="0" w:before="0" w:line="230"/>
+              <w:jc w:val="left"/>
+            </w:pPr>
+            <w:r>
+              <w:rPr>
+                <w:rFonts w:ascii="Arial" w:cs="Arial" w:eastAsia="Arial" w:hAnsi="Arial"/>
+                <w:b w:val="false"/>
+                <w:bCs w:val="false"/>
+                <w:i w:val="false"/>
+                <w:iCs w:val="false"/>
+                <w:caps w:val="false"/>
+                <w:color w:val="1A1530"/>
+                <w:sz w:val="13"/>
+                <w:szCs w:val="13"/>
+              </w:rPr>
+              <w:t xml:space="preserve">Stosowane przejściowo w klasach, które w roku 2026/2027 nie objęła jeszcze nowa podstawa (kl. II–III, V–VIII).  </w:t>
             </w:r>
             <w:r>
               <w:rPr>
@@ -7044,7 +7178,7 @@
                 <w:sz w:val="12"/>
                 <w:szCs w:val="12"/>
               </w:rPr>
-              <w:t xml:space="preserve">Raport Oceny Funkcjonalnej · Metryczka i obserwacja wstępna</w:t>
+              <w:t xml:space="preserve">Ocena Funkcjonalna · Metryczka i obserwacja wstępna</w:t>
             </w:r>
           </w:p>
         </w:tc>
@@ -9267,7 +9401,7 @@
                 <w:sz w:val="12"/>
                 <w:szCs w:val="12"/>
               </w:rPr>
-              <w:t xml:space="preserve">Raport Oceny Funkcjonalnej · Obserwacja pogłębiona</w:t>
+              <w:t xml:space="preserve">Ocena Funkcjonalna · Obserwacja pogłębiona</w:t>
             </w:r>
           </w:p>
         </w:tc>
@@ -10548,7 +10682,7 @@
                 <w:sz w:val="12"/>
                 <w:szCs w:val="12"/>
               </w:rPr>
-              <w:t xml:space="preserve">Raport Oceny Funkcjonalnej · Część II · Funkcjonowanie w placówce</w:t>
+              <w:t xml:space="preserve">Ocena Funkcjonalna · Część II · Funkcjonowanie w placówce</w:t>
             </w:r>
           </w:p>
         </w:tc>
@@ -10874,7 +11008,7 @@
           <w:szCs w:val="13"/>
           <w:shd w:fill="E74509" w:color="auto" w:val="clear"/>
         </w:rPr>
-        <w:t xml:space="preserve">  RAPORT OCENY FUNKCJONALNEJ DZIECKA / UCZNIA · CZĘŚĆ II  </w:t>
+        <w:t xml:space="preserve">  OCENA FUNKCJONALNA DZIECKA / UCZNIA · PODSUMOWANIE WOPF I IPET · CZĘŚĆ II  </w:t>
       </w:r>
     </w:p>
     <w:p>
@@ -11023,7 +11157,7 @@
           <w:sz w:val="16"/>
           <w:szCs w:val="16"/>
         </w:rPr>
-        <w:t xml:space="preserve">Syntetyczne zestawienie potencjału rozwojowego oraz barier zidentyfikowanych w toku codziennej aktywności przez nauczycieli, wychowawców i specjalistów – w tych samych domenach ICF, które w sekcji 5 otrzymują wynik liczbowy:</w:t>
+        <w:t xml:space="preserve">Syntetyczne zestawienie potencjału rozwojowego oraz barier zidentyfikowanych w toku codziennej aktywności przez nauczycieli, wychowawców i specjalistów – w pięciu obszarach w kolejności z rozporządzenia; kody wskazują domeny ICF, które w sekcji 5 otrzymują wynik liczbowy:</w:t>
       </w:r>
     </w:p>
     <w:tbl>
@@ -11206,7 +11340,7 @@
                 <w:sz w:val="16"/>
                 <w:szCs w:val="16"/>
               </w:rPr>
-              <w:t xml:space="preserve">Uczenie się i zadania · d1, d2</w:t>
+              <w:t xml:space="preserve">1 · Uczenie się i stosowanie wiedzy (aktywność poznawcza) · d1, d2, d8</w:t>
             </w:r>
           </w:p>
         </w:tc>
@@ -11244,7 +11378,7 @@
                 <w:sz w:val="16"/>
                 <w:szCs w:val="16"/>
               </w:rPr>
-              <w:t xml:space="preserve">Bardzo dobra pamięć wzrokowa; szybkie zapamiętywanie schematów graficznych; wąskie, ale głębokie zainteresowania tematyczne; wysoka motywacja do pracy z ulubionymi pomocami.</w:t>
+              <w:t xml:space="preserve">Bardzo dobra pamięć wzrokowa; szybkie zapamiętywanie schematów graficznych; wąskie, ale głębokie zainteresowania tematyczne; wysoka motywacja do pracy z ulubionymi pomocami dydaktycznymi.</w:t>
             </w:r>
           </w:p>
         </w:tc>
@@ -11282,7 +11416,7 @@
                 <w:sz w:val="16"/>
                 <w:szCs w:val="16"/>
               </w:rPr>
-              <w:t xml:space="preserve">Trudności z przerzutnością i podzielnością uwagi; szybka męczliwość przy instrukcjach wieloetapowych; problem z uogólnianiem wiedzy; silny stres przy nagłych zmianach planu.</w:t>
+              <w:t xml:space="preserve">Trudności z przerzutnością i podzielnością uwagi; szybka męczliwość przy instrukcjach wieloetapowych; problem z uogólnianiem wiedzy; silny stres przy nagłych zmianach planu; wymaga dostosowania metod, tempa i stałego nadzoru nauczyciela.</w:t>
             </w:r>
           </w:p>
         </w:tc>
@@ -11325,7 +11459,7 @@
                 <w:sz w:val="16"/>
                 <w:szCs w:val="16"/>
               </w:rPr>
-              <w:t xml:space="preserve">Komunikacja · d3</w:t>
+              <w:t xml:space="preserve">2 · Przystosowanie społeczne i emocjonalne (zachowania społeczne, relacje, emocje) · d7, d9</w:t>
             </w:r>
           </w:p>
         </w:tc>
@@ -11363,7 +11497,7 @@
                 <w:sz w:val="16"/>
                 <w:szCs w:val="16"/>
               </w:rPr>
-              <w:t xml:space="preserve">Prawidłowe rozumienie prostych, jednoznacznych komunikatów wspartych gestem; sygnalizowanie podstawowych potrzeb.</w:t>
+              <w:t xml:space="preserve">Chęć przebywania w pobliżu grupy; pozytywna reakcja na stałych, przewidywalnych dorosłych; przestrzeganie czytelnych zasad wizualnych.</w:t>
             </w:r>
           </w:p>
         </w:tc>
@@ -11401,7 +11535,7 @@
                 <w:sz w:val="16"/>
                 <w:szCs w:val="16"/>
               </w:rPr>
-              <w:t xml:space="preserve">Dosłowne rozumienie wypowiedzi (metafora, żart); echolalie odroczone; trudności w inicjowaniu dialogu i naprzemienności w grupie rówieśniczej; potrzeba wsparcia AAC.</w:t>
+              <w:t xml:space="preserve">Trudności w odczytywaniu emocji i intencji innych (teoria umysłu); niska tolerancja frustracji przy przegranej lub nagłej zmianie; tendencja do wycofywania się lub zachowań trudnych, zwłaszcza w apelach i wyjściach zbiorowych.</w:t>
             </w:r>
           </w:p>
         </w:tc>
@@ -11444,7 +11578,7 @@
                 <w:sz w:val="16"/>
                 <w:szCs w:val="16"/>
               </w:rPr>
-              <w:t xml:space="preserve">Motoryka · d4</w:t>
+              <w:t xml:space="preserve">3 · Porozumiewanie się (komunikacja) · d3</w:t>
             </w:r>
           </w:p>
         </w:tc>
@@ -11482,7 +11616,7 @@
                 <w:sz w:val="16"/>
                 <w:szCs w:val="16"/>
               </w:rPr>
-              <w:t xml:space="preserve">Sprawność w zakresie motoryki dużej (bieganie, wspinanie się); chętny udział w zabawach ruchowych w otwartej przestrzeni.</w:t>
+              <w:t xml:space="preserve">Prawidłowe rozumienie prostych, jednoznacznych komunikatów słownych wspartych gestem; sygnalizowanie podstawowych potrzeb fizjologicznych.</w:t>
             </w:r>
           </w:p>
         </w:tc>
@@ -11520,7 +11654,7 @@
                 <w:sz w:val="16"/>
                 <w:szCs w:val="16"/>
               </w:rPr>
-              <w:t xml:space="preserve">Obniżona precyzja motoryki małej i koordynacji wzrokowo-ruchowej; nieprawidłowy chwyt pisarski; zmienne napięcie posturalne; męczliwość ręki wiodącej.</w:t>
+              <w:t xml:space="preserve">Dosłowne rozumienie wypowiedzi (trudność z metaforą i żartem); echolalie odroczone; trudności w inicjowaniu dialogu i naprzemienności wypowiedzi w grupie rówieśniczej; potrzeba wsparcia AAC.</w:t>
             </w:r>
           </w:p>
         </w:tc>
@@ -11563,7 +11697,7 @@
                 <w:sz w:val="16"/>
                 <w:szCs w:val="16"/>
               </w:rPr>
-              <w:t xml:space="preserve">Samoobsługa i obowiązki · d5, d6</w:t>
+              <w:t xml:space="preserve">4 · Aktywność ruchowa i poruszanie się (motoryka i sprawność fizyczna) · d4</w:t>
             </w:r>
           </w:p>
         </w:tc>
@@ -11601,7 +11735,7 @@
                 <w:sz w:val="16"/>
                 <w:szCs w:val="16"/>
               </w:rPr>
-              <w:t xml:space="preserve">Samodzielność w podstawowych nawykach higienicznych i toaletowych; znajomość własnej szafki i przyborów; sprząta po przypomnieniu.</w:t>
+              <w:t xml:space="preserve">Sprawność w zakresie motoryki dużej (bieganie, wspinanie się); chętne uczestnictwo w zabawach ruchowych w otwartej przestrzeni.</w:t>
             </w:r>
           </w:p>
         </w:tc>
@@ -11639,7 +11773,7 @@
                 <w:sz w:val="16"/>
                 <w:szCs w:val="16"/>
               </w:rPr>
-              <w:t xml:space="preserve">Opór sensoryczny przy myciu rąk (faktura mydła, woda); wybiórczość pokarmowa; problem z odzieżą o trudnych zapięciach; nie inicjuje obowiązków samodzielnie.</w:t>
+              <w:t xml:space="preserve">Obniżona precyzja motoryki małej i koordynacji wzrokowo-ruchowej; nieprawidłowy chwyt pisarski / narzędzi; wzmożone lub obniżone napięcie posturalne; męczliwość ręki wiodącej.</w:t>
             </w:r>
           </w:p>
         </w:tc>
@@ -11682,7 +11816,7 @@
                 <w:sz w:val="16"/>
                 <w:szCs w:val="16"/>
               </w:rPr>
-              <w:t xml:space="preserve">Relacje i uczestnictwo · d7, d9</w:t>
+              <w:t xml:space="preserve">5 · Dbanie o siebie – samoobsługa i autonomia · d5, d6</w:t>
             </w:r>
           </w:p>
         </w:tc>
@@ -11720,7 +11854,7 @@
                 <w:sz w:val="16"/>
                 <w:szCs w:val="16"/>
               </w:rPr>
-              <w:t xml:space="preserve">Chęć przebywania w pobliżu grupy; pozytywna reakcja na stałych, przewidywalnych dorosłych; przestrzeganie czytelnych zasad wizualnych.</w:t>
+              <w:t xml:space="preserve">Samodzielność w zakresie podstawowych nawyków higienicznych i toaletowych; znajomość własnej szafki i osobistych przyborów; sprząta kącik po przypomnieniu.</w:t>
             </w:r>
           </w:p>
         </w:tc>
@@ -11758,126 +11892,7 @@
                 <w:sz w:val="16"/>
                 <w:szCs w:val="16"/>
               </w:rPr>
-              <w:t xml:space="preserve">Trudności w odczytywaniu emocji i intencji innych (teoria umysłu); niska tolerancja frustracji przy przegranej lub zmianie; wycofanie lub zachowania trudne w apelach i wyjściach.</w:t>
-            </w:r>
-          </w:p>
-        </w:tc>
-      </w:tr>
-      <w:tr>
-        <w:trPr>
-          <w:cantSplit/>
-        </w:trPr>
-        <w:tc>
-          <w:tcPr>
-            <w:tcW w:type="dxa" w:w="1900"/>
-            <w:tcBorders>
-              <w:top w:val="single" w:color="E3E1EC" w:sz="4"/>
-              <w:left w:val="single" w:color="E3E1EC" w:sz="4"/>
-              <w:bottom w:val="single" w:color="E3E1EC" w:sz="4"/>
-              <w:right w:val="single" w:color="E3E1EC" w:sz="4"/>
-            </w:tcBorders>
-            <w:tcMar>
-              <w:top w:type="dxa" w:w="70"/>
-              <w:left w:type="dxa" w:w="140"/>
-              <w:bottom w:type="dxa" w:w="70"/>
-              <w:right w:type="dxa" w:w="120"/>
-            </w:tcMar>
-            <w:vAlign w:val="top"/>
-          </w:tcPr>
-          <w:p>
-            <w:pPr>
-              <w:spacing w:after="0" w:before="0" w:line="250"/>
-              <w:jc w:val="left"/>
-            </w:pPr>
-            <w:r>
-              <w:rPr>
-                <w:rFonts w:ascii="Arial" w:cs="Arial" w:eastAsia="Arial" w:hAnsi="Arial"/>
-                <w:b/>
-                <w:bCs/>
-                <w:i w:val="false"/>
-                <w:iCs w:val="false"/>
-                <w:caps w:val="false"/>
-                <w:color w:val="2D1B69"/>
-                <w:sz w:val="16"/>
-                <w:szCs w:val="16"/>
-              </w:rPr>
-              <w:t xml:space="preserve">Edukacja · d8</w:t>
-            </w:r>
-          </w:p>
-        </w:tc>
-        <w:tc>
-          <w:tcPr>
-            <w:tcW w:type="dxa" w:w="4003"/>
-            <w:tcBorders>
-              <w:top w:val="single" w:color="E3E1EC" w:sz="4"/>
-              <w:left w:val="single" w:color="2E7D45" w:sz="24"/>
-              <w:bottom w:val="single" w:color="E3E1EC" w:sz="4"/>
-              <w:right w:val="single" w:color="E3E1EC" w:sz="4"/>
-            </w:tcBorders>
-            <w:tcMar>
-              <w:top w:type="dxa" w:w="70"/>
-              <w:left w:type="dxa" w:w="140"/>
-              <w:bottom w:type="dxa" w:w="70"/>
-              <w:right w:type="dxa" w:w="120"/>
-            </w:tcMar>
-            <w:vAlign w:val="top"/>
-          </w:tcPr>
-          <w:p>
-            <w:pPr>
-              <w:spacing w:after="0" w:before="0" w:line="250"/>
-              <w:jc w:val="left"/>
-            </w:pPr>
-            <w:r>
-              <w:rPr>
-                <w:rFonts w:ascii="Arial" w:cs="Arial" w:eastAsia="Arial" w:hAnsi="Arial"/>
-                <w:b w:val="false"/>
-                <w:bCs w:val="false"/>
-                <w:i w:val="false"/>
-                <w:iCs w:val="false"/>
-                <w:caps w:val="false"/>
-                <w:color w:val="1A1530"/>
-                <w:sz w:val="16"/>
-                <w:szCs w:val="16"/>
-              </w:rPr>
-              <w:t xml:space="preserve">Pracuje z zaangażowaniem przy zadaniach z obrazem i przy ulubionych tematach; utrzymuje uwagę do 8 min po dostosowaniu środowiska.</w:t>
-            </w:r>
-          </w:p>
-        </w:tc>
-        <w:tc>
-          <w:tcPr>
-            <w:tcW w:type="dxa" w:w="4003"/>
-            <w:tcBorders>
-              <w:top w:val="single" w:color="E3E1EC" w:sz="4"/>
-              <w:left w:val="single" w:color="BF382A" w:sz="24"/>
-              <w:bottom w:val="single" w:color="E3E1EC" w:sz="4"/>
-              <w:right w:val="single" w:color="E3E1EC" w:sz="4"/>
-            </w:tcBorders>
-            <w:tcMar>
-              <w:top w:type="dxa" w:w="70"/>
-              <w:left w:type="dxa" w:w="140"/>
-              <w:bottom w:type="dxa" w:w="70"/>
-              <w:right w:type="dxa" w:w="120"/>
-            </w:tcMar>
-            <w:vAlign w:val="top"/>
-          </w:tcPr>
-          <w:p>
-            <w:pPr>
-              <w:spacing w:after="0" w:before="0" w:line="250"/>
-              <w:jc w:val="left"/>
-            </w:pPr>
-            <w:r>
-              <w:rPr>
-                <w:rFonts w:ascii="Arial" w:cs="Arial" w:eastAsia="Arial" w:hAnsi="Arial"/>
-                <w:b w:val="false"/>
-                <w:bCs w:val="false"/>
-                <w:i w:val="false"/>
-                <w:iCs w:val="false"/>
-                <w:caps w:val="false"/>
-                <w:color w:val="1A1530"/>
-                <w:sz w:val="16"/>
-                <w:szCs w:val="16"/>
-              </w:rPr>
-              <w:t xml:space="preserve">Wymaga dostosowania metod, tempa i form pracy oraz stałego nadzoru nauczyciela; szybka męczliwość przy zadaniach pisemnych.</w:t>
+              <w:t xml:space="preserve">Opór sensoryczny przy myciu rąk (wrażliwość na fakturę mydła/wodę); wybiórczość pokarmowa; problem z ubieraniem odzieży o skomplikowanych zapięciach; nie inicjuje obowiązków samodzielnie; potrzeba nadzoru dorosłego.</w:t>
             </w:r>
           </w:p>
         </w:tc>
@@ -12018,7 +12033,7 @@
                 <w:sz w:val="12"/>
                 <w:szCs w:val="12"/>
               </w:rPr>
-              <w:t xml:space="preserve">Raport Oceny Funkcjonalnej · Część II · Wyniki liczbowe</w:t>
+              <w:t xml:space="preserve">Ocena Funkcjonalna · Część II · Wyniki liczbowe</w:t>
             </w:r>
           </w:p>
         </w:tc>
@@ -15538,7 +15553,7 @@
                 <w:sz w:val="12"/>
                 <w:szCs w:val="12"/>
               </w:rPr>
-              <w:t xml:space="preserve">Raport Oceny Funkcjonalnej · Część II · Wyniki arkuszy specjalistycznych</w:t>
+              <w:t xml:space="preserve">Ocena Funkcjonalna · Część II · Wyniki arkuszy specjalistycznych</w:t>
             </w:r>
           </w:p>
         </w:tc>
@@ -16884,7 +16899,7 @@
                 <w:sz w:val="12"/>
                 <w:szCs w:val="12"/>
               </w:rPr>
-              <w:t xml:space="preserve">Raport Oceny Funkcjonalnej · Część II · Mój głos</w:t>
+              <w:t xml:space="preserve">Ocena Funkcjonalna · Część II · Mój głos</w:t>
             </w:r>
           </w:p>
         </w:tc>
@@ -19042,7 +19057,7 @@
                 <w:sz w:val="12"/>
                 <w:szCs w:val="12"/>
               </w:rPr>
-              <w:t xml:space="preserve">Raport Oceny Funkcjonalnej · Część II · Działania dotychczas podjęte</w:t>
+              <w:t xml:space="preserve">Ocena Funkcjonalna · Część II · Działania dotychczas podjęte</w:t>
             </w:r>
           </w:p>
         </w:tc>
@@ -20171,7 +20186,7 @@
                 <w:sz w:val="12"/>
                 <w:szCs w:val="12"/>
               </w:rPr>
-              <w:t xml:space="preserve">Raport Oceny Funkcjonalnej · Część II · Analiza jakościowa</w:t>
+              <w:t xml:space="preserve">Ocena Funkcjonalna · Część II · Analiza jakościowa</w:t>
             </w:r>
           </w:p>
         </w:tc>
@@ -22533,7 +22548,7 @@
                 <w:sz w:val="12"/>
                 <w:szCs w:val="12"/>
               </w:rPr>
-              <w:t xml:space="preserve">Raport Oceny Funkcjonalnej · Część II · Decyzja Zespołu</w:t>
+              <w:t xml:space="preserve">Ocena Funkcjonalna · Część II · Decyzja Zespołu</w:t>
             </w:r>
           </w:p>
         </w:tc>
@@ -24397,7 +24412,7 @@
                 <w:sz w:val="12"/>
                 <w:szCs w:val="12"/>
               </w:rPr>
-              <w:t xml:space="preserve">Raport Oceny Funkcjonalnej · Część III · Dostosowanie programu</w:t>
+              <w:t xml:space="preserve">Ocena Funkcjonalna · Część III · Dostosowanie programu</w:t>
             </w:r>
           </w:p>
         </w:tc>
@@ -24723,7 +24738,7 @@
           <w:szCs w:val="13"/>
           <w:shd w:fill="2D1B69" w:color="auto" w:val="clear"/>
         </w:rPr>
-        <w:t xml:space="preserve">  RAPORT OCENY FUNKCJONALNEJ DZIECKA / UCZNIA · CZĘŚĆ III  </w:t>
+        <w:t xml:space="preserve">  OCENA FUNKCJONALNA DZIECKA / UCZNIA · PODSUMOWANIE WOPF I IPET · CZĘŚĆ III  </w:t>
       </w:r>
     </w:p>
     <w:p>
@@ -24838,7 +24853,7 @@
           <w:szCs w:val="12"/>
           <w:shd w:fill="EFE9F9" w:color="auto" w:val="clear"/>
         </w:rPr>
-        <w:t xml:space="preserve"> § Podstawa prawna: § 6 ust. 1 pkt 1 i 7 rozp. o kształceniu specjalnym · rozp. o podstawie programowej </w:t>
+        <w:t xml:space="preserve"> § Podstawa prawna: § 6 ust. 1 pkt 1 i 7 rozp. o kształceniu specjalnym · rozp. ME z 11.03.2026 o podstawie programowej (Dz. U. 2026 poz. 378) </w:t>
       </w:r>
     </w:p>
     <w:p>
@@ -24949,7 +24964,7 @@
           <w:sz w:val="18"/>
           <w:szCs w:val="18"/>
         </w:rPr>
-        <w:t xml:space="preserve">   Zakres i sposób dostosowania programu wychowania przedszkolnego / podstawy programowej</w:t>
+        <w:t xml:space="preserve">   Zakres i sposób dostosowania programu wychowania przedszkolnego / podstawy programowej (nowa podstawa 2026 – Dz. U. 2026 poz. 378)</w:t>
       </w:r>
       <w:r>
         <w:rPr>
@@ -25689,7 +25704,7 @@
                 <w:sz w:val="12"/>
                 <w:szCs w:val="12"/>
               </w:rPr>
-              <w:t xml:space="preserve">Raport Oceny Funkcjonalnej · Część III · Organizacja i technologie</w:t>
+              <w:t xml:space="preserve">Ocena Funkcjonalna · Część III · Organizacja i technologie</w:t>
             </w:r>
           </w:p>
         </w:tc>
@@ -27243,7 +27258,7 @@
                 <w:sz w:val="12"/>
                 <w:szCs w:val="12"/>
               </w:rPr>
-              <w:t xml:space="preserve">Raport Oceny Funkcjonalnej · Część III · Zintegrowane działania</w:t>
+              <w:t xml:space="preserve">Ocena Funkcjonalna · Część III · Zintegrowane działania</w:t>
             </w:r>
           </w:p>
         </w:tc>
@@ -28670,7 +28685,7 @@
                 <w:sz w:val="12"/>
                 <w:szCs w:val="12"/>
               </w:rPr>
-              <w:t xml:space="preserve">Raport Oceny Funkcjonalnej · Część III · Zajęcia: rewalidacja i PPP</w:t>
+              <w:t xml:space="preserve">Ocena Funkcjonalna · Część III · Zajęcia: rewalidacja i PPP</w:t>
             </w:r>
           </w:p>
         </w:tc>
@@ -30397,7 +30412,7 @@
                 <w:sz w:val="12"/>
                 <w:szCs w:val="12"/>
               </w:rPr>
-              <w:t xml:space="preserve">Raport Oceny Funkcjonalnej · Część III · Pomoc psychologiczno-pedagogiczna</w:t>
+              <w:t xml:space="preserve">Ocena Funkcjonalna · Część III · Pomoc psychologiczno-pedagogiczna</w:t>
             </w:r>
           </w:p>
         </w:tc>
@@ -32423,7 +32438,7 @@
                 <w:sz w:val="12"/>
                 <w:szCs w:val="12"/>
               </w:rPr>
-              <w:t xml:space="preserve">Raport Oceny Funkcjonalnej · Część III · Realizacja zaleceń poradni</w:t>
+              <w:t xml:space="preserve">Ocena Funkcjonalna · Część III · Realizacja zaleceń poradni</w:t>
             </w:r>
           </w:p>
         </w:tc>
@@ -35473,7 +35488,7 @@
                 <w:sz w:val="12"/>
                 <w:szCs w:val="12"/>
               </w:rPr>
-              <w:t xml:space="preserve">Raport Oceny Funkcjonalnej · Część III · Dodatkowa osoba</w:t>
+              <w:t xml:space="preserve">Ocena Funkcjonalna · Część III · Dodatkowa osoba</w:t>
             </w:r>
           </w:p>
         </w:tc>
@@ -36690,7 +36705,7 @@
                 <w:sz w:val="12"/>
                 <w:szCs w:val="12"/>
               </w:rPr>
-              <w:t xml:space="preserve">Raport Oceny Funkcjonalnej · Część III · Współpraca z rodzicami i poradnią</w:t>
+              <w:t xml:space="preserve">Ocena Funkcjonalna · Część III · Współpraca z rodzicami i poradnią</w:t>
             </w:r>
           </w:p>
         </w:tc>
@@ -39535,7 +39550,7 @@
                 <w:sz w:val="12"/>
                 <w:szCs w:val="12"/>
               </w:rPr>
-              <w:t xml:space="preserve">Raport Oceny Funkcjonalnej · Część III · Ocena efektywności · podpisy</w:t>
+              <w:t xml:space="preserve">Ocena Funkcjonalna · Część III · Ocena efektywności · podpisy</w:t>
             </w:r>
           </w:p>
         </w:tc>
@@ -41668,7 +41683,7 @@
         <w:sz w:val="12"/>
         <w:szCs w:val="12"/>
       </w:rPr>
-      <w:t xml:space="preserve"> · Raport Oceny Funkcjonalnej</w:t>
+      <w:t xml:space="preserve"> · Ocena Funkcjonalna</w:t>
     </w:r>
   </w:p>
 </w:ftr>

</xml_diff>

<commit_message>
Ocena Funkcjonalna: kolejność narzędzi – biopsychospołeczny, ABC, sensoryczny, mowa, ToM
Ta sama kolejność w sekcji 3 (wskazania) i 6 (wyniki), w HTML, PDF i Word.

Co-Authored-By: Claude Fable 5.1 <noreply@anthropic.com>
Claude-Session: https://claude.ai/code/session_01FpF7vCSW7jSofte5z6wEKy
</commit_message>
<xml_diff>
--- a/eduplaner2026/raport_oceny_funkcjonalnej/Raport_Oceny_Funkcjonalnej.docx
+++ b/eduplaner2026/raport_oceny_funkcjonalnej/Raport_Oceny_Funkcjonalnej.docx
@@ -1461,7 +1461,7 @@
                 <w:sz w:val="13"/>
                 <w:szCs w:val="13"/>
               </w:rPr>
-              <w:t xml:space="preserve">wskazania i narzędzia: ABC, biopsychospołeczny, sensoryczny, mowa, ToM</w:t>
+              <w:t xml:space="preserve">wskazania i narzędzia: biopsychospołeczny, ABC, sensoryczny, mowa, ToM</w:t>
             </w:r>
           </w:p>
         </w:tc>
@@ -9917,7 +9917,7 @@
             <w:tcW w:type="dxa" w:w="9906"/>
             <w:tcBorders>
               <w:top w:val="single" w:color="D9D0F0" w:sz="4"/>
-              <w:left w:val="single" w:color="BF382A" w:sz="32"/>
+              <w:left w:val="single" w:color="2D1B69" w:sz="32"/>
               <w:bottom w:val="single" w:color="D9D0F0" w:sz="4"/>
               <w:right w:val="single" w:color="D9D0F0" w:sz="4"/>
             </w:tcBorders>
@@ -9942,12 +9942,117 @@
                 <w:i w:val="false"/>
                 <w:iCs w:val="false"/>
                 <w:caps w:val="false"/>
+                <w:color w:val="2D1B69"/>
+                <w:spacing w:val="14"/>
+                <w:sz w:val="13"/>
+                <w:szCs w:val="13"/>
+              </w:rPr>
+              <w:t xml:space="preserve">1 · CAŁOŚCIOWY OBRAZ</w:t>
+            </w:r>
+          </w:p>
+          <w:p>
+            <w:pPr>
+              <w:spacing w:after="70" w:before="0" w:line="250"/>
+              <w:jc w:val="left"/>
+            </w:pPr>
+            <w:r>
+              <w:rPr>
+                <w:rFonts w:ascii="Arial" w:cs="Arial" w:eastAsia="Arial" w:hAnsi="Arial"/>
+                <w:b/>
+                <w:bCs/>
+                <w:i w:val="false"/>
+                <w:iCs w:val="false"/>
+                <w:caps w:val="false"/>
+                <w:color w:val="2D1B69"/>
+                <w:sz w:val="20"/>
+                <w:szCs w:val="20"/>
+              </w:rPr>
+              <w:t xml:space="preserve">Profil Biopsychospołeczny</w:t>
+            </w:r>
+          </w:p>
+          <w:p>
+            <w:pPr>
+              <w:spacing w:after="0" w:before="0" w:line="255"/>
+              <w:jc w:val="left"/>
+            </w:pPr>
+            <w:r>
+              <w:rPr>
+                <w:rFonts w:ascii="Arial" w:cs="Arial" w:eastAsia="Arial" w:hAnsi="Arial"/>
+                <w:b w:val="false"/>
+                <w:bCs w:val="false"/>
+                <w:i w:val="false"/>
+                <w:iCs w:val="false"/>
+                <w:caps w:val="false"/>
+                <w:color w:val="1A1530"/>
+                <w:sz w:val="17"/>
+                <w:szCs w:val="17"/>
+              </w:rPr>
+              <w:t xml:space="preserve">Ujęcie funkcjonowania dziecka w wymiarze biologicznym, psychologicznym i społecznym – zgodnie z modelem ICF; punkt wyjścia do interpretacji pozostałych arkuszy.</w:t>
+            </w:r>
+          </w:p>
+        </w:tc>
+      </w:tr>
+    </w:tbl>
+    <w:p>
+      <w:pPr>
+        <w:spacing w:after="100" w:before="0"/>
+      </w:pPr>
+    </w:p>
+    <w:tbl>
+      <w:tblPr>
+        <w:tblW w:type="dxa" w:w="9906"/>
+        <w:tblBorders>
+          <w:top w:val="single" w:color="auto" w:sz="4"/>
+          <w:left w:val="single" w:color="auto" w:sz="4"/>
+          <w:bottom w:val="single" w:color="auto" w:sz="4"/>
+          <w:right w:val="single" w:color="auto" w:sz="4"/>
+          <w:insideH w:val="single" w:color="auto" w:sz="4"/>
+          <w:insideV w:val="single" w:color="auto" w:sz="4"/>
+        </w:tblBorders>
+      </w:tblPr>
+      <w:tblGrid>
+        <w:gridCol w:w="9906"/>
+      </w:tblGrid>
+      <w:tr>
+        <w:trPr>
+          <w:cantSplit/>
+        </w:trPr>
+        <w:tc>
+          <w:tcPr>
+            <w:tcW w:type="dxa" w:w="9906"/>
+            <w:tcBorders>
+              <w:top w:val="single" w:color="D9D0F0" w:sz="4"/>
+              <w:left w:val="single" w:color="BF382A" w:sz="32"/>
+              <w:bottom w:val="single" w:color="D9D0F0" w:sz="4"/>
+              <w:right w:val="single" w:color="D9D0F0" w:sz="4"/>
+            </w:tcBorders>
+            <w:tcMar>
+              <w:top w:type="dxa" w:w="120"/>
+              <w:left w:type="dxa" w:w="220"/>
+              <w:bottom w:type="dxa" w:w="130"/>
+              <w:right w:type="dxa" w:w="180"/>
+            </w:tcMar>
+            <w:vAlign w:val="top"/>
+          </w:tcPr>
+          <w:p>
+            <w:pPr>
+              <w:spacing w:after="40" w:before="0" w:line="276"/>
+              <w:jc w:val="left"/>
+            </w:pPr>
+            <w:r>
+              <w:rPr>
+                <w:rFonts w:ascii="Arial" w:cs="Arial" w:eastAsia="Arial" w:hAnsi="Arial"/>
+                <w:b/>
+                <w:bCs/>
+                <w:i w:val="false"/>
+                <w:iCs w:val="false"/>
+                <w:caps w:val="false"/>
                 <w:color w:val="BF382A"/>
                 <w:spacing w:val="14"/>
                 <w:sz w:val="13"/>
                 <w:szCs w:val="13"/>
               </w:rPr>
-              <w:t xml:space="preserve">ZACHOWANIA TRUDNE</w:t>
+              <w:t xml:space="preserve">2 · ZACHOWANIA TRUDNE</w:t>
             </w:r>
           </w:p>
           <w:p>
@@ -10229,7 +10334,7 @@
             <w:tcW w:type="dxa" w:w="4953"/>
             <w:tcBorders>
               <w:top w:val="single" w:color="D9D0F0" w:sz="4"/>
-              <w:left w:val="single" w:color="2D1B69" w:sz="32"/>
+              <w:left w:val="single" w:color="2D6BB3" w:sz="32"/>
               <w:bottom w:val="single" w:color="D9D0F0" w:sz="4"/>
               <w:right w:val="single" w:color="D9D0F0" w:sz="4"/>
             </w:tcBorders>
@@ -10254,12 +10359,12 @@
                 <w:i w:val="false"/>
                 <w:iCs w:val="false"/>
                 <w:caps w:val="false"/>
-                <w:color w:val="2D1B69"/>
+                <w:color w:val="2D6BB3"/>
                 <w:spacing w:val="14"/>
                 <w:sz w:val="13"/>
                 <w:szCs w:val="13"/>
               </w:rPr>
-              <w:t xml:space="preserve">CAŁOŚCIOWY OBRAZ</w:t>
+              <w:t xml:space="preserve">3 · PRZETWARZANIE BODŹCÓW</w:t>
             </w:r>
           </w:p>
           <w:p>
@@ -10279,7 +10384,7 @@
                 <w:sz w:val="20"/>
                 <w:szCs w:val="20"/>
               </w:rPr>
-              <w:t xml:space="preserve">Profil Biopsychospołeczny</w:t>
+              <w:t xml:space="preserve">Profil Sensoryczny</w:t>
             </w:r>
           </w:p>
           <w:p>
@@ -10299,7 +10404,7 @@
                 <w:sz w:val="17"/>
                 <w:szCs w:val="17"/>
               </w:rPr>
-              <w:t xml:space="preserve">Ujęcie funkcjonowania dziecka w wymiarze biologicznym, psychologicznym i społecznym – zgodnie z modelem ICF.</w:t>
+              <w:t xml:space="preserve">Ocena reaktywności sensorycznej (nadwrażliwości, podwrażliwości, poszukiwania stymulacji) i wpływu bodźców środowiskowych na dysregulację dziecka.</w:t>
             </w:r>
           </w:p>
         </w:tc>
@@ -10308,7 +10413,7 @@
             <w:tcW w:type="dxa" w:w="4953"/>
             <w:tcBorders>
               <w:top w:val="single" w:color="D9D0F0" w:sz="4"/>
-              <w:left w:val="single" w:color="2D6BB3" w:sz="32"/>
+              <w:left w:val="single" w:color="E74509" w:sz="32"/>
               <w:bottom w:val="single" w:color="D9D0F0" w:sz="4"/>
               <w:right w:val="single" w:color="D9D0F0" w:sz="4"/>
             </w:tcBorders>
@@ -10333,12 +10438,12 @@
                 <w:i w:val="false"/>
                 <w:iCs w:val="false"/>
                 <w:caps w:val="false"/>
-                <w:color w:val="2D6BB3"/>
+                <w:color w:val="E74509"/>
                 <w:spacing w:val="14"/>
                 <w:sz w:val="13"/>
                 <w:szCs w:val="13"/>
               </w:rPr>
-              <w:t xml:space="preserve">PRZETWARZANIE BODŹCÓW</w:t>
+              <w:t xml:space="preserve">4 · KOMUNIKACJA</w:t>
             </w:r>
           </w:p>
           <w:p>
@@ -10358,7 +10463,7 @@
                 <w:sz w:val="20"/>
                 <w:szCs w:val="20"/>
               </w:rPr>
-              <w:t xml:space="preserve">Profil Sensoryczny</w:t>
+              <w:t xml:space="preserve">Arkusz Oceny Rozwoju Mowy i Komunikacji</w:t>
             </w:r>
           </w:p>
           <w:p>
@@ -10378,21 +10483,42 @@
                 <w:sz w:val="17"/>
                 <w:szCs w:val="17"/>
               </w:rPr>
-              <w:t xml:space="preserve">Ocena reaktywności sensorycznej (nadwrażliwości, podwrażliwości, poszukiwania stymulacji) i wpływu bodźców środowiskowych na dysregulację dziecka.</w:t>
+              <w:t xml:space="preserve">Zastosowany w związku ze specyficznymi trudnościami w nadawaniu i rozumieniu mowy, echolaliami lub potrzebą wdrożenia / rozwijania AAC.</w:t>
             </w:r>
           </w:p>
         </w:tc>
       </w:tr>
+    </w:tbl>
+    <w:p>
+      <w:pPr>
+        <w:spacing w:after="100" w:before="0"/>
+      </w:pPr>
+    </w:p>
+    <w:tbl>
+      <w:tblPr>
+        <w:tblW w:type="dxa" w:w="9906"/>
+        <w:tblBorders>
+          <w:top w:val="single" w:color="auto" w:sz="4"/>
+          <w:left w:val="single" w:color="auto" w:sz="4"/>
+          <w:bottom w:val="single" w:color="auto" w:sz="4"/>
+          <w:right w:val="single" w:color="auto" w:sz="4"/>
+          <w:insideH w:val="single" w:color="auto" w:sz="4"/>
+          <w:insideV w:val="single" w:color="auto" w:sz="4"/>
+        </w:tblBorders>
+      </w:tblPr>
+      <w:tblGrid>
+        <w:gridCol w:w="9906"/>
+      </w:tblGrid>
       <w:tr>
         <w:trPr>
           <w:cantSplit/>
         </w:trPr>
         <w:tc>
           <w:tcPr>
-            <w:tcW w:type="dxa" w:w="4953"/>
+            <w:tcW w:type="dxa" w:w="9906"/>
             <w:tcBorders>
               <w:top w:val="single" w:color="D9D0F0" w:sz="4"/>
-              <w:left w:val="single" w:color="E74509" w:sz="32"/>
+              <w:left w:val="single" w:color="2E7D45" w:sz="32"/>
               <w:bottom w:val="single" w:color="D9D0F0" w:sz="4"/>
               <w:right w:val="single" w:color="D9D0F0" w:sz="4"/>
             </w:tcBorders>
@@ -10417,91 +10543,12 @@
                 <w:i w:val="false"/>
                 <w:iCs w:val="false"/>
                 <w:caps w:val="false"/>
-                <w:color w:val="E74509"/>
-                <w:spacing w:val="14"/>
-                <w:sz w:val="13"/>
-                <w:szCs w:val="13"/>
-              </w:rPr>
-              <w:t xml:space="preserve">KOMUNIKACJA</w:t>
-            </w:r>
-          </w:p>
-          <w:p>
-            <w:pPr>
-              <w:spacing w:after="70" w:before="0" w:line="250"/>
-              <w:jc w:val="left"/>
-            </w:pPr>
-            <w:r>
-              <w:rPr>
-                <w:rFonts w:ascii="Arial" w:cs="Arial" w:eastAsia="Arial" w:hAnsi="Arial"/>
-                <w:b/>
-                <w:bCs/>
-                <w:i w:val="false"/>
-                <w:iCs w:val="false"/>
-                <w:caps w:val="false"/>
-                <w:color w:val="2D1B69"/>
-                <w:sz w:val="20"/>
-                <w:szCs w:val="20"/>
-              </w:rPr>
-              <w:t xml:space="preserve">Arkusz Oceny Rozwoju Mowy i Komunikacji</w:t>
-            </w:r>
-          </w:p>
-          <w:p>
-            <w:pPr>
-              <w:spacing w:after="0" w:before="0" w:line="255"/>
-              <w:jc w:val="left"/>
-            </w:pPr>
-            <w:r>
-              <w:rPr>
-                <w:rFonts w:ascii="Arial" w:cs="Arial" w:eastAsia="Arial" w:hAnsi="Arial"/>
-                <w:b w:val="false"/>
-                <w:bCs w:val="false"/>
-                <w:i w:val="false"/>
-                <w:iCs w:val="false"/>
-                <w:caps w:val="false"/>
-                <w:color w:val="1A1530"/>
-                <w:sz w:val="17"/>
-                <w:szCs w:val="17"/>
-              </w:rPr>
-              <w:t xml:space="preserve">Zastosowany w związku ze specyficznymi trudnościami w nadawaniu i rozumieniu mowy, echolaliami lub potrzebą wdrożenia / rozwijania AAC.</w:t>
-            </w:r>
-          </w:p>
-        </w:tc>
-        <w:tc>
-          <w:tcPr>
-            <w:tcW w:type="dxa" w:w="4953"/>
-            <w:tcBorders>
-              <w:top w:val="single" w:color="D9D0F0" w:sz="4"/>
-              <w:left w:val="single" w:color="2E7D45" w:sz="32"/>
-              <w:bottom w:val="single" w:color="D9D0F0" w:sz="4"/>
-              <w:right w:val="single" w:color="D9D0F0" w:sz="4"/>
-            </w:tcBorders>
-            <w:tcMar>
-              <w:top w:type="dxa" w:w="120"/>
-              <w:left w:type="dxa" w:w="220"/>
-              <w:bottom w:type="dxa" w:w="130"/>
-              <w:right w:type="dxa" w:w="180"/>
-            </w:tcMar>
-            <w:vAlign w:val="top"/>
-          </w:tcPr>
-          <w:p>
-            <w:pPr>
-              <w:spacing w:after="40" w:before="0" w:line="276"/>
-              <w:jc w:val="left"/>
-            </w:pPr>
-            <w:r>
-              <w:rPr>
-                <w:rFonts w:ascii="Arial" w:cs="Arial" w:eastAsia="Arial" w:hAnsi="Arial"/>
-                <w:b/>
-                <w:bCs/>
-                <w:i w:val="false"/>
-                <w:iCs w:val="false"/>
-                <w:caps w:val="false"/>
                 <w:color w:val="2E7D45"/>
                 <w:spacing w:val="14"/>
                 <w:sz w:val="13"/>
                 <w:szCs w:val="13"/>
               </w:rPr>
-              <w:t xml:space="preserve">FUNKCJE POZNAWCZE I SPOŁECZNE</w:t>
+              <w:t xml:space="preserve">5 · FUNKCJE POZNAWCZE I SPOŁECZNE</w:t>
             </w:r>
           </w:p>
           <w:p>
@@ -15978,7 +16025,7 @@
             <w:tcW w:type="dxa" w:w="9906"/>
             <w:tcBorders>
               <w:top w:val="single" w:color="D9D0F0" w:sz="4"/>
-              <w:left w:val="single" w:color="BF382A" w:sz="32"/>
+              <w:left w:val="single" w:color="2D1B69" w:sz="32"/>
               <w:bottom w:val="single" w:color="D9D0F0" w:sz="4"/>
               <w:right w:val="single" w:color="D9D0F0" w:sz="4"/>
             </w:tcBorders>
@@ -16007,14 +16054,28 @@
                 <w:sz w:val="18"/>
                 <w:szCs w:val="18"/>
               </w:rPr>
-              <w:t xml:space="preserve">Arkusz Obserwacji Behawioralnej ABC</w:t>
-            </w:r>
-          </w:p>
-          <w:p>
-            <w:pPr>
-              <w:spacing w:after="50" w:before="0" w:line="255"/>
+              <w:t xml:space="preserve">Profil Biopsychospołeczny</w:t>
+            </w:r>
+          </w:p>
+          <w:p>
+            <w:pPr>
+              <w:spacing w:after="0" w:before="0" w:line="255"/>
               <w:jc w:val="both"/>
             </w:pPr>
+            <w:r>
+              <w:rPr>
+                <w:rFonts w:ascii="Arial" w:cs="Arial" w:eastAsia="Arial" w:hAnsi="Arial"/>
+                <w:b/>
+                <w:bCs/>
+                <w:i w:val="false"/>
+                <w:iCs w:val="false"/>
+                <w:caps w:val="false"/>
+                <w:color w:val="2D1B69"/>
+                <w:sz w:val="16"/>
+                <w:szCs w:val="16"/>
+              </w:rPr>
+              <w:t xml:space="preserve">Uwarunkowania biologiczne: </w:t>
+            </w:r>
             <w:r>
               <w:rPr>
                 <w:rFonts w:ascii="Arial" w:cs="Arial" w:eastAsia="Arial" w:hAnsi="Arial"/>
@@ -16027,21 +16088,21 @@
                 <w:sz w:val="16"/>
                 <w:szCs w:val="16"/>
               </w:rPr>
-              <w:t xml:space="preserve">Zidentyfikowano </w:t>
-            </w:r>
-            <w:r>
-              <w:rPr>
-                <w:rFonts w:ascii="Arial" w:cs="Arial" w:eastAsia="Arial" w:hAnsi="Arial"/>
-                <w:b/>
-                <w:bCs/>
-                <w:i w:val="false"/>
-                <w:iCs w:val="false"/>
-                <w:caps w:val="false"/>
-                <w:color w:val="BF382A"/>
+              <w:t xml:space="preserve">spektrum autyzmu, zaburzenia snu wpływają na zmęczenie poranne. </w:t>
+            </w:r>
+            <w:r>
+              <w:rPr>
+                <w:rFonts w:ascii="Arial" w:cs="Arial" w:eastAsia="Arial" w:hAnsi="Arial"/>
+                <w:b/>
+                <w:bCs/>
+                <w:i w:val="false"/>
+                <w:iCs w:val="false"/>
+                <w:caps w:val="false"/>
+                <w:color w:val="2D1B69"/>
                 <w:sz w:val="16"/>
                 <w:szCs w:val="16"/>
               </w:rPr>
-              <w:t xml:space="preserve">14 epizodów</w:t>
+              <w:t xml:space="preserve">Uwarunkowania psychologiczne: </w:t>
             </w:r>
             <w:r>
               <w:rPr>
@@ -16055,21 +16116,21 @@
                 <w:sz w:val="16"/>
                 <w:szCs w:val="16"/>
               </w:rPr>
-              <w:t xml:space="preserve"> zachowań trudnych. </w:t>
-            </w:r>
-            <w:r>
-              <w:rPr>
-                <w:rFonts w:ascii="Arial" w:cs="Arial" w:eastAsia="Arial" w:hAnsi="Arial"/>
-                <w:b/>
-                <w:bCs/>
-                <w:i w:val="false"/>
-                <w:iCs w:val="false"/>
-                <w:caps w:val="false"/>
-                <w:color w:val="BF382A"/>
+              <w:t xml:space="preserve">silny lęk przed zmianą schematu, sztywność poznawcza. </w:t>
+            </w:r>
+            <w:r>
+              <w:rPr>
+                <w:rFonts w:ascii="Arial" w:cs="Arial" w:eastAsia="Arial" w:hAnsi="Arial"/>
+                <w:b/>
+                <w:bCs/>
+                <w:i w:val="false"/>
+                <w:iCs w:val="false"/>
+                <w:caps w:val="false"/>
+                <w:color w:val="2D1B69"/>
                 <w:sz w:val="16"/>
                 <w:szCs w:val="16"/>
               </w:rPr>
-              <w:t xml:space="preserve">Bodźce wyzwalające (A): </w:t>
+              <w:t xml:space="preserve">Czynniki środowiskowe: </w:t>
             </w:r>
             <w:r>
               <w:rPr>
@@ -16083,97 +16144,7 @@
                 <w:sz w:val="16"/>
                 <w:szCs w:val="16"/>
               </w:rPr>
-              <w:t xml:space="preserve">trudne polecenia pisemne, hałas, niespodziewane przejścia między aktywnościami. </w:t>
-            </w:r>
-            <w:r>
-              <w:rPr>
-                <w:rFonts w:ascii="Arial" w:cs="Arial" w:eastAsia="Arial" w:hAnsi="Arial"/>
-                <w:b/>
-                <w:bCs/>
-                <w:i w:val="false"/>
-                <w:iCs w:val="false"/>
-                <w:caps w:val="false"/>
-                <w:color w:val="BF382A"/>
-                <w:sz w:val="16"/>
-                <w:szCs w:val="16"/>
-              </w:rPr>
-              <w:t xml:space="preserve">Topografia zachowania (B): </w:t>
-            </w:r>
-            <w:r>
-              <w:rPr>
-                <w:rFonts w:ascii="Arial" w:cs="Arial" w:eastAsia="Arial" w:hAnsi="Arial"/>
-                <w:b w:val="false"/>
-                <w:bCs w:val="false"/>
-                <w:i w:val="false"/>
-                <w:iCs w:val="false"/>
-                <w:caps w:val="false"/>
-                <w:color w:val="1A1530"/>
-                <w:sz w:val="16"/>
-                <w:szCs w:val="16"/>
-              </w:rPr>
-              <w:t xml:space="preserve">głośny krzyk, odmowa zejścia z dywanu, odpychanie kart pracy. </w:t>
-            </w:r>
-            <w:r>
-              <w:rPr>
-                <w:rFonts w:ascii="Arial" w:cs="Arial" w:eastAsia="Arial" w:hAnsi="Arial"/>
-                <w:b/>
-                <w:bCs/>
-                <w:i w:val="false"/>
-                <w:iCs w:val="false"/>
-                <w:caps w:val="false"/>
-                <w:color w:val="BF382A"/>
-                <w:sz w:val="16"/>
-                <w:szCs w:val="16"/>
-              </w:rPr>
-              <w:t xml:space="preserve">Funkcja (C): </w:t>
-            </w:r>
-            <w:r>
-              <w:rPr>
-                <w:rFonts w:ascii="Arial" w:cs="Arial" w:eastAsia="Arial" w:hAnsi="Arial"/>
-                <w:b w:val="false"/>
-                <w:bCs w:val="false"/>
-                <w:i w:val="false"/>
-                <w:iCs w:val="false"/>
-                <w:caps w:val="false"/>
-                <w:color w:val="1A1530"/>
-                <w:sz w:val="16"/>
-                <w:szCs w:val="16"/>
-              </w:rPr>
-              <w:t xml:space="preserve">ucieczka przed przeciążeniem sensorycznym / zadaniem trudnym poznawczo.</w:t>
-            </w:r>
-          </w:p>
-          <w:p>
-            <w:pPr>
-              <w:spacing w:after="0" w:before="0" w:line="276"/>
-              <w:jc w:val="left"/>
-            </w:pPr>
-            <w:r>
-              <w:rPr>
-                <w:rFonts w:ascii="Arial" w:cs="Arial" w:eastAsia="Arial" w:hAnsi="Arial"/>
-                <w:b/>
-                <w:bCs/>
-                <w:i w:val="false"/>
-                <w:iCs w:val="false"/>
-                <w:caps w:val="false"/>
-                <w:color w:val="E74509"/>
-                <w:sz w:val="16"/>
-                <w:szCs w:val="16"/>
-              </w:rPr>
-              <w:t xml:space="preserve">Zalecenie: </w:t>
-            </w:r>
-            <w:r>
-              <w:rPr>
-                <w:rFonts w:ascii="Arial" w:cs="Arial" w:eastAsia="Arial" w:hAnsi="Arial"/>
-                <w:b w:val="false"/>
-                <w:bCs w:val="false"/>
-                <w:i w:val="false"/>
-                <w:iCs w:val="false"/>
-                <w:caps w:val="false"/>
-                <w:color w:val="2D1B69"/>
-                <w:sz w:val="16"/>
-                <w:szCs w:val="16"/>
-              </w:rPr>
-              <w:t xml:space="preserve">protokół wyprzedzający i nauka komunikatu zastępczego.</w:t>
+              <w:t xml:space="preserve">wysokie zaangażowanie rodziny, pozytywna reakcja na stałą kadrę.</w:t>
             </w:r>
           </w:p>
         </w:tc>
@@ -16208,7 +16179,7 @@
             <w:tcW w:type="dxa" w:w="9906"/>
             <w:tcBorders>
               <w:top w:val="single" w:color="D9D0F0" w:sz="4"/>
-              <w:left w:val="single" w:color="2D1B69" w:sz="32"/>
+              <w:left w:val="single" w:color="BF382A" w:sz="32"/>
               <w:bottom w:val="single" w:color="D9D0F0" w:sz="4"/>
               <w:right w:val="single" w:color="D9D0F0" w:sz="4"/>
             </w:tcBorders>
@@ -16237,19 +16208,165 @@
                 <w:sz w:val="18"/>
                 <w:szCs w:val="18"/>
               </w:rPr>
-              <w:t xml:space="preserve">Profil Biopsychospołeczny</w:t>
-            </w:r>
-          </w:p>
-          <w:p>
-            <w:pPr>
-              <w:spacing w:after="0" w:before="0" w:line="255"/>
+              <w:t xml:space="preserve">Arkusz Obserwacji Behawioralnej ABC</w:t>
+            </w:r>
+          </w:p>
+          <w:p>
+            <w:pPr>
+              <w:spacing w:after="50" w:before="0" w:line="255"/>
               <w:jc w:val="both"/>
             </w:pPr>
             <w:r>
               <w:rPr>
                 <w:rFonts w:ascii="Arial" w:cs="Arial" w:eastAsia="Arial" w:hAnsi="Arial"/>
-                <w:b/>
-                <w:bCs/>
+                <w:b w:val="false"/>
+                <w:bCs w:val="false"/>
+                <w:i w:val="false"/>
+                <w:iCs w:val="false"/>
+                <w:caps w:val="false"/>
+                <w:color w:val="1A1530"/>
+                <w:sz w:val="16"/>
+                <w:szCs w:val="16"/>
+              </w:rPr>
+              <w:t xml:space="preserve">Zidentyfikowano </w:t>
+            </w:r>
+            <w:r>
+              <w:rPr>
+                <w:rFonts w:ascii="Arial" w:cs="Arial" w:eastAsia="Arial" w:hAnsi="Arial"/>
+                <w:b/>
+                <w:bCs/>
+                <w:i w:val="false"/>
+                <w:iCs w:val="false"/>
+                <w:caps w:val="false"/>
+                <w:color w:val="BF382A"/>
+                <w:sz w:val="16"/>
+                <w:szCs w:val="16"/>
+              </w:rPr>
+              <w:t xml:space="preserve">14 epizodów</w:t>
+            </w:r>
+            <w:r>
+              <w:rPr>
+                <w:rFonts w:ascii="Arial" w:cs="Arial" w:eastAsia="Arial" w:hAnsi="Arial"/>
+                <w:b w:val="false"/>
+                <w:bCs w:val="false"/>
+                <w:i w:val="false"/>
+                <w:iCs w:val="false"/>
+                <w:caps w:val="false"/>
+                <w:color w:val="1A1530"/>
+                <w:sz w:val="16"/>
+                <w:szCs w:val="16"/>
+              </w:rPr>
+              <w:t xml:space="preserve"> zachowań trudnych. </w:t>
+            </w:r>
+            <w:r>
+              <w:rPr>
+                <w:rFonts w:ascii="Arial" w:cs="Arial" w:eastAsia="Arial" w:hAnsi="Arial"/>
+                <w:b/>
+                <w:bCs/>
+                <w:i w:val="false"/>
+                <w:iCs w:val="false"/>
+                <w:caps w:val="false"/>
+                <w:color w:val="BF382A"/>
+                <w:sz w:val="16"/>
+                <w:szCs w:val="16"/>
+              </w:rPr>
+              <w:t xml:space="preserve">Bodźce wyzwalające (A): </w:t>
+            </w:r>
+            <w:r>
+              <w:rPr>
+                <w:rFonts w:ascii="Arial" w:cs="Arial" w:eastAsia="Arial" w:hAnsi="Arial"/>
+                <w:b w:val="false"/>
+                <w:bCs w:val="false"/>
+                <w:i w:val="false"/>
+                <w:iCs w:val="false"/>
+                <w:caps w:val="false"/>
+                <w:color w:val="1A1530"/>
+                <w:sz w:val="16"/>
+                <w:szCs w:val="16"/>
+              </w:rPr>
+              <w:t xml:space="preserve">trudne polecenia pisemne, hałas, niespodziewane przejścia między aktywnościami. </w:t>
+            </w:r>
+            <w:r>
+              <w:rPr>
+                <w:rFonts w:ascii="Arial" w:cs="Arial" w:eastAsia="Arial" w:hAnsi="Arial"/>
+                <w:b/>
+                <w:bCs/>
+                <w:i w:val="false"/>
+                <w:iCs w:val="false"/>
+                <w:caps w:val="false"/>
+                <w:color w:val="BF382A"/>
+                <w:sz w:val="16"/>
+                <w:szCs w:val="16"/>
+              </w:rPr>
+              <w:t xml:space="preserve">Topografia zachowania (B): </w:t>
+            </w:r>
+            <w:r>
+              <w:rPr>
+                <w:rFonts w:ascii="Arial" w:cs="Arial" w:eastAsia="Arial" w:hAnsi="Arial"/>
+                <w:b w:val="false"/>
+                <w:bCs w:val="false"/>
+                <w:i w:val="false"/>
+                <w:iCs w:val="false"/>
+                <w:caps w:val="false"/>
+                <w:color w:val="1A1530"/>
+                <w:sz w:val="16"/>
+                <w:szCs w:val="16"/>
+              </w:rPr>
+              <w:t xml:space="preserve">głośny krzyk, odmowa zejścia z dywanu, odpychanie kart pracy. </w:t>
+            </w:r>
+            <w:r>
+              <w:rPr>
+                <w:rFonts w:ascii="Arial" w:cs="Arial" w:eastAsia="Arial" w:hAnsi="Arial"/>
+                <w:b/>
+                <w:bCs/>
+                <w:i w:val="false"/>
+                <w:iCs w:val="false"/>
+                <w:caps w:val="false"/>
+                <w:color w:val="BF382A"/>
+                <w:sz w:val="16"/>
+                <w:szCs w:val="16"/>
+              </w:rPr>
+              <w:t xml:space="preserve">Funkcja (C): </w:t>
+            </w:r>
+            <w:r>
+              <w:rPr>
+                <w:rFonts w:ascii="Arial" w:cs="Arial" w:eastAsia="Arial" w:hAnsi="Arial"/>
+                <w:b w:val="false"/>
+                <w:bCs w:val="false"/>
+                <w:i w:val="false"/>
+                <w:iCs w:val="false"/>
+                <w:caps w:val="false"/>
+                <w:color w:val="1A1530"/>
+                <w:sz w:val="16"/>
+                <w:szCs w:val="16"/>
+              </w:rPr>
+              <w:t xml:space="preserve">ucieczka przed przeciążeniem sensorycznym / zadaniem trudnym poznawczo.</w:t>
+            </w:r>
+          </w:p>
+          <w:p>
+            <w:pPr>
+              <w:spacing w:after="0" w:before="0" w:line="276"/>
+              <w:jc w:val="left"/>
+            </w:pPr>
+            <w:r>
+              <w:rPr>
+                <w:rFonts w:ascii="Arial" w:cs="Arial" w:eastAsia="Arial" w:hAnsi="Arial"/>
+                <w:b/>
+                <w:bCs/>
+                <w:i w:val="false"/>
+                <w:iCs w:val="false"/>
+                <w:caps w:val="false"/>
+                <w:color w:val="E74509"/>
+                <w:sz w:val="16"/>
+                <w:szCs w:val="16"/>
+              </w:rPr>
+              <w:t xml:space="preserve">Zalecenie: </w:t>
+            </w:r>
+            <w:r>
+              <w:rPr>
+                <w:rFonts w:ascii="Arial" w:cs="Arial" w:eastAsia="Arial" w:hAnsi="Arial"/>
+                <w:b w:val="false"/>
+                <w:bCs w:val="false"/>
                 <w:i w:val="false"/>
                 <w:iCs w:val="false"/>
                 <w:caps w:val="false"/>
@@ -16257,77 +16374,7 @@
                 <w:sz w:val="16"/>
                 <w:szCs w:val="16"/>
               </w:rPr>
-              <w:t xml:space="preserve">Uwarunkowania biologiczne: </w:t>
-            </w:r>
-            <w:r>
-              <w:rPr>
-                <w:rFonts w:ascii="Arial" w:cs="Arial" w:eastAsia="Arial" w:hAnsi="Arial"/>
-                <w:b w:val="false"/>
-                <w:bCs w:val="false"/>
-                <w:i w:val="false"/>
-                <w:iCs w:val="false"/>
-                <w:caps w:val="false"/>
-                <w:color w:val="1A1530"/>
-                <w:sz w:val="16"/>
-                <w:szCs w:val="16"/>
-              </w:rPr>
-              <w:t xml:space="preserve">spektrum autyzmu, zaburzenia snu wpływają na zmęczenie poranne. </w:t>
-            </w:r>
-            <w:r>
-              <w:rPr>
-                <w:rFonts w:ascii="Arial" w:cs="Arial" w:eastAsia="Arial" w:hAnsi="Arial"/>
-                <w:b/>
-                <w:bCs/>
-                <w:i w:val="false"/>
-                <w:iCs w:val="false"/>
-                <w:caps w:val="false"/>
-                <w:color w:val="2D1B69"/>
-                <w:sz w:val="16"/>
-                <w:szCs w:val="16"/>
-              </w:rPr>
-              <w:t xml:space="preserve">Uwarunkowania psychologiczne: </w:t>
-            </w:r>
-            <w:r>
-              <w:rPr>
-                <w:rFonts w:ascii="Arial" w:cs="Arial" w:eastAsia="Arial" w:hAnsi="Arial"/>
-                <w:b w:val="false"/>
-                <w:bCs w:val="false"/>
-                <w:i w:val="false"/>
-                <w:iCs w:val="false"/>
-                <w:caps w:val="false"/>
-                <w:color w:val="1A1530"/>
-                <w:sz w:val="16"/>
-                <w:szCs w:val="16"/>
-              </w:rPr>
-              <w:t xml:space="preserve">silny lęk przed zmianą schematu, sztywność poznawcza. </w:t>
-            </w:r>
-            <w:r>
-              <w:rPr>
-                <w:rFonts w:ascii="Arial" w:cs="Arial" w:eastAsia="Arial" w:hAnsi="Arial"/>
-                <w:b/>
-                <w:bCs/>
-                <w:i w:val="false"/>
-                <w:iCs w:val="false"/>
-                <w:caps w:val="false"/>
-                <w:color w:val="2D1B69"/>
-                <w:sz w:val="16"/>
-                <w:szCs w:val="16"/>
-              </w:rPr>
-              <w:t xml:space="preserve">Czynniki środowiskowe: </w:t>
-            </w:r>
-            <w:r>
-              <w:rPr>
-                <w:rFonts w:ascii="Arial" w:cs="Arial" w:eastAsia="Arial" w:hAnsi="Arial"/>
-                <w:b w:val="false"/>
-                <w:bCs w:val="false"/>
-                <w:i w:val="false"/>
-                <w:iCs w:val="false"/>
-                <w:caps w:val="false"/>
-                <w:color w:val="1A1530"/>
-                <w:sz w:val="16"/>
-                <w:szCs w:val="16"/>
-              </w:rPr>
-              <w:t xml:space="preserve">wysokie zaangażowanie rodziny, pozytywna reakcja na stałą kadrę.</w:t>
+              <w:t xml:space="preserve">protokół wyprzedzający i nauka komunikatu zastępczego.</w:t>
             </w:r>
           </w:p>
         </w:tc>

</xml_diff>

<commit_message>
Word: mniejsze etykiety w nagłówku strony (bez zawijania)
Co-Authored-By: Claude Fable 5.1 <noreply@anthropic.com>
Claude-Session: https://claude.ai/code/session_01FpF7vCSW7jSofte5z6wEKy
</commit_message>
<xml_diff>
--- a/eduplaner2026/raport_oceny_funkcjonalnej/Raport_Oceny_Funkcjonalnej.docx
+++ b/eduplaner2026/raport_oceny_funkcjonalnej/Raport_Oceny_Funkcjonalnej.docx
@@ -113,9 +113,9 @@
                 <w:iCs w:val="false"/>
                 <w:caps/>
                 <w:color w:val="6B6378"/>
-                <w:spacing w:val="14"/>
-                <w:sz w:val="18"/>
-                <w:szCs w:val="18"/>
+                <w:spacing w:val="12"/>
+                <w:sz w:val="14"/>
+                <w:szCs w:val="14"/>
               </w:rPr>
               <w:t xml:space="preserve">Ocena Funkcjonalna · Okładka</w:t>
             </w:r>
@@ -152,9 +152,9 @@
                 <w:iCs w:val="false"/>
                 <w:caps w:val="false"/>
                 <w:color w:val="FFFFFF"/>
-                <w:spacing w:val="10"/>
-                <w:sz w:val="18"/>
-                <w:szCs w:val="18"/>
+                <w:spacing w:val="8"/>
+                <w:sz w:val="14"/>
+                <w:szCs w:val="14"/>
                 <w:shd w:fill="E74509" w:color="auto" w:val="clear"/>
               </w:rPr>
               <w:t xml:space="preserve">  OCENA FUNKCJONALNA · 2026  </w:t>
@@ -174,9 +174,9 @@
                 <w:iCs w:val="false"/>
                 <w:caps w:val="false"/>
                 <w:color w:val="6B6378"/>
-                <w:spacing w:val="14"/>
-                <w:sz w:val="18"/>
-                <w:szCs w:val="18"/>
+                <w:spacing w:val="10"/>
+                <w:sz w:val="13"/>
+                <w:szCs w:val="13"/>
               </w:rPr>
               <w:t xml:space="preserve">DOKUMENT DLA RODZICA I PORADNI</w:t>
             </w:r>
@@ -245,9 +245,9 @@
                 <w:iCs w:val="false"/>
                 <w:caps w:val="false"/>
                 <w:color w:val="7D6FB0"/>
-                <w:spacing w:val="14"/>
-                <w:sz w:val="18"/>
-                <w:szCs w:val="18"/>
+                <w:spacing w:val="12"/>
+                <w:sz w:val="15"/>
+                <w:szCs w:val="15"/>
               </w:rPr>
               <w:t xml:space="preserve">DOTYCZY DZIECKA</w:t>
             </w:r>
@@ -260,10 +260,10 @@
                 <w:iCs w:val="false"/>
                 <w:caps w:val="false"/>
                 <w:color w:val="B6A6DF"/>
-                <w:sz w:val="18"/>
-                <w:szCs w:val="18"/>
-              </w:rPr>
-              <w:t xml:space="preserve">  ....................................................</w:t>
+                <w:sz w:val="15"/>
+                <w:szCs w:val="15"/>
+              </w:rPr>
+              <w:t xml:space="preserve">  ........................................</w:t>
             </w:r>
             <w:r>
               <w:rPr>
@@ -313,9 +313,9 @@
                 <w:iCs w:val="false"/>
                 <w:caps w:val="false"/>
                 <w:color w:val="7D6FB0"/>
-                <w:spacing w:val="14"/>
-                <w:sz w:val="18"/>
-                <w:szCs w:val="18"/>
+                <w:spacing w:val="12"/>
+                <w:sz w:val="15"/>
+                <w:szCs w:val="15"/>
               </w:rPr>
               <w:t xml:space="preserve">GRUPA / KLASA</w:t>
             </w:r>
@@ -328,10 +328,10 @@
                 <w:iCs w:val="false"/>
                 <w:caps w:val="false"/>
                 <w:color w:val="B6A6DF"/>
-                <w:sz w:val="18"/>
-                <w:szCs w:val="18"/>
-              </w:rPr>
-              <w:t xml:space="preserve">  ..............................</w:t>
+                <w:sz w:val="15"/>
+                <w:szCs w:val="15"/>
+              </w:rPr>
+              <w:t xml:space="preserve">  ......................</w:t>
             </w:r>
             <w:r>
               <w:rPr>
@@ -381,9 +381,9 @@
                 <w:iCs w:val="false"/>
                 <w:caps w:val="false"/>
                 <w:color w:val="7D6FB0"/>
-                <w:spacing w:val="14"/>
-                <w:sz w:val="18"/>
-                <w:szCs w:val="18"/>
+                <w:spacing w:val="12"/>
+                <w:sz w:val="15"/>
+                <w:szCs w:val="15"/>
               </w:rPr>
               <w:t xml:space="preserve">DATA</w:t>
             </w:r>
@@ -396,10 +396,10 @@
                 <w:iCs w:val="false"/>
                 <w:caps w:val="false"/>
                 <w:color w:val="B6A6DF"/>
-                <w:sz w:val="18"/>
-                <w:szCs w:val="18"/>
-              </w:rPr>
-              <w:t xml:space="preserve">  ..............................</w:t>
+                <w:sz w:val="15"/>
+                <w:szCs w:val="15"/>
+              </w:rPr>
+              <w:t xml:space="preserve">  ......................</w:t>
             </w:r>
             <w:r>
               <w:rPr>
@@ -2470,9 +2470,9 @@
                 <w:iCs w:val="false"/>
                 <w:caps/>
                 <w:color w:val="6B6378"/>
-                <w:spacing w:val="14"/>
-                <w:sz w:val="18"/>
-                <w:szCs w:val="18"/>
+                <w:spacing w:val="12"/>
+                <w:sz w:val="14"/>
+                <w:szCs w:val="14"/>
               </w:rPr>
               <w:t xml:space="preserve">Ocena Funkcjonalna · Jak czytać raport · dwa warianty</w:t>
             </w:r>
@@ -2509,9 +2509,9 @@
                 <w:iCs w:val="false"/>
                 <w:caps w:val="false"/>
                 <w:color w:val="FFFFFF"/>
-                <w:spacing w:val="10"/>
-                <w:sz w:val="18"/>
-                <w:szCs w:val="18"/>
+                <w:spacing w:val="8"/>
+                <w:sz w:val="14"/>
+                <w:szCs w:val="14"/>
                 <w:shd w:fill="E74509" w:color="auto" w:val="clear"/>
               </w:rPr>
               <w:t xml:space="preserve">  OCENA FUNKCJONALNA · 2026  </w:t>
@@ -2531,9 +2531,9 @@
                 <w:iCs w:val="false"/>
                 <w:caps w:val="false"/>
                 <w:color w:val="6B6378"/>
-                <w:spacing w:val="14"/>
-                <w:sz w:val="18"/>
-                <w:szCs w:val="18"/>
+                <w:spacing w:val="10"/>
+                <w:sz w:val="13"/>
+                <w:szCs w:val="13"/>
               </w:rPr>
               <w:t xml:space="preserve">DOKUMENT DLA RODZICA I PORADNI</w:t>
             </w:r>
@@ -2602,9 +2602,9 @@
                 <w:iCs w:val="false"/>
                 <w:caps w:val="false"/>
                 <w:color w:val="7D6FB0"/>
-                <w:spacing w:val="14"/>
-                <w:sz w:val="18"/>
-                <w:szCs w:val="18"/>
+                <w:spacing w:val="12"/>
+                <w:sz w:val="15"/>
+                <w:szCs w:val="15"/>
               </w:rPr>
               <w:t xml:space="preserve">DOTYCZY DZIECKA</w:t>
             </w:r>
@@ -2617,10 +2617,10 @@
                 <w:iCs w:val="false"/>
                 <w:caps w:val="false"/>
                 <w:color w:val="B6A6DF"/>
-                <w:sz w:val="18"/>
-                <w:szCs w:val="18"/>
-              </w:rPr>
-              <w:t xml:space="preserve">  ....................................................</w:t>
+                <w:sz w:val="15"/>
+                <w:szCs w:val="15"/>
+              </w:rPr>
+              <w:t xml:space="preserve">  ........................................</w:t>
             </w:r>
             <w:r>
               <w:rPr>
@@ -2670,9 +2670,9 @@
                 <w:iCs w:val="false"/>
                 <w:caps w:val="false"/>
                 <w:color w:val="7D6FB0"/>
-                <w:spacing w:val="14"/>
-                <w:sz w:val="18"/>
-                <w:szCs w:val="18"/>
+                <w:spacing w:val="12"/>
+                <w:sz w:val="15"/>
+                <w:szCs w:val="15"/>
               </w:rPr>
               <w:t xml:space="preserve">GRUPA / KLASA</w:t>
             </w:r>
@@ -2685,10 +2685,10 @@
                 <w:iCs w:val="false"/>
                 <w:caps w:val="false"/>
                 <w:color w:val="B6A6DF"/>
-                <w:sz w:val="18"/>
-                <w:szCs w:val="18"/>
-              </w:rPr>
-              <w:t xml:space="preserve">  ..............................</w:t>
+                <w:sz w:val="15"/>
+                <w:szCs w:val="15"/>
+              </w:rPr>
+              <w:t xml:space="preserve">  ......................</w:t>
             </w:r>
             <w:r>
               <w:rPr>
@@ -2738,9 +2738,9 @@
                 <w:iCs w:val="false"/>
                 <w:caps w:val="false"/>
                 <w:color w:val="7D6FB0"/>
-                <w:spacing w:val="14"/>
-                <w:sz w:val="18"/>
-                <w:szCs w:val="18"/>
+                <w:spacing w:val="12"/>
+                <w:sz w:val="15"/>
+                <w:szCs w:val="15"/>
               </w:rPr>
               <w:t xml:space="preserve">DATA</w:t>
             </w:r>
@@ -2753,10 +2753,10 @@
                 <w:iCs w:val="false"/>
                 <w:caps w:val="false"/>
                 <w:color w:val="B6A6DF"/>
-                <w:sz w:val="18"/>
-                <w:szCs w:val="18"/>
-              </w:rPr>
-              <w:t xml:space="preserve">  ..............................</w:t>
+                <w:sz w:val="15"/>
+                <w:szCs w:val="15"/>
+              </w:rPr>
+              <w:t xml:space="preserve">  ......................</w:t>
             </w:r>
             <w:r>
               <w:rPr>
@@ -5365,9 +5365,9 @@
                 <w:iCs w:val="false"/>
                 <w:caps/>
                 <w:color w:val="6B6378"/>
-                <w:spacing w:val="14"/>
-                <w:sz w:val="18"/>
-                <w:szCs w:val="18"/>
+                <w:spacing w:val="12"/>
+                <w:sz w:val="14"/>
+                <w:szCs w:val="14"/>
               </w:rPr>
               <w:t xml:space="preserve">Ocena Funkcjonalna · Podstawy prawne</w:t>
             </w:r>
@@ -5404,9 +5404,9 @@
                 <w:iCs w:val="false"/>
                 <w:caps w:val="false"/>
                 <w:color w:val="FFFFFF"/>
-                <w:spacing w:val="10"/>
-                <w:sz w:val="18"/>
-                <w:szCs w:val="18"/>
+                <w:spacing w:val="8"/>
+                <w:sz w:val="14"/>
+                <w:szCs w:val="14"/>
                 <w:shd w:fill="E74509" w:color="auto" w:val="clear"/>
               </w:rPr>
               <w:t xml:space="preserve">  OCENA FUNKCJONALNA · 2026  </w:t>
@@ -5426,9 +5426,9 @@
                 <w:iCs w:val="false"/>
                 <w:caps w:val="false"/>
                 <w:color w:val="6B6378"/>
-                <w:spacing w:val="14"/>
-                <w:sz w:val="18"/>
-                <w:szCs w:val="18"/>
+                <w:spacing w:val="10"/>
+                <w:sz w:val="13"/>
+                <w:szCs w:val="13"/>
               </w:rPr>
               <w:t xml:space="preserve">DOKUMENT DLA RODZICA I PORADNI</w:t>
             </w:r>
@@ -5497,9 +5497,9 @@
                 <w:iCs w:val="false"/>
                 <w:caps w:val="false"/>
                 <w:color w:val="7D6FB0"/>
-                <w:spacing w:val="14"/>
-                <w:sz w:val="18"/>
-                <w:szCs w:val="18"/>
+                <w:spacing w:val="12"/>
+                <w:sz w:val="15"/>
+                <w:szCs w:val="15"/>
               </w:rPr>
               <w:t xml:space="preserve">DOTYCZY DZIECKA</w:t>
             </w:r>
@@ -5512,10 +5512,10 @@
                 <w:iCs w:val="false"/>
                 <w:caps w:val="false"/>
                 <w:color w:val="B6A6DF"/>
-                <w:sz w:val="18"/>
-                <w:szCs w:val="18"/>
-              </w:rPr>
-              <w:t xml:space="preserve">  ....................................................</w:t>
+                <w:sz w:val="15"/>
+                <w:szCs w:val="15"/>
+              </w:rPr>
+              <w:t xml:space="preserve">  ........................................</w:t>
             </w:r>
             <w:r>
               <w:rPr>
@@ -5565,9 +5565,9 @@
                 <w:iCs w:val="false"/>
                 <w:caps w:val="false"/>
                 <w:color w:val="7D6FB0"/>
-                <w:spacing w:val="14"/>
-                <w:sz w:val="18"/>
-                <w:szCs w:val="18"/>
+                <w:spacing w:val="12"/>
+                <w:sz w:val="15"/>
+                <w:szCs w:val="15"/>
               </w:rPr>
               <w:t xml:space="preserve">GRUPA / KLASA</w:t>
             </w:r>
@@ -5580,10 +5580,10 @@
                 <w:iCs w:val="false"/>
                 <w:caps w:val="false"/>
                 <w:color w:val="B6A6DF"/>
-                <w:sz w:val="18"/>
-                <w:szCs w:val="18"/>
-              </w:rPr>
-              <w:t xml:space="preserve">  ..............................</w:t>
+                <w:sz w:val="15"/>
+                <w:szCs w:val="15"/>
+              </w:rPr>
+              <w:t xml:space="preserve">  ......................</w:t>
             </w:r>
             <w:r>
               <w:rPr>
@@ -5633,9 +5633,9 @@
                 <w:iCs w:val="false"/>
                 <w:caps w:val="false"/>
                 <w:color w:val="7D6FB0"/>
-                <w:spacing w:val="14"/>
-                <w:sz w:val="18"/>
-                <w:szCs w:val="18"/>
+                <w:spacing w:val="12"/>
+                <w:sz w:val="15"/>
+                <w:szCs w:val="15"/>
               </w:rPr>
               <w:t xml:space="preserve">DATA</w:t>
             </w:r>
@@ -5648,10 +5648,10 @@
                 <w:iCs w:val="false"/>
                 <w:caps w:val="false"/>
                 <w:color w:val="B6A6DF"/>
-                <w:sz w:val="18"/>
-                <w:szCs w:val="18"/>
-              </w:rPr>
-              <w:t xml:space="preserve">  ..............................</w:t>
+                <w:sz w:val="15"/>
+                <w:szCs w:val="15"/>
+              </w:rPr>
+              <w:t xml:space="preserve">  ......................</w:t>
             </w:r>
             <w:r>
               <w:rPr>
@@ -7174,9 +7174,9 @@
                 <w:iCs w:val="false"/>
                 <w:caps/>
                 <w:color w:val="6B6378"/>
-                <w:spacing w:val="14"/>
-                <w:sz w:val="18"/>
-                <w:szCs w:val="18"/>
+                <w:spacing w:val="12"/>
+                <w:sz w:val="14"/>
+                <w:szCs w:val="14"/>
               </w:rPr>
               <w:t xml:space="preserve">Ocena Funkcjonalna · Metryczka i obserwacja wstępna</w:t>
             </w:r>
@@ -7213,9 +7213,9 @@
                 <w:iCs w:val="false"/>
                 <w:caps w:val="false"/>
                 <w:color w:val="FFFFFF"/>
-                <w:spacing w:val="10"/>
-                <w:sz w:val="18"/>
-                <w:szCs w:val="18"/>
+                <w:spacing w:val="8"/>
+                <w:sz w:val="14"/>
+                <w:szCs w:val="14"/>
                 <w:shd w:fill="E74509" w:color="auto" w:val="clear"/>
               </w:rPr>
               <w:t xml:space="preserve">  OCENA FUNKCJONALNA · 2026  </w:t>
@@ -7235,9 +7235,9 @@
                 <w:iCs w:val="false"/>
                 <w:caps w:val="false"/>
                 <w:color w:val="6B6378"/>
-                <w:spacing w:val="14"/>
-                <w:sz w:val="18"/>
-                <w:szCs w:val="18"/>
+                <w:spacing w:val="10"/>
+                <w:sz w:val="13"/>
+                <w:szCs w:val="13"/>
               </w:rPr>
               <w:t xml:space="preserve">DOKUMENT DLA RODZICA I PORADNI</w:t>
             </w:r>
@@ -7306,9 +7306,9 @@
                 <w:iCs w:val="false"/>
                 <w:caps w:val="false"/>
                 <w:color w:val="7D6FB0"/>
-                <w:spacing w:val="14"/>
-                <w:sz w:val="18"/>
-                <w:szCs w:val="18"/>
+                <w:spacing w:val="12"/>
+                <w:sz w:val="15"/>
+                <w:szCs w:val="15"/>
               </w:rPr>
               <w:t xml:space="preserve">DOTYCZY DZIECKA</w:t>
             </w:r>
@@ -7321,10 +7321,10 @@
                 <w:iCs w:val="false"/>
                 <w:caps w:val="false"/>
                 <w:color w:val="B6A6DF"/>
-                <w:sz w:val="18"/>
-                <w:szCs w:val="18"/>
-              </w:rPr>
-              <w:t xml:space="preserve">  ....................................................</w:t>
+                <w:sz w:val="15"/>
+                <w:szCs w:val="15"/>
+              </w:rPr>
+              <w:t xml:space="preserve">  ........................................</w:t>
             </w:r>
             <w:r>
               <w:rPr>
@@ -7374,9 +7374,9 @@
                 <w:iCs w:val="false"/>
                 <w:caps w:val="false"/>
                 <w:color w:val="7D6FB0"/>
-                <w:spacing w:val="14"/>
-                <w:sz w:val="18"/>
-                <w:szCs w:val="18"/>
+                <w:spacing w:val="12"/>
+                <w:sz w:val="15"/>
+                <w:szCs w:val="15"/>
               </w:rPr>
               <w:t xml:space="preserve">GRUPA / KLASA</w:t>
             </w:r>
@@ -7389,10 +7389,10 @@
                 <w:iCs w:val="false"/>
                 <w:caps w:val="false"/>
                 <w:color w:val="B6A6DF"/>
-                <w:sz w:val="18"/>
-                <w:szCs w:val="18"/>
-              </w:rPr>
-              <w:t xml:space="preserve">  ..............................</w:t>
+                <w:sz w:val="15"/>
+                <w:szCs w:val="15"/>
+              </w:rPr>
+              <w:t xml:space="preserve">  ......................</w:t>
             </w:r>
             <w:r>
               <w:rPr>
@@ -7442,9 +7442,9 @@
                 <w:iCs w:val="false"/>
                 <w:caps w:val="false"/>
                 <w:color w:val="7D6FB0"/>
-                <w:spacing w:val="14"/>
-                <w:sz w:val="18"/>
-                <w:szCs w:val="18"/>
+                <w:spacing w:val="12"/>
+                <w:sz w:val="15"/>
+                <w:szCs w:val="15"/>
               </w:rPr>
               <w:t xml:space="preserve">DATA</w:t>
             </w:r>
@@ -7457,10 +7457,10 @@
                 <w:iCs w:val="false"/>
                 <w:caps w:val="false"/>
                 <w:color w:val="B6A6DF"/>
-                <w:sz w:val="18"/>
-                <w:szCs w:val="18"/>
-              </w:rPr>
-              <w:t xml:space="preserve">  ..............................</w:t>
+                <w:sz w:val="15"/>
+                <w:szCs w:val="15"/>
+              </w:rPr>
+              <w:t xml:space="preserve">  ......................</w:t>
             </w:r>
             <w:r>
               <w:rPr>
@@ -9397,9 +9397,9 @@
                 <w:iCs w:val="false"/>
                 <w:caps/>
                 <w:color w:val="6B6378"/>
-                <w:spacing w:val="14"/>
-                <w:sz w:val="18"/>
-                <w:szCs w:val="18"/>
+                <w:spacing w:val="12"/>
+                <w:sz w:val="14"/>
+                <w:szCs w:val="14"/>
               </w:rPr>
               <w:t xml:space="preserve">Ocena Funkcjonalna · Obserwacja pogłębiona</w:t>
             </w:r>
@@ -9436,9 +9436,9 @@
                 <w:iCs w:val="false"/>
                 <w:caps w:val="false"/>
                 <w:color w:val="FFFFFF"/>
-                <w:spacing w:val="10"/>
-                <w:sz w:val="18"/>
-                <w:szCs w:val="18"/>
+                <w:spacing w:val="8"/>
+                <w:sz w:val="14"/>
+                <w:szCs w:val="14"/>
                 <w:shd w:fill="E74509" w:color="auto" w:val="clear"/>
               </w:rPr>
               <w:t xml:space="preserve">  OCENA FUNKCJONALNA · 2026  </w:t>
@@ -9458,9 +9458,9 @@
                 <w:iCs w:val="false"/>
                 <w:caps w:val="false"/>
                 <w:color w:val="6B6378"/>
-                <w:spacing w:val="14"/>
-                <w:sz w:val="18"/>
-                <w:szCs w:val="18"/>
+                <w:spacing w:val="10"/>
+                <w:sz w:val="13"/>
+                <w:szCs w:val="13"/>
               </w:rPr>
               <w:t xml:space="preserve">DOKUMENT DLA RODZICA I PORADNI</w:t>
             </w:r>
@@ -9529,9 +9529,9 @@
                 <w:iCs w:val="false"/>
                 <w:caps w:val="false"/>
                 <w:color w:val="7D6FB0"/>
-                <w:spacing w:val="14"/>
-                <w:sz w:val="18"/>
-                <w:szCs w:val="18"/>
+                <w:spacing w:val="12"/>
+                <w:sz w:val="15"/>
+                <w:szCs w:val="15"/>
               </w:rPr>
               <w:t xml:space="preserve">DOTYCZY DZIECKA</w:t>
             </w:r>
@@ -9544,10 +9544,10 @@
                 <w:iCs w:val="false"/>
                 <w:caps w:val="false"/>
                 <w:color w:val="B6A6DF"/>
-                <w:sz w:val="18"/>
-                <w:szCs w:val="18"/>
-              </w:rPr>
-              <w:t xml:space="preserve">  ....................................................</w:t>
+                <w:sz w:val="15"/>
+                <w:szCs w:val="15"/>
+              </w:rPr>
+              <w:t xml:space="preserve">  ........................................</w:t>
             </w:r>
             <w:r>
               <w:rPr>
@@ -9597,9 +9597,9 @@
                 <w:iCs w:val="false"/>
                 <w:caps w:val="false"/>
                 <w:color w:val="7D6FB0"/>
-                <w:spacing w:val="14"/>
-                <w:sz w:val="18"/>
-                <w:szCs w:val="18"/>
+                <w:spacing w:val="12"/>
+                <w:sz w:val="15"/>
+                <w:szCs w:val="15"/>
               </w:rPr>
               <w:t xml:space="preserve">GRUPA / KLASA</w:t>
             </w:r>
@@ -9612,10 +9612,10 @@
                 <w:iCs w:val="false"/>
                 <w:caps w:val="false"/>
                 <w:color w:val="B6A6DF"/>
-                <w:sz w:val="18"/>
-                <w:szCs w:val="18"/>
-              </w:rPr>
-              <w:t xml:space="preserve">  ..............................</w:t>
+                <w:sz w:val="15"/>
+                <w:szCs w:val="15"/>
+              </w:rPr>
+              <w:t xml:space="preserve">  ......................</w:t>
             </w:r>
             <w:r>
               <w:rPr>
@@ -9665,9 +9665,9 @@
                 <w:iCs w:val="false"/>
                 <w:caps w:val="false"/>
                 <w:color w:val="7D6FB0"/>
-                <w:spacing w:val="14"/>
-                <w:sz w:val="18"/>
-                <w:szCs w:val="18"/>
+                <w:spacing w:val="12"/>
+                <w:sz w:val="15"/>
+                <w:szCs w:val="15"/>
               </w:rPr>
               <w:t xml:space="preserve">DATA</w:t>
             </w:r>
@@ -9680,10 +9680,10 @@
                 <w:iCs w:val="false"/>
                 <w:caps w:val="false"/>
                 <w:color w:val="B6A6DF"/>
-                <w:sz w:val="18"/>
-                <w:szCs w:val="18"/>
-              </w:rPr>
-              <w:t xml:space="preserve">  ..............................</w:t>
+                <w:sz w:val="15"/>
+                <w:szCs w:val="15"/>
+              </w:rPr>
+              <w:t xml:space="preserve">  ......................</w:t>
             </w:r>
             <w:r>
               <w:rPr>
@@ -10725,9 +10725,9 @@
                 <w:iCs w:val="false"/>
                 <w:caps/>
                 <w:color w:val="6B6378"/>
-                <w:spacing w:val="14"/>
-                <w:sz w:val="18"/>
-                <w:szCs w:val="18"/>
+                <w:spacing w:val="12"/>
+                <w:sz w:val="14"/>
+                <w:szCs w:val="14"/>
               </w:rPr>
               <w:t xml:space="preserve">Ocena Funkcjonalna · Część II · Funkcjonowanie w placówce · przedszkole</w:t>
             </w:r>
@@ -10764,9 +10764,9 @@
                 <w:iCs w:val="false"/>
                 <w:caps w:val="false"/>
                 <w:color w:val="FFFFFF"/>
-                <w:spacing w:val="10"/>
-                <w:sz w:val="18"/>
-                <w:szCs w:val="18"/>
+                <w:spacing w:val="8"/>
+                <w:sz w:val="14"/>
+                <w:szCs w:val="14"/>
                 <w:shd w:fill="E74509" w:color="auto" w:val="clear"/>
               </w:rPr>
               <w:t xml:space="preserve">  OCENA FUNKCJONALNA · 2026  </w:t>
@@ -10786,9 +10786,9 @@
                 <w:iCs w:val="false"/>
                 <w:caps w:val="false"/>
                 <w:color w:val="6B6378"/>
-                <w:spacing w:val="14"/>
-                <w:sz w:val="18"/>
-                <w:szCs w:val="18"/>
+                <w:spacing w:val="10"/>
+                <w:sz w:val="13"/>
+                <w:szCs w:val="13"/>
               </w:rPr>
               <w:t xml:space="preserve">DOKUMENT DLA RODZICA I PORADNI</w:t>
             </w:r>
@@ -10857,9 +10857,9 @@
                 <w:iCs w:val="false"/>
                 <w:caps w:val="false"/>
                 <w:color w:val="7D6FB0"/>
-                <w:spacing w:val="14"/>
-                <w:sz w:val="18"/>
-                <w:szCs w:val="18"/>
+                <w:spacing w:val="12"/>
+                <w:sz w:val="15"/>
+                <w:szCs w:val="15"/>
               </w:rPr>
               <w:t xml:space="preserve">DOTYCZY DZIECKA</w:t>
             </w:r>
@@ -10872,10 +10872,10 @@
                 <w:iCs w:val="false"/>
                 <w:caps w:val="false"/>
                 <w:color w:val="B6A6DF"/>
-                <w:sz w:val="18"/>
-                <w:szCs w:val="18"/>
-              </w:rPr>
-              <w:t xml:space="preserve">  ....................................................</w:t>
+                <w:sz w:val="15"/>
+                <w:szCs w:val="15"/>
+              </w:rPr>
+              <w:t xml:space="preserve">  ........................................</w:t>
             </w:r>
             <w:r>
               <w:rPr>
@@ -10925,9 +10925,9 @@
                 <w:iCs w:val="false"/>
                 <w:caps w:val="false"/>
                 <w:color w:val="7D6FB0"/>
-                <w:spacing w:val="14"/>
-                <w:sz w:val="18"/>
-                <w:szCs w:val="18"/>
+                <w:spacing w:val="12"/>
+                <w:sz w:val="15"/>
+                <w:szCs w:val="15"/>
               </w:rPr>
               <w:t xml:space="preserve">GRUPA / KLASA</w:t>
             </w:r>
@@ -10940,10 +10940,10 @@
                 <w:iCs w:val="false"/>
                 <w:caps w:val="false"/>
                 <w:color w:val="B6A6DF"/>
-                <w:sz w:val="18"/>
-                <w:szCs w:val="18"/>
-              </w:rPr>
-              <w:t xml:space="preserve">  ..............................</w:t>
+                <w:sz w:val="15"/>
+                <w:szCs w:val="15"/>
+              </w:rPr>
+              <w:t xml:space="preserve">  ......................</w:t>
             </w:r>
             <w:r>
               <w:rPr>
@@ -10993,9 +10993,9 @@
                 <w:iCs w:val="false"/>
                 <w:caps w:val="false"/>
                 <w:color w:val="7D6FB0"/>
-                <w:spacing w:val="14"/>
-                <w:sz w:val="18"/>
-                <w:szCs w:val="18"/>
+                <w:spacing w:val="12"/>
+                <w:sz w:val="15"/>
+                <w:szCs w:val="15"/>
               </w:rPr>
               <w:t xml:space="preserve">DATA</w:t>
             </w:r>
@@ -11008,10 +11008,10 @@
                 <w:iCs w:val="false"/>
                 <w:caps w:val="false"/>
                 <w:color w:val="B6A6DF"/>
-                <w:sz w:val="18"/>
-                <w:szCs w:val="18"/>
-              </w:rPr>
-              <w:t xml:space="preserve">  ..............................</w:t>
+                <w:sz w:val="15"/>
+                <w:szCs w:val="15"/>
+              </w:rPr>
+              <w:t xml:space="preserve">  ......................</w:t>
             </w:r>
             <w:r>
               <w:rPr>
@@ -12125,9 +12125,9 @@
                 <w:iCs w:val="false"/>
                 <w:caps/>
                 <w:color w:val="6B6378"/>
-                <w:spacing w:val="14"/>
-                <w:sz w:val="18"/>
-                <w:szCs w:val="18"/>
+                <w:spacing w:val="12"/>
+                <w:sz w:val="14"/>
+                <w:szCs w:val="14"/>
               </w:rPr>
               <w:t xml:space="preserve">Ocena Funkcjonalna · Część II · Funkcjonowanie w placówce · szkoła</w:t>
             </w:r>
@@ -12164,9 +12164,9 @@
                 <w:iCs w:val="false"/>
                 <w:caps w:val="false"/>
                 <w:color w:val="FFFFFF"/>
-                <w:spacing w:val="10"/>
-                <w:sz w:val="18"/>
-                <w:szCs w:val="18"/>
+                <w:spacing w:val="8"/>
+                <w:sz w:val="14"/>
+                <w:szCs w:val="14"/>
                 <w:shd w:fill="E74509" w:color="auto" w:val="clear"/>
               </w:rPr>
               <w:t xml:space="preserve">  OCENA FUNKCJONALNA · 2026  </w:t>
@@ -12186,9 +12186,9 @@
                 <w:iCs w:val="false"/>
                 <w:caps w:val="false"/>
                 <w:color w:val="6B6378"/>
-                <w:spacing w:val="14"/>
-                <w:sz w:val="18"/>
-                <w:szCs w:val="18"/>
+                <w:spacing w:val="10"/>
+                <w:sz w:val="13"/>
+                <w:szCs w:val="13"/>
               </w:rPr>
               <w:t xml:space="preserve">DOKUMENT DLA RODZICA I PORADNI</w:t>
             </w:r>
@@ -12257,9 +12257,9 @@
                 <w:iCs w:val="false"/>
                 <w:caps w:val="false"/>
                 <w:color w:val="7D6FB0"/>
-                <w:spacing w:val="14"/>
-                <w:sz w:val="18"/>
-                <w:szCs w:val="18"/>
+                <w:spacing w:val="12"/>
+                <w:sz w:val="15"/>
+                <w:szCs w:val="15"/>
               </w:rPr>
               <w:t xml:space="preserve">DOTYCZY DZIECKA</w:t>
             </w:r>
@@ -12272,10 +12272,10 @@
                 <w:iCs w:val="false"/>
                 <w:caps w:val="false"/>
                 <w:color w:val="B6A6DF"/>
-                <w:sz w:val="18"/>
-                <w:szCs w:val="18"/>
-              </w:rPr>
-              <w:t xml:space="preserve">  ....................................................</w:t>
+                <w:sz w:val="15"/>
+                <w:szCs w:val="15"/>
+              </w:rPr>
+              <w:t xml:space="preserve">  ........................................</w:t>
             </w:r>
             <w:r>
               <w:rPr>
@@ -12325,9 +12325,9 @@
                 <w:iCs w:val="false"/>
                 <w:caps w:val="false"/>
                 <w:color w:val="7D6FB0"/>
-                <w:spacing w:val="14"/>
-                <w:sz w:val="18"/>
-                <w:szCs w:val="18"/>
+                <w:spacing w:val="12"/>
+                <w:sz w:val="15"/>
+                <w:szCs w:val="15"/>
               </w:rPr>
               <w:t xml:space="preserve">GRUPA / KLASA</w:t>
             </w:r>
@@ -12340,10 +12340,10 @@
                 <w:iCs w:val="false"/>
                 <w:caps w:val="false"/>
                 <w:color w:val="B6A6DF"/>
-                <w:sz w:val="18"/>
-                <w:szCs w:val="18"/>
-              </w:rPr>
-              <w:t xml:space="preserve">  ..............................</w:t>
+                <w:sz w:val="15"/>
+                <w:szCs w:val="15"/>
+              </w:rPr>
+              <w:t xml:space="preserve">  ......................</w:t>
             </w:r>
             <w:r>
               <w:rPr>
@@ -12393,9 +12393,9 @@
                 <w:iCs w:val="false"/>
                 <w:caps w:val="false"/>
                 <w:color w:val="7D6FB0"/>
-                <w:spacing w:val="14"/>
-                <w:sz w:val="18"/>
-                <w:szCs w:val="18"/>
+                <w:spacing w:val="12"/>
+                <w:sz w:val="15"/>
+                <w:szCs w:val="15"/>
               </w:rPr>
               <w:t xml:space="preserve">DATA</w:t>
             </w:r>
@@ -12408,10 +12408,10 @@
                 <w:iCs w:val="false"/>
                 <w:caps w:val="false"/>
                 <w:color w:val="B6A6DF"/>
-                <w:sz w:val="18"/>
-                <w:szCs w:val="18"/>
-              </w:rPr>
-              <w:t xml:space="preserve">  ..............................</w:t>
+                <w:sz w:val="15"/>
+                <w:szCs w:val="15"/>
+              </w:rPr>
+              <w:t xml:space="preserve">  ......................</w:t>
             </w:r>
             <w:r>
               <w:rPr>
@@ -13645,9 +13645,9 @@
                 <w:iCs w:val="false"/>
                 <w:caps/>
                 <w:color w:val="6B6378"/>
-                <w:spacing w:val="14"/>
-                <w:sz w:val="18"/>
-                <w:szCs w:val="18"/>
+                <w:spacing w:val="12"/>
+                <w:sz w:val="14"/>
+                <w:szCs w:val="14"/>
               </w:rPr>
               <w:t xml:space="preserve">Ocena Funkcjonalna · Część II · Wyniki liczbowe</w:t>
             </w:r>
@@ -13684,9 +13684,9 @@
                 <w:iCs w:val="false"/>
                 <w:caps w:val="false"/>
                 <w:color w:val="FFFFFF"/>
-                <w:spacing w:val="10"/>
-                <w:sz w:val="18"/>
-                <w:szCs w:val="18"/>
+                <w:spacing w:val="8"/>
+                <w:sz w:val="14"/>
+                <w:szCs w:val="14"/>
                 <w:shd w:fill="E74509" w:color="auto" w:val="clear"/>
               </w:rPr>
               <w:t xml:space="preserve">  OCENA FUNKCJONALNA · 2026  </w:t>
@@ -13706,9 +13706,9 @@
                 <w:iCs w:val="false"/>
                 <w:caps w:val="false"/>
                 <w:color w:val="6B6378"/>
-                <w:spacing w:val="14"/>
-                <w:sz w:val="18"/>
-                <w:szCs w:val="18"/>
+                <w:spacing w:val="10"/>
+                <w:sz w:val="13"/>
+                <w:szCs w:val="13"/>
               </w:rPr>
               <w:t xml:space="preserve">DOKUMENT DLA RODZICA I PORADNI</w:t>
             </w:r>
@@ -13777,9 +13777,9 @@
                 <w:iCs w:val="false"/>
                 <w:caps w:val="false"/>
                 <w:color w:val="7D6FB0"/>
-                <w:spacing w:val="14"/>
-                <w:sz w:val="18"/>
-                <w:szCs w:val="18"/>
+                <w:spacing w:val="12"/>
+                <w:sz w:val="15"/>
+                <w:szCs w:val="15"/>
               </w:rPr>
               <w:t xml:space="preserve">DOTYCZY DZIECKA</w:t>
             </w:r>
@@ -13792,10 +13792,10 @@
                 <w:iCs w:val="false"/>
                 <w:caps w:val="false"/>
                 <w:color w:val="B6A6DF"/>
-                <w:sz w:val="18"/>
-                <w:szCs w:val="18"/>
-              </w:rPr>
-              <w:t xml:space="preserve">  ....................................................</w:t>
+                <w:sz w:val="15"/>
+                <w:szCs w:val="15"/>
+              </w:rPr>
+              <w:t xml:space="preserve">  ........................................</w:t>
             </w:r>
             <w:r>
               <w:rPr>
@@ -13845,9 +13845,9 @@
                 <w:iCs w:val="false"/>
                 <w:caps w:val="false"/>
                 <w:color w:val="7D6FB0"/>
-                <w:spacing w:val="14"/>
-                <w:sz w:val="18"/>
-                <w:szCs w:val="18"/>
+                <w:spacing w:val="12"/>
+                <w:sz w:val="15"/>
+                <w:szCs w:val="15"/>
               </w:rPr>
               <w:t xml:space="preserve">GRUPA / KLASA</w:t>
             </w:r>
@@ -13860,10 +13860,10 @@
                 <w:iCs w:val="false"/>
                 <w:caps w:val="false"/>
                 <w:color w:val="B6A6DF"/>
-                <w:sz w:val="18"/>
-                <w:szCs w:val="18"/>
-              </w:rPr>
-              <w:t xml:space="preserve">  ..............................</w:t>
+                <w:sz w:val="15"/>
+                <w:szCs w:val="15"/>
+              </w:rPr>
+              <w:t xml:space="preserve">  ......................</w:t>
             </w:r>
             <w:r>
               <w:rPr>
@@ -13913,9 +13913,9 @@
                 <w:iCs w:val="false"/>
                 <w:caps w:val="false"/>
                 <w:color w:val="7D6FB0"/>
-                <w:spacing w:val="14"/>
-                <w:sz w:val="18"/>
-                <w:szCs w:val="18"/>
+                <w:spacing w:val="12"/>
+                <w:sz w:val="15"/>
+                <w:szCs w:val="15"/>
               </w:rPr>
               <w:t xml:space="preserve">DATA</w:t>
             </w:r>
@@ -13928,10 +13928,10 @@
                 <w:iCs w:val="false"/>
                 <w:caps w:val="false"/>
                 <w:color w:val="B6A6DF"/>
-                <w:sz w:val="18"/>
-                <w:szCs w:val="18"/>
-              </w:rPr>
-              <w:t xml:space="preserve">  ..............................</w:t>
+                <w:sz w:val="15"/>
+                <w:szCs w:val="15"/>
+              </w:rPr>
+              <w:t xml:space="preserve">  ......................</w:t>
             </w:r>
             <w:r>
               <w:rPr>
@@ -17165,9 +17165,9 @@
                 <w:iCs w:val="false"/>
                 <w:caps/>
                 <w:color w:val="6B6378"/>
-                <w:spacing w:val="14"/>
-                <w:sz w:val="18"/>
-                <w:szCs w:val="18"/>
+                <w:spacing w:val="12"/>
+                <w:sz w:val="14"/>
+                <w:szCs w:val="14"/>
               </w:rPr>
               <w:t xml:space="preserve">Ocena Funkcjonalna · Część II · Wyniki arkuszy specjalistycznych</w:t>
             </w:r>
@@ -17204,9 +17204,9 @@
                 <w:iCs w:val="false"/>
                 <w:caps w:val="false"/>
                 <w:color w:val="FFFFFF"/>
-                <w:spacing w:val="10"/>
-                <w:sz w:val="18"/>
-                <w:szCs w:val="18"/>
+                <w:spacing w:val="8"/>
+                <w:sz w:val="14"/>
+                <w:szCs w:val="14"/>
                 <w:shd w:fill="E74509" w:color="auto" w:val="clear"/>
               </w:rPr>
               <w:t xml:space="preserve">  OCENA FUNKCJONALNA · 2026  </w:t>
@@ -17226,9 +17226,9 @@
                 <w:iCs w:val="false"/>
                 <w:caps w:val="false"/>
                 <w:color w:val="6B6378"/>
-                <w:spacing w:val="14"/>
-                <w:sz w:val="18"/>
-                <w:szCs w:val="18"/>
+                <w:spacing w:val="10"/>
+                <w:sz w:val="13"/>
+                <w:szCs w:val="13"/>
               </w:rPr>
               <w:t xml:space="preserve">DOKUMENT DLA RODZICA I PORADNI</w:t>
             </w:r>
@@ -17297,9 +17297,9 @@
                 <w:iCs w:val="false"/>
                 <w:caps w:val="false"/>
                 <w:color w:val="7D6FB0"/>
-                <w:spacing w:val="14"/>
-                <w:sz w:val="18"/>
-                <w:szCs w:val="18"/>
+                <w:spacing w:val="12"/>
+                <w:sz w:val="15"/>
+                <w:szCs w:val="15"/>
               </w:rPr>
               <w:t xml:space="preserve">DOTYCZY DZIECKA</w:t>
             </w:r>
@@ -17312,10 +17312,10 @@
                 <w:iCs w:val="false"/>
                 <w:caps w:val="false"/>
                 <w:color w:val="B6A6DF"/>
-                <w:sz w:val="18"/>
-                <w:szCs w:val="18"/>
-              </w:rPr>
-              <w:t xml:space="preserve">  ....................................................</w:t>
+                <w:sz w:val="15"/>
+                <w:szCs w:val="15"/>
+              </w:rPr>
+              <w:t xml:space="preserve">  ........................................</w:t>
             </w:r>
             <w:r>
               <w:rPr>
@@ -17365,9 +17365,9 @@
                 <w:iCs w:val="false"/>
                 <w:caps w:val="false"/>
                 <w:color w:val="7D6FB0"/>
-                <w:spacing w:val="14"/>
-                <w:sz w:val="18"/>
-                <w:szCs w:val="18"/>
+                <w:spacing w:val="12"/>
+                <w:sz w:val="15"/>
+                <w:szCs w:val="15"/>
               </w:rPr>
               <w:t xml:space="preserve">GRUPA / KLASA</w:t>
             </w:r>
@@ -17380,10 +17380,10 @@
                 <w:iCs w:val="false"/>
                 <w:caps w:val="false"/>
                 <w:color w:val="B6A6DF"/>
-                <w:sz w:val="18"/>
-                <w:szCs w:val="18"/>
-              </w:rPr>
-              <w:t xml:space="preserve">  ..............................</w:t>
+                <w:sz w:val="15"/>
+                <w:szCs w:val="15"/>
+              </w:rPr>
+              <w:t xml:space="preserve">  ......................</w:t>
             </w:r>
             <w:r>
               <w:rPr>
@@ -17433,9 +17433,9 @@
                 <w:iCs w:val="false"/>
                 <w:caps w:val="false"/>
                 <w:color w:val="7D6FB0"/>
-                <w:spacing w:val="14"/>
-                <w:sz w:val="18"/>
-                <w:szCs w:val="18"/>
+                <w:spacing w:val="12"/>
+                <w:sz w:val="15"/>
+                <w:szCs w:val="15"/>
               </w:rPr>
               <w:t xml:space="preserve">DATA</w:t>
             </w:r>
@@ -17448,10 +17448,10 @@
                 <w:iCs w:val="false"/>
                 <w:caps w:val="false"/>
                 <w:color w:val="B6A6DF"/>
-                <w:sz w:val="18"/>
-                <w:szCs w:val="18"/>
-              </w:rPr>
-              <w:t xml:space="preserve">  ..............................</w:t>
+                <w:sz w:val="15"/>
+                <w:szCs w:val="15"/>
+              </w:rPr>
+              <w:t xml:space="preserve">  ......................</w:t>
             </w:r>
             <w:r>
               <w:rPr>
@@ -18511,9 +18511,9 @@
                 <w:iCs w:val="false"/>
                 <w:caps/>
                 <w:color w:val="6B6378"/>
-                <w:spacing w:val="14"/>
-                <w:sz w:val="18"/>
-                <w:szCs w:val="18"/>
+                <w:spacing w:val="12"/>
+                <w:sz w:val="14"/>
+                <w:szCs w:val="14"/>
               </w:rPr>
               <w:t xml:space="preserve">Ocena Funkcjonalna · Część II · Mój głos</w:t>
             </w:r>
@@ -18550,9 +18550,9 @@
                 <w:iCs w:val="false"/>
                 <w:caps w:val="false"/>
                 <w:color w:val="FFFFFF"/>
-                <w:spacing w:val="10"/>
-                <w:sz w:val="18"/>
-                <w:szCs w:val="18"/>
+                <w:spacing w:val="8"/>
+                <w:sz w:val="14"/>
+                <w:szCs w:val="14"/>
                 <w:shd w:fill="E74509" w:color="auto" w:val="clear"/>
               </w:rPr>
               <w:t xml:space="preserve">  OCENA FUNKCJONALNA · 2026  </w:t>
@@ -18572,9 +18572,9 @@
                 <w:iCs w:val="false"/>
                 <w:caps w:val="false"/>
                 <w:color w:val="6B6378"/>
-                <w:spacing w:val="14"/>
-                <w:sz w:val="18"/>
-                <w:szCs w:val="18"/>
+                <w:spacing w:val="10"/>
+                <w:sz w:val="13"/>
+                <w:szCs w:val="13"/>
               </w:rPr>
               <w:t xml:space="preserve">DOKUMENT DLA RODZICA I PORADNI</w:t>
             </w:r>
@@ -18643,9 +18643,9 @@
                 <w:iCs w:val="false"/>
                 <w:caps w:val="false"/>
                 <w:color w:val="7D6FB0"/>
-                <w:spacing w:val="14"/>
-                <w:sz w:val="18"/>
-                <w:szCs w:val="18"/>
+                <w:spacing w:val="12"/>
+                <w:sz w:val="15"/>
+                <w:szCs w:val="15"/>
               </w:rPr>
               <w:t xml:space="preserve">DOTYCZY DZIECKA</w:t>
             </w:r>
@@ -18658,10 +18658,10 @@
                 <w:iCs w:val="false"/>
                 <w:caps w:val="false"/>
                 <w:color w:val="B6A6DF"/>
-                <w:sz w:val="18"/>
-                <w:szCs w:val="18"/>
-              </w:rPr>
-              <w:t xml:space="preserve">  ....................................................</w:t>
+                <w:sz w:val="15"/>
+                <w:szCs w:val="15"/>
+              </w:rPr>
+              <w:t xml:space="preserve">  ........................................</w:t>
             </w:r>
             <w:r>
               <w:rPr>
@@ -18711,9 +18711,9 @@
                 <w:iCs w:val="false"/>
                 <w:caps w:val="false"/>
                 <w:color w:val="7D6FB0"/>
-                <w:spacing w:val="14"/>
-                <w:sz w:val="18"/>
-                <w:szCs w:val="18"/>
+                <w:spacing w:val="12"/>
+                <w:sz w:val="15"/>
+                <w:szCs w:val="15"/>
               </w:rPr>
               <w:t xml:space="preserve">GRUPA / KLASA</w:t>
             </w:r>
@@ -18726,10 +18726,10 @@
                 <w:iCs w:val="false"/>
                 <w:caps w:val="false"/>
                 <w:color w:val="B6A6DF"/>
-                <w:sz w:val="18"/>
-                <w:szCs w:val="18"/>
-              </w:rPr>
-              <w:t xml:space="preserve">  ..............................</w:t>
+                <w:sz w:val="15"/>
+                <w:szCs w:val="15"/>
+              </w:rPr>
+              <w:t xml:space="preserve">  ......................</w:t>
             </w:r>
             <w:r>
               <w:rPr>
@@ -18779,9 +18779,9 @@
                 <w:iCs w:val="false"/>
                 <w:caps w:val="false"/>
                 <w:color w:val="7D6FB0"/>
-                <w:spacing w:val="14"/>
-                <w:sz w:val="18"/>
-                <w:szCs w:val="18"/>
+                <w:spacing w:val="12"/>
+                <w:sz w:val="15"/>
+                <w:szCs w:val="15"/>
               </w:rPr>
               <w:t xml:space="preserve">DATA</w:t>
             </w:r>
@@ -18794,10 +18794,10 @@
                 <w:iCs w:val="false"/>
                 <w:caps w:val="false"/>
                 <w:color w:val="B6A6DF"/>
-                <w:sz w:val="18"/>
-                <w:szCs w:val="18"/>
-              </w:rPr>
-              <w:t xml:space="preserve">  ..............................</w:t>
+                <w:sz w:val="15"/>
+                <w:szCs w:val="15"/>
+              </w:rPr>
+              <w:t xml:space="preserve">  ......................</w:t>
             </w:r>
             <w:r>
               <w:rPr>
@@ -20669,9 +20669,9 @@
                 <w:iCs w:val="false"/>
                 <w:caps/>
                 <w:color w:val="6B6378"/>
-                <w:spacing w:val="14"/>
-                <w:sz w:val="18"/>
-                <w:szCs w:val="18"/>
+                <w:spacing w:val="12"/>
+                <w:sz w:val="14"/>
+                <w:szCs w:val="14"/>
               </w:rPr>
               <w:t xml:space="preserve">Ocena Funkcjonalna · Część II · Działania dotychczas podjęte</w:t>
             </w:r>
@@ -20708,9 +20708,9 @@
                 <w:iCs w:val="false"/>
                 <w:caps w:val="false"/>
                 <w:color w:val="FFFFFF"/>
-                <w:spacing w:val="10"/>
-                <w:sz w:val="18"/>
-                <w:szCs w:val="18"/>
+                <w:spacing w:val="8"/>
+                <w:sz w:val="14"/>
+                <w:szCs w:val="14"/>
                 <w:shd w:fill="E74509" w:color="auto" w:val="clear"/>
               </w:rPr>
               <w:t xml:space="preserve">  OCENA FUNKCJONALNA · 2026  </w:t>
@@ -20730,9 +20730,9 @@
                 <w:iCs w:val="false"/>
                 <w:caps w:val="false"/>
                 <w:color w:val="6B6378"/>
-                <w:spacing w:val="14"/>
-                <w:sz w:val="18"/>
-                <w:szCs w:val="18"/>
+                <w:spacing w:val="10"/>
+                <w:sz w:val="13"/>
+                <w:szCs w:val="13"/>
               </w:rPr>
               <w:t xml:space="preserve">DOKUMENT DLA RODZICA I PORADNI</w:t>
             </w:r>
@@ -20801,9 +20801,9 @@
                 <w:iCs w:val="false"/>
                 <w:caps w:val="false"/>
                 <w:color w:val="7D6FB0"/>
-                <w:spacing w:val="14"/>
-                <w:sz w:val="18"/>
-                <w:szCs w:val="18"/>
+                <w:spacing w:val="12"/>
+                <w:sz w:val="15"/>
+                <w:szCs w:val="15"/>
               </w:rPr>
               <w:t xml:space="preserve">DOTYCZY DZIECKA</w:t>
             </w:r>
@@ -20816,10 +20816,10 @@
                 <w:iCs w:val="false"/>
                 <w:caps w:val="false"/>
                 <w:color w:val="B6A6DF"/>
-                <w:sz w:val="18"/>
-                <w:szCs w:val="18"/>
-              </w:rPr>
-              <w:t xml:space="preserve">  ....................................................</w:t>
+                <w:sz w:val="15"/>
+                <w:szCs w:val="15"/>
+              </w:rPr>
+              <w:t xml:space="preserve">  ........................................</w:t>
             </w:r>
             <w:r>
               <w:rPr>
@@ -20869,9 +20869,9 @@
                 <w:iCs w:val="false"/>
                 <w:caps w:val="false"/>
                 <w:color w:val="7D6FB0"/>
-                <w:spacing w:val="14"/>
-                <w:sz w:val="18"/>
-                <w:szCs w:val="18"/>
+                <w:spacing w:val="12"/>
+                <w:sz w:val="15"/>
+                <w:szCs w:val="15"/>
               </w:rPr>
               <w:t xml:space="preserve">GRUPA / KLASA</w:t>
             </w:r>
@@ -20884,10 +20884,10 @@
                 <w:iCs w:val="false"/>
                 <w:caps w:val="false"/>
                 <w:color w:val="B6A6DF"/>
-                <w:sz w:val="18"/>
-                <w:szCs w:val="18"/>
-              </w:rPr>
-              <w:t xml:space="preserve">  ..............................</w:t>
+                <w:sz w:val="15"/>
+                <w:szCs w:val="15"/>
+              </w:rPr>
+              <w:t xml:space="preserve">  ......................</w:t>
             </w:r>
             <w:r>
               <w:rPr>
@@ -20937,9 +20937,9 @@
                 <w:iCs w:val="false"/>
                 <w:caps w:val="false"/>
                 <w:color w:val="7D6FB0"/>
-                <w:spacing w:val="14"/>
-                <w:sz w:val="18"/>
-                <w:szCs w:val="18"/>
+                <w:spacing w:val="12"/>
+                <w:sz w:val="15"/>
+                <w:szCs w:val="15"/>
               </w:rPr>
               <w:t xml:space="preserve">DATA</w:t>
             </w:r>
@@ -20952,10 +20952,10 @@
                 <w:iCs w:val="false"/>
                 <w:caps w:val="false"/>
                 <w:color w:val="B6A6DF"/>
-                <w:sz w:val="18"/>
-                <w:szCs w:val="18"/>
-              </w:rPr>
-              <w:t xml:space="preserve">  ..............................</w:t>
+                <w:sz w:val="15"/>
+                <w:szCs w:val="15"/>
+              </w:rPr>
+              <w:t xml:space="preserve">  ......................</w:t>
             </w:r>
             <w:r>
               <w:rPr>
@@ -21798,9 +21798,9 @@
                 <w:iCs w:val="false"/>
                 <w:caps/>
                 <w:color w:val="6B6378"/>
-                <w:spacing w:val="14"/>
-                <w:sz w:val="18"/>
-                <w:szCs w:val="18"/>
+                <w:spacing w:val="12"/>
+                <w:sz w:val="14"/>
+                <w:szCs w:val="14"/>
               </w:rPr>
               <w:t xml:space="preserve">Ocena Funkcjonalna · Część II · Analiza jakościowa</w:t>
             </w:r>
@@ -21837,9 +21837,9 @@
                 <w:iCs w:val="false"/>
                 <w:caps w:val="false"/>
                 <w:color w:val="FFFFFF"/>
-                <w:spacing w:val="10"/>
-                <w:sz w:val="18"/>
-                <w:szCs w:val="18"/>
+                <w:spacing w:val="8"/>
+                <w:sz w:val="14"/>
+                <w:szCs w:val="14"/>
                 <w:shd w:fill="E74509" w:color="auto" w:val="clear"/>
               </w:rPr>
               <w:t xml:space="preserve">  OCENA FUNKCJONALNA · 2026  </w:t>
@@ -21859,9 +21859,9 @@
                 <w:iCs w:val="false"/>
                 <w:caps w:val="false"/>
                 <w:color w:val="6B6378"/>
-                <w:spacing w:val="14"/>
-                <w:sz w:val="18"/>
-                <w:szCs w:val="18"/>
+                <w:spacing w:val="10"/>
+                <w:sz w:val="13"/>
+                <w:szCs w:val="13"/>
               </w:rPr>
               <w:t xml:space="preserve">DOKUMENT DLA RODZICA I PORADNI</w:t>
             </w:r>
@@ -21930,9 +21930,9 @@
                 <w:iCs w:val="false"/>
                 <w:caps w:val="false"/>
                 <w:color w:val="7D6FB0"/>
-                <w:spacing w:val="14"/>
-                <w:sz w:val="18"/>
-                <w:szCs w:val="18"/>
+                <w:spacing w:val="12"/>
+                <w:sz w:val="15"/>
+                <w:szCs w:val="15"/>
               </w:rPr>
               <w:t xml:space="preserve">DOTYCZY DZIECKA</w:t>
             </w:r>
@@ -21945,10 +21945,10 @@
                 <w:iCs w:val="false"/>
                 <w:caps w:val="false"/>
                 <w:color w:val="B6A6DF"/>
-                <w:sz w:val="18"/>
-                <w:szCs w:val="18"/>
-              </w:rPr>
-              <w:t xml:space="preserve">  ....................................................</w:t>
+                <w:sz w:val="15"/>
+                <w:szCs w:val="15"/>
+              </w:rPr>
+              <w:t xml:space="preserve">  ........................................</w:t>
             </w:r>
             <w:r>
               <w:rPr>
@@ -21998,9 +21998,9 @@
                 <w:iCs w:val="false"/>
                 <w:caps w:val="false"/>
                 <w:color w:val="7D6FB0"/>
-                <w:spacing w:val="14"/>
-                <w:sz w:val="18"/>
-                <w:szCs w:val="18"/>
+                <w:spacing w:val="12"/>
+                <w:sz w:val="15"/>
+                <w:szCs w:val="15"/>
               </w:rPr>
               <w:t xml:space="preserve">GRUPA / KLASA</w:t>
             </w:r>
@@ -22013,10 +22013,10 @@
                 <w:iCs w:val="false"/>
                 <w:caps w:val="false"/>
                 <w:color w:val="B6A6DF"/>
-                <w:sz w:val="18"/>
-                <w:szCs w:val="18"/>
-              </w:rPr>
-              <w:t xml:space="preserve">  ..............................</w:t>
+                <w:sz w:val="15"/>
+                <w:szCs w:val="15"/>
+              </w:rPr>
+              <w:t xml:space="preserve">  ......................</w:t>
             </w:r>
             <w:r>
               <w:rPr>
@@ -22066,9 +22066,9 @@
                 <w:iCs w:val="false"/>
                 <w:caps w:val="false"/>
                 <w:color w:val="7D6FB0"/>
-                <w:spacing w:val="14"/>
-                <w:sz w:val="18"/>
-                <w:szCs w:val="18"/>
+                <w:spacing w:val="12"/>
+                <w:sz w:val="15"/>
+                <w:szCs w:val="15"/>
               </w:rPr>
               <w:t xml:space="preserve">DATA</w:t>
             </w:r>
@@ -22081,10 +22081,10 @@
                 <w:iCs w:val="false"/>
                 <w:caps w:val="false"/>
                 <w:color w:val="B6A6DF"/>
-                <w:sz w:val="18"/>
-                <w:szCs w:val="18"/>
-              </w:rPr>
-              <w:t xml:space="preserve">  ..............................</w:t>
+                <w:sz w:val="15"/>
+                <w:szCs w:val="15"/>
+              </w:rPr>
+              <w:t xml:space="preserve">  ......................</w:t>
             </w:r>
             <w:r>
               <w:rPr>
@@ -24160,9 +24160,9 @@
                 <w:iCs w:val="false"/>
                 <w:caps/>
                 <w:color w:val="6B6378"/>
-                <w:spacing w:val="14"/>
-                <w:sz w:val="18"/>
-                <w:szCs w:val="18"/>
+                <w:spacing w:val="12"/>
+                <w:sz w:val="14"/>
+                <w:szCs w:val="14"/>
               </w:rPr>
               <w:t xml:space="preserve">Ocena Funkcjonalna · Część II · Decyzja Zespołu</w:t>
             </w:r>
@@ -24199,9 +24199,9 @@
                 <w:iCs w:val="false"/>
                 <w:caps w:val="false"/>
                 <w:color w:val="FFFFFF"/>
-                <w:spacing w:val="10"/>
-                <w:sz w:val="18"/>
-                <w:szCs w:val="18"/>
+                <w:spacing w:val="8"/>
+                <w:sz w:val="14"/>
+                <w:szCs w:val="14"/>
                 <w:shd w:fill="E74509" w:color="auto" w:val="clear"/>
               </w:rPr>
               <w:t xml:space="preserve">  OCENA FUNKCJONALNA · 2026  </w:t>
@@ -24221,9 +24221,9 @@
                 <w:iCs w:val="false"/>
                 <w:caps w:val="false"/>
                 <w:color w:val="6B6378"/>
-                <w:spacing w:val="14"/>
-                <w:sz w:val="18"/>
-                <w:szCs w:val="18"/>
+                <w:spacing w:val="10"/>
+                <w:sz w:val="13"/>
+                <w:szCs w:val="13"/>
               </w:rPr>
               <w:t xml:space="preserve">DOKUMENT DLA RODZICA I PORADNI</w:t>
             </w:r>
@@ -24292,9 +24292,9 @@
                 <w:iCs w:val="false"/>
                 <w:caps w:val="false"/>
                 <w:color w:val="7D6FB0"/>
-                <w:spacing w:val="14"/>
-                <w:sz w:val="18"/>
-                <w:szCs w:val="18"/>
+                <w:spacing w:val="12"/>
+                <w:sz w:val="15"/>
+                <w:szCs w:val="15"/>
               </w:rPr>
               <w:t xml:space="preserve">DOTYCZY DZIECKA</w:t>
             </w:r>
@@ -24307,10 +24307,10 @@
                 <w:iCs w:val="false"/>
                 <w:caps w:val="false"/>
                 <w:color w:val="B6A6DF"/>
-                <w:sz w:val="18"/>
-                <w:szCs w:val="18"/>
-              </w:rPr>
-              <w:t xml:space="preserve">  ....................................................</w:t>
+                <w:sz w:val="15"/>
+                <w:szCs w:val="15"/>
+              </w:rPr>
+              <w:t xml:space="preserve">  ........................................</w:t>
             </w:r>
             <w:r>
               <w:rPr>
@@ -24360,9 +24360,9 @@
                 <w:iCs w:val="false"/>
                 <w:caps w:val="false"/>
                 <w:color w:val="7D6FB0"/>
-                <w:spacing w:val="14"/>
-                <w:sz w:val="18"/>
-                <w:szCs w:val="18"/>
+                <w:spacing w:val="12"/>
+                <w:sz w:val="15"/>
+                <w:szCs w:val="15"/>
               </w:rPr>
               <w:t xml:space="preserve">GRUPA / KLASA</w:t>
             </w:r>
@@ -24375,10 +24375,10 @@
                 <w:iCs w:val="false"/>
                 <w:caps w:val="false"/>
                 <w:color w:val="B6A6DF"/>
-                <w:sz w:val="18"/>
-                <w:szCs w:val="18"/>
-              </w:rPr>
-              <w:t xml:space="preserve">  ..............................</w:t>
+                <w:sz w:val="15"/>
+                <w:szCs w:val="15"/>
+              </w:rPr>
+              <w:t xml:space="preserve">  ......................</w:t>
             </w:r>
             <w:r>
               <w:rPr>
@@ -24428,9 +24428,9 @@
                 <w:iCs w:val="false"/>
                 <w:caps w:val="false"/>
                 <w:color w:val="7D6FB0"/>
-                <w:spacing w:val="14"/>
-                <w:sz w:val="18"/>
-                <w:szCs w:val="18"/>
+                <w:spacing w:val="12"/>
+                <w:sz w:val="15"/>
+                <w:szCs w:val="15"/>
               </w:rPr>
               <w:t xml:space="preserve">DATA</w:t>
             </w:r>
@@ -24443,10 +24443,10 @@
                 <w:iCs w:val="false"/>
                 <w:caps w:val="false"/>
                 <w:color w:val="B6A6DF"/>
-                <w:sz w:val="18"/>
-                <w:szCs w:val="18"/>
-              </w:rPr>
-              <w:t xml:space="preserve">  ..............................</w:t>
+                <w:sz w:val="15"/>
+                <w:szCs w:val="15"/>
+              </w:rPr>
+              <w:t xml:space="preserve">  ......................</w:t>
             </w:r>
             <w:r>
               <w:rPr>
@@ -26024,9 +26024,9 @@
                 <w:iCs w:val="false"/>
                 <w:caps/>
                 <w:color w:val="6B6378"/>
-                <w:spacing w:val="14"/>
-                <w:sz w:val="18"/>
-                <w:szCs w:val="18"/>
+                <w:spacing w:val="12"/>
+                <w:sz w:val="14"/>
+                <w:szCs w:val="14"/>
               </w:rPr>
               <w:t xml:space="preserve">Ocena Funkcjonalna · Część III · Dostosowanie programu</w:t>
             </w:r>
@@ -26063,9 +26063,9 @@
                 <w:iCs w:val="false"/>
                 <w:caps w:val="false"/>
                 <w:color w:val="FFFFFF"/>
-                <w:spacing w:val="10"/>
-                <w:sz w:val="18"/>
-                <w:szCs w:val="18"/>
+                <w:spacing w:val="8"/>
+                <w:sz w:val="14"/>
+                <w:szCs w:val="14"/>
                 <w:shd w:fill="E74509" w:color="auto" w:val="clear"/>
               </w:rPr>
               <w:t xml:space="preserve">  OCENA FUNKCJONALNA · 2026  </w:t>
@@ -26085,9 +26085,9 @@
                 <w:iCs w:val="false"/>
                 <w:caps w:val="false"/>
                 <w:color w:val="6B6378"/>
-                <w:spacing w:val="14"/>
-                <w:sz w:val="18"/>
-                <w:szCs w:val="18"/>
+                <w:spacing w:val="10"/>
+                <w:sz w:val="13"/>
+                <w:szCs w:val="13"/>
               </w:rPr>
               <w:t xml:space="preserve">DOKUMENT DLA RODZICA I PORADNI</w:t>
             </w:r>
@@ -26156,9 +26156,9 @@
                 <w:iCs w:val="false"/>
                 <w:caps w:val="false"/>
                 <w:color w:val="7D6FB0"/>
-                <w:spacing w:val="14"/>
-                <w:sz w:val="18"/>
-                <w:szCs w:val="18"/>
+                <w:spacing w:val="12"/>
+                <w:sz w:val="15"/>
+                <w:szCs w:val="15"/>
               </w:rPr>
               <w:t xml:space="preserve">DOTYCZY DZIECKA</w:t>
             </w:r>
@@ -26171,10 +26171,10 @@
                 <w:iCs w:val="false"/>
                 <w:caps w:val="false"/>
                 <w:color w:val="B6A6DF"/>
-                <w:sz w:val="18"/>
-                <w:szCs w:val="18"/>
-              </w:rPr>
-              <w:t xml:space="preserve">  ....................................................</w:t>
+                <w:sz w:val="15"/>
+                <w:szCs w:val="15"/>
+              </w:rPr>
+              <w:t xml:space="preserve">  ........................................</w:t>
             </w:r>
             <w:r>
               <w:rPr>
@@ -26224,9 +26224,9 @@
                 <w:iCs w:val="false"/>
                 <w:caps w:val="false"/>
                 <w:color w:val="7D6FB0"/>
-                <w:spacing w:val="14"/>
-                <w:sz w:val="18"/>
-                <w:szCs w:val="18"/>
+                <w:spacing w:val="12"/>
+                <w:sz w:val="15"/>
+                <w:szCs w:val="15"/>
               </w:rPr>
               <w:t xml:space="preserve">GRUPA / KLASA</w:t>
             </w:r>
@@ -26239,10 +26239,10 @@
                 <w:iCs w:val="false"/>
                 <w:caps w:val="false"/>
                 <w:color w:val="B6A6DF"/>
-                <w:sz w:val="18"/>
-                <w:szCs w:val="18"/>
-              </w:rPr>
-              <w:t xml:space="preserve">  ..............................</w:t>
+                <w:sz w:val="15"/>
+                <w:szCs w:val="15"/>
+              </w:rPr>
+              <w:t xml:space="preserve">  ......................</w:t>
             </w:r>
             <w:r>
               <w:rPr>
@@ -26292,9 +26292,9 @@
                 <w:iCs w:val="false"/>
                 <w:caps w:val="false"/>
                 <w:color w:val="7D6FB0"/>
-                <w:spacing w:val="14"/>
-                <w:sz w:val="18"/>
-                <w:szCs w:val="18"/>
+                <w:spacing w:val="12"/>
+                <w:sz w:val="15"/>
+                <w:szCs w:val="15"/>
               </w:rPr>
               <w:t xml:space="preserve">DATA</w:t>
             </w:r>
@@ -26307,10 +26307,10 @@
                 <w:iCs w:val="false"/>
                 <w:caps w:val="false"/>
                 <w:color w:val="B6A6DF"/>
-                <w:sz w:val="18"/>
-                <w:szCs w:val="18"/>
-              </w:rPr>
-              <w:t xml:space="preserve">  ..............................</w:t>
+                <w:sz w:val="15"/>
+                <w:szCs w:val="15"/>
+              </w:rPr>
+              <w:t xml:space="preserve">  ......................</w:t>
             </w:r>
             <w:r>
               <w:rPr>
@@ -27316,9 +27316,9 @@
                 <w:iCs w:val="false"/>
                 <w:caps/>
                 <w:color w:val="6B6378"/>
-                <w:spacing w:val="14"/>
-                <w:sz w:val="18"/>
-                <w:szCs w:val="18"/>
+                <w:spacing w:val="12"/>
+                <w:sz w:val="14"/>
+                <w:szCs w:val="14"/>
               </w:rPr>
               <w:t xml:space="preserve">Ocena Funkcjonalna · Część III · Organizacja i technologie</w:t>
             </w:r>
@@ -27355,9 +27355,9 @@
                 <w:iCs w:val="false"/>
                 <w:caps w:val="false"/>
                 <w:color w:val="FFFFFF"/>
-                <w:spacing w:val="10"/>
-                <w:sz w:val="18"/>
-                <w:szCs w:val="18"/>
+                <w:spacing w:val="8"/>
+                <w:sz w:val="14"/>
+                <w:szCs w:val="14"/>
                 <w:shd w:fill="E74509" w:color="auto" w:val="clear"/>
               </w:rPr>
               <w:t xml:space="preserve">  OCENA FUNKCJONALNA · 2026  </w:t>
@@ -27377,9 +27377,9 @@
                 <w:iCs w:val="false"/>
                 <w:caps w:val="false"/>
                 <w:color w:val="6B6378"/>
-                <w:spacing w:val="14"/>
-                <w:sz w:val="18"/>
-                <w:szCs w:val="18"/>
+                <w:spacing w:val="10"/>
+                <w:sz w:val="13"/>
+                <w:szCs w:val="13"/>
               </w:rPr>
               <w:t xml:space="preserve">DOKUMENT DLA RODZICA I PORADNI</w:t>
             </w:r>
@@ -27448,9 +27448,9 @@
                 <w:iCs w:val="false"/>
                 <w:caps w:val="false"/>
                 <w:color w:val="7D6FB0"/>
-                <w:spacing w:val="14"/>
-                <w:sz w:val="18"/>
-                <w:szCs w:val="18"/>
+                <w:spacing w:val="12"/>
+                <w:sz w:val="15"/>
+                <w:szCs w:val="15"/>
               </w:rPr>
               <w:t xml:space="preserve">DOTYCZY DZIECKA</w:t>
             </w:r>
@@ -27463,10 +27463,10 @@
                 <w:iCs w:val="false"/>
                 <w:caps w:val="false"/>
                 <w:color w:val="B6A6DF"/>
-                <w:sz w:val="18"/>
-                <w:szCs w:val="18"/>
-              </w:rPr>
-              <w:t xml:space="preserve">  ....................................................</w:t>
+                <w:sz w:val="15"/>
+                <w:szCs w:val="15"/>
+              </w:rPr>
+              <w:t xml:space="preserve">  ........................................</w:t>
             </w:r>
             <w:r>
               <w:rPr>
@@ -27516,9 +27516,9 @@
                 <w:iCs w:val="false"/>
                 <w:caps w:val="false"/>
                 <w:color w:val="7D6FB0"/>
-                <w:spacing w:val="14"/>
-                <w:sz w:val="18"/>
-                <w:szCs w:val="18"/>
+                <w:spacing w:val="12"/>
+                <w:sz w:val="15"/>
+                <w:szCs w:val="15"/>
               </w:rPr>
               <w:t xml:space="preserve">GRUPA / KLASA</w:t>
             </w:r>
@@ -27531,10 +27531,10 @@
                 <w:iCs w:val="false"/>
                 <w:caps w:val="false"/>
                 <w:color w:val="B6A6DF"/>
-                <w:sz w:val="18"/>
-                <w:szCs w:val="18"/>
-              </w:rPr>
-              <w:t xml:space="preserve">  ..............................</w:t>
+                <w:sz w:val="15"/>
+                <w:szCs w:val="15"/>
+              </w:rPr>
+              <w:t xml:space="preserve">  ......................</w:t>
             </w:r>
             <w:r>
               <w:rPr>
@@ -27584,9 +27584,9 @@
                 <w:iCs w:val="false"/>
                 <w:caps w:val="false"/>
                 <w:color w:val="7D6FB0"/>
-                <w:spacing w:val="14"/>
-                <w:sz w:val="18"/>
-                <w:szCs w:val="18"/>
+                <w:spacing w:val="12"/>
+                <w:sz w:val="15"/>
+                <w:szCs w:val="15"/>
               </w:rPr>
               <w:t xml:space="preserve">DATA</w:t>
             </w:r>
@@ -27599,10 +27599,10 @@
                 <w:iCs w:val="false"/>
                 <w:caps w:val="false"/>
                 <w:color w:val="B6A6DF"/>
-                <w:sz w:val="18"/>
-                <w:szCs w:val="18"/>
-              </w:rPr>
-              <w:t xml:space="preserve">  ..............................</w:t>
+                <w:sz w:val="15"/>
+                <w:szCs w:val="15"/>
+              </w:rPr>
+              <w:t xml:space="preserve">  ......................</w:t>
             </w:r>
             <w:r>
               <w:rPr>
@@ -28870,9 +28870,9 @@
                 <w:iCs w:val="false"/>
                 <w:caps/>
                 <w:color w:val="6B6378"/>
-                <w:spacing w:val="14"/>
-                <w:sz w:val="18"/>
-                <w:szCs w:val="18"/>
+                <w:spacing w:val="12"/>
+                <w:sz w:val="14"/>
+                <w:szCs w:val="14"/>
               </w:rPr>
               <w:t xml:space="preserve">Ocena Funkcjonalna · Część III · Zintegrowane działania</w:t>
             </w:r>
@@ -28909,9 +28909,9 @@
                 <w:iCs w:val="false"/>
                 <w:caps w:val="false"/>
                 <w:color w:val="FFFFFF"/>
-                <w:spacing w:val="10"/>
-                <w:sz w:val="18"/>
-                <w:szCs w:val="18"/>
+                <w:spacing w:val="8"/>
+                <w:sz w:val="14"/>
+                <w:szCs w:val="14"/>
                 <w:shd w:fill="E74509" w:color="auto" w:val="clear"/>
               </w:rPr>
               <w:t xml:space="preserve">  OCENA FUNKCJONALNA · 2026  </w:t>
@@ -28931,9 +28931,9 @@
                 <w:iCs w:val="false"/>
                 <w:caps w:val="false"/>
                 <w:color w:val="6B6378"/>
-                <w:spacing w:val="14"/>
-                <w:sz w:val="18"/>
-                <w:szCs w:val="18"/>
+                <w:spacing w:val="10"/>
+                <w:sz w:val="13"/>
+                <w:szCs w:val="13"/>
               </w:rPr>
               <w:t xml:space="preserve">DOKUMENT DLA RODZICA I PORADNI</w:t>
             </w:r>
@@ -29002,9 +29002,9 @@
                 <w:iCs w:val="false"/>
                 <w:caps w:val="false"/>
                 <w:color w:val="7D6FB0"/>
-                <w:spacing w:val="14"/>
-                <w:sz w:val="18"/>
-                <w:szCs w:val="18"/>
+                <w:spacing w:val="12"/>
+                <w:sz w:val="15"/>
+                <w:szCs w:val="15"/>
               </w:rPr>
               <w:t xml:space="preserve">DOTYCZY DZIECKA</w:t>
             </w:r>
@@ -29017,10 +29017,10 @@
                 <w:iCs w:val="false"/>
                 <w:caps w:val="false"/>
                 <w:color w:val="B6A6DF"/>
-                <w:sz w:val="18"/>
-                <w:szCs w:val="18"/>
-              </w:rPr>
-              <w:t xml:space="preserve">  ....................................................</w:t>
+                <w:sz w:val="15"/>
+                <w:szCs w:val="15"/>
+              </w:rPr>
+              <w:t xml:space="preserve">  ........................................</w:t>
             </w:r>
             <w:r>
               <w:rPr>
@@ -29070,9 +29070,9 @@
                 <w:iCs w:val="false"/>
                 <w:caps w:val="false"/>
                 <w:color w:val="7D6FB0"/>
-                <w:spacing w:val="14"/>
-                <w:sz w:val="18"/>
-                <w:szCs w:val="18"/>
+                <w:spacing w:val="12"/>
+                <w:sz w:val="15"/>
+                <w:szCs w:val="15"/>
               </w:rPr>
               <w:t xml:space="preserve">GRUPA / KLASA</w:t>
             </w:r>
@@ -29085,10 +29085,10 @@
                 <w:iCs w:val="false"/>
                 <w:caps w:val="false"/>
                 <w:color w:val="B6A6DF"/>
-                <w:sz w:val="18"/>
-                <w:szCs w:val="18"/>
-              </w:rPr>
-              <w:t xml:space="preserve">  ..............................</w:t>
+                <w:sz w:val="15"/>
+                <w:szCs w:val="15"/>
+              </w:rPr>
+              <w:t xml:space="preserve">  ......................</w:t>
             </w:r>
             <w:r>
               <w:rPr>
@@ -29138,9 +29138,9 @@
                 <w:iCs w:val="false"/>
                 <w:caps w:val="false"/>
                 <w:color w:val="7D6FB0"/>
-                <w:spacing w:val="14"/>
-                <w:sz w:val="18"/>
-                <w:szCs w:val="18"/>
+                <w:spacing w:val="12"/>
+                <w:sz w:val="15"/>
+                <w:szCs w:val="15"/>
               </w:rPr>
               <w:t xml:space="preserve">DATA</w:t>
             </w:r>
@@ -29153,10 +29153,10 @@
                 <w:iCs w:val="false"/>
                 <w:caps w:val="false"/>
                 <w:color w:val="B6A6DF"/>
-                <w:sz w:val="18"/>
-                <w:szCs w:val="18"/>
-              </w:rPr>
-              <w:t xml:space="preserve">  ..............................</w:t>
+                <w:sz w:val="15"/>
+                <w:szCs w:val="15"/>
+              </w:rPr>
+              <w:t xml:space="preserve">  ......................</w:t>
             </w:r>
             <w:r>
               <w:rPr>
@@ -30297,9 +30297,9 @@
                 <w:iCs w:val="false"/>
                 <w:caps/>
                 <w:color w:val="6B6378"/>
-                <w:spacing w:val="14"/>
-                <w:sz w:val="18"/>
-                <w:szCs w:val="18"/>
+                <w:spacing w:val="12"/>
+                <w:sz w:val="14"/>
+                <w:szCs w:val="14"/>
               </w:rPr>
               <w:t xml:space="preserve">Ocena Funkcjonalna · Część III · Zajęcia: rewalidacja i PPP</w:t>
             </w:r>
@@ -30336,9 +30336,9 @@
                 <w:iCs w:val="false"/>
                 <w:caps w:val="false"/>
                 <w:color w:val="FFFFFF"/>
-                <w:spacing w:val="10"/>
-                <w:sz w:val="18"/>
-                <w:szCs w:val="18"/>
+                <w:spacing w:val="8"/>
+                <w:sz w:val="14"/>
+                <w:szCs w:val="14"/>
                 <w:shd w:fill="E74509" w:color="auto" w:val="clear"/>
               </w:rPr>
               <w:t xml:space="preserve">  OCENA FUNKCJONALNA · 2026  </w:t>
@@ -30358,9 +30358,9 @@
                 <w:iCs w:val="false"/>
                 <w:caps w:val="false"/>
                 <w:color w:val="6B6378"/>
-                <w:spacing w:val="14"/>
-                <w:sz w:val="18"/>
-                <w:szCs w:val="18"/>
+                <w:spacing w:val="10"/>
+                <w:sz w:val="13"/>
+                <w:szCs w:val="13"/>
               </w:rPr>
               <w:t xml:space="preserve">DOKUMENT DLA RODZICA I PORADNI</w:t>
             </w:r>
@@ -30429,9 +30429,9 @@
                 <w:iCs w:val="false"/>
                 <w:caps w:val="false"/>
                 <w:color w:val="7D6FB0"/>
-                <w:spacing w:val="14"/>
-                <w:sz w:val="18"/>
-                <w:szCs w:val="18"/>
+                <w:spacing w:val="12"/>
+                <w:sz w:val="15"/>
+                <w:szCs w:val="15"/>
               </w:rPr>
               <w:t xml:space="preserve">DOTYCZY DZIECKA</w:t>
             </w:r>
@@ -30444,10 +30444,10 @@
                 <w:iCs w:val="false"/>
                 <w:caps w:val="false"/>
                 <w:color w:val="B6A6DF"/>
-                <w:sz w:val="18"/>
-                <w:szCs w:val="18"/>
-              </w:rPr>
-              <w:t xml:space="preserve">  ....................................................</w:t>
+                <w:sz w:val="15"/>
+                <w:szCs w:val="15"/>
+              </w:rPr>
+              <w:t xml:space="preserve">  ........................................</w:t>
             </w:r>
             <w:r>
               <w:rPr>
@@ -30497,9 +30497,9 @@
                 <w:iCs w:val="false"/>
                 <w:caps w:val="false"/>
                 <w:color w:val="7D6FB0"/>
-                <w:spacing w:val="14"/>
-                <w:sz w:val="18"/>
-                <w:szCs w:val="18"/>
+                <w:spacing w:val="12"/>
+                <w:sz w:val="15"/>
+                <w:szCs w:val="15"/>
               </w:rPr>
               <w:t xml:space="preserve">GRUPA / KLASA</w:t>
             </w:r>
@@ -30512,10 +30512,10 @@
                 <w:iCs w:val="false"/>
                 <w:caps w:val="false"/>
                 <w:color w:val="B6A6DF"/>
-                <w:sz w:val="18"/>
-                <w:szCs w:val="18"/>
-              </w:rPr>
-              <w:t xml:space="preserve">  ..............................</w:t>
+                <w:sz w:val="15"/>
+                <w:szCs w:val="15"/>
+              </w:rPr>
+              <w:t xml:space="preserve">  ......................</w:t>
             </w:r>
             <w:r>
               <w:rPr>
@@ -30565,9 +30565,9 @@
                 <w:iCs w:val="false"/>
                 <w:caps w:val="false"/>
                 <w:color w:val="7D6FB0"/>
-                <w:spacing w:val="14"/>
-                <w:sz w:val="18"/>
-                <w:szCs w:val="18"/>
+                <w:spacing w:val="12"/>
+                <w:sz w:val="15"/>
+                <w:szCs w:val="15"/>
               </w:rPr>
               <w:t xml:space="preserve">DATA</w:t>
             </w:r>
@@ -30580,10 +30580,10 @@
                 <w:iCs w:val="false"/>
                 <w:caps w:val="false"/>
                 <w:color w:val="B6A6DF"/>
-                <w:sz w:val="18"/>
-                <w:szCs w:val="18"/>
-              </w:rPr>
-              <w:t xml:space="preserve">  ..............................</w:t>
+                <w:sz w:val="15"/>
+                <w:szCs w:val="15"/>
+              </w:rPr>
+              <w:t xml:space="preserve">  ......................</w:t>
             </w:r>
             <w:r>
               <w:rPr>
@@ -32024,9 +32024,9 @@
                 <w:iCs w:val="false"/>
                 <w:caps/>
                 <w:color w:val="6B6378"/>
-                <w:spacing w:val="14"/>
-                <w:sz w:val="18"/>
-                <w:szCs w:val="18"/>
+                <w:spacing w:val="12"/>
+                <w:sz w:val="14"/>
+                <w:szCs w:val="14"/>
               </w:rPr>
               <w:t xml:space="preserve">Ocena Funkcjonalna · Część III · Pomoc psychologiczno-pedagogiczna</w:t>
             </w:r>
@@ -32063,9 +32063,9 @@
                 <w:iCs w:val="false"/>
                 <w:caps w:val="false"/>
                 <w:color w:val="FFFFFF"/>
-                <w:spacing w:val="10"/>
-                <w:sz w:val="18"/>
-                <w:szCs w:val="18"/>
+                <w:spacing w:val="8"/>
+                <w:sz w:val="14"/>
+                <w:szCs w:val="14"/>
                 <w:shd w:fill="E74509" w:color="auto" w:val="clear"/>
               </w:rPr>
               <w:t xml:space="preserve">  OCENA FUNKCJONALNA · 2026  </w:t>
@@ -32085,9 +32085,9 @@
                 <w:iCs w:val="false"/>
                 <w:caps w:val="false"/>
                 <w:color w:val="6B6378"/>
-                <w:spacing w:val="14"/>
-                <w:sz w:val="18"/>
-                <w:szCs w:val="18"/>
+                <w:spacing w:val="10"/>
+                <w:sz w:val="13"/>
+                <w:szCs w:val="13"/>
               </w:rPr>
               <w:t xml:space="preserve">DOKUMENT DLA RODZICA I PORADNI</w:t>
             </w:r>
@@ -32156,9 +32156,9 @@
                 <w:iCs w:val="false"/>
                 <w:caps w:val="false"/>
                 <w:color w:val="7D6FB0"/>
-                <w:spacing w:val="14"/>
-                <w:sz w:val="18"/>
-                <w:szCs w:val="18"/>
+                <w:spacing w:val="12"/>
+                <w:sz w:val="15"/>
+                <w:szCs w:val="15"/>
               </w:rPr>
               <w:t xml:space="preserve">DOTYCZY DZIECKA</w:t>
             </w:r>
@@ -32171,10 +32171,10 @@
                 <w:iCs w:val="false"/>
                 <w:caps w:val="false"/>
                 <w:color w:val="B6A6DF"/>
-                <w:sz w:val="18"/>
-                <w:szCs w:val="18"/>
-              </w:rPr>
-              <w:t xml:space="preserve">  ....................................................</w:t>
+                <w:sz w:val="15"/>
+                <w:szCs w:val="15"/>
+              </w:rPr>
+              <w:t xml:space="preserve">  ........................................</w:t>
             </w:r>
             <w:r>
               <w:rPr>
@@ -32224,9 +32224,9 @@
                 <w:iCs w:val="false"/>
                 <w:caps w:val="false"/>
                 <w:color w:val="7D6FB0"/>
-                <w:spacing w:val="14"/>
-                <w:sz w:val="18"/>
-                <w:szCs w:val="18"/>
+                <w:spacing w:val="12"/>
+                <w:sz w:val="15"/>
+                <w:szCs w:val="15"/>
               </w:rPr>
               <w:t xml:space="preserve">GRUPA / KLASA</w:t>
             </w:r>
@@ -32239,10 +32239,10 @@
                 <w:iCs w:val="false"/>
                 <w:caps w:val="false"/>
                 <w:color w:val="B6A6DF"/>
-                <w:sz w:val="18"/>
-                <w:szCs w:val="18"/>
-              </w:rPr>
-              <w:t xml:space="preserve">  ..............................</w:t>
+                <w:sz w:val="15"/>
+                <w:szCs w:val="15"/>
+              </w:rPr>
+              <w:t xml:space="preserve">  ......................</w:t>
             </w:r>
             <w:r>
               <w:rPr>
@@ -32292,9 +32292,9 @@
                 <w:iCs w:val="false"/>
                 <w:caps w:val="false"/>
                 <w:color w:val="7D6FB0"/>
-                <w:spacing w:val="14"/>
-                <w:sz w:val="18"/>
-                <w:szCs w:val="18"/>
+                <w:spacing w:val="12"/>
+                <w:sz w:val="15"/>
+                <w:szCs w:val="15"/>
               </w:rPr>
               <w:t xml:space="preserve">DATA</w:t>
             </w:r>
@@ -32307,10 +32307,10 @@
                 <w:iCs w:val="false"/>
                 <w:caps w:val="false"/>
                 <w:color w:val="B6A6DF"/>
-                <w:sz w:val="18"/>
-                <w:szCs w:val="18"/>
-              </w:rPr>
-              <w:t xml:space="preserve">  ..............................</w:t>
+                <w:sz w:val="15"/>
+                <w:szCs w:val="15"/>
+              </w:rPr>
+              <w:t xml:space="preserve">  ......................</w:t>
             </w:r>
             <w:r>
               <w:rPr>
@@ -34050,9 +34050,9 @@
                 <w:iCs w:val="false"/>
                 <w:caps/>
                 <w:color w:val="6B6378"/>
-                <w:spacing w:val="14"/>
-                <w:sz w:val="18"/>
-                <w:szCs w:val="18"/>
+                <w:spacing w:val="12"/>
+                <w:sz w:val="14"/>
+                <w:szCs w:val="14"/>
               </w:rPr>
               <w:t xml:space="preserve">Ocena Funkcjonalna · Część III · Realizacja zaleceń poradni</w:t>
             </w:r>
@@ -34089,9 +34089,9 @@
                 <w:iCs w:val="false"/>
                 <w:caps w:val="false"/>
                 <w:color w:val="FFFFFF"/>
-                <w:spacing w:val="10"/>
-                <w:sz w:val="18"/>
-                <w:szCs w:val="18"/>
+                <w:spacing w:val="8"/>
+                <w:sz w:val="14"/>
+                <w:szCs w:val="14"/>
                 <w:shd w:fill="E74509" w:color="auto" w:val="clear"/>
               </w:rPr>
               <w:t xml:space="preserve">  OCENA FUNKCJONALNA · 2026  </w:t>
@@ -34111,9 +34111,9 @@
                 <w:iCs w:val="false"/>
                 <w:caps w:val="false"/>
                 <w:color w:val="6B6378"/>
-                <w:spacing w:val="14"/>
-                <w:sz w:val="18"/>
-                <w:szCs w:val="18"/>
+                <w:spacing w:val="10"/>
+                <w:sz w:val="13"/>
+                <w:szCs w:val="13"/>
               </w:rPr>
               <w:t xml:space="preserve">DOKUMENT DLA RODZICA I PORADNI</w:t>
             </w:r>
@@ -34182,9 +34182,9 @@
                 <w:iCs w:val="false"/>
                 <w:caps w:val="false"/>
                 <w:color w:val="7D6FB0"/>
-                <w:spacing w:val="14"/>
-                <w:sz w:val="18"/>
-                <w:szCs w:val="18"/>
+                <w:spacing w:val="12"/>
+                <w:sz w:val="15"/>
+                <w:szCs w:val="15"/>
               </w:rPr>
               <w:t xml:space="preserve">DOTYCZY DZIECKA</w:t>
             </w:r>
@@ -34197,10 +34197,10 @@
                 <w:iCs w:val="false"/>
                 <w:caps w:val="false"/>
                 <w:color w:val="B6A6DF"/>
-                <w:sz w:val="18"/>
-                <w:szCs w:val="18"/>
-              </w:rPr>
-              <w:t xml:space="preserve">  ....................................................</w:t>
+                <w:sz w:val="15"/>
+                <w:szCs w:val="15"/>
+              </w:rPr>
+              <w:t xml:space="preserve">  ........................................</w:t>
             </w:r>
             <w:r>
               <w:rPr>
@@ -34250,9 +34250,9 @@
                 <w:iCs w:val="false"/>
                 <w:caps w:val="false"/>
                 <w:color w:val="7D6FB0"/>
-                <w:spacing w:val="14"/>
-                <w:sz w:val="18"/>
-                <w:szCs w:val="18"/>
+                <w:spacing w:val="12"/>
+                <w:sz w:val="15"/>
+                <w:szCs w:val="15"/>
               </w:rPr>
               <w:t xml:space="preserve">GRUPA / KLASA</w:t>
             </w:r>
@@ -34265,10 +34265,10 @@
                 <w:iCs w:val="false"/>
                 <w:caps w:val="false"/>
                 <w:color w:val="B6A6DF"/>
-                <w:sz w:val="18"/>
-                <w:szCs w:val="18"/>
-              </w:rPr>
-              <w:t xml:space="preserve">  ..............................</w:t>
+                <w:sz w:val="15"/>
+                <w:szCs w:val="15"/>
+              </w:rPr>
+              <w:t xml:space="preserve">  ......................</w:t>
             </w:r>
             <w:r>
               <w:rPr>
@@ -34318,9 +34318,9 @@
                 <w:iCs w:val="false"/>
                 <w:caps w:val="false"/>
                 <w:color w:val="7D6FB0"/>
-                <w:spacing w:val="14"/>
-                <w:sz w:val="18"/>
-                <w:szCs w:val="18"/>
+                <w:spacing w:val="12"/>
+                <w:sz w:val="15"/>
+                <w:szCs w:val="15"/>
               </w:rPr>
               <w:t xml:space="preserve">DATA</w:t>
             </w:r>
@@ -34333,10 +34333,10 @@
                 <w:iCs w:val="false"/>
                 <w:caps w:val="false"/>
                 <w:color w:val="B6A6DF"/>
-                <w:sz w:val="18"/>
-                <w:szCs w:val="18"/>
-              </w:rPr>
-              <w:t xml:space="preserve">  ..............................</w:t>
+                <w:sz w:val="15"/>
+                <w:szCs w:val="15"/>
+              </w:rPr>
+              <w:t xml:space="preserve">  ......................</w:t>
             </w:r>
             <w:r>
               <w:rPr>
@@ -37100,9 +37100,9 @@
                 <w:iCs w:val="false"/>
                 <w:caps/>
                 <w:color w:val="6B6378"/>
-                <w:spacing w:val="14"/>
-                <w:sz w:val="18"/>
-                <w:szCs w:val="18"/>
+                <w:spacing w:val="12"/>
+                <w:sz w:val="14"/>
+                <w:szCs w:val="14"/>
               </w:rPr>
               <w:t xml:space="preserve">Ocena Funkcjonalna · Część III · Dodatkowa osoba</w:t>
             </w:r>
@@ -37139,9 +37139,9 @@
                 <w:iCs w:val="false"/>
                 <w:caps w:val="false"/>
                 <w:color w:val="FFFFFF"/>
-                <w:spacing w:val="10"/>
-                <w:sz w:val="18"/>
-                <w:szCs w:val="18"/>
+                <w:spacing w:val="8"/>
+                <w:sz w:val="14"/>
+                <w:szCs w:val="14"/>
                 <w:shd w:fill="E74509" w:color="auto" w:val="clear"/>
               </w:rPr>
               <w:t xml:space="preserve">  OCENA FUNKCJONALNA · 2026  </w:t>
@@ -37161,9 +37161,9 @@
                 <w:iCs w:val="false"/>
                 <w:caps w:val="false"/>
                 <w:color w:val="6B6378"/>
-                <w:spacing w:val="14"/>
-                <w:sz w:val="18"/>
-                <w:szCs w:val="18"/>
+                <w:spacing w:val="10"/>
+                <w:sz w:val="13"/>
+                <w:szCs w:val="13"/>
               </w:rPr>
               <w:t xml:space="preserve">DOKUMENT DLA RODZICA I PORADNI</w:t>
             </w:r>
@@ -37232,9 +37232,9 @@
                 <w:iCs w:val="false"/>
                 <w:caps w:val="false"/>
                 <w:color w:val="7D6FB0"/>
-                <w:spacing w:val="14"/>
-                <w:sz w:val="18"/>
-                <w:szCs w:val="18"/>
+                <w:spacing w:val="12"/>
+                <w:sz w:val="15"/>
+                <w:szCs w:val="15"/>
               </w:rPr>
               <w:t xml:space="preserve">DOTYCZY DZIECKA</w:t>
             </w:r>
@@ -37247,10 +37247,10 @@
                 <w:iCs w:val="false"/>
                 <w:caps w:val="false"/>
                 <w:color w:val="B6A6DF"/>
-                <w:sz w:val="18"/>
-                <w:szCs w:val="18"/>
-              </w:rPr>
-              <w:t xml:space="preserve">  ....................................................</w:t>
+                <w:sz w:val="15"/>
+                <w:szCs w:val="15"/>
+              </w:rPr>
+              <w:t xml:space="preserve">  ........................................</w:t>
             </w:r>
             <w:r>
               <w:rPr>
@@ -37300,9 +37300,9 @@
                 <w:iCs w:val="false"/>
                 <w:caps w:val="false"/>
                 <w:color w:val="7D6FB0"/>
-                <w:spacing w:val="14"/>
-                <w:sz w:val="18"/>
-                <w:szCs w:val="18"/>
+                <w:spacing w:val="12"/>
+                <w:sz w:val="15"/>
+                <w:szCs w:val="15"/>
               </w:rPr>
               <w:t xml:space="preserve">GRUPA / KLASA</w:t>
             </w:r>
@@ -37315,10 +37315,10 @@
                 <w:iCs w:val="false"/>
                 <w:caps w:val="false"/>
                 <w:color w:val="B6A6DF"/>
-                <w:sz w:val="18"/>
-                <w:szCs w:val="18"/>
-              </w:rPr>
-              <w:t xml:space="preserve">  ..............................</w:t>
+                <w:sz w:val="15"/>
+                <w:szCs w:val="15"/>
+              </w:rPr>
+              <w:t xml:space="preserve">  ......................</w:t>
             </w:r>
             <w:r>
               <w:rPr>
@@ -37368,9 +37368,9 @@
                 <w:iCs w:val="false"/>
                 <w:caps w:val="false"/>
                 <w:color w:val="7D6FB0"/>
-                <w:spacing w:val="14"/>
-                <w:sz w:val="18"/>
-                <w:szCs w:val="18"/>
+                <w:spacing w:val="12"/>
+                <w:sz w:val="15"/>
+                <w:szCs w:val="15"/>
               </w:rPr>
               <w:t xml:space="preserve">DATA</w:t>
             </w:r>
@@ -37383,10 +37383,10 @@
                 <w:iCs w:val="false"/>
                 <w:caps w:val="false"/>
                 <w:color w:val="B6A6DF"/>
-                <w:sz w:val="18"/>
-                <w:szCs w:val="18"/>
-              </w:rPr>
-              <w:t xml:space="preserve">  ..............................</w:t>
+                <w:sz w:val="15"/>
+                <w:szCs w:val="15"/>
+              </w:rPr>
+              <w:t xml:space="preserve">  ......................</w:t>
             </w:r>
             <w:r>
               <w:rPr>
@@ -38317,9 +38317,9 @@
                 <w:iCs w:val="false"/>
                 <w:caps/>
                 <w:color w:val="6B6378"/>
-                <w:spacing w:val="14"/>
-                <w:sz w:val="18"/>
-                <w:szCs w:val="18"/>
+                <w:spacing w:val="12"/>
+                <w:sz w:val="14"/>
+                <w:szCs w:val="14"/>
               </w:rPr>
               <w:t xml:space="preserve">Ocena Funkcjonalna · Część III · Współpraca z rodzicami i poradnią</w:t>
             </w:r>
@@ -38356,9 +38356,9 @@
                 <w:iCs w:val="false"/>
                 <w:caps w:val="false"/>
                 <w:color w:val="FFFFFF"/>
-                <w:spacing w:val="10"/>
-                <w:sz w:val="18"/>
-                <w:szCs w:val="18"/>
+                <w:spacing w:val="8"/>
+                <w:sz w:val="14"/>
+                <w:szCs w:val="14"/>
                 <w:shd w:fill="E74509" w:color="auto" w:val="clear"/>
               </w:rPr>
               <w:t xml:space="preserve">  OCENA FUNKCJONALNA · 2026  </w:t>
@@ -38378,9 +38378,9 @@
                 <w:iCs w:val="false"/>
                 <w:caps w:val="false"/>
                 <w:color w:val="6B6378"/>
-                <w:spacing w:val="14"/>
-                <w:sz w:val="18"/>
-                <w:szCs w:val="18"/>
+                <w:spacing w:val="10"/>
+                <w:sz w:val="13"/>
+                <w:szCs w:val="13"/>
               </w:rPr>
               <w:t xml:space="preserve">DOKUMENT DLA RODZICA I PORADNI</w:t>
             </w:r>
@@ -38449,9 +38449,9 @@
                 <w:iCs w:val="false"/>
                 <w:caps w:val="false"/>
                 <w:color w:val="7D6FB0"/>
-                <w:spacing w:val="14"/>
-                <w:sz w:val="18"/>
-                <w:szCs w:val="18"/>
+                <w:spacing w:val="12"/>
+                <w:sz w:val="15"/>
+                <w:szCs w:val="15"/>
               </w:rPr>
               <w:t xml:space="preserve">DOTYCZY DZIECKA</w:t>
             </w:r>
@@ -38464,10 +38464,10 @@
                 <w:iCs w:val="false"/>
                 <w:caps w:val="false"/>
                 <w:color w:val="B6A6DF"/>
-                <w:sz w:val="18"/>
-                <w:szCs w:val="18"/>
-              </w:rPr>
-              <w:t xml:space="preserve">  ....................................................</w:t>
+                <w:sz w:val="15"/>
+                <w:szCs w:val="15"/>
+              </w:rPr>
+              <w:t xml:space="preserve">  ........................................</w:t>
             </w:r>
             <w:r>
               <w:rPr>
@@ -38517,9 +38517,9 @@
                 <w:iCs w:val="false"/>
                 <w:caps w:val="false"/>
                 <w:color w:val="7D6FB0"/>
-                <w:spacing w:val="14"/>
-                <w:sz w:val="18"/>
-                <w:szCs w:val="18"/>
+                <w:spacing w:val="12"/>
+                <w:sz w:val="15"/>
+                <w:szCs w:val="15"/>
               </w:rPr>
               <w:t xml:space="preserve">GRUPA / KLASA</w:t>
             </w:r>
@@ -38532,10 +38532,10 @@
                 <w:iCs w:val="false"/>
                 <w:caps w:val="false"/>
                 <w:color w:val="B6A6DF"/>
-                <w:sz w:val="18"/>
-                <w:szCs w:val="18"/>
-              </w:rPr>
-              <w:t xml:space="preserve">  ..............................</w:t>
+                <w:sz w:val="15"/>
+                <w:szCs w:val="15"/>
+              </w:rPr>
+              <w:t xml:space="preserve">  ......................</w:t>
             </w:r>
             <w:r>
               <w:rPr>
@@ -38585,9 +38585,9 @@
                 <w:iCs w:val="false"/>
                 <w:caps w:val="false"/>
                 <w:color w:val="7D6FB0"/>
-                <w:spacing w:val="14"/>
-                <w:sz w:val="18"/>
-                <w:szCs w:val="18"/>
+                <w:spacing w:val="12"/>
+                <w:sz w:val="15"/>
+                <w:szCs w:val="15"/>
               </w:rPr>
               <w:t xml:space="preserve">DATA</w:t>
             </w:r>
@@ -38600,10 +38600,10 @@
                 <w:iCs w:val="false"/>
                 <w:caps w:val="false"/>
                 <w:color w:val="B6A6DF"/>
-                <w:sz w:val="18"/>
-                <w:szCs w:val="18"/>
-              </w:rPr>
-              <w:t xml:space="preserve">  ..............................</w:t>
+                <w:sz w:val="15"/>
+                <w:szCs w:val="15"/>
+              </w:rPr>
+              <w:t xml:space="preserve">  ......................</w:t>
             </w:r>
             <w:r>
               <w:rPr>
@@ -41162,9 +41162,9 @@
                 <w:iCs w:val="false"/>
                 <w:caps/>
                 <w:color w:val="6B6378"/>
-                <w:spacing w:val="14"/>
-                <w:sz w:val="18"/>
-                <w:szCs w:val="18"/>
+                <w:spacing w:val="12"/>
+                <w:sz w:val="14"/>
+                <w:szCs w:val="14"/>
               </w:rPr>
               <w:t xml:space="preserve">Ocena Funkcjonalna · Część III · Ocena efektywności · podpisy</w:t>
             </w:r>
@@ -41201,9 +41201,9 @@
                 <w:iCs w:val="false"/>
                 <w:caps w:val="false"/>
                 <w:color w:val="FFFFFF"/>
-                <w:spacing w:val="10"/>
-                <w:sz w:val="18"/>
-                <w:szCs w:val="18"/>
+                <w:spacing w:val="8"/>
+                <w:sz w:val="14"/>
+                <w:szCs w:val="14"/>
                 <w:shd w:fill="E74509" w:color="auto" w:val="clear"/>
               </w:rPr>
               <w:t xml:space="preserve">  OCENA FUNKCJONALNA · 2026  </w:t>
@@ -41223,9 +41223,9 @@
                 <w:iCs w:val="false"/>
                 <w:caps w:val="false"/>
                 <w:color w:val="6B6378"/>
-                <w:spacing w:val="14"/>
-                <w:sz w:val="18"/>
-                <w:szCs w:val="18"/>
+                <w:spacing w:val="10"/>
+                <w:sz w:val="13"/>
+                <w:szCs w:val="13"/>
               </w:rPr>
               <w:t xml:space="preserve">DOKUMENT DLA RODZICA I PORADNI</w:t>
             </w:r>
@@ -41294,9 +41294,9 @@
                 <w:iCs w:val="false"/>
                 <w:caps w:val="false"/>
                 <w:color w:val="7D6FB0"/>
-                <w:spacing w:val="14"/>
-                <w:sz w:val="18"/>
-                <w:szCs w:val="18"/>
+                <w:spacing w:val="12"/>
+                <w:sz w:val="15"/>
+                <w:szCs w:val="15"/>
               </w:rPr>
               <w:t xml:space="preserve">DOTYCZY DZIECKA</w:t>
             </w:r>
@@ -41309,10 +41309,10 @@
                 <w:iCs w:val="false"/>
                 <w:caps w:val="false"/>
                 <w:color w:val="B6A6DF"/>
-                <w:sz w:val="18"/>
-                <w:szCs w:val="18"/>
-              </w:rPr>
-              <w:t xml:space="preserve">  ....................................................</w:t>
+                <w:sz w:val="15"/>
+                <w:szCs w:val="15"/>
+              </w:rPr>
+              <w:t xml:space="preserve">  ........................................</w:t>
             </w:r>
             <w:r>
               <w:rPr>
@@ -41362,9 +41362,9 @@
                 <w:iCs w:val="false"/>
                 <w:caps w:val="false"/>
                 <w:color w:val="7D6FB0"/>
-                <w:spacing w:val="14"/>
-                <w:sz w:val="18"/>
-                <w:szCs w:val="18"/>
+                <w:spacing w:val="12"/>
+                <w:sz w:val="15"/>
+                <w:szCs w:val="15"/>
               </w:rPr>
               <w:t xml:space="preserve">GRUPA / KLASA</w:t>
             </w:r>
@@ -41377,10 +41377,10 @@
                 <w:iCs w:val="false"/>
                 <w:caps w:val="false"/>
                 <w:color w:val="B6A6DF"/>
-                <w:sz w:val="18"/>
-                <w:szCs w:val="18"/>
-              </w:rPr>
-              <w:t xml:space="preserve">  ..............................</w:t>
+                <w:sz w:val="15"/>
+                <w:szCs w:val="15"/>
+              </w:rPr>
+              <w:t xml:space="preserve">  ......................</w:t>
             </w:r>
             <w:r>
               <w:rPr>
@@ -41430,9 +41430,9 @@
                 <w:iCs w:val="false"/>
                 <w:caps w:val="false"/>
                 <w:color w:val="7D6FB0"/>
-                <w:spacing w:val="14"/>
-                <w:sz w:val="18"/>
-                <w:szCs w:val="18"/>
+                <w:spacing w:val="12"/>
+                <w:sz w:val="15"/>
+                <w:szCs w:val="15"/>
               </w:rPr>
               <w:t xml:space="preserve">DATA</w:t>
             </w:r>
@@ -41445,10 +41445,10 @@
                 <w:iCs w:val="false"/>
                 <w:caps w:val="false"/>
                 <w:color w:val="B6A6DF"/>
-                <w:sz w:val="18"/>
-                <w:szCs w:val="18"/>
-              </w:rPr>
-              <w:t xml:space="preserve">  ..............................</w:t>
+                <w:sz w:val="15"/>
+                <w:szCs w:val="15"/>
+              </w:rPr>
+              <w:t xml:space="preserve">  ......................</w:t>
             </w:r>
             <w:r>
               <w:rPr>

</xml_diff>

<commit_message>
Word: bez podziału strony przed sekcją 3 – układ ciągły
Co-Authored-By: Claude Fable 5.1 <noreply@anthropic.com>
Claude-Session: https://claude.ai/code/session_01FpF7vCSW7jSofte5z6wEKy
</commit_message>
<xml_diff>
--- a/eduplaner2026/raport_oceny_funkcjonalnej/Raport_Oceny_Funkcjonalnej.docx
+++ b/eduplaner2026/raport_oceny_funkcjonalnej/Raport_Oceny_Funkcjonalnej.docx
@@ -8461,430 +8461,8 @@
       </w:tr>
     </w:tbl>
     <w:p>
-      <w:r>
-        <w:br w:type="page"/>
-      </w:r>
-    </w:p>
-    <w:tbl>
-      <w:tblPr>
-        <w:tblW w:type="dxa" w:w="9906"/>
-        <w:tblBorders>
-          <w:top w:val="single" w:color="auto" w:sz="4"/>
-          <w:left w:val="single" w:color="auto" w:sz="4"/>
-          <w:bottom w:val="single" w:color="auto" w:sz="4"/>
-          <w:right w:val="single" w:color="auto" w:sz="4"/>
-          <w:insideH w:val="single" w:color="auto" w:sz="4"/>
-          <w:insideV w:val="single" w:color="auto" w:sz="4"/>
-        </w:tblBorders>
-      </w:tblPr>
-      <w:tblGrid>
-        <w:gridCol w:w="700"/>
-        <w:gridCol w:w="6200"/>
-        <w:gridCol w:w="3006"/>
-      </w:tblGrid>
-      <w:tr>
-        <w:trPr>
-          <w:cantSplit/>
-        </w:trPr>
-        <w:tc>
-          <w:tcPr>
-            <w:tcW w:type="dxa" w:w="700"/>
-            <w:tcBorders>
-              <w:top w:val="nil"/>
-              <w:left w:val="nil"/>
-              <w:bottom w:val="nil"/>
-              <w:right w:val="nil"/>
-            </w:tcBorders>
-            <w:shd w:fill="2D1B69" w:color="auto" w:val="clear"/>
-            <w:tcMar>
-              <w:top w:type="dxa" w:w="120"/>
-              <w:left w:type="dxa" w:w="40"/>
-              <w:bottom w:type="dxa" w:w="120"/>
-              <w:right w:type="dxa" w:w="40"/>
-            </w:tcMar>
-            <w:vAlign w:val="center"/>
-          </w:tcPr>
-          <w:p>
-            <w:pPr>
-              <w:spacing w:after="0" w:before="0" w:line="276"/>
-              <w:jc w:val="center"/>
-            </w:pPr>
-            <w:r>
-              <w:rPr>
-                <w:rFonts w:ascii="Arial" w:cs="Arial" w:eastAsia="Arial" w:hAnsi="Arial"/>
-                <w:b/>
-                <w:bCs/>
-                <w:i w:val="false"/>
-                <w:iCs w:val="false"/>
-                <w:caps w:val="false"/>
-                <w:color w:val="FFFFFF"/>
-                <w:sz w:val="24"/>
-                <w:szCs w:val="24"/>
-              </w:rPr>
-              <w:t xml:space="preserve">§</w:t>
-            </w:r>
-          </w:p>
-        </w:tc>
-        <w:tc>
-          <w:tcPr>
-            <w:tcW w:type="dxa" w:w="6200"/>
-            <w:tcBorders>
-              <w:top w:val="nil"/>
-              <w:left w:val="nil"/>
-              <w:bottom w:val="nil"/>
-              <w:right w:val="nil"/>
-            </w:tcBorders>
-            <w:tcMar>
-              <w:top w:type="dxa" w:w="0"/>
-              <w:left w:type="dxa" w:w="160"/>
-              <w:bottom w:type="dxa" w:w="0"/>
-              <w:right w:type="dxa" w:w="0"/>
-            </w:tcMar>
-            <w:vAlign w:val="center"/>
-          </w:tcPr>
-          <w:p>
-            <w:pPr>
-              <w:spacing w:after="20" w:before="0" w:line="276"/>
-              <w:jc w:val="left"/>
-            </w:pPr>
-            <w:r>
-              <w:rPr>
-                <w:rFonts w:ascii="Arial" w:cs="Arial" w:eastAsia="Arial" w:hAnsi="Arial"/>
-                <w:b/>
-                <w:bCs/>
-                <w:i w:val="false"/>
-                <w:iCs w:val="false"/>
-                <w:caps w:val="false"/>
-                <w:color w:val="2D1B69"/>
-                <w:sz w:val="28"/>
-                <w:szCs w:val="28"/>
-              </w:rPr>
-              <w:t xml:space="preserve">[Nazwa przedszkola / szkoły]</w:t>
-            </w:r>
-          </w:p>
-          <w:p>
-            <w:pPr>
-              <w:spacing w:after="0" w:before="0" w:line="276"/>
-              <w:jc w:val="left"/>
-            </w:pPr>
-            <w:r>
-              <w:rPr>
-                <w:rFonts w:ascii="Arial" w:cs="Arial" w:eastAsia="Arial" w:hAnsi="Arial"/>
-                <w:b w:val="false"/>
-                <w:bCs w:val="false"/>
-                <w:i w:val="false"/>
-                <w:iCs w:val="false"/>
-                <w:caps/>
-                <w:color w:val="6B6378"/>
-                <w:spacing w:val="12"/>
-                <w:sz w:val="20"/>
-                <w:szCs w:val="20"/>
-              </w:rPr>
-              <w:t xml:space="preserve">Ocena Funkcjonalna · Obserwacja pogłębiona</w:t>
-            </w:r>
-          </w:p>
-        </w:tc>
-        <w:tc>
-          <w:tcPr>
-            <w:tcW w:type="dxa" w:w="3006"/>
-            <w:tcBorders>
-              <w:top w:val="nil"/>
-              <w:left w:val="nil"/>
-              <w:bottom w:val="nil"/>
-              <w:right w:val="nil"/>
-            </w:tcBorders>
-            <w:tcMar>
-              <w:top w:type="dxa" w:w="0"/>
-              <w:left w:type="dxa" w:w="0"/>
-              <w:bottom w:type="dxa" w:w="0"/>
-              <w:right w:type="dxa" w:w="0"/>
-            </w:tcMar>
-            <w:vAlign w:val="center"/>
-          </w:tcPr>
-          <w:p>
-            <w:pPr>
-              <w:spacing w:after="60" w:before="0" w:line="276"/>
-              <w:jc w:val="right"/>
-            </w:pPr>
-            <w:r>
-              <w:rPr>
-                <w:rFonts w:ascii="Arial" w:cs="Arial" w:eastAsia="Arial" w:hAnsi="Arial"/>
-                <w:b/>
-                <w:bCs/>
-                <w:i w:val="false"/>
-                <w:iCs w:val="false"/>
-                <w:caps w:val="false"/>
-                <w:color w:val="FFFFFF"/>
-                <w:spacing w:val="8"/>
-                <w:sz w:val="20"/>
-                <w:szCs w:val="20"/>
-                <w:shd w:fill="E74509" w:color="auto" w:val="clear"/>
-              </w:rPr>
-              <w:t xml:space="preserve">  OCENA FUNKCJONALNA · 2026  </w:t>
-            </w:r>
-          </w:p>
-          <w:p>
-            <w:pPr>
-              <w:spacing w:after="0" w:before="0" w:line="276"/>
-              <w:jc w:val="right"/>
-            </w:pPr>
-            <w:r>
-              <w:rPr>
-                <w:rFonts w:ascii="Arial" w:cs="Arial" w:eastAsia="Arial" w:hAnsi="Arial"/>
-                <w:b w:val="false"/>
-                <w:bCs w:val="false"/>
-                <w:i w:val="false"/>
-                <w:iCs w:val="false"/>
-                <w:caps w:val="false"/>
-                <w:color w:val="6B6378"/>
-                <w:spacing w:val="10"/>
-                <w:sz w:val="20"/>
-                <w:szCs w:val="20"/>
-              </w:rPr>
-              <w:t xml:space="preserve">DOKUMENT DLA RODZICA I PORADNI</w:t>
-            </w:r>
-          </w:p>
-        </w:tc>
-      </w:tr>
-    </w:tbl>
-    <w:p>
       <w:pPr>
-        <w:pBdr>
-          <w:bottom w:val="single" w:color="2D1B69" w:sz="24" w:space="1"/>
-        </w:pBdr>
-        <w:spacing w:after="160" w:before="60"/>
-      </w:pPr>
-    </w:p>
-    <w:tbl>
-      <w:tblPr>
-        <w:tblW w:type="dxa" w:w="9706"/>
-        <w:tblBorders>
-          <w:top w:val="single" w:color="auto" w:sz="4"/>
-          <w:left w:val="single" w:color="auto" w:sz="4"/>
-          <w:bottom w:val="single" w:color="auto" w:sz="4"/>
-          <w:right w:val="single" w:color="auto" w:sz="4"/>
-          <w:insideH w:val="single" w:color="auto" w:sz="4"/>
-          <w:insideV w:val="single" w:color="auto" w:sz="4"/>
-        </w:tblBorders>
-      </w:tblPr>
-      <w:tblGrid>
-        <w:gridCol w:w="3900"/>
-        <w:gridCol w:w="2900"/>
-        <w:gridCol w:w="2906"/>
-      </w:tblGrid>
-      <w:tr>
-        <w:trPr>
-          <w:cantSplit/>
-        </w:trPr>
-        <w:tc>
-          <w:tcPr>
-            <w:tcW w:type="dxa" w:w="3900"/>
-            <w:tcBorders>
-              <w:top w:val="single" w:color="FFFFFF" w:sz="12"/>
-              <w:left w:val="single" w:color="FFFFFF" w:sz="12"/>
-              <w:bottom w:val="single" w:color="FFFFFF" w:sz="12"/>
-              <w:right w:val="single" w:color="FFFFFF" w:sz="12"/>
-            </w:tcBorders>
-            <w:shd w:fill="EFE9F9" w:color="auto" w:val="clear"/>
-            <w:tcMar>
-              <w:top w:type="dxa" w:w="110"/>
-              <w:left w:type="dxa" w:w="180"/>
-              <w:bottom w:type="dxa" w:w="110"/>
-              <w:right w:type="dxa" w:w="120"/>
-            </w:tcMar>
-            <w:vAlign w:val="top"/>
-          </w:tcPr>
-          <w:p>
-            <w:pPr>
-              <w:spacing w:after="0" w:before="0" w:line="276"/>
-              <w:jc w:val="left"/>
-            </w:pPr>
-            <w:r>
-              <w:rPr>
-                <w:rFonts w:ascii="Arial" w:cs="Arial" w:eastAsia="Arial" w:hAnsi="Arial"/>
-                <w:b/>
-                <w:bCs/>
-                <w:i w:val="false"/>
-                <w:iCs w:val="false"/>
-                <w:caps w:val="false"/>
-                <w:color w:val="7D6FB0"/>
-                <w:spacing w:val="12"/>
-                <w:sz w:val="24"/>
-                <w:szCs w:val="24"/>
-              </w:rPr>
-              <w:t xml:space="preserve">DOTYCZY DZIECKA</w:t>
-            </w:r>
-            <w:r>
-              <w:rPr>
-                <w:rFonts w:ascii="Arial" w:cs="Arial" w:eastAsia="Arial" w:hAnsi="Arial"/>
-                <w:b w:val="false"/>
-                <w:bCs w:val="false"/>
-                <w:i w:val="false"/>
-                <w:iCs w:val="false"/>
-                <w:caps w:val="false"/>
-                <w:color w:val="B6A6DF"/>
-                <w:sz w:val="24"/>
-                <w:szCs w:val="24"/>
-              </w:rPr>
-              <w:t xml:space="preserve">  ........................................</w:t>
-            </w:r>
-            <w:r>
-              <w:rPr>
-                <w:rFonts w:ascii="Arial" w:cs="Arial" w:eastAsia="Arial" w:hAnsi="Arial"/>
-                <w:b w:val="false"/>
-                <w:bCs w:val="false"/>
-                <w:i w:val="false"/>
-                <w:iCs w:val="false"/>
-                <w:caps w:val="false"/>
-                <w:color w:val="6B6378"/>
-                <w:sz w:val="24"/>
-                <w:szCs w:val="24"/>
-              </w:rPr>
-              <w:t xml:space="preserve"/>
-            </w:r>
-          </w:p>
-        </w:tc>
-        <w:tc>
-          <w:tcPr>
-            <w:tcW w:type="dxa" w:w="2900"/>
-            <w:tcBorders>
-              <w:top w:val="single" w:color="FFFFFF" w:sz="12"/>
-              <w:left w:val="single" w:color="FFFFFF" w:sz="12"/>
-              <w:bottom w:val="single" w:color="FFFFFF" w:sz="12"/>
-              <w:right w:val="single" w:color="FFFFFF" w:sz="12"/>
-            </w:tcBorders>
-            <w:shd w:fill="EFE9F9" w:color="auto" w:val="clear"/>
-            <w:tcMar>
-              <w:top w:type="dxa" w:w="110"/>
-              <w:left w:type="dxa" w:w="180"/>
-              <w:bottom w:type="dxa" w:w="110"/>
-              <w:right w:type="dxa" w:w="120"/>
-            </w:tcMar>
-            <w:vAlign w:val="top"/>
-          </w:tcPr>
-          <w:p>
-            <w:pPr>
-              <w:spacing w:after="0" w:before="0" w:line="276"/>
-              <w:jc w:val="left"/>
-            </w:pPr>
-            <w:r>
-              <w:rPr>
-                <w:rFonts w:ascii="Arial" w:cs="Arial" w:eastAsia="Arial" w:hAnsi="Arial"/>
-                <w:b/>
-                <w:bCs/>
-                <w:i w:val="false"/>
-                <w:iCs w:val="false"/>
-                <w:caps w:val="false"/>
-                <w:color w:val="7D6FB0"/>
-                <w:spacing w:val="12"/>
-                <w:sz w:val="24"/>
-                <w:szCs w:val="24"/>
-              </w:rPr>
-              <w:t xml:space="preserve">GRUPA / KLASA</w:t>
-            </w:r>
-            <w:r>
-              <w:rPr>
-                <w:rFonts w:ascii="Arial" w:cs="Arial" w:eastAsia="Arial" w:hAnsi="Arial"/>
-                <w:b w:val="false"/>
-                <w:bCs w:val="false"/>
-                <w:i w:val="false"/>
-                <w:iCs w:val="false"/>
-                <w:caps w:val="false"/>
-                <w:color w:val="B6A6DF"/>
-                <w:sz w:val="24"/>
-                <w:szCs w:val="24"/>
-              </w:rPr>
-              <w:t xml:space="preserve">  ......................</w:t>
-            </w:r>
-            <w:r>
-              <w:rPr>
-                <w:rFonts w:ascii="Arial" w:cs="Arial" w:eastAsia="Arial" w:hAnsi="Arial"/>
-                <w:b w:val="false"/>
-                <w:bCs w:val="false"/>
-                <w:i w:val="false"/>
-                <w:iCs w:val="false"/>
-                <w:caps w:val="false"/>
-                <w:color w:val="6B6378"/>
-                <w:sz w:val="24"/>
-                <w:szCs w:val="24"/>
-              </w:rPr>
-              <w:t xml:space="preserve"/>
-            </w:r>
-          </w:p>
-        </w:tc>
-        <w:tc>
-          <w:tcPr>
-            <w:tcW w:type="dxa" w:w="2906"/>
-            <w:tcBorders>
-              <w:top w:val="single" w:color="FFFFFF" w:sz="12"/>
-              <w:left w:val="single" w:color="FFFFFF" w:sz="12"/>
-              <w:bottom w:val="single" w:color="FFFFFF" w:sz="12"/>
-              <w:right w:val="single" w:color="FFFFFF" w:sz="12"/>
-            </w:tcBorders>
-            <w:shd w:fill="EFE9F9" w:color="auto" w:val="clear"/>
-            <w:tcMar>
-              <w:top w:type="dxa" w:w="110"/>
-              <w:left w:type="dxa" w:w="180"/>
-              <w:bottom w:type="dxa" w:w="110"/>
-              <w:right w:type="dxa" w:w="120"/>
-            </w:tcMar>
-            <w:vAlign w:val="top"/>
-          </w:tcPr>
-          <w:p>
-            <w:pPr>
-              <w:spacing w:after="0" w:before="0" w:line="276"/>
-              <w:jc w:val="left"/>
-            </w:pPr>
-            <w:r>
-              <w:rPr>
-                <w:rFonts w:ascii="Arial" w:cs="Arial" w:eastAsia="Arial" w:hAnsi="Arial"/>
-                <w:b/>
-                <w:bCs/>
-                <w:i w:val="false"/>
-                <w:iCs w:val="false"/>
-                <w:caps w:val="false"/>
-                <w:color w:val="7D6FB0"/>
-                <w:spacing w:val="12"/>
-                <w:sz w:val="24"/>
-                <w:szCs w:val="24"/>
-              </w:rPr>
-              <w:t xml:space="preserve">DATA</w:t>
-            </w:r>
-            <w:r>
-              <w:rPr>
-                <w:rFonts w:ascii="Arial" w:cs="Arial" w:eastAsia="Arial" w:hAnsi="Arial"/>
-                <w:b w:val="false"/>
-                <w:bCs w:val="false"/>
-                <w:i w:val="false"/>
-                <w:iCs w:val="false"/>
-                <w:caps w:val="false"/>
-                <w:color w:val="B6A6DF"/>
-                <w:sz w:val="24"/>
-                <w:szCs w:val="24"/>
-              </w:rPr>
-              <w:t xml:space="preserve">  ......................</w:t>
-            </w:r>
-            <w:r>
-              <w:rPr>
-                <w:rFonts w:ascii="Arial" w:cs="Arial" w:eastAsia="Arial" w:hAnsi="Arial"/>
-                <w:b w:val="false"/>
-                <w:bCs w:val="false"/>
-                <w:i w:val="false"/>
-                <w:iCs w:val="false"/>
-                <w:caps w:val="false"/>
-                <w:color w:val="6B6378"/>
-                <w:sz w:val="24"/>
-                <w:szCs w:val="24"/>
-              </w:rPr>
-              <w:t xml:space="preserve">  r.</w:t>
-            </w:r>
-          </w:p>
-        </w:tc>
-      </w:tr>
-    </w:tbl>
-    <w:p>
-      <w:pPr>
-        <w:spacing w:after="120" w:before="0"/>
+        <w:spacing w:after="360" w:before="0"/>
       </w:pPr>
     </w:p>
     <w:p>

</xml_diff>